<commit_message>
#7 Exploración de datos
- Se ha incluido script de generación de gráficos y reporte EDA.

- Se han añadido los gráficos y el reporte como evidencia.

- También se ha añadido la información relativa a la memoria.
</commit_message>
<xml_diff>
--- a/docs/13MBID - 0CT25-26 - Memoria de trabajo - Proyecto.docx
+++ b/docs/13MBID - 0CT25-26 - Memoria de trabajo - Proyecto.docx
@@ -38,8 +38,30 @@
         <w:rPr>
           <w:rFonts w:ascii="Calibri" w:eastAsia="Calibri" w:hAnsi="Calibri" w:cs="Calibri"/>
         </w:rPr>
-        <w:t xml:space="preserve"> en la integración planteada con DataOps y MLOps</w:t>
-      </w:r>
+        <w:t xml:space="preserve"> en la integración planteada con </w:t>
+      </w:r>
+      <w:proofErr w:type="spellStart"/>
+      <w:r>
+        <w:rPr>
+          <w:rFonts w:ascii="Calibri" w:eastAsia="Calibri" w:hAnsi="Calibri" w:cs="Calibri"/>
+        </w:rPr>
+        <w:t>DataOps</w:t>
+      </w:r>
+      <w:proofErr w:type="spellEnd"/>
+      <w:r>
+        <w:rPr>
+          <w:rFonts w:ascii="Calibri" w:eastAsia="Calibri" w:hAnsi="Calibri" w:cs="Calibri"/>
+        </w:rPr>
+        <w:t xml:space="preserve"> y </w:t>
+      </w:r>
+      <w:proofErr w:type="spellStart"/>
+      <w:r>
+        <w:rPr>
+          <w:rFonts w:ascii="Calibri" w:eastAsia="Calibri" w:hAnsi="Calibri" w:cs="Calibri"/>
+        </w:rPr>
+        <w:t>MLOps</w:t>
+      </w:r>
+      <w:proofErr w:type="spellEnd"/>
       <w:r>
         <w:rPr>
           <w:rFonts w:ascii="Calibri" w:eastAsia="Calibri" w:hAnsi="Calibri" w:cs="Calibri"/>
@@ -508,7 +530,15 @@
     </w:p>
     <w:p>
       <w:r>
-        <w:t>Se cuenta, para esta segunda etapa, con los archivos de la experimentación que han sido generados para el proyecto durante la construcción de la primera versión de su producto resultante (el modelo de predicción) y los resultados de su utilización en un nuevo dataset.</w:t>
+        <w:t xml:space="preserve">Se cuenta, para esta segunda etapa, con los archivos de la experimentación que han sido generados para el proyecto durante la construcción de la primera versión de su producto resultante (el modelo de predicción) y los resultados de su utilización en un nuevo </w:t>
+      </w:r>
+      <w:proofErr w:type="spellStart"/>
+      <w:r>
+        <w:t>dataset</w:t>
+      </w:r>
+      <w:proofErr w:type="spellEnd"/>
+      <w:r>
+        <w:t>.</w:t>
       </w:r>
     </w:p>
     <w:p>
@@ -650,7 +680,39 @@
           <w:rFonts w:ascii="Calibri" w:eastAsia="Calibri" w:hAnsi="Calibri" w:cs="Calibri"/>
           <w:color w:val="000000" w:themeColor="text1"/>
         </w:rPr>
-        <w:t>Implementar prácticas originadas en los modelos de DataOps y MLOps para automatizar ciertas cuestiones del proyecto y permitir la replicación de los resultados del mismo a lo largo del tiempo.</w:t>
+        <w:t xml:space="preserve">Implementar prácticas originadas en los modelos de </w:t>
+      </w:r>
+      <w:proofErr w:type="spellStart"/>
+      <w:r>
+        <w:rPr>
+          <w:rFonts w:ascii="Calibri" w:eastAsia="Calibri" w:hAnsi="Calibri" w:cs="Calibri"/>
+          <w:color w:val="000000" w:themeColor="text1"/>
+        </w:rPr>
+        <w:t>DataOps</w:t>
+      </w:r>
+      <w:proofErr w:type="spellEnd"/>
+      <w:r>
+        <w:rPr>
+          <w:rFonts w:ascii="Calibri" w:eastAsia="Calibri" w:hAnsi="Calibri" w:cs="Calibri"/>
+          <w:color w:val="000000" w:themeColor="text1"/>
+        </w:rPr>
+        <w:t xml:space="preserve"> y </w:t>
+      </w:r>
+      <w:proofErr w:type="spellStart"/>
+      <w:r>
+        <w:rPr>
+          <w:rFonts w:ascii="Calibri" w:eastAsia="Calibri" w:hAnsi="Calibri" w:cs="Calibri"/>
+          <w:color w:val="000000" w:themeColor="text1"/>
+        </w:rPr>
+        <w:t>MLOps</w:t>
+      </w:r>
+      <w:proofErr w:type="spellEnd"/>
+      <w:r>
+        <w:rPr>
+          <w:rFonts w:ascii="Calibri" w:eastAsia="Calibri" w:hAnsi="Calibri" w:cs="Calibri"/>
+          <w:color w:val="000000" w:themeColor="text1"/>
+        </w:rPr>
+        <w:t xml:space="preserve"> para automatizar ciertas cuestiones del proyecto y permitir la replicación de los resultados del mismo a lo largo del tiempo.</w:t>
       </w:r>
     </w:p>
     <w:p>
@@ -689,7 +751,15 @@
         </w:rPr>
       </w:pPr>
       <w:r>
-        <w:t>Definir plan del proyecto (tareas, recursos, etc)</w:t>
+        <w:t xml:space="preserve">Definir plan del proyecto (tareas, recursos, </w:t>
+      </w:r>
+      <w:proofErr w:type="spellStart"/>
+      <w:r>
+        <w:t>etc</w:t>
+      </w:r>
+      <w:proofErr w:type="spellEnd"/>
+      <w:r>
+        <w:t>)</w:t>
       </w:r>
     </w:p>
     <w:p/>
@@ -749,7 +819,15 @@
         </w:numPr>
       </w:pPr>
       <w:r>
-        <w:t>Resultados parciales sobre un dataset nuevo</w:t>
+        <w:t xml:space="preserve">Resultados parciales sobre un </w:t>
+      </w:r>
+      <w:proofErr w:type="spellStart"/>
+      <w:r>
+        <w:t>dataset</w:t>
+      </w:r>
+      <w:proofErr w:type="spellEnd"/>
+      <w:r>
+        <w:t xml:space="preserve"> nuevo</w:t>
       </w:r>
     </w:p>
     <w:p>
@@ -797,7 +875,23 @@
     </w:p>
     <w:p>
       <w:r>
-        <w:t>A continuación, se agregan los enlaces relacionados con la gestión de tareas del proyecto en Github Projects, así como al repositorio donde se encuentran los archivos. Adicionalmente, se añaden evidencias del tablero de backlog generado:</w:t>
+        <w:t xml:space="preserve">A continuación, se agregan los enlaces relacionados con la gestión de tareas del proyecto en </w:t>
+      </w:r>
+      <w:proofErr w:type="spellStart"/>
+      <w:r>
+        <w:t>Github</w:t>
+      </w:r>
+      <w:proofErr w:type="spellEnd"/>
+      <w:r>
+        <w:t xml:space="preserve"> </w:t>
+      </w:r>
+      <w:proofErr w:type="spellStart"/>
+      <w:r>
+        <w:t>Projects</w:t>
+      </w:r>
+      <w:proofErr w:type="spellEnd"/>
+      <w:r>
+        <w:t>, así como al repositorio donde se encuentran los archivos. Adicionalmente, se añaden evidencias del tablero de backlog generado:</w:t>
       </w:r>
     </w:p>
     <w:p>
@@ -811,11 +905,19 @@
           <w:lang w:val="en-GB"/>
         </w:rPr>
       </w:pPr>
+      <w:proofErr w:type="spellStart"/>
       <w:r>
         <w:rPr>
           <w:lang w:val="en-GB"/>
         </w:rPr>
-        <w:t>Github P</w:t>
+        <w:t>Github</w:t>
+      </w:r>
+      <w:proofErr w:type="spellEnd"/>
+      <w:r>
+        <w:rPr>
+          <w:lang w:val="en-GB"/>
+        </w:rPr>
+        <w:t xml:space="preserve"> P</w:t>
       </w:r>
       <w:r>
         <w:rPr>
@@ -844,8 +946,13 @@
       <w:r>
         <w:t xml:space="preserve">Repositorio </w:t>
       </w:r>
-      <w:r>
-        <w:t xml:space="preserve">Github: </w:t>
+      <w:proofErr w:type="spellStart"/>
+      <w:r>
+        <w:t>Github</w:t>
+      </w:r>
+      <w:proofErr w:type="spellEnd"/>
+      <w:r>
+        <w:t xml:space="preserve">: </w:t>
       </w:r>
       <w:hyperlink r:id="rId10" w:history="1">
         <w:r>
@@ -980,9 +1087,11 @@
       <w:r>
         <w:t xml:space="preserve">un </w:t>
       </w:r>
+      <w:proofErr w:type="spellStart"/>
       <w:r>
         <w:t>dataset</w:t>
       </w:r>
+      <w:proofErr w:type="spellEnd"/>
       <w:r>
         <w:t xml:space="preserve"> </w:t>
       </w:r>
@@ -1017,8 +1126,13 @@
         <w:t xml:space="preserve"> </w:t>
       </w:r>
       <w:r>
-        <w:t>en formato .csv</w:t>
-      </w:r>
+        <w:t>en formato .</w:t>
+      </w:r>
+      <w:proofErr w:type="spellStart"/>
+      <w:r>
+        <w:t>csv</w:t>
+      </w:r>
+      <w:proofErr w:type="spellEnd"/>
       <w:r>
         <w:t xml:space="preserve"> con las siguientes características</w:t>
       </w:r>
@@ -1134,7 +1248,23 @@
           <w:rFonts w:ascii="Calibri" w:eastAsia="Calibri" w:hAnsi="Calibri" w:cs="Calibri"/>
           <w:color w:val="000000" w:themeColor="text1"/>
         </w:rPr>
-        <w:t>Se han versionado los dos datasets iniciales (completo y datos nuevos sin etiquetar) utilizando la librería DVC.</w:t>
+        <w:t xml:space="preserve">Se han versionado los dos </w:t>
+      </w:r>
+      <w:proofErr w:type="spellStart"/>
+      <w:r>
+        <w:rPr>
+          <w:rFonts w:ascii="Calibri" w:eastAsia="Calibri" w:hAnsi="Calibri" w:cs="Calibri"/>
+          <w:color w:val="000000" w:themeColor="text1"/>
+        </w:rPr>
+        <w:t>datasets</w:t>
+      </w:r>
+      <w:proofErr w:type="spellEnd"/>
+      <w:r>
+        <w:rPr>
+          <w:rFonts w:ascii="Calibri" w:eastAsia="Calibri" w:hAnsi="Calibri" w:cs="Calibri"/>
+          <w:color w:val="000000" w:themeColor="text1"/>
+        </w:rPr>
+        <w:t xml:space="preserve"> iniciales (completo y datos nuevos sin etiquetar) utilizando la librería DVC.</w:t>
       </w:r>
     </w:p>
     <w:p>
@@ -1196,7 +1326,15 @@
         <w:t>l</w:t>
       </w:r>
       <w:r>
-        <w:t xml:space="preserve"> dataset:</w:t>
+        <w:t xml:space="preserve"> </w:t>
+      </w:r>
+      <w:proofErr w:type="spellStart"/>
+      <w:r>
+        <w:t>dataset</w:t>
+      </w:r>
+      <w:proofErr w:type="spellEnd"/>
+      <w:r>
+        <w:t>:</w:t>
       </w:r>
     </w:p>
     <w:p>
@@ -1225,8 +1363,13 @@
           <w:numId w:val="29"/>
         </w:numPr>
       </w:pPr>
-      <w:r>
-        <w:t>age: edad (numérica)</w:t>
+      <w:proofErr w:type="spellStart"/>
+      <w:r>
+        <w:t>age</w:t>
+      </w:r>
+      <w:proofErr w:type="spellEnd"/>
+      <w:r>
+        <w:t>: edad (numérica)</w:t>
       </w:r>
     </w:p>
     <w:p>
@@ -1244,7 +1387,49 @@
         <w:rPr>
           <w:lang w:val="en-US"/>
         </w:rPr>
-        <w:t>job: tipo de trabajo (categórica: admin., blue-collar, entrepreneur, housemaid, management, retired, self-employed, services, student, technician, unemployed, unknown)</w:t>
+        <w:t xml:space="preserve">job: </w:t>
+      </w:r>
+      <w:proofErr w:type="spellStart"/>
+      <w:r>
+        <w:rPr>
+          <w:lang w:val="en-US"/>
+        </w:rPr>
+        <w:t>tipo</w:t>
+      </w:r>
+      <w:proofErr w:type="spellEnd"/>
+      <w:r>
+        <w:rPr>
+          <w:lang w:val="en-US"/>
+        </w:rPr>
+        <w:t xml:space="preserve"> de </w:t>
+      </w:r>
+      <w:proofErr w:type="spellStart"/>
+      <w:r>
+        <w:rPr>
+          <w:lang w:val="en-US"/>
+        </w:rPr>
+        <w:t>trabajo</w:t>
+      </w:r>
+      <w:proofErr w:type="spellEnd"/>
+      <w:r>
+        <w:rPr>
+          <w:lang w:val="en-US"/>
+        </w:rPr>
+        <w:t xml:space="preserve"> (</w:t>
+      </w:r>
+      <w:proofErr w:type="spellStart"/>
+      <w:r>
+        <w:rPr>
+          <w:lang w:val="en-US"/>
+        </w:rPr>
+        <w:t>categórica</w:t>
+      </w:r>
+      <w:proofErr w:type="spellEnd"/>
+      <w:r>
+        <w:rPr>
+          <w:lang w:val="en-US"/>
+        </w:rPr>
+        <w:t>: admin., blue-collar, entrepreneur, housemaid, management, retired, self-employed, services, student, technician, unemployed, unknown)</w:t>
       </w:r>
     </w:p>
     <w:p>
@@ -1262,7 +1447,35 @@
         <w:rPr>
           <w:lang w:val="en-US"/>
         </w:rPr>
-        <w:t>marital: estado civil (categórica: divorced, married, single, unknown)</w:t>
+        <w:t xml:space="preserve">marital: </w:t>
+      </w:r>
+      <w:proofErr w:type="spellStart"/>
+      <w:r>
+        <w:rPr>
+          <w:lang w:val="en-US"/>
+        </w:rPr>
+        <w:t>estado</w:t>
+      </w:r>
+      <w:proofErr w:type="spellEnd"/>
+      <w:r>
+        <w:rPr>
+          <w:lang w:val="en-US"/>
+        </w:rPr>
+        <w:t xml:space="preserve"> civil (</w:t>
+      </w:r>
+      <w:proofErr w:type="spellStart"/>
+      <w:r>
+        <w:rPr>
+          <w:lang w:val="en-US"/>
+        </w:rPr>
+        <w:t>categórica</w:t>
+      </w:r>
+      <w:proofErr w:type="spellEnd"/>
+      <w:r>
+        <w:rPr>
+          <w:lang w:val="en-US"/>
+        </w:rPr>
+        <w:t>: divorced, married, single, unknown)</w:t>
       </w:r>
     </w:p>
     <w:p>
@@ -1280,7 +1493,91 @@
         <w:rPr>
           <w:lang w:val="en-GB"/>
         </w:rPr>
-        <w:t>education: nivel educativo (categórica: basic.4y, basic.6y, basic.9y, high.school, illiterate, professional.course, university.degree, unknown)</w:t>
+        <w:t xml:space="preserve">education: </w:t>
+      </w:r>
+      <w:proofErr w:type="spellStart"/>
+      <w:r>
+        <w:rPr>
+          <w:lang w:val="en-GB"/>
+        </w:rPr>
+        <w:t>nivel</w:t>
+      </w:r>
+      <w:proofErr w:type="spellEnd"/>
+      <w:r>
+        <w:rPr>
+          <w:lang w:val="en-GB"/>
+        </w:rPr>
+        <w:t xml:space="preserve"> </w:t>
+      </w:r>
+      <w:proofErr w:type="spellStart"/>
+      <w:r>
+        <w:rPr>
+          <w:lang w:val="en-GB"/>
+        </w:rPr>
+        <w:t>educativo</w:t>
+      </w:r>
+      <w:proofErr w:type="spellEnd"/>
+      <w:r>
+        <w:rPr>
+          <w:lang w:val="en-GB"/>
+        </w:rPr>
+        <w:t xml:space="preserve"> (</w:t>
+      </w:r>
+      <w:proofErr w:type="spellStart"/>
+      <w:r>
+        <w:rPr>
+          <w:lang w:val="en-GB"/>
+        </w:rPr>
+        <w:t>categórica</w:t>
+      </w:r>
+      <w:proofErr w:type="spellEnd"/>
+      <w:r>
+        <w:rPr>
+          <w:lang w:val="en-GB"/>
+        </w:rPr>
+        <w:t xml:space="preserve">: basic.4y, basic.6y, basic.9y, </w:t>
+      </w:r>
+      <w:proofErr w:type="spellStart"/>
+      <w:r>
+        <w:rPr>
+          <w:lang w:val="en-GB"/>
+        </w:rPr>
+        <w:t>high.school</w:t>
+      </w:r>
+      <w:proofErr w:type="spellEnd"/>
+      <w:r>
+        <w:rPr>
+          <w:lang w:val="en-GB"/>
+        </w:rPr>
+        <w:t xml:space="preserve">, illiterate, </w:t>
+      </w:r>
+      <w:proofErr w:type="spellStart"/>
+      <w:r>
+        <w:rPr>
+          <w:lang w:val="en-GB"/>
+        </w:rPr>
+        <w:t>professional.course</w:t>
+      </w:r>
+      <w:proofErr w:type="spellEnd"/>
+      <w:r>
+        <w:rPr>
+          <w:lang w:val="en-GB"/>
+        </w:rPr>
+        <w:t xml:space="preserve">, </w:t>
+      </w:r>
+      <w:proofErr w:type="spellStart"/>
+      <w:r>
+        <w:rPr>
+          <w:lang w:val="en-GB"/>
+        </w:rPr>
+        <w:t>university.degree</w:t>
+      </w:r>
+      <w:proofErr w:type="spellEnd"/>
+      <w:r>
+        <w:rPr>
+          <w:lang w:val="en-GB"/>
+        </w:rPr>
+        <w:t>, unknown)</w:t>
       </w:r>
     </w:p>
     <w:p>
@@ -1292,7 +1589,15 @@
         </w:numPr>
       </w:pPr>
       <w:r>
-        <w:t>default: ¿tiene créditos en default? (yes, no, unknown)</w:t>
+        <w:t xml:space="preserve">default: ¿tiene créditos en default? (yes, no, </w:t>
+      </w:r>
+      <w:proofErr w:type="spellStart"/>
+      <w:r>
+        <w:t>unknown</w:t>
+      </w:r>
+      <w:proofErr w:type="spellEnd"/>
+      <w:r>
+        <w:t>)</w:t>
       </w:r>
     </w:p>
     <w:p>
@@ -1303,8 +1608,21 @@
           <w:numId w:val="29"/>
         </w:numPr>
       </w:pPr>
-      <w:r>
-        <w:t>housing: ¿tiene préstamo hipotecario? (yes, no, unknown)</w:t>
+      <w:proofErr w:type="spellStart"/>
+      <w:r>
+        <w:t>housing</w:t>
+      </w:r>
+      <w:proofErr w:type="spellEnd"/>
+      <w:r>
+        <w:t xml:space="preserve">: ¿tiene préstamo hipotecario? (yes, no, </w:t>
+      </w:r>
+      <w:proofErr w:type="spellStart"/>
+      <w:r>
+        <w:t>unknown</w:t>
+      </w:r>
+      <w:proofErr w:type="spellEnd"/>
+      <w:r>
+        <w:t>)</w:t>
       </w:r>
     </w:p>
     <w:p>
@@ -1316,7 +1634,15 @@
         </w:numPr>
       </w:pPr>
       <w:r>
-        <w:t>loan: ¿tiene préstamo personal? (yes, no, unknown)</w:t>
+        <w:t xml:space="preserve">loan: ¿tiene préstamo personal? (yes, no, </w:t>
+      </w:r>
+      <w:proofErr w:type="spellStart"/>
+      <w:r>
+        <w:t>unknown</w:t>
+      </w:r>
+      <w:proofErr w:type="spellEnd"/>
+      <w:r>
+        <w:t>)</w:t>
       </w:r>
     </w:p>
     <w:p>
@@ -1342,8 +1668,29 @@
           <w:numId w:val="28"/>
         </w:numPr>
       </w:pPr>
-      <w:r>
-        <w:t xml:space="preserve">contact: tipo de contacto (cellular, telephone) </w:t>
+      <w:proofErr w:type="spellStart"/>
+      <w:r>
+        <w:t>contact</w:t>
+      </w:r>
+      <w:proofErr w:type="spellEnd"/>
+      <w:r>
+        <w:t>: tipo de contacto (</w:t>
+      </w:r>
+      <w:proofErr w:type="spellStart"/>
+      <w:r>
+        <w:t>cellular</w:t>
+      </w:r>
+      <w:proofErr w:type="spellEnd"/>
+      <w:r>
+        <w:t xml:space="preserve">, </w:t>
+      </w:r>
+      <w:proofErr w:type="spellStart"/>
+      <w:r>
+        <w:t>telephone</w:t>
+      </w:r>
+      <w:proofErr w:type="spellEnd"/>
+      <w:r>
+        <w:t xml:space="preserve">) </w:t>
       </w:r>
     </w:p>
     <w:p>
@@ -1354,8 +1701,29 @@
           <w:numId w:val="28"/>
         </w:numPr>
       </w:pPr>
-      <w:r>
-        <w:t xml:space="preserve">month: mes del último contacto (jan, feb, mar, …, nov, dec) </w:t>
+      <w:proofErr w:type="spellStart"/>
+      <w:r>
+        <w:t>month</w:t>
+      </w:r>
+      <w:proofErr w:type="spellEnd"/>
+      <w:r>
+        <w:t>: mes del último contacto (</w:t>
+      </w:r>
+      <w:proofErr w:type="spellStart"/>
+      <w:r>
+        <w:t>jan</w:t>
+      </w:r>
+      <w:proofErr w:type="spellEnd"/>
+      <w:r>
+        <w:t xml:space="preserve">, feb, mar, …, nov, </w:t>
+      </w:r>
+      <w:proofErr w:type="spellStart"/>
+      <w:r>
+        <w:t>dec</w:t>
+      </w:r>
+      <w:proofErr w:type="spellEnd"/>
+      <w:r>
+        <w:t xml:space="preserve">) </w:t>
       </w:r>
     </w:p>
     <w:p>
@@ -1369,11 +1737,89 @@
           <w:lang w:val="en-GB"/>
         </w:rPr>
       </w:pPr>
+      <w:proofErr w:type="spellStart"/>
       <w:r>
         <w:rPr>
           <w:lang w:val="en-GB"/>
         </w:rPr>
-        <w:t xml:space="preserve">day_of_week: día de la semana (mon, tue, wed, thu, fri) </w:t>
+        <w:t>day_of_week</w:t>
+      </w:r>
+      <w:proofErr w:type="spellEnd"/>
+      <w:r>
+        <w:rPr>
+          <w:lang w:val="en-GB"/>
+        </w:rPr>
+        <w:t xml:space="preserve">: día de la </w:t>
+      </w:r>
+      <w:proofErr w:type="spellStart"/>
+      <w:r>
+        <w:rPr>
+          <w:lang w:val="en-GB"/>
+        </w:rPr>
+        <w:t>semana</w:t>
+      </w:r>
+      <w:proofErr w:type="spellEnd"/>
+      <w:r>
+        <w:rPr>
+          <w:lang w:val="en-GB"/>
+        </w:rPr>
+        <w:t xml:space="preserve"> (</w:t>
+      </w:r>
+      <w:proofErr w:type="spellStart"/>
+      <w:r>
+        <w:rPr>
+          <w:lang w:val="en-GB"/>
+        </w:rPr>
+        <w:t>mon</w:t>
+      </w:r>
+      <w:proofErr w:type="spellEnd"/>
+      <w:r>
+        <w:rPr>
+          <w:lang w:val="en-GB"/>
+        </w:rPr>
+        <w:t xml:space="preserve">, </w:t>
+      </w:r>
+      <w:proofErr w:type="spellStart"/>
+      <w:r>
+        <w:rPr>
+          <w:lang w:val="en-GB"/>
+        </w:rPr>
+        <w:t>tue</w:t>
+      </w:r>
+      <w:proofErr w:type="spellEnd"/>
+      <w:r>
+        <w:rPr>
+          <w:lang w:val="en-GB"/>
+        </w:rPr>
+        <w:t xml:space="preserve">, wed, </w:t>
+      </w:r>
+      <w:proofErr w:type="spellStart"/>
+      <w:r>
+        <w:rPr>
+          <w:lang w:val="en-GB"/>
+        </w:rPr>
+        <w:t>thu</w:t>
+      </w:r>
+      <w:proofErr w:type="spellEnd"/>
+      <w:r>
+        <w:rPr>
+          <w:lang w:val="en-GB"/>
+        </w:rPr>
+        <w:t xml:space="preserve">, </w:t>
+      </w:r>
+      <w:proofErr w:type="spellStart"/>
+      <w:r>
+        <w:rPr>
+          <w:lang w:val="en-GB"/>
+        </w:rPr>
+        <w:t>fri</w:t>
+      </w:r>
+      <w:proofErr w:type="spellEnd"/>
+      <w:r>
+        <w:rPr>
+          <w:lang w:val="en-GB"/>
+        </w:rPr>
+        <w:t xml:space="preserve">) </w:t>
       </w:r>
     </w:p>
     <w:p>
@@ -1384,8 +1830,13 @@
           <w:numId w:val="28"/>
         </w:numPr>
       </w:pPr>
-      <w:r>
-        <w:t xml:space="preserve">duration: duración del último contacto en segundos (numérica) </w:t>
+      <w:proofErr w:type="spellStart"/>
+      <w:r>
+        <w:t>duration</w:t>
+      </w:r>
+      <w:proofErr w:type="spellEnd"/>
+      <w:r>
+        <w:t xml:space="preserve">: duración del último contacto en segundos (numérica) </w:t>
       </w:r>
     </w:p>
     <w:p>
@@ -1416,9 +1867,14 @@
           <w:numId w:val="27"/>
         </w:numPr>
       </w:pPr>
+      <w:proofErr w:type="spellStart"/>
       <w:r>
         <w:lastRenderedPageBreak/>
-        <w:t xml:space="preserve">campaign: número de contactos en esta campaña (numérica) </w:t>
+        <w:t>campaign</w:t>
+      </w:r>
+      <w:proofErr w:type="spellEnd"/>
+      <w:r>
+        <w:t xml:space="preserve">: número de contactos en esta campaña (numérica) </w:t>
       </w:r>
     </w:p>
     <w:p>
@@ -1429,8 +1885,13 @@
           <w:numId w:val="27"/>
         </w:numPr>
       </w:pPr>
-      <w:r>
-        <w:t xml:space="preserve">pdays: días transcurridos desde el último contacto en campañas anteriores (numérica; 999 = nunca contactado) </w:t>
+      <w:proofErr w:type="spellStart"/>
+      <w:r>
+        <w:t>pdays</w:t>
+      </w:r>
+      <w:proofErr w:type="spellEnd"/>
+      <w:r>
+        <w:t xml:space="preserve">: días transcurridos desde el último contacto en campañas anteriores (numérica; 999 = nunca contactado) </w:t>
       </w:r>
     </w:p>
     <w:p>
@@ -1441,8 +1902,13 @@
           <w:numId w:val="27"/>
         </w:numPr>
       </w:pPr>
-      <w:r>
-        <w:t xml:space="preserve">previous: número de contactos previos a esta campaña (numérica) </w:t>
+      <w:proofErr w:type="spellStart"/>
+      <w:r>
+        <w:t>previous</w:t>
+      </w:r>
+      <w:proofErr w:type="spellEnd"/>
+      <w:r>
+        <w:t xml:space="preserve">: número de contactos previos a esta campaña (numérica) </w:t>
       </w:r>
     </w:p>
     <w:p>
@@ -1453,8 +1919,37 @@
           <w:numId w:val="27"/>
         </w:numPr>
       </w:pPr>
-      <w:r>
-        <w:t xml:space="preserve">poutcome: resultado de la campaña anterior (failure, nonexistent, success) </w:t>
+      <w:proofErr w:type="spellStart"/>
+      <w:r>
+        <w:t>poutcome</w:t>
+      </w:r>
+      <w:proofErr w:type="spellEnd"/>
+      <w:r>
+        <w:t>: resultado de la campaña anterior (</w:t>
+      </w:r>
+      <w:proofErr w:type="spellStart"/>
+      <w:r>
+        <w:t>failure</w:t>
+      </w:r>
+      <w:proofErr w:type="spellEnd"/>
+      <w:r>
+        <w:t xml:space="preserve">, </w:t>
+      </w:r>
+      <w:proofErr w:type="spellStart"/>
+      <w:r>
+        <w:t>nonexistent</w:t>
+      </w:r>
+      <w:proofErr w:type="spellEnd"/>
+      <w:r>
+        <w:t xml:space="preserve">, </w:t>
+      </w:r>
+      <w:proofErr w:type="spellStart"/>
+      <w:r>
+        <w:t>success</w:t>
+      </w:r>
+      <w:proofErr w:type="spellEnd"/>
+      <w:r>
+        <w:t xml:space="preserve">) </w:t>
       </w:r>
     </w:p>
     <w:p>
@@ -1480,8 +1975,13 @@
           <w:numId w:val="26"/>
         </w:numPr>
       </w:pPr>
-      <w:r>
-        <w:t xml:space="preserve">emp.var.rate: tasa de variación del empleo – indicador trimestral (numérica) </w:t>
+      <w:proofErr w:type="spellStart"/>
+      <w:r>
+        <w:t>emp.var.rate</w:t>
+      </w:r>
+      <w:proofErr w:type="spellEnd"/>
+      <w:r>
+        <w:t xml:space="preserve">: tasa de variación del empleo – indicador trimestral (numérica) </w:t>
       </w:r>
     </w:p>
     <w:p>
@@ -1492,8 +1992,13 @@
           <w:numId w:val="26"/>
         </w:numPr>
       </w:pPr>
-      <w:r>
-        <w:t xml:space="preserve">cons.price.idx: índice de precios al consumidor – indicador mensual (numérica) </w:t>
+      <w:proofErr w:type="spellStart"/>
+      <w:r>
+        <w:t>cons.price.idx</w:t>
+      </w:r>
+      <w:proofErr w:type="spellEnd"/>
+      <w:r>
+        <w:t xml:space="preserve">: índice de precios al consumidor – indicador mensual (numérica) </w:t>
       </w:r>
     </w:p>
     <w:p>
@@ -1504,8 +2009,13 @@
           <w:numId w:val="26"/>
         </w:numPr>
       </w:pPr>
-      <w:r>
-        <w:t xml:space="preserve">cons.conf.idx: índice de confianza del consumidor – indicador mensual (numérica) </w:t>
+      <w:proofErr w:type="spellStart"/>
+      <w:r>
+        <w:t>cons.conf.idx</w:t>
+      </w:r>
+      <w:proofErr w:type="spellEnd"/>
+      <w:r>
+        <w:t xml:space="preserve">: índice de confianza del consumidor – indicador mensual (numérica) </w:t>
       </w:r>
     </w:p>
     <w:p>
@@ -1528,8 +2038,13 @@
           <w:numId w:val="26"/>
         </w:numPr>
       </w:pPr>
-      <w:r>
-        <w:t xml:space="preserve">nr.employed: número de empleados – indicador trimestral (numérica) </w:t>
+      <w:proofErr w:type="spellStart"/>
+      <w:r>
+        <w:t>nr.employed</w:t>
+      </w:r>
+      <w:proofErr w:type="spellEnd"/>
+      <w:r>
+        <w:t xml:space="preserve">: número de empleados – indicador trimestral (numérica) </w:t>
       </w:r>
     </w:p>
     <w:p>
@@ -1566,7 +2081,15 @@
     </w:p>
     <w:p>
       <w:r>
-        <w:t>Se mantiene sin cambios el dataset del proyecto.</w:t>
+        <w:t xml:space="preserve">Se mantiene sin cambios el </w:t>
+      </w:r>
+      <w:proofErr w:type="spellStart"/>
+      <w:r>
+        <w:t>dataset</w:t>
+      </w:r>
+      <w:proofErr w:type="spellEnd"/>
+      <w:r>
+        <w:t xml:space="preserve"> del proyecto.</w:t>
       </w:r>
     </w:p>
     <w:p>
@@ -1643,12 +2166,21 @@
       <w:r>
         <w:t xml:space="preserve">genera gráficos en el directorio </w:t>
       </w:r>
+      <w:proofErr w:type="spellStart"/>
       <w:r>
         <w:rPr>
           <w:b/>
           <w:bCs/>
         </w:rPr>
-        <w:t>docs/figures</w:t>
+        <w:t>docs</w:t>
+      </w:r>
+      <w:proofErr w:type="spellEnd"/>
+      <w:r>
+        <w:rPr>
+          <w:b/>
+          <w:bCs/>
+        </w:rPr>
+        <w:t>/figures</w:t>
       </w:r>
       <w:r>
         <w:t xml:space="preserve"> del repositorio.</w:t>
@@ -1663,7 +2195,13 @@
     <w:p>
       <w:r>
         <w:lastRenderedPageBreak/>
-        <w:t>A continuación se agregan algunos gráficos de interés:</w:t>
+        <w:t xml:space="preserve">A </w:t>
+      </w:r>
+      <w:r>
+        <w:t>continuación,</w:t>
+      </w:r>
+      <w:r>
+        <w:t xml:space="preserve"> se agregan algunos gráficos de interés:</w:t>
       </w:r>
     </w:p>
     <w:p>
@@ -1675,7 +2213,13 @@
         </w:numPr>
       </w:pPr>
       <w:r>
-        <w:t>Distribución de valores del atributo target (“y”)</w:t>
+        <w:t xml:space="preserve">Distribución de valores del atributo </w:t>
+      </w:r>
+      <w:r>
+        <w:t xml:space="preserve">objetivo </w:t>
+      </w:r>
+      <w:r>
+        <w:t>(“y”)</w:t>
       </w:r>
     </w:p>
     <w:p>
@@ -1739,7 +2283,15 @@
         </w:numPr>
       </w:pPr>
       <w:r>
-        <w:t>Distribución de valores del atributo “education” (nivel educativo alcanzado)</w:t>
+        <w:t>Distribución de valores del atributo “</w:t>
+      </w:r>
+      <w:proofErr w:type="spellStart"/>
+      <w:r>
+        <w:t>education</w:t>
+      </w:r>
+      <w:proofErr w:type="spellEnd"/>
+      <w:r>
+        <w:t>” (nivel educativo alcanzado)</w:t>
       </w:r>
     </w:p>
     <w:p>
@@ -1792,33 +2344,71 @@
     </w:p>
     <w:p>
       <w:pPr>
-        <w:rPr>
-          <w:highlight w:val="yellow"/>
-        </w:rPr>
-      </w:pPr>
-      <w:r>
-        <w:rPr>
-          <w:highlight w:val="yellow"/>
-        </w:rPr>
-        <w:t>Agregar:</w:t>
-      </w:r>
-    </w:p>
-    <w:p>
-      <w:pPr>
         <w:pStyle w:val="ListParagraph"/>
         <w:numPr>
           <w:ilvl w:val="0"/>
-          <w:numId w:val="14"/>
+          <w:numId w:val="65"/>
         </w:numPr>
-        <w:rPr>
-          <w:highlight w:val="yellow"/>
-        </w:rPr>
-      </w:pPr>
-      <w:r>
-        <w:rPr>
-          <w:highlight w:val="yellow"/>
-        </w:rPr>
-        <w:t>La generación de al menos 2 gráficos más al script</w:t>
+      </w:pPr>
+      <w:r>
+        <w:t>Distribución de los valores del atributo ‘</w:t>
+      </w:r>
+      <w:proofErr w:type="spellStart"/>
+      <w:r>
+        <w:t>job</w:t>
+      </w:r>
+      <w:proofErr w:type="spellEnd"/>
+      <w:r>
+        <w:t>’ (tipo de trabajo)</w:t>
+      </w:r>
+    </w:p>
+    <w:p>
+      <w:r>
+        <w:rPr>
+          <w:noProof/>
+        </w:rPr>
+        <w:lastRenderedPageBreak/>
+        <w:drawing>
+          <wp:inline distT="0" distB="0" distL="0" distR="0" wp14:anchorId="533D2E1F" wp14:editId="0AC80687">
+            <wp:extent cx="5486411" cy="3657607"/>
+            <wp:effectExtent l="0" t="0" r="0" b="0"/>
+            <wp:docPr id="1903441777" name="Picture 1" descr="A graph of a number of people&#10;&#10;AI-generated content may be incorrect."/>
+            <wp:cNvGraphicFramePr>
+              <a:graphicFrameLocks xmlns:a="http://schemas.openxmlformats.org/drawingml/2006/main" noChangeAspect="1"/>
+            </wp:cNvGraphicFramePr>
+            <a:graphic xmlns:a="http://schemas.openxmlformats.org/drawingml/2006/main">
+              <a:graphicData uri="http://schemas.openxmlformats.org/drawingml/2006/picture">
+                <pic:pic xmlns:pic="http://schemas.openxmlformats.org/drawingml/2006/picture">
+                  <pic:nvPicPr>
+                    <pic:cNvPr id="1903441777" name="Picture 1" descr="A graph of a number of people&#10;&#10;AI-generated content may be incorrect."/>
+                    <pic:cNvPicPr/>
+                  </pic:nvPicPr>
+                  <pic:blipFill>
+                    <a:blip r:embed="rId14">
+                      <a:extLst>
+                        <a:ext uri="{28A0092B-C50C-407E-A947-70E740481C1C}">
+                          <a14:useLocalDpi xmlns:a14="http://schemas.microsoft.com/office/drawing/2010/main" val="0"/>
+                        </a:ext>
+                      </a:extLst>
+                    </a:blip>
+                    <a:stretch>
+                      <a:fillRect/>
+                    </a:stretch>
+                  </pic:blipFill>
+                  <pic:spPr>
+                    <a:xfrm>
+                      <a:off x="0" y="0"/>
+                      <a:ext cx="5486411" cy="3657607"/>
+                    </a:xfrm>
+                    <a:prstGeom prst="rect">
+                      <a:avLst/>
+                    </a:prstGeom>
+                  </pic:spPr>
+                </pic:pic>
+              </a:graphicData>
+            </a:graphic>
+          </wp:inline>
+        </w:drawing>
       </w:r>
     </w:p>
     <w:p>
@@ -1826,23 +2416,294 @@
         <w:pStyle w:val="ListParagraph"/>
         <w:numPr>
           <w:ilvl w:val="0"/>
-          <w:numId w:val="14"/>
+          <w:numId w:val="65"/>
         </w:numPr>
-        <w:rPr>
-          <w:highlight w:val="yellow"/>
-        </w:rPr>
-      </w:pPr>
-      <w:r>
-        <w:rPr>
-          <w:highlight w:val="yellow"/>
-        </w:rPr>
-        <w:t>Agregar los gráficos generados en este documento</w:t>
-      </w:r>
-    </w:p>
-    <w:p/>
-    <w:p>
-      <w:r>
-        <w:br w:type="page"/>
+      </w:pPr>
+      <w:r>
+        <w:t>Distribución del atributo ‘loan’ (préstamos personales)</w:t>
+      </w:r>
+    </w:p>
+    <w:p>
+      <w:r>
+        <w:rPr>
+          <w:noProof/>
+        </w:rPr>
+        <w:drawing>
+          <wp:inline distT="0" distB="0" distL="0" distR="0" wp14:anchorId="09395202" wp14:editId="078649F1">
+            <wp:extent cx="5486411" cy="3657607"/>
+            <wp:effectExtent l="0" t="0" r="0" b="0"/>
+            <wp:docPr id="1763311297" name="Picture 2" descr="A graph with blue squares&#10;&#10;AI-generated content may be incorrect."/>
+            <wp:cNvGraphicFramePr>
+              <a:graphicFrameLocks xmlns:a="http://schemas.openxmlformats.org/drawingml/2006/main" noChangeAspect="1"/>
+            </wp:cNvGraphicFramePr>
+            <a:graphic xmlns:a="http://schemas.openxmlformats.org/drawingml/2006/main">
+              <a:graphicData uri="http://schemas.openxmlformats.org/drawingml/2006/picture">
+                <pic:pic xmlns:pic="http://schemas.openxmlformats.org/drawingml/2006/picture">
+                  <pic:nvPicPr>
+                    <pic:cNvPr id="1763311297" name="Picture 2" descr="A graph with blue squares&#10;&#10;AI-generated content may be incorrect."/>
+                    <pic:cNvPicPr/>
+                  </pic:nvPicPr>
+                  <pic:blipFill>
+                    <a:blip r:embed="rId15">
+                      <a:extLst>
+                        <a:ext uri="{28A0092B-C50C-407E-A947-70E740481C1C}">
+                          <a14:useLocalDpi xmlns:a14="http://schemas.microsoft.com/office/drawing/2010/main" val="0"/>
+                        </a:ext>
+                      </a:extLst>
+                    </a:blip>
+                    <a:stretch>
+                      <a:fillRect/>
+                    </a:stretch>
+                  </pic:blipFill>
+                  <pic:spPr>
+                    <a:xfrm>
+                      <a:off x="0" y="0"/>
+                      <a:ext cx="5486411" cy="3657607"/>
+                    </a:xfrm>
+                    <a:prstGeom prst="rect">
+                      <a:avLst/>
+                    </a:prstGeom>
+                  </pic:spPr>
+                </pic:pic>
+              </a:graphicData>
+            </a:graphic>
+          </wp:inline>
+        </w:drawing>
+      </w:r>
+    </w:p>
+    <w:p>
+      <w:pPr>
+        <w:pStyle w:val="ListParagraph"/>
+        <w:numPr>
+          <w:ilvl w:val="0"/>
+          <w:numId w:val="65"/>
+        </w:numPr>
+      </w:pPr>
+      <w:r>
+        <w:t>Distribución del atributo ‘</w:t>
+      </w:r>
+      <w:proofErr w:type="spellStart"/>
+      <w:r>
+        <w:t>housing</w:t>
+      </w:r>
+      <w:proofErr w:type="spellEnd"/>
+      <w:r>
+        <w:t>’ (préstamos hipotecarios)</w:t>
+      </w:r>
+    </w:p>
+    <w:p>
+      <w:r>
+        <w:rPr>
+          <w:noProof/>
+        </w:rPr>
+        <w:lastRenderedPageBreak/>
+        <w:drawing>
+          <wp:inline distT="0" distB="0" distL="0" distR="0" wp14:anchorId="03AB826C" wp14:editId="712570D1">
+            <wp:extent cx="5486411" cy="3657607"/>
+            <wp:effectExtent l="0" t="0" r="0" b="0"/>
+            <wp:docPr id="1130926046" name="Picture 3" descr="A graph of a number of blue squares&#10;&#10;AI-generated content may be incorrect."/>
+            <wp:cNvGraphicFramePr>
+              <a:graphicFrameLocks xmlns:a="http://schemas.openxmlformats.org/drawingml/2006/main" noChangeAspect="1"/>
+            </wp:cNvGraphicFramePr>
+            <a:graphic xmlns:a="http://schemas.openxmlformats.org/drawingml/2006/main">
+              <a:graphicData uri="http://schemas.openxmlformats.org/drawingml/2006/picture">
+                <pic:pic xmlns:pic="http://schemas.openxmlformats.org/drawingml/2006/picture">
+                  <pic:nvPicPr>
+                    <pic:cNvPr id="1130926046" name="Picture 3" descr="A graph of a number of blue squares&#10;&#10;AI-generated content may be incorrect."/>
+                    <pic:cNvPicPr/>
+                  </pic:nvPicPr>
+                  <pic:blipFill>
+                    <a:blip r:embed="rId16">
+                      <a:extLst>
+                        <a:ext uri="{28A0092B-C50C-407E-A947-70E740481C1C}">
+                          <a14:useLocalDpi xmlns:a14="http://schemas.microsoft.com/office/drawing/2010/main" val="0"/>
+                        </a:ext>
+                      </a:extLst>
+                    </a:blip>
+                    <a:stretch>
+                      <a:fillRect/>
+                    </a:stretch>
+                  </pic:blipFill>
+                  <pic:spPr>
+                    <a:xfrm>
+                      <a:off x="0" y="0"/>
+                      <a:ext cx="5486411" cy="3657607"/>
+                    </a:xfrm>
+                    <a:prstGeom prst="rect">
+                      <a:avLst/>
+                    </a:prstGeom>
+                  </pic:spPr>
+                </pic:pic>
+              </a:graphicData>
+            </a:graphic>
+          </wp:inline>
+        </w:drawing>
+      </w:r>
+    </w:p>
+    <w:p>
+      <w:pPr>
+        <w:pStyle w:val="ListParagraph"/>
+        <w:numPr>
+          <w:ilvl w:val="0"/>
+          <w:numId w:val="65"/>
+        </w:numPr>
+      </w:pPr>
+      <w:r>
+        <w:t xml:space="preserve">Matriz de correlación entre variables del </w:t>
+      </w:r>
+      <w:proofErr w:type="spellStart"/>
+      <w:r>
+        <w:t>dataset</w:t>
+      </w:r>
+      <w:proofErr w:type="spellEnd"/>
+    </w:p>
+    <w:p>
+      <w:r>
+        <w:rPr>
+          <w:noProof/>
+        </w:rPr>
+        <w:drawing>
+          <wp:inline distT="0" distB="0" distL="0" distR="0" wp14:anchorId="08F38F25" wp14:editId="17FE560B">
+            <wp:extent cx="5731510" cy="4585335"/>
+            <wp:effectExtent l="0" t="0" r="2540" b="5715"/>
+            <wp:docPr id="1891091829" name="Picture 4" descr="A screenshot of a graph&#10;&#10;AI-generated content may be incorrect."/>
+            <wp:cNvGraphicFramePr>
+              <a:graphicFrameLocks xmlns:a="http://schemas.openxmlformats.org/drawingml/2006/main" noChangeAspect="1"/>
+            </wp:cNvGraphicFramePr>
+            <a:graphic xmlns:a="http://schemas.openxmlformats.org/drawingml/2006/main">
+              <a:graphicData uri="http://schemas.openxmlformats.org/drawingml/2006/picture">
+                <pic:pic xmlns:pic="http://schemas.openxmlformats.org/drawingml/2006/picture">
+                  <pic:nvPicPr>
+                    <pic:cNvPr id="1891091829" name="Picture 4" descr="A screenshot of a graph&#10;&#10;AI-generated content may be incorrect."/>
+                    <pic:cNvPicPr/>
+                  </pic:nvPicPr>
+                  <pic:blipFill>
+                    <a:blip r:embed="rId17">
+                      <a:extLst>
+                        <a:ext uri="{28A0092B-C50C-407E-A947-70E740481C1C}">
+                          <a14:useLocalDpi xmlns:a14="http://schemas.microsoft.com/office/drawing/2010/main" val="0"/>
+                        </a:ext>
+                      </a:extLst>
+                    </a:blip>
+                    <a:stretch>
+                      <a:fillRect/>
+                    </a:stretch>
+                  </pic:blipFill>
+                  <pic:spPr>
+                    <a:xfrm>
+                      <a:off x="0" y="0"/>
+                      <a:ext cx="5731510" cy="4585335"/>
+                    </a:xfrm>
+                    <a:prstGeom prst="rect">
+                      <a:avLst/>
+                    </a:prstGeom>
+                  </pic:spPr>
+                </pic:pic>
+              </a:graphicData>
+            </a:graphic>
+          </wp:inline>
+        </w:drawing>
+      </w:r>
+    </w:p>
+    <w:p>
+      <w:r>
+        <w:lastRenderedPageBreak/>
+        <w:t xml:space="preserve">También se ha añadido en el mencionado </w:t>
+      </w:r>
+      <w:r>
+        <w:rPr>
+          <w:i/>
+          <w:iCs/>
+        </w:rPr>
+        <w:t>script</w:t>
+      </w:r>
+      <w:r>
+        <w:t xml:space="preserve"> una generación de reporte del análisis </w:t>
+      </w:r>
+      <w:r>
+        <w:t xml:space="preserve">exploratorio de datos </w:t>
+      </w:r>
+      <w:r>
+        <w:t xml:space="preserve">(EDA) que queda almacenado en </w:t>
+      </w:r>
+      <w:proofErr w:type="spellStart"/>
+      <w:r>
+        <w:rPr>
+          <w:b/>
+          <w:bCs/>
+        </w:rPr>
+        <w:t>docs</w:t>
+      </w:r>
+      <w:proofErr w:type="spellEnd"/>
+      <w:r>
+        <w:rPr>
+          <w:b/>
+          <w:bCs/>
+        </w:rPr>
+        <w:t>/</w:t>
+      </w:r>
+      <w:proofErr w:type="spellStart"/>
+      <w:r>
+        <w:rPr>
+          <w:b/>
+          <w:bCs/>
+        </w:rPr>
+        <w:t>reports</w:t>
+      </w:r>
+      <w:proofErr w:type="spellEnd"/>
+      <w:r>
+        <w:t>, bajo el nombre de “EDA</w:t>
+      </w:r>
+      <w:r>
+        <w:t>_reporte</w:t>
+      </w:r>
+      <w:r>
+        <w:t>.html”</w:t>
+      </w:r>
+      <w:r>
+        <w:t>. Una muestra es la siguiente:</w:t>
+      </w:r>
+    </w:p>
+    <w:p>
+      <w:r>
+        <w:rPr>
+          <w:noProof/>
+        </w:rPr>
+        <w:drawing>
+          <wp:inline distT="0" distB="0" distL="0" distR="0" wp14:anchorId="64EE56EF" wp14:editId="160C7FFD">
+            <wp:extent cx="5731510" cy="5005705"/>
+            <wp:effectExtent l="0" t="0" r="2540" b="4445"/>
+            <wp:docPr id="1674385798" name="Picture 1" descr="A screenshot of a computer&#10;&#10;AI-generated content may be incorrect."/>
+            <wp:cNvGraphicFramePr>
+              <a:graphicFrameLocks xmlns:a="http://schemas.openxmlformats.org/drawingml/2006/main" noChangeAspect="1"/>
+            </wp:cNvGraphicFramePr>
+            <a:graphic xmlns:a="http://schemas.openxmlformats.org/drawingml/2006/main">
+              <a:graphicData uri="http://schemas.openxmlformats.org/drawingml/2006/picture">
+                <pic:pic xmlns:pic="http://schemas.openxmlformats.org/drawingml/2006/picture">
+                  <pic:nvPicPr>
+                    <pic:cNvPr id="1674385798" name="Picture 1" descr="A screenshot of a computer&#10;&#10;AI-generated content may be incorrect."/>
+                    <pic:cNvPicPr/>
+                  </pic:nvPicPr>
+                  <pic:blipFill>
+                    <a:blip r:embed="rId18"/>
+                    <a:stretch>
+                      <a:fillRect/>
+                    </a:stretch>
+                  </pic:blipFill>
+                  <pic:spPr>
+                    <a:xfrm>
+                      <a:off x="0" y="0"/>
+                      <a:ext cx="5731510" cy="5005705"/>
+                    </a:xfrm>
+                    <a:prstGeom prst="rect">
+                      <a:avLst/>
+                    </a:prstGeom>
+                  </pic:spPr>
+                </pic:pic>
+              </a:graphicData>
+            </a:graphic>
+          </wp:inline>
+        </w:drawing>
       </w:r>
     </w:p>
     <w:p>
@@ -1855,7 +2716,6 @@
         </w:rPr>
       </w:pPr>
       <w:r>
-        <w:lastRenderedPageBreak/>
         <w:t>Verificación de la calidad de los datos</w:t>
       </w:r>
     </w:p>
@@ -1864,6 +2724,7 @@
       <w:r>
         <w:t>Se ha verificado que algunas variables categóricas presentan valores faltantes representados como "</w:t>
       </w:r>
+      <w:proofErr w:type="spellStart"/>
       <w:r>
         <w:rPr>
           <w:b/>
@@ -1871,6 +2732,7 @@
         </w:rPr>
         <w:t>unknown</w:t>
       </w:r>
+      <w:proofErr w:type="spellEnd"/>
       <w:r>
         <w:t xml:space="preserve">". Se ha considerado que esto no es una categoría en sí misma y se determinó que serán considerados como valores nulos. </w:t>
       </w:r>
@@ -1901,7 +2763,15 @@
         <w:t>un umbral de corte para la eliminación de atributos con valores nulos del 20%</w:t>
       </w:r>
       <w:r>
-        <w:t xml:space="preserve"> que fue empleado en la fase siguiente para la limpieza del dataset.</w:t>
+        <w:t xml:space="preserve"> que fue empleado en la fase siguiente para la limpieza del </w:t>
+      </w:r>
+      <w:proofErr w:type="spellStart"/>
+      <w:r>
+        <w:t>dataset</w:t>
+      </w:r>
+      <w:proofErr w:type="spellEnd"/>
+      <w:r>
+        <w:t>.</w:t>
       </w:r>
     </w:p>
     <w:p>
@@ -2097,6 +2967,7 @@
                 <w:rFonts w:ascii="Calibri" w:eastAsia="Calibri" w:hAnsi="Calibri" w:cs="Calibri"/>
                 <w:color w:val="000000" w:themeColor="text1"/>
               </w:rPr>
+              <w:lastRenderedPageBreak/>
               <w:t>Completitud</w:t>
             </w:r>
           </w:p>
@@ -2125,7 +2996,23 @@
                 <w:rFonts w:ascii="Calibri" w:eastAsia="Calibri" w:hAnsi="Calibri" w:cs="Calibri"/>
                 <w:color w:val="000000" w:themeColor="text1"/>
               </w:rPr>
-              <w:t>Grado en el que los datos de un registro tienen valores asociados a cada una de sus columnas y el dataset en general aplica el mismo criterio para todas sus filas.</w:t>
+              <w:t xml:space="preserve">Grado en el que los datos de un registro tienen valores asociados a cada una de sus columnas y el </w:t>
+            </w:r>
+            <w:proofErr w:type="spellStart"/>
+            <w:r>
+              <w:rPr>
+                <w:rFonts w:ascii="Calibri" w:eastAsia="Calibri" w:hAnsi="Calibri" w:cs="Calibri"/>
+                <w:color w:val="000000" w:themeColor="text1"/>
+              </w:rPr>
+              <w:t>dataset</w:t>
+            </w:r>
+            <w:proofErr w:type="spellEnd"/>
+            <w:r>
+              <w:rPr>
+                <w:rFonts w:ascii="Calibri" w:eastAsia="Calibri" w:hAnsi="Calibri" w:cs="Calibri"/>
+                <w:color w:val="000000" w:themeColor="text1"/>
+              </w:rPr>
+              <w:t xml:space="preserve"> en general aplica el mismo criterio para todas sus filas.</w:t>
             </w:r>
           </w:p>
         </w:tc>
@@ -2352,7 +3239,23 @@
                 <w:rFonts w:ascii="Calibri" w:eastAsia="Calibri" w:hAnsi="Calibri" w:cs="Calibri"/>
                 <w:color w:val="000000" w:themeColor="text1"/>
               </w:rPr>
-              <w:t>Composición del dataset (cantidad de columnas)</w:t>
+              <w:t xml:space="preserve">Composición del </w:t>
+            </w:r>
+            <w:proofErr w:type="spellStart"/>
+            <w:r>
+              <w:rPr>
+                <w:rFonts w:ascii="Calibri" w:eastAsia="Calibri" w:hAnsi="Calibri" w:cs="Calibri"/>
+                <w:color w:val="000000" w:themeColor="text1"/>
+              </w:rPr>
+              <w:t>dataset</w:t>
+            </w:r>
+            <w:proofErr w:type="spellEnd"/>
+            <w:r>
+              <w:rPr>
+                <w:rFonts w:ascii="Calibri" w:eastAsia="Calibri" w:hAnsi="Calibri" w:cs="Calibri"/>
+                <w:color w:val="000000" w:themeColor="text1"/>
+              </w:rPr>
+              <w:t xml:space="preserve"> (cantidad de columnas)</w:t>
             </w:r>
           </w:p>
           <w:p>
@@ -2373,7 +3276,23 @@
                 <w:rFonts w:ascii="Calibri" w:eastAsia="Calibri" w:hAnsi="Calibri" w:cs="Calibri"/>
                 <w:color w:val="000000" w:themeColor="text1"/>
               </w:rPr>
-              <w:t xml:space="preserve">Composición del dataset (tipo </w:t>
+              <w:t xml:space="preserve">Composición del </w:t>
+            </w:r>
+            <w:proofErr w:type="spellStart"/>
+            <w:r>
+              <w:rPr>
+                <w:rFonts w:ascii="Calibri" w:eastAsia="Calibri" w:hAnsi="Calibri" w:cs="Calibri"/>
+                <w:color w:val="000000" w:themeColor="text1"/>
+              </w:rPr>
+              <w:t>dataset</w:t>
+            </w:r>
+            <w:proofErr w:type="spellEnd"/>
+            <w:r>
+              <w:rPr>
+                <w:rFonts w:ascii="Calibri" w:eastAsia="Calibri" w:hAnsi="Calibri" w:cs="Calibri"/>
+                <w:color w:val="000000" w:themeColor="text1"/>
+              </w:rPr>
+              <w:t xml:space="preserve"> (tipo </w:t>
             </w:r>
             <w:r>
               <w:rPr>
@@ -2697,7 +3616,23 @@
         </w:numPr>
       </w:pPr>
       <w:r>
-        <w:t xml:space="preserve">Se implementaron una serie de tests automatizables (a través de código) utilizando la librería PyTest. En este caso se validaron aspectos de </w:t>
+        <w:t xml:space="preserve">Se implementaron una serie de </w:t>
+      </w:r>
+      <w:proofErr w:type="spellStart"/>
+      <w:r>
+        <w:t>tests</w:t>
+      </w:r>
+      <w:proofErr w:type="spellEnd"/>
+      <w:r>
+        <w:t xml:space="preserve"> automatizables (a través de código) utilizando la librería </w:t>
+      </w:r>
+      <w:proofErr w:type="spellStart"/>
+      <w:r>
+        <w:t>PyTest</w:t>
+      </w:r>
+      <w:proofErr w:type="spellEnd"/>
+      <w:r>
+        <w:t xml:space="preserve">. En este caso se validaron aspectos de </w:t>
       </w:r>
       <w:r>
         <w:t>exactitud y completitud.</w:t>
@@ -2712,7 +3647,23 @@
         </w:numPr>
       </w:pPr>
       <w:r>
-        <w:t>Se implementaron una serie de tests utilizando la librería Great Expectations para validar cuestiones de consistencia.</w:t>
+        <w:t xml:space="preserve">Se implementaron una serie de </w:t>
+      </w:r>
+      <w:proofErr w:type="spellStart"/>
+      <w:r>
+        <w:t>tests</w:t>
+      </w:r>
+      <w:proofErr w:type="spellEnd"/>
+      <w:r>
+        <w:t xml:space="preserve"> utilizando la librería Great </w:t>
+      </w:r>
+      <w:proofErr w:type="spellStart"/>
+      <w:r>
+        <w:t>Expectations</w:t>
+      </w:r>
+      <w:proofErr w:type="spellEnd"/>
+      <w:r>
+        <w:t xml:space="preserve"> para validar cuestiones de consistencia.</w:t>
       </w:r>
     </w:p>
     <w:p>
@@ -2724,8 +3675,15 @@
         </w:numPr>
       </w:pPr>
       <w:r>
-        <w:lastRenderedPageBreak/>
-        <w:t xml:space="preserve">Todos los tests se han incorporado a un pipeline gestionado mediante la librería DVC que permite su ejecución en forma secuencial y la generación de un reporte en formato HMTL que podría ser </w:t>
+        <w:t xml:space="preserve">Todos los </w:t>
+      </w:r>
+      <w:proofErr w:type="spellStart"/>
+      <w:r>
+        <w:t>tests</w:t>
+      </w:r>
+      <w:proofErr w:type="spellEnd"/>
+      <w:r>
+        <w:t xml:space="preserve"> se han incorporado a un pipeline gestionado mediante la librería DVC que permite su ejecución en forma secuencial y la generación de un reporte en formato HMTL que podría ser </w:t>
       </w:r>
       <w:r>
         <w:t>utilizado</w:t>
@@ -2772,7 +3730,35 @@
         <w:rPr>
           <w:highlight w:val="yellow"/>
         </w:rPr>
-        <w:t>La salida html de los tests ejecutados</w:t>
+        <w:t xml:space="preserve">La salida </w:t>
+      </w:r>
+      <w:proofErr w:type="spellStart"/>
+      <w:r>
+        <w:rPr>
+          <w:highlight w:val="yellow"/>
+        </w:rPr>
+        <w:t>html</w:t>
+      </w:r>
+      <w:proofErr w:type="spellEnd"/>
+      <w:r>
+        <w:rPr>
+          <w:highlight w:val="yellow"/>
+        </w:rPr>
+        <w:t xml:space="preserve"> de los </w:t>
+      </w:r>
+      <w:proofErr w:type="spellStart"/>
+      <w:r>
+        <w:rPr>
+          <w:highlight w:val="yellow"/>
+        </w:rPr>
+        <w:t>tests</w:t>
+      </w:r>
+      <w:proofErr w:type="spellEnd"/>
+      <w:r>
+        <w:rPr>
+          <w:highlight w:val="yellow"/>
+        </w:rPr>
+        <w:t xml:space="preserve"> ejecutados</w:t>
       </w:r>
     </w:p>
     <w:p>
@@ -2790,7 +3776,21 @@
         <w:rPr>
           <w:highlight w:val="yellow"/>
         </w:rPr>
-        <w:t>En la tabla de evaluaciones, el detalle de los tests generados en cada archivo</w:t>
+        <w:t xml:space="preserve">En la tabla de evaluaciones, el detalle de los </w:t>
+      </w:r>
+      <w:proofErr w:type="spellStart"/>
+      <w:r>
+        <w:rPr>
+          <w:highlight w:val="yellow"/>
+        </w:rPr>
+        <w:t>tests</w:t>
+      </w:r>
+      <w:proofErr w:type="spellEnd"/>
+      <w:r>
+        <w:rPr>
+          <w:highlight w:val="yellow"/>
+        </w:rPr>
+        <w:t xml:space="preserve"> generados en cada archivo</w:t>
       </w:r>
     </w:p>
     <w:p/>
@@ -2846,7 +3846,15 @@
     </w:p>
     <w:p>
       <w:r>
-        <w:t>En función de los resultados tanto del análisis de calidad de datos como de la exploración del dataset realizada, se ha determinado que los siguientes atributos serán eliminados:</w:t>
+        <w:t xml:space="preserve">En función de los resultados tanto del análisis de calidad de datos como de la exploración del </w:t>
+      </w:r>
+      <w:proofErr w:type="spellStart"/>
+      <w:r>
+        <w:t>dataset</w:t>
+      </w:r>
+      <w:proofErr w:type="spellEnd"/>
+      <w:r>
+        <w:t xml:space="preserve"> realizada, se ha determinado que los siguientes atributos serán eliminados:</w:t>
       </w:r>
     </w:p>
     <w:p>
@@ -2889,7 +3897,15 @@
         <w:t xml:space="preserve"> </w:t>
       </w:r>
       <w:r>
-        <w:t>no presentaba variedad en los datos con una clase teniendo el 99.9% de la frecuencia en el dataset, además de presentar un alto valor de filas nulas (&gt;20%).</w:t>
+        <w:t xml:space="preserve">no presentaba variedad en los datos con una clase teniendo el 99.9% de la frecuencia en el </w:t>
+      </w:r>
+      <w:proofErr w:type="spellStart"/>
+      <w:r>
+        <w:t>dataset</w:t>
+      </w:r>
+      <w:proofErr w:type="spellEnd"/>
+      <w:r>
+        <w:t>, además de presentar un alto valor de filas nulas (&gt;20%).</w:t>
       </w:r>
     </w:p>
     <w:p>
@@ -2989,7 +4005,15 @@
         </w:numPr>
       </w:pPr>
       <w:r>
-        <w:t>Eliminación de la variable “pdays” dado que fuera reemplazada por la del punto previo.</w:t>
+        <w:t>Eliminación de la variable “</w:t>
+      </w:r>
+      <w:proofErr w:type="spellStart"/>
+      <w:r>
+        <w:t>pdays</w:t>
+      </w:r>
+      <w:proofErr w:type="spellEnd"/>
+      <w:r>
+        <w:t>” dado que fuera reemplazada por la del punto previo.</w:t>
       </w:r>
     </w:p>
     <w:p/>
@@ -3008,7 +4032,15 @@
     </w:p>
     <w:p>
       <w:r>
-        <w:t xml:space="preserve">Finalizadas las operaciones de transformación de los datos, se ha obtenido un nuevo dataset sobre </w:t>
+        <w:t xml:space="preserve">Finalizadas las operaciones de transformación de los datos, se ha obtenido un nuevo </w:t>
+      </w:r>
+      <w:proofErr w:type="spellStart"/>
+      <w:r>
+        <w:t>dataset</w:t>
+      </w:r>
+      <w:proofErr w:type="spellEnd"/>
+      <w:r>
+        <w:t xml:space="preserve"> sobre </w:t>
       </w:r>
       <w:r>
         <w:t>el cual se aplicaron operaciones de normalización</w:t>
@@ -3032,8 +4064,21 @@
     </w:p>
     <w:p>
       <w:r>
-        <w:t>- Se reemplazaron los valores 'unknown' por NaN</w:t>
-      </w:r>
+        <w:t>- Se reemplazaron los valores '</w:t>
+      </w:r>
+      <w:proofErr w:type="spellStart"/>
+      <w:r>
+        <w:t>unknown</w:t>
+      </w:r>
+      <w:proofErr w:type="spellEnd"/>
+      <w:r>
+        <w:t xml:space="preserve">' por </w:t>
+      </w:r>
+      <w:proofErr w:type="spellStart"/>
+      <w:r>
+        <w:t>NaN</w:t>
+      </w:r>
+      <w:proofErr w:type="spellEnd"/>
     </w:p>
     <w:p>
       <w:r>
@@ -3213,9 +4258,11 @@
           <w:numId w:val="41"/>
         </w:numPr>
       </w:pPr>
+      <w:proofErr w:type="spellStart"/>
       <w:r>
         <w:t>LinearSVC</w:t>
       </w:r>
+      <w:proofErr w:type="spellEnd"/>
     </w:p>
     <w:p>
       <w:pPr>
@@ -3265,7 +4312,23 @@
     </w:p>
     <w:p>
       <w:r>
-        <w:t>En este caso, se va a utilizar una libreta de jupyter para el registro de la experimentación realidad con la modificación de integrar la misma a la librería MLFlow para que se dejen evidencias de:</w:t>
+        <w:t xml:space="preserve">En este caso, se va a utilizar una libreta de </w:t>
+      </w:r>
+      <w:proofErr w:type="spellStart"/>
+      <w:r>
+        <w:t>jupyter</w:t>
+      </w:r>
+      <w:proofErr w:type="spellEnd"/>
+      <w:r>
+        <w:t xml:space="preserve"> para el registro de la experimentación realidad con la modificación de integrar la misma a la librería </w:t>
+      </w:r>
+      <w:proofErr w:type="spellStart"/>
+      <w:r>
+        <w:t>MLFlow</w:t>
+      </w:r>
+      <w:proofErr w:type="spellEnd"/>
+      <w:r>
+        <w:t xml:space="preserve"> para que se dejen evidencias de:</w:t>
       </w:r>
     </w:p>
     <w:p>
@@ -3301,8 +4364,13 @@
         </w:numPr>
       </w:pPr>
       <w:r>
-        <w:t>Valores del dataset</w:t>
-      </w:r>
+        <w:t xml:space="preserve">Valores del </w:t>
+      </w:r>
+      <w:proofErr w:type="spellStart"/>
+      <w:r>
+        <w:t>dataset</w:t>
+      </w:r>
+      <w:proofErr w:type="spellEnd"/>
     </w:p>
     <w:p>
       <w:pPr>
@@ -3415,12 +4483,28 @@
     </w:p>
     <w:p>
       <w:r>
-        <w:t>Se va a aplicar el mismo criterio de la actividad anterior haciendo uso de MLFlow para el registro de la experimentación que fuera realizada. Los resultados quedarán disponibles en el mismo directorio del repositorio que contiene el código del proyecto.</w:t>
-      </w:r>
-    </w:p>
-    <w:p>
-      <w:r>
-        <w:t>En la siguiente tabla se documenta el detalle de la experimentación que ha sido registrada igualmente en mlflow:</w:t>
+        <w:t xml:space="preserve">Se va a aplicar el mismo criterio de la actividad anterior haciendo uso de </w:t>
+      </w:r>
+      <w:proofErr w:type="spellStart"/>
+      <w:r>
+        <w:t>MLFlow</w:t>
+      </w:r>
+      <w:proofErr w:type="spellEnd"/>
+      <w:r>
+        <w:t xml:space="preserve"> para el registro de la experimentación que fuera realizada. Los resultados quedarán disponibles en el mismo directorio del repositorio que contiene el código del proyecto.</w:t>
+      </w:r>
+    </w:p>
+    <w:p>
+      <w:r>
+        <w:t xml:space="preserve">En la siguiente tabla se documenta el detalle de la experimentación que ha sido registrada igualmente en </w:t>
+      </w:r>
+      <w:proofErr w:type="spellStart"/>
+      <w:r>
+        <w:t>mlflow</w:t>
+      </w:r>
+      <w:proofErr w:type="spellEnd"/>
+      <w:r>
+        <w:t>:</w:t>
       </w:r>
     </w:p>
     <w:tbl>
@@ -3512,9 +4596,19 @@
             <w:tcW w:w="3005" w:type="dxa"/>
           </w:tcPr>
           <w:p>
+            <w:proofErr w:type="spellStart"/>
             <w:r>
-              <w:t>Logistic Regression</w:t>
+              <w:t>Logistic</w:t>
             </w:r>
+            <w:proofErr w:type="spellEnd"/>
+            <w:r>
+              <w:t xml:space="preserve"> </w:t>
+            </w:r>
+            <w:proofErr w:type="spellStart"/>
+            <w:r>
+              <w:t>Regression</w:t>
+            </w:r>
+            <w:proofErr w:type="spellEnd"/>
           </w:p>
         </w:tc>
         <w:tc>
@@ -3527,11 +4621,19 @@
                 <w:lang w:val="en-GB"/>
               </w:rPr>
             </w:pPr>
+            <w:proofErr w:type="spellStart"/>
             <w:r>
               <w:rPr>
                 <w:lang w:val="en-GB"/>
               </w:rPr>
-              <w:t>n_jobs: None</w:t>
+              <w:t>n_jobs</w:t>
+            </w:r>
+            <w:proofErr w:type="spellEnd"/>
+            <w:r>
+              <w:rPr>
+                <w:lang w:val="en-GB"/>
+              </w:rPr>
+              <w:t>: None</w:t>
             </w:r>
           </w:p>
           <w:p>
@@ -3540,11 +4642,19 @@
                 <w:lang w:val="en-GB"/>
               </w:rPr>
             </w:pPr>
+            <w:proofErr w:type="spellStart"/>
             <w:r>
               <w:rPr>
                 <w:lang w:val="en-GB"/>
               </w:rPr>
-              <w:t>class_weight: None</w:t>
+              <w:t>class_weight</w:t>
+            </w:r>
+            <w:proofErr w:type="spellEnd"/>
+            <w:r>
+              <w:rPr>
+                <w:lang w:val="en-GB"/>
+              </w:rPr>
+              <w:t>: None</w:t>
             </w:r>
           </w:p>
           <w:p>
@@ -3566,11 +4676,83 @@
                 <w:lang w:val="en-GB"/>
               </w:rPr>
             </w:pPr>
+            <w:proofErr w:type="spellStart"/>
             <w:r>
               <w:rPr>
                 <w:lang w:val="en-GB"/>
               </w:rPr>
-              <w:t>test_samples: 7647</w:t>
+              <w:t>test_samples</w:t>
+            </w:r>
+            <w:proofErr w:type="spellEnd"/>
+            <w:r>
+              <w:rPr>
+                <w:lang w:val="en-GB"/>
+              </w:rPr>
+              <w:t>: 7647</w:t>
+            </w:r>
+          </w:p>
+          <w:p>
+            <w:pPr>
+              <w:rPr>
+                <w:lang w:val="en-GB"/>
+              </w:rPr>
+            </w:pPr>
+            <w:proofErr w:type="spellStart"/>
+            <w:r>
+              <w:rPr>
+                <w:lang w:val="en-GB"/>
+              </w:rPr>
+              <w:t>max_iter</w:t>
+            </w:r>
+            <w:proofErr w:type="spellEnd"/>
+            <w:r>
+              <w:rPr>
+                <w:lang w:val="en-GB"/>
+              </w:rPr>
+              <w:t>: 100</w:t>
+            </w:r>
+          </w:p>
+          <w:p>
+            <w:pPr>
+              <w:rPr>
+                <w:lang w:val="en-GB"/>
+              </w:rPr>
+            </w:pPr>
+            <w:proofErr w:type="spellStart"/>
+            <w:r>
+              <w:rPr>
+                <w:lang w:val="en-GB"/>
+              </w:rPr>
+              <w:lastRenderedPageBreak/>
+              <w:t>cv_folds</w:t>
+            </w:r>
+            <w:proofErr w:type="spellEnd"/>
+            <w:r>
+              <w:rPr>
+                <w:lang w:val="en-GB"/>
+              </w:rPr>
+              <w:t>: 5</w:t>
+            </w:r>
+          </w:p>
+          <w:p>
+            <w:pPr>
+              <w:rPr>
+                <w:lang w:val="en-GB"/>
+              </w:rPr>
+            </w:pPr>
+            <w:proofErr w:type="spellStart"/>
+            <w:r>
+              <w:rPr>
+                <w:lang w:val="en-GB"/>
+              </w:rPr>
+              <w:t>multi_class</w:t>
+            </w:r>
+            <w:proofErr w:type="spellEnd"/>
+            <w:r>
+              <w:rPr>
+                <w:lang w:val="en-GB"/>
+              </w:rPr>
+              <w:t>: deprecated</w:t>
             </w:r>
           </w:p>
           <w:p>
@@ -3583,8 +4765,16 @@
               <w:rPr>
                 <w:lang w:val="en-GB"/>
               </w:rPr>
-              <w:t>max_iter: 100</w:t>
+              <w:t xml:space="preserve">Solver: </w:t>
             </w:r>
+            <w:proofErr w:type="spellStart"/>
+            <w:r>
+              <w:rPr>
+                <w:lang w:val="en-GB"/>
+              </w:rPr>
+              <w:t>liblinear</w:t>
+            </w:r>
+            <w:proofErr w:type="spellEnd"/>
           </w:p>
           <w:p>
             <w:pPr>
@@ -3592,51 +4782,19 @@
                 <w:lang w:val="en-GB"/>
               </w:rPr>
             </w:pPr>
+            <w:proofErr w:type="spellStart"/>
             <w:r>
               <w:rPr>
                 <w:lang w:val="en-GB"/>
               </w:rPr>
-              <w:lastRenderedPageBreak/>
-              <w:t>cv_folds: 5</w:t>
+              <w:t>train_samples</w:t>
             </w:r>
-          </w:p>
-          <w:p>
-            <w:pPr>
-              <w:rPr>
-                <w:lang w:val="en-GB"/>
-              </w:rPr>
-            </w:pPr>
+            <w:proofErr w:type="spellEnd"/>
             <w:r>
               <w:rPr>
                 <w:lang w:val="en-GB"/>
               </w:rPr>
-              <w:t>multi_class: deprecated</w:t>
-            </w:r>
-          </w:p>
-          <w:p>
-            <w:pPr>
-              <w:rPr>
-                <w:lang w:val="en-GB"/>
-              </w:rPr>
-            </w:pPr>
-            <w:r>
-              <w:rPr>
-                <w:lang w:val="en-GB"/>
-              </w:rPr>
-              <w:t>Solver: liblinear</w:t>
-            </w:r>
-          </w:p>
-          <w:p>
-            <w:pPr>
-              <w:rPr>
-                <w:lang w:val="en-GB"/>
-              </w:rPr>
-            </w:pPr>
-            <w:r>
-              <w:rPr>
-                <w:lang w:val="en-GB"/>
-              </w:rPr>
-              <w:t>train_samples: 5438</w:t>
+              <w:t>: 5438</w:t>
             </w:r>
           </w:p>
           <w:p>
@@ -3684,11 +4842,19 @@
                 <w:lang w:val="en-GB"/>
               </w:rPr>
             </w:pPr>
+            <w:proofErr w:type="spellStart"/>
             <w:r>
               <w:rPr>
                 <w:lang w:val="en-GB"/>
               </w:rPr>
-              <w:t>random_state: 1</w:t>
+              <w:t>random_state</w:t>
+            </w:r>
+            <w:proofErr w:type="spellEnd"/>
+            <w:r>
+              <w:rPr>
+                <w:lang w:val="en-GB"/>
+              </w:rPr>
+              <w:t>: 1</w:t>
             </w:r>
           </w:p>
           <w:p>
@@ -3697,12 +4863,28 @@
                 <w:lang w:val="en-GB"/>
               </w:rPr>
             </w:pPr>
+            <w:proofErr w:type="spellStart"/>
             <w:r>
               <w:rPr>
                 <w:lang w:val="en-GB"/>
               </w:rPr>
-              <w:t>balancing_method: undersampling</w:t>
+              <w:t>balancing_method</w:t>
             </w:r>
+            <w:proofErr w:type="spellEnd"/>
+            <w:r>
+              <w:rPr>
+                <w:lang w:val="en-GB"/>
+              </w:rPr>
+              <w:t xml:space="preserve">: </w:t>
+            </w:r>
+            <w:proofErr w:type="spellStart"/>
+            <w:r>
+              <w:rPr>
+                <w:lang w:val="en-GB"/>
+              </w:rPr>
+              <w:t>undersampling</w:t>
+            </w:r>
+            <w:proofErr w:type="spellEnd"/>
           </w:p>
           <w:p>
             <w:pPr>
@@ -3723,11 +4905,19 @@
                 <w:lang w:val="en-GB"/>
               </w:rPr>
             </w:pPr>
+            <w:proofErr w:type="spellStart"/>
             <w:r>
               <w:rPr>
                 <w:lang w:val="en-GB"/>
               </w:rPr>
-              <w:t>intercept_scaling: 1</w:t>
+              <w:t>intercept_scaling</w:t>
+            </w:r>
+            <w:proofErr w:type="spellEnd"/>
+            <w:r>
+              <w:rPr>
+                <w:lang w:val="en-GB"/>
+              </w:rPr>
+              <w:t>: 1</w:t>
             </w:r>
           </w:p>
           <w:p>
@@ -3736,11 +4926,19 @@
                 <w:lang w:val="en-GB"/>
               </w:rPr>
             </w:pPr>
+            <w:proofErr w:type="spellStart"/>
             <w:r>
               <w:rPr>
                 <w:lang w:val="en-GB"/>
               </w:rPr>
-              <w:t>fit_intercept: True</w:t>
+              <w:t>fit_intercept</w:t>
+            </w:r>
+            <w:proofErr w:type="spellEnd"/>
+            <w:r>
+              <w:rPr>
+                <w:lang w:val="en-GB"/>
+              </w:rPr>
+              <w:t>: True</w:t>
             </w:r>
           </w:p>
           <w:p>
@@ -3757,8 +4955,13 @@
             </w:r>
           </w:p>
           <w:p>
+            <w:proofErr w:type="spellStart"/>
             <w:r>
-              <w:t>warm_start: False</w:t>
+              <w:t>warm_start</w:t>
+            </w:r>
+            <w:proofErr w:type="spellEnd"/>
+            <w:r>
+              <w:t>: False</w:t>
             </w:r>
           </w:p>
         </w:tc>
@@ -3774,21 +4977,151 @@
                 <w:lang w:val="en-US"/>
               </w:rPr>
             </w:pPr>
+            <w:proofErr w:type="spellStart"/>
             <w:r>
               <w:rPr>
                 <w:rFonts w:ascii="Calibri" w:eastAsia="Calibri" w:hAnsi="Calibri" w:cs="Calibri"/>
                 <w:lang w:val="en-US"/>
               </w:rPr>
               <w:lastRenderedPageBreak/>
-              <w:t xml:space="preserve">cv_recall_mean: 0.5204162604268227 cv_f1_std: 0.014864271739294858 </w:t>
+              <w:t>cv_recall_mean</w:t>
             </w:r>
+            <w:proofErr w:type="spellEnd"/>
+            <w:r>
+              <w:rPr>
+                <w:rFonts w:ascii="Calibri" w:eastAsia="Calibri" w:hAnsi="Calibri" w:cs="Calibri"/>
+                <w:lang w:val="en-US"/>
+              </w:rPr>
+              <w:t xml:space="preserve">: 0.5204162604268227 cv_f1_std: 0.014864271739294858 </w:t>
+            </w:r>
+            <w:proofErr w:type="spellStart"/>
             <w:r>
               <w:rPr>
                 <w:rFonts w:ascii="Calibri" w:eastAsia="Calibri" w:hAnsi="Calibri" w:cs="Calibri"/>
                 <w:lang w:val="en-US"/>
               </w:rPr>
               <w:lastRenderedPageBreak/>
-              <w:t>cv_accuracy_mean: 0.5277624262676552 cv_precision_std: 0.023367665079500846 test_accuracy: 0.5216424741728782 test_precision: 0.0693464252838294 cv_precision_mean: 0.5289300713714633 cv_accuracy_std: 0.021251829345951337 test_f1: 0.10997566909975669 test_recall:  0.26556991774383076 cv_recall_std:  0.011290217723442728 cv_f1_mean:  0.5244457520113056</w:t>
+              <w:t>cv_accuracy_mean</w:t>
+            </w:r>
+            <w:proofErr w:type="spellEnd"/>
+            <w:r>
+              <w:rPr>
+                <w:rFonts w:ascii="Calibri" w:eastAsia="Calibri" w:hAnsi="Calibri" w:cs="Calibri"/>
+                <w:lang w:val="en-US"/>
+              </w:rPr>
+              <w:t xml:space="preserve">: 0.5277624262676552 </w:t>
+            </w:r>
+            <w:proofErr w:type="spellStart"/>
+            <w:r>
+              <w:rPr>
+                <w:rFonts w:ascii="Calibri" w:eastAsia="Calibri" w:hAnsi="Calibri" w:cs="Calibri"/>
+                <w:lang w:val="en-US"/>
+              </w:rPr>
+              <w:t>cv_precision_std</w:t>
+            </w:r>
+            <w:proofErr w:type="spellEnd"/>
+            <w:r>
+              <w:rPr>
+                <w:rFonts w:ascii="Calibri" w:eastAsia="Calibri" w:hAnsi="Calibri" w:cs="Calibri"/>
+                <w:lang w:val="en-US"/>
+              </w:rPr>
+              <w:t xml:space="preserve">: 0.023367665079500846 </w:t>
+            </w:r>
+            <w:proofErr w:type="spellStart"/>
+            <w:r>
+              <w:rPr>
+                <w:rFonts w:ascii="Calibri" w:eastAsia="Calibri" w:hAnsi="Calibri" w:cs="Calibri"/>
+                <w:lang w:val="en-US"/>
+              </w:rPr>
+              <w:t>test_accuracy</w:t>
+            </w:r>
+            <w:proofErr w:type="spellEnd"/>
+            <w:r>
+              <w:rPr>
+                <w:rFonts w:ascii="Calibri" w:eastAsia="Calibri" w:hAnsi="Calibri" w:cs="Calibri"/>
+                <w:lang w:val="en-US"/>
+              </w:rPr>
+              <w:t xml:space="preserve">: 0.5216424741728782 </w:t>
+            </w:r>
+            <w:proofErr w:type="spellStart"/>
+            <w:r>
+              <w:rPr>
+                <w:rFonts w:ascii="Calibri" w:eastAsia="Calibri" w:hAnsi="Calibri" w:cs="Calibri"/>
+                <w:lang w:val="en-US"/>
+              </w:rPr>
+              <w:t>test_precision</w:t>
+            </w:r>
+            <w:proofErr w:type="spellEnd"/>
+            <w:r>
+              <w:rPr>
+                <w:rFonts w:ascii="Calibri" w:eastAsia="Calibri" w:hAnsi="Calibri" w:cs="Calibri"/>
+                <w:lang w:val="en-US"/>
+              </w:rPr>
+              <w:t xml:space="preserve">: 0.0693464252838294 </w:t>
+            </w:r>
+            <w:proofErr w:type="spellStart"/>
+            <w:r>
+              <w:rPr>
+                <w:rFonts w:ascii="Calibri" w:eastAsia="Calibri" w:hAnsi="Calibri" w:cs="Calibri"/>
+                <w:lang w:val="en-US"/>
+              </w:rPr>
+              <w:t>cv_precision_mean</w:t>
+            </w:r>
+            <w:proofErr w:type="spellEnd"/>
+            <w:r>
+              <w:rPr>
+                <w:rFonts w:ascii="Calibri" w:eastAsia="Calibri" w:hAnsi="Calibri" w:cs="Calibri"/>
+                <w:lang w:val="en-US"/>
+              </w:rPr>
+              <w:t xml:space="preserve">: 0.5289300713714633 </w:t>
+            </w:r>
+            <w:proofErr w:type="spellStart"/>
+            <w:r>
+              <w:rPr>
+                <w:rFonts w:ascii="Calibri" w:eastAsia="Calibri" w:hAnsi="Calibri" w:cs="Calibri"/>
+                <w:lang w:val="en-US"/>
+              </w:rPr>
+              <w:t>cv_accuracy_std</w:t>
+            </w:r>
+            <w:proofErr w:type="spellEnd"/>
+            <w:r>
+              <w:rPr>
+                <w:rFonts w:ascii="Calibri" w:eastAsia="Calibri" w:hAnsi="Calibri" w:cs="Calibri"/>
+                <w:lang w:val="en-US"/>
+              </w:rPr>
+              <w:t xml:space="preserve">: 0.021251829345951337 test_f1: 0.10997566909975669 </w:t>
+            </w:r>
+            <w:proofErr w:type="spellStart"/>
+            <w:r>
+              <w:rPr>
+                <w:rFonts w:ascii="Calibri" w:eastAsia="Calibri" w:hAnsi="Calibri" w:cs="Calibri"/>
+                <w:lang w:val="en-US"/>
+              </w:rPr>
+              <w:t>test_recall</w:t>
+            </w:r>
+            <w:proofErr w:type="spellEnd"/>
+            <w:r>
+              <w:rPr>
+                <w:rFonts w:ascii="Calibri" w:eastAsia="Calibri" w:hAnsi="Calibri" w:cs="Calibri"/>
+                <w:lang w:val="en-US"/>
+              </w:rPr>
+              <w:t xml:space="preserve">:  0.26556991774383076 </w:t>
+            </w:r>
+            <w:proofErr w:type="spellStart"/>
+            <w:r>
+              <w:rPr>
+                <w:rFonts w:ascii="Calibri" w:eastAsia="Calibri" w:hAnsi="Calibri" w:cs="Calibri"/>
+                <w:lang w:val="en-US"/>
+              </w:rPr>
+              <w:t>cv_recall_std</w:t>
+            </w:r>
+            <w:proofErr w:type="spellEnd"/>
+            <w:r>
+              <w:rPr>
+                <w:rFonts w:ascii="Calibri" w:eastAsia="Calibri" w:hAnsi="Calibri" w:cs="Calibri"/>
+                <w:lang w:val="en-US"/>
+              </w:rPr>
+              <w:t>:  0.011290217723442728 cv_f1_mean:  0.5244457520113056</w:t>
             </w:r>
           </w:p>
           <w:p>
@@ -3933,11 +5266,19 @@
           <w:lang w:val="en-US"/>
         </w:rPr>
       </w:pPr>
+      <w:proofErr w:type="spellStart"/>
       <w:r>
         <w:rPr>
           <w:lang w:val="en-US"/>
         </w:rPr>
-        <w:t xml:space="preserve">LogisticRegression </w:t>
+        <w:t>LogisticRegression</w:t>
+      </w:r>
+      <w:proofErr w:type="spellEnd"/>
+      <w:r>
+        <w:rPr>
+          <w:lang w:val="en-US"/>
+        </w:rPr>
+        <w:t xml:space="preserve"> </w:t>
       </w:r>
     </w:p>
     <w:p>
@@ -3988,7 +5329,21 @@
         <w:rPr>
           <w:lang w:val="en-US"/>
         </w:rPr>
-        <w:t>solver='liblinear',</w:t>
+        <w:t>solver='</w:t>
+      </w:r>
+      <w:proofErr w:type="spellStart"/>
+      <w:r>
+        <w:rPr>
+          <w:lang w:val="en-US"/>
+        </w:rPr>
+        <w:t>liblinear</w:t>
+      </w:r>
+      <w:proofErr w:type="spellEnd"/>
+      <w:r>
+        <w:rPr>
+          <w:lang w:val="en-US"/>
+        </w:rPr>
+        <w:t>',</w:t>
       </w:r>
     </w:p>
     <w:p>
@@ -3999,11 +5354,19 @@
           <w:numId w:val="21"/>
         </w:numPr>
       </w:pPr>
+      <w:proofErr w:type="spellStart"/>
       <w:r>
         <w:rPr>
           <w:lang w:val="en-US"/>
         </w:rPr>
-        <w:t>random_state=1,</w:t>
+        <w:t>random_state</w:t>
+      </w:r>
+      <w:proofErr w:type="spellEnd"/>
+      <w:r>
+        <w:rPr>
+          <w:lang w:val="en-US"/>
+        </w:rPr>
+        <w:t>=1,</w:t>
       </w:r>
     </w:p>
     <w:p>
@@ -4014,11 +5377,19 @@
           <w:numId w:val="21"/>
         </w:numPr>
       </w:pPr>
+      <w:proofErr w:type="spellStart"/>
       <w:r>
         <w:rPr>
           <w:lang w:val="en-US"/>
         </w:rPr>
-        <w:t>max_iter=100,</w:t>
+        <w:t>max_iter</w:t>
+      </w:r>
+      <w:proofErr w:type="spellEnd"/>
+      <w:r>
+        <w:rPr>
+          <w:lang w:val="en-US"/>
+        </w:rPr>
+        <w:t>=100,</w:t>
       </w:r>
     </w:p>
     <w:p>
@@ -4029,11 +5400,19 @@
           <w:numId w:val="21"/>
         </w:numPr>
       </w:pPr>
+      <w:proofErr w:type="spellStart"/>
       <w:r>
         <w:rPr>
           <w:lang w:val="en-US"/>
         </w:rPr>
-        <w:t>tol=0.000000001</w:t>
+        <w:t>tol</w:t>
+      </w:r>
+      <w:proofErr w:type="spellEnd"/>
+      <w:r>
+        <w:rPr>
+          <w:lang w:val="en-US"/>
+        </w:rPr>
+        <w:t>=0.000000001</w:t>
       </w:r>
     </w:p>
     <w:p>
@@ -4044,9 +5423,11 @@
           <w:numId w:val="21"/>
         </w:numPr>
       </w:pPr>
+      <w:proofErr w:type="spellStart"/>
       <w:r>
         <w:t>LinearSVC</w:t>
       </w:r>
+      <w:proofErr w:type="spellEnd"/>
     </w:p>
     <w:p>
       <w:pPr>
@@ -4056,8 +5437,13 @@
           <w:numId w:val="21"/>
         </w:numPr>
       </w:pPr>
-      <w:r>
-        <w:t>max_iter=10000,</w:t>
+      <w:proofErr w:type="spellStart"/>
+      <w:r>
+        <w:t>max_iter</w:t>
+      </w:r>
+      <w:proofErr w:type="spellEnd"/>
+      <w:r>
+        <w:t>=10000,</w:t>
       </w:r>
     </w:p>
     <w:p>
@@ -4080,9 +5466,11 @@
           <w:numId w:val="21"/>
         </w:numPr>
       </w:pPr>
+      <w:proofErr w:type="spellStart"/>
       <w:r>
         <w:t>KNeighborsClassifier</w:t>
       </w:r>
+      <w:proofErr w:type="spellEnd"/>
     </w:p>
     <w:p>
       <w:pPr>
@@ -4092,8 +5480,13 @@
           <w:numId w:val="21"/>
         </w:numPr>
       </w:pPr>
-      <w:r>
-        <w:t>n_neighbors=7</w:t>
+      <w:proofErr w:type="spellStart"/>
+      <w:r>
+        <w:t>n_neighbors</w:t>
+      </w:r>
+      <w:proofErr w:type="spellEnd"/>
+      <w:r>
+        <w:t>=7</w:t>
       </w:r>
     </w:p>
     <w:p>
@@ -4104,9 +5497,11 @@
           <w:numId w:val="21"/>
         </w:numPr>
       </w:pPr>
+      <w:proofErr w:type="spellStart"/>
       <w:r>
         <w:t>DecisionTreeClassifier</w:t>
       </w:r>
+      <w:proofErr w:type="spellEnd"/>
     </w:p>
     <w:p>
       <w:pPr>
@@ -4185,7 +5580,15 @@
         </w:numPr>
       </w:pPr>
       <w:r>
-        <w:t>Exportación a un archivo .pkl del modelo en cuestión</w:t>
+        <w:t>Exportación a un archivo .</w:t>
+      </w:r>
+      <w:proofErr w:type="spellStart"/>
+      <w:r>
+        <w:t>pkl</w:t>
+      </w:r>
+      <w:proofErr w:type="spellEnd"/>
+      <w:r>
+        <w:t xml:space="preserve"> del modelo en cuestión</w:t>
       </w:r>
     </w:p>
     <w:p>
@@ -4197,8 +5600,13 @@
         </w:numPr>
       </w:pPr>
       <w:r>
-        <w:t>Registro de todas las operaciones en mlflow</w:t>
-      </w:r>
+        <w:t xml:space="preserve">Registro de todas las operaciones en </w:t>
+      </w:r>
+      <w:proofErr w:type="spellStart"/>
+      <w:r>
+        <w:t>mlflow</w:t>
+      </w:r>
+      <w:proofErr w:type="spellEnd"/>
     </w:p>
     <w:p>
       <w:pPr>
@@ -4209,7 +5617,15 @@
         </w:numPr>
       </w:pPr>
       <w:r>
-        <w:t>Exportación a un archivo .json de las métricas obtenidas ante el entrenamiento.</w:t>
+        <w:t>Exportación a un archivo .</w:t>
+      </w:r>
+      <w:proofErr w:type="spellStart"/>
+      <w:r>
+        <w:t>json</w:t>
+      </w:r>
+      <w:proofErr w:type="spellEnd"/>
+      <w:r>
+        <w:t xml:space="preserve"> de las métricas obtenidas ante el entrenamiento.</w:t>
       </w:r>
     </w:p>
     <w:p>
@@ -4251,11 +5667,19 @@
           <w:lang w:val="en-US"/>
         </w:rPr>
       </w:pPr>
+      <w:proofErr w:type="spellStart"/>
       <w:r>
         <w:rPr>
           <w:lang w:val="en-US"/>
         </w:rPr>
-        <w:t xml:space="preserve">LogisticRegression </w:t>
+        <w:t>LogisticRegression</w:t>
+      </w:r>
+      <w:proofErr w:type="spellEnd"/>
+      <w:r>
+        <w:rPr>
+          <w:lang w:val="en-US"/>
+        </w:rPr>
+        <w:t xml:space="preserve"> </w:t>
       </w:r>
     </w:p>
     <w:p>
@@ -4266,8 +5690,21 @@
           <w:numId w:val="21"/>
         </w:numPr>
       </w:pPr>
-      <w:r>
-        <w:t>cross validation f1 scores [47.68946396 51.57116451 49.29709466 49.5412844  50.72727273]</w:t>
+      <w:proofErr w:type="spellStart"/>
+      <w:r>
+        <w:t>cross</w:t>
+      </w:r>
+      <w:proofErr w:type="spellEnd"/>
+      <w:r>
+        <w:t xml:space="preserve"> </w:t>
+      </w:r>
+      <w:proofErr w:type="spellStart"/>
+      <w:r>
+        <w:t>validation</w:t>
+      </w:r>
+      <w:proofErr w:type="spellEnd"/>
+      <w:r>
+        <w:t xml:space="preserve"> f1 scores [47.68946396 51.57116451 49.29709466 49.5412844  50.72727273]</w:t>
       </w:r>
     </w:p>
     <w:p>
@@ -4279,8 +5716,21 @@
         </w:numPr>
         <w:spacing w:before="240" w:after="240"/>
       </w:pPr>
-      <w:r>
-        <w:t>cross validation f1 mean 49.76525605093318</w:t>
+      <w:proofErr w:type="spellStart"/>
+      <w:r>
+        <w:t>cross</w:t>
+      </w:r>
+      <w:proofErr w:type="spellEnd"/>
+      <w:r>
+        <w:t xml:space="preserve"> </w:t>
+      </w:r>
+      <w:proofErr w:type="spellStart"/>
+      <w:r>
+        <w:t>validation</w:t>
+      </w:r>
+      <w:proofErr w:type="spellEnd"/>
+      <w:r>
+        <w:t xml:space="preserve"> f1 mean 49.76525605093318</w:t>
       </w:r>
     </w:p>
     <w:p>
@@ -4292,8 +5742,29 @@
         </w:numPr>
         <w:spacing w:before="240" w:after="240"/>
       </w:pPr>
-      <w:r>
-        <w:t>cross validation f1 std 0.0132401153018114</w:t>
+      <w:proofErr w:type="spellStart"/>
+      <w:r>
+        <w:t>cross</w:t>
+      </w:r>
+      <w:proofErr w:type="spellEnd"/>
+      <w:r>
+        <w:t xml:space="preserve"> </w:t>
+      </w:r>
+      <w:proofErr w:type="spellStart"/>
+      <w:r>
+        <w:t>validation</w:t>
+      </w:r>
+      <w:proofErr w:type="spellEnd"/>
+      <w:r>
+        <w:t xml:space="preserve"> f1 </w:t>
+      </w:r>
+      <w:proofErr w:type="spellStart"/>
+      <w:r>
+        <w:t>std</w:t>
+      </w:r>
+      <w:proofErr w:type="spellEnd"/>
+      <w:r>
+        <w:t xml:space="preserve"> 0.0132401153018114</w:t>
       </w:r>
     </w:p>
     <w:p>
@@ -4305,8 +5776,29 @@
         </w:numPr>
         <w:spacing w:before="240" w:after="240"/>
       </w:pPr>
-      <w:r>
-        <w:t>cross validation recall scores [47.33944954 51.19266055 48.25688073 49.5412844  51.19266055]</w:t>
+      <w:proofErr w:type="spellStart"/>
+      <w:r>
+        <w:t>cross</w:t>
+      </w:r>
+      <w:proofErr w:type="spellEnd"/>
+      <w:r>
+        <w:t xml:space="preserve"> </w:t>
+      </w:r>
+      <w:proofErr w:type="spellStart"/>
+      <w:r>
+        <w:t>validation</w:t>
+      </w:r>
+      <w:proofErr w:type="spellEnd"/>
+      <w:r>
+        <w:t xml:space="preserve"> </w:t>
+      </w:r>
+      <w:proofErr w:type="spellStart"/>
+      <w:r>
+        <w:t>recall</w:t>
+      </w:r>
+      <w:proofErr w:type="spellEnd"/>
+      <w:r>
+        <w:t xml:space="preserve"> scores [47.33944954 51.19266055 48.25688073 49.5412844  51.19266055]</w:t>
       </w:r>
     </w:p>
     <w:p>
@@ -4318,8 +5810,29 @@
         </w:numPr>
         <w:spacing w:before="240" w:after="240"/>
       </w:pPr>
-      <w:r>
-        <w:t>cross validation recall mean 49.50458715596331</w:t>
+      <w:proofErr w:type="spellStart"/>
+      <w:r>
+        <w:t>cross</w:t>
+      </w:r>
+      <w:proofErr w:type="spellEnd"/>
+      <w:r>
+        <w:t xml:space="preserve"> </w:t>
+      </w:r>
+      <w:proofErr w:type="spellStart"/>
+      <w:r>
+        <w:t>validation</w:t>
+      </w:r>
+      <w:proofErr w:type="spellEnd"/>
+      <w:r>
+        <w:t xml:space="preserve"> </w:t>
+      </w:r>
+      <w:proofErr w:type="spellStart"/>
+      <w:r>
+        <w:t>recall</w:t>
+      </w:r>
+      <w:proofErr w:type="spellEnd"/>
+      <w:r>
+        <w:t xml:space="preserve"> mean 49.50458715596331</w:t>
       </w:r>
     </w:p>
     <w:p>
@@ -4330,8 +5843,37 @@
           <w:numId w:val="21"/>
         </w:numPr>
       </w:pPr>
-      <w:r>
-        <w:t>cross validation recall std 0.01545646949625883</w:t>
+      <w:proofErr w:type="spellStart"/>
+      <w:r>
+        <w:t>cross</w:t>
+      </w:r>
+      <w:proofErr w:type="spellEnd"/>
+      <w:r>
+        <w:t xml:space="preserve"> </w:t>
+      </w:r>
+      <w:proofErr w:type="spellStart"/>
+      <w:r>
+        <w:t>validation</w:t>
+      </w:r>
+      <w:proofErr w:type="spellEnd"/>
+      <w:r>
+        <w:t xml:space="preserve"> </w:t>
+      </w:r>
+      <w:proofErr w:type="spellStart"/>
+      <w:r>
+        <w:t>recall</w:t>
+      </w:r>
+      <w:proofErr w:type="spellEnd"/>
+      <w:r>
+        <w:t xml:space="preserve"> </w:t>
+      </w:r>
+      <w:proofErr w:type="spellStart"/>
+      <w:r>
+        <w:t>std</w:t>
+      </w:r>
+      <w:proofErr w:type="spellEnd"/>
+      <w:r>
+        <w:t xml:space="preserve"> 0.01545646949625883</w:t>
       </w:r>
     </w:p>
     <w:p>
@@ -4342,9 +5884,11 @@
           <w:numId w:val="21"/>
         </w:numPr>
       </w:pPr>
+      <w:proofErr w:type="spellStart"/>
       <w:r>
         <w:t>LinearSVC</w:t>
       </w:r>
+      <w:proofErr w:type="spellEnd"/>
     </w:p>
     <w:p>
       <w:pPr>
@@ -4354,8 +5898,21 @@
           <w:numId w:val="21"/>
         </w:numPr>
       </w:pPr>
-      <w:r>
-        <w:t>cross validation f1 scores [47.75022957 51.84501845 50.27932961 49.72273567 50.77343039]</w:t>
+      <w:proofErr w:type="spellStart"/>
+      <w:r>
+        <w:t>cross</w:t>
+      </w:r>
+      <w:proofErr w:type="spellEnd"/>
+      <w:r>
+        <w:t xml:space="preserve"> </w:t>
+      </w:r>
+      <w:proofErr w:type="spellStart"/>
+      <w:r>
+        <w:t>validation</w:t>
+      </w:r>
+      <w:proofErr w:type="spellEnd"/>
+      <w:r>
+        <w:t xml:space="preserve"> f1 scores [47.75022957 51.84501845 50.27932961 49.72273567 50.77343039]</w:t>
       </w:r>
     </w:p>
     <w:p>
@@ -4367,8 +5924,21 @@
         </w:numPr>
         <w:spacing w:before="240" w:after="240"/>
       </w:pPr>
-      <w:r>
-        <w:t>cross validation f1 mean 50.07414873869516</w:t>
+      <w:proofErr w:type="spellStart"/>
+      <w:r>
+        <w:t>cross</w:t>
+      </w:r>
+      <w:proofErr w:type="spellEnd"/>
+      <w:r>
+        <w:t xml:space="preserve"> </w:t>
+      </w:r>
+      <w:proofErr w:type="spellStart"/>
+      <w:r>
+        <w:t>validation</w:t>
+      </w:r>
+      <w:proofErr w:type="spellEnd"/>
+      <w:r>
+        <w:t xml:space="preserve"> f1 mean 50.07414873869516</w:t>
       </w:r>
     </w:p>
     <w:p>
@@ -4380,8 +5950,29 @@
         </w:numPr>
         <w:spacing w:before="240" w:after="240"/>
       </w:pPr>
-      <w:r>
-        <w:t>cross validation f1 std 0.01355814515763869</w:t>
+      <w:proofErr w:type="spellStart"/>
+      <w:r>
+        <w:t>cross</w:t>
+      </w:r>
+      <w:proofErr w:type="spellEnd"/>
+      <w:r>
+        <w:t xml:space="preserve"> </w:t>
+      </w:r>
+      <w:proofErr w:type="spellStart"/>
+      <w:r>
+        <w:t>validation</w:t>
+      </w:r>
+      <w:proofErr w:type="spellEnd"/>
+      <w:r>
+        <w:t xml:space="preserve"> f1 </w:t>
+      </w:r>
+      <w:proofErr w:type="spellStart"/>
+      <w:r>
+        <w:t>std</w:t>
+      </w:r>
+      <w:proofErr w:type="spellEnd"/>
+      <w:r>
+        <w:t xml:space="preserve"> 0.01355814515763869</w:t>
       </w:r>
     </w:p>
     <w:p>
@@ -4393,8 +5984,29 @@
         </w:numPr>
         <w:spacing w:before="240" w:after="240"/>
       </w:pPr>
-      <w:r>
-        <w:t>cross validation recall scores [47.70642202 51.55963303 49.5412844  49.35779817 51.19266055]</w:t>
+      <w:proofErr w:type="spellStart"/>
+      <w:r>
+        <w:t>cross</w:t>
+      </w:r>
+      <w:proofErr w:type="spellEnd"/>
+      <w:r>
+        <w:t xml:space="preserve"> </w:t>
+      </w:r>
+      <w:proofErr w:type="spellStart"/>
+      <w:r>
+        <w:t>validation</w:t>
+      </w:r>
+      <w:proofErr w:type="spellEnd"/>
+      <w:r>
+        <w:t xml:space="preserve"> </w:t>
+      </w:r>
+      <w:proofErr w:type="spellStart"/>
+      <w:r>
+        <w:t>recall</w:t>
+      </w:r>
+      <w:proofErr w:type="spellEnd"/>
+      <w:r>
+        <w:t xml:space="preserve"> scores [47.70642202 51.55963303 49.5412844  49.35779817 51.19266055]</w:t>
       </w:r>
     </w:p>
     <w:p>
@@ -4406,8 +6018,29 @@
         </w:numPr>
         <w:spacing w:before="240" w:after="240"/>
       </w:pPr>
-      <w:r>
-        <w:t>cross validation recall mean 49.871559633027516</w:t>
+      <w:proofErr w:type="spellStart"/>
+      <w:r>
+        <w:t>cross</w:t>
+      </w:r>
+      <w:proofErr w:type="spellEnd"/>
+      <w:r>
+        <w:t xml:space="preserve"> </w:t>
+      </w:r>
+      <w:proofErr w:type="spellStart"/>
+      <w:r>
+        <w:t>validation</w:t>
+      </w:r>
+      <w:proofErr w:type="spellEnd"/>
+      <w:r>
+        <w:t xml:space="preserve"> </w:t>
+      </w:r>
+      <w:proofErr w:type="spellStart"/>
+      <w:r>
+        <w:t>recall</w:t>
+      </w:r>
+      <w:proofErr w:type="spellEnd"/>
+      <w:r>
+        <w:t xml:space="preserve"> mean 49.871559633027516</w:t>
       </w:r>
     </w:p>
     <w:p>
@@ -4418,8 +6051,37 @@
           <w:numId w:val="21"/>
         </w:numPr>
       </w:pPr>
-      <w:r>
-        <w:t>cross validation recall std 0.013896584388081803</w:t>
+      <w:proofErr w:type="spellStart"/>
+      <w:r>
+        <w:t>cross</w:t>
+      </w:r>
+      <w:proofErr w:type="spellEnd"/>
+      <w:r>
+        <w:t xml:space="preserve"> </w:t>
+      </w:r>
+      <w:proofErr w:type="spellStart"/>
+      <w:r>
+        <w:t>validation</w:t>
+      </w:r>
+      <w:proofErr w:type="spellEnd"/>
+      <w:r>
+        <w:t xml:space="preserve"> </w:t>
+      </w:r>
+      <w:proofErr w:type="spellStart"/>
+      <w:r>
+        <w:t>recall</w:t>
+      </w:r>
+      <w:proofErr w:type="spellEnd"/>
+      <w:r>
+        <w:t xml:space="preserve"> </w:t>
+      </w:r>
+      <w:proofErr w:type="spellStart"/>
+      <w:r>
+        <w:t>std</w:t>
+      </w:r>
+      <w:proofErr w:type="spellEnd"/>
+      <w:r>
+        <w:t xml:space="preserve"> 0.013896584388081803</w:t>
       </w:r>
     </w:p>
     <w:p>
@@ -4430,9 +6092,11 @@
           <w:numId w:val="21"/>
         </w:numPr>
       </w:pPr>
+      <w:proofErr w:type="spellStart"/>
       <w:r>
         <w:t>KNeighborsClassifier</w:t>
       </w:r>
+      <w:proofErr w:type="spellEnd"/>
     </w:p>
     <w:p>
       <w:pPr>
@@ -4442,8 +6106,21 @@
           <w:numId w:val="21"/>
         </w:numPr>
       </w:pPr>
-      <w:r>
-        <w:t>cross validation f1 scores [60.0896861  57.96579658 59.35030729 54.34583715 57.96579658]</w:t>
+      <w:proofErr w:type="spellStart"/>
+      <w:r>
+        <w:t>cross</w:t>
+      </w:r>
+      <w:proofErr w:type="spellEnd"/>
+      <w:r>
+        <w:t xml:space="preserve"> </w:t>
+      </w:r>
+      <w:proofErr w:type="spellStart"/>
+      <w:r>
+        <w:t>validation</w:t>
+      </w:r>
+      <w:proofErr w:type="spellEnd"/>
+      <w:r>
+        <w:t xml:space="preserve"> f1 scores [60.0896861  57.96579658 59.35030729 54.34583715 57.96579658]</w:t>
       </w:r>
     </w:p>
     <w:p>
@@ -4455,8 +6132,21 @@
         </w:numPr>
         <w:spacing w:before="240" w:after="240"/>
       </w:pPr>
-      <w:r>
-        <w:t>cross validation f1 mean 57.94348473810715</w:t>
+      <w:proofErr w:type="spellStart"/>
+      <w:r>
+        <w:t>cross</w:t>
+      </w:r>
+      <w:proofErr w:type="spellEnd"/>
+      <w:r>
+        <w:t xml:space="preserve"> </w:t>
+      </w:r>
+      <w:proofErr w:type="spellStart"/>
+      <w:r>
+        <w:t>validation</w:t>
+      </w:r>
+      <w:proofErr w:type="spellEnd"/>
+      <w:r>
+        <w:t xml:space="preserve"> f1 mean 57.94348473810715</w:t>
       </w:r>
     </w:p>
     <w:p>
@@ -4468,8 +6158,29 @@
         </w:numPr>
         <w:spacing w:before="240" w:after="240"/>
       </w:pPr>
-      <w:r>
-        <w:t>cross validation f1 std 0.019763296183430562</w:t>
+      <w:proofErr w:type="spellStart"/>
+      <w:r>
+        <w:t>cross</w:t>
+      </w:r>
+      <w:proofErr w:type="spellEnd"/>
+      <w:r>
+        <w:t xml:space="preserve"> </w:t>
+      </w:r>
+      <w:proofErr w:type="spellStart"/>
+      <w:r>
+        <w:t>validation</w:t>
+      </w:r>
+      <w:proofErr w:type="spellEnd"/>
+      <w:r>
+        <w:t xml:space="preserve"> f1 </w:t>
+      </w:r>
+      <w:proofErr w:type="spellStart"/>
+      <w:r>
+        <w:t>std</w:t>
+      </w:r>
+      <w:proofErr w:type="spellEnd"/>
+      <w:r>
+        <w:t xml:space="preserve"> 0.019763296183430562</w:t>
       </w:r>
     </w:p>
     <w:p>
@@ -4481,8 +6192,29 @@
         </w:numPr>
         <w:spacing w:before="240" w:after="240"/>
       </w:pPr>
-      <w:r>
-        <w:t>cross validation recall scores [61.46788991 59.08256881 62.01834862 54.49541284 59.08256881]</w:t>
+      <w:proofErr w:type="spellStart"/>
+      <w:r>
+        <w:t>cross</w:t>
+      </w:r>
+      <w:proofErr w:type="spellEnd"/>
+      <w:r>
+        <w:t xml:space="preserve"> </w:t>
+      </w:r>
+      <w:proofErr w:type="spellStart"/>
+      <w:r>
+        <w:t>validation</w:t>
+      </w:r>
+      <w:proofErr w:type="spellEnd"/>
+      <w:r>
+        <w:t xml:space="preserve"> </w:t>
+      </w:r>
+      <w:proofErr w:type="spellStart"/>
+      <w:r>
+        <w:t>recall</w:t>
+      </w:r>
+      <w:proofErr w:type="spellEnd"/>
+      <w:r>
+        <w:t xml:space="preserve"> scores [61.46788991 59.08256881 62.01834862 54.49541284 59.08256881]</w:t>
       </w:r>
     </w:p>
     <w:p>
@@ -4494,8 +6226,29 @@
         </w:numPr>
         <w:spacing w:before="240" w:after="240"/>
       </w:pPr>
-      <w:r>
-        <w:t>cross validation recall mean 59.22935779816514</w:t>
+      <w:proofErr w:type="spellStart"/>
+      <w:r>
+        <w:t>cross</w:t>
+      </w:r>
+      <w:proofErr w:type="spellEnd"/>
+      <w:r>
+        <w:t xml:space="preserve"> </w:t>
+      </w:r>
+      <w:proofErr w:type="spellStart"/>
+      <w:r>
+        <w:t>validation</w:t>
+      </w:r>
+      <w:proofErr w:type="spellEnd"/>
+      <w:r>
+        <w:t xml:space="preserve"> </w:t>
+      </w:r>
+      <w:proofErr w:type="spellStart"/>
+      <w:r>
+        <w:t>recall</w:t>
+      </w:r>
+      <w:proofErr w:type="spellEnd"/>
+      <w:r>
+        <w:t xml:space="preserve"> mean 59.22935779816514</w:t>
       </w:r>
     </w:p>
     <w:p>
@@ -4506,8 +6259,37 @@
           <w:numId w:val="21"/>
         </w:numPr>
       </w:pPr>
-      <w:r>
-        <w:t>cross validation recall std 0.02654913357458485</w:t>
+      <w:proofErr w:type="spellStart"/>
+      <w:r>
+        <w:t>cross</w:t>
+      </w:r>
+      <w:proofErr w:type="spellEnd"/>
+      <w:r>
+        <w:t xml:space="preserve"> </w:t>
+      </w:r>
+      <w:proofErr w:type="spellStart"/>
+      <w:r>
+        <w:t>validation</w:t>
+      </w:r>
+      <w:proofErr w:type="spellEnd"/>
+      <w:r>
+        <w:t xml:space="preserve"> </w:t>
+      </w:r>
+      <w:proofErr w:type="spellStart"/>
+      <w:r>
+        <w:t>recall</w:t>
+      </w:r>
+      <w:proofErr w:type="spellEnd"/>
+      <w:r>
+        <w:t xml:space="preserve"> </w:t>
+      </w:r>
+      <w:proofErr w:type="spellStart"/>
+      <w:r>
+        <w:t>std</w:t>
+      </w:r>
+      <w:proofErr w:type="spellEnd"/>
+      <w:r>
+        <w:t xml:space="preserve"> 0.02654913357458485</w:t>
       </w:r>
     </w:p>
     <w:p>
@@ -4518,9 +6300,11 @@
           <w:numId w:val="21"/>
         </w:numPr>
       </w:pPr>
+      <w:proofErr w:type="spellStart"/>
       <w:r>
         <w:t>DecisionTreeClassifier</w:t>
       </w:r>
+      <w:proofErr w:type="spellEnd"/>
     </w:p>
     <w:p>
       <w:pPr>
@@ -4530,8 +6314,21 @@
           <w:numId w:val="21"/>
         </w:numPr>
       </w:pPr>
-      <w:r>
-        <w:t>cross validation f1 scores [70.83685545 69.40874036 69.59517657 70.68965517 72.26596675]</w:t>
+      <w:proofErr w:type="spellStart"/>
+      <w:r>
+        <w:t>cross</w:t>
+      </w:r>
+      <w:proofErr w:type="spellEnd"/>
+      <w:r>
+        <w:t xml:space="preserve"> </w:t>
+      </w:r>
+      <w:proofErr w:type="spellStart"/>
+      <w:r>
+        <w:t>validation</w:t>
+      </w:r>
+      <w:proofErr w:type="spellEnd"/>
+      <w:r>
+        <w:t xml:space="preserve"> f1 scores [70.83685545 69.40874036 69.59517657 70.68965517 72.26596675]</w:t>
       </w:r>
     </w:p>
     <w:p>
@@ -4543,9 +6340,22 @@
         </w:numPr>
         <w:spacing w:before="240" w:after="240"/>
       </w:pPr>
+      <w:proofErr w:type="spellStart"/>
       <w:r>
         <w:lastRenderedPageBreak/>
-        <w:t>cross validation f1 mean 70.5592788621255</w:t>
+        <w:t>cross</w:t>
+      </w:r>
+      <w:proofErr w:type="spellEnd"/>
+      <w:r>
+        <w:t xml:space="preserve"> </w:t>
+      </w:r>
+      <w:proofErr w:type="spellStart"/>
+      <w:r>
+        <w:t>validation</w:t>
+      </w:r>
+      <w:proofErr w:type="spellEnd"/>
+      <w:r>
+        <w:t xml:space="preserve"> f1 mean 70.5592788621255</w:t>
       </w:r>
     </w:p>
     <w:p>
@@ -4557,8 +6367,29 @@
         </w:numPr>
         <w:spacing w:before="240" w:after="240"/>
       </w:pPr>
-      <w:r>
-        <w:t>cross validation f1 std 0.010256765940153307</w:t>
+      <w:proofErr w:type="spellStart"/>
+      <w:r>
+        <w:t>cross</w:t>
+      </w:r>
+      <w:proofErr w:type="spellEnd"/>
+      <w:r>
+        <w:t xml:space="preserve"> </w:t>
+      </w:r>
+      <w:proofErr w:type="spellStart"/>
+      <w:r>
+        <w:t>validation</w:t>
+      </w:r>
+      <w:proofErr w:type="spellEnd"/>
+      <w:r>
+        <w:t xml:space="preserve"> f1 </w:t>
+      </w:r>
+      <w:proofErr w:type="spellStart"/>
+      <w:r>
+        <w:t>std</w:t>
+      </w:r>
+      <w:proofErr w:type="spellEnd"/>
+      <w:r>
+        <w:t xml:space="preserve"> 0.010256765940153307</w:t>
       </w:r>
     </w:p>
     <w:p>
@@ -4570,8 +6401,29 @@
         </w:numPr>
         <w:spacing w:before="240" w:after="240"/>
       </w:pPr>
-      <w:r>
-        <w:t>cross validation recall scores [75.41284404 72.66055046 74.67889908 75.2293578  75.41284404]</w:t>
+      <w:proofErr w:type="spellStart"/>
+      <w:r>
+        <w:t>cross</w:t>
+      </w:r>
+      <w:proofErr w:type="spellEnd"/>
+      <w:r>
+        <w:t xml:space="preserve"> </w:t>
+      </w:r>
+      <w:proofErr w:type="spellStart"/>
+      <w:r>
+        <w:t>validation</w:t>
+      </w:r>
+      <w:proofErr w:type="spellEnd"/>
+      <w:r>
+        <w:t xml:space="preserve"> </w:t>
+      </w:r>
+      <w:proofErr w:type="spellStart"/>
+      <w:r>
+        <w:t>recall</w:t>
+      </w:r>
+      <w:proofErr w:type="spellEnd"/>
+      <w:r>
+        <w:t xml:space="preserve"> scores [75.41284404 72.66055046 74.67889908 75.2293578  75.41284404]</w:t>
       </w:r>
     </w:p>
     <w:p>
@@ -4583,8 +6435,29 @@
         </w:numPr>
         <w:spacing w:before="240" w:after="240"/>
       </w:pPr>
-      <w:r>
-        <w:t>cross validation recall mean 74.6788990825688</w:t>
+      <w:proofErr w:type="spellStart"/>
+      <w:r>
+        <w:t>cross</w:t>
+      </w:r>
+      <w:proofErr w:type="spellEnd"/>
+      <w:r>
+        <w:t xml:space="preserve"> </w:t>
+      </w:r>
+      <w:proofErr w:type="spellStart"/>
+      <w:r>
+        <w:t>validation</w:t>
+      </w:r>
+      <w:proofErr w:type="spellEnd"/>
+      <w:r>
+        <w:t xml:space="preserve"> </w:t>
+      </w:r>
+      <w:proofErr w:type="spellStart"/>
+      <w:r>
+        <w:t>recall</w:t>
+      </w:r>
+      <w:proofErr w:type="spellEnd"/>
+      <w:r>
+        <w:t xml:space="preserve"> mean 74.6788990825688</w:t>
       </w:r>
     </w:p>
     <w:p>
@@ -4595,8 +6468,37 @@
           <w:numId w:val="21"/>
         </w:numPr>
       </w:pPr>
-      <w:r>
-        <w:t>cross validation recall std 0.010444219795051512</w:t>
+      <w:proofErr w:type="spellStart"/>
+      <w:r>
+        <w:t>cross</w:t>
+      </w:r>
+      <w:proofErr w:type="spellEnd"/>
+      <w:r>
+        <w:t xml:space="preserve"> </w:t>
+      </w:r>
+      <w:proofErr w:type="spellStart"/>
+      <w:r>
+        <w:t>validation</w:t>
+      </w:r>
+      <w:proofErr w:type="spellEnd"/>
+      <w:r>
+        <w:t xml:space="preserve"> </w:t>
+      </w:r>
+      <w:proofErr w:type="spellStart"/>
+      <w:r>
+        <w:t>recall</w:t>
+      </w:r>
+      <w:proofErr w:type="spellEnd"/>
+      <w:r>
+        <w:t xml:space="preserve"> </w:t>
+      </w:r>
+      <w:proofErr w:type="spellStart"/>
+      <w:r>
+        <w:t>std</w:t>
+      </w:r>
+      <w:proofErr w:type="spellEnd"/>
+      <w:r>
+        <w:t xml:space="preserve"> 0.010444219795051512</w:t>
       </w:r>
     </w:p>
     <w:p/>
@@ -4639,7 +6541,35 @@
         <w:rPr>
           <w:highlight w:val="yellow"/>
         </w:rPr>
-        <w:t>Corroborar los valores resultantes de la experimentación (acutalizada) contra los documentados aquí y determinar si hubo modificaciones. En caso de haberlas, registarlas.</w:t>
+        <w:t>Corroborar los valores resultantes de la experimentación (</w:t>
+      </w:r>
+      <w:proofErr w:type="spellStart"/>
+      <w:r>
+        <w:rPr>
+          <w:highlight w:val="yellow"/>
+        </w:rPr>
+        <w:t>acutalizada</w:t>
+      </w:r>
+      <w:proofErr w:type="spellEnd"/>
+      <w:r>
+        <w:rPr>
+          <w:highlight w:val="yellow"/>
+        </w:rPr>
+        <w:t xml:space="preserve">) contra los documentados aquí y determinar si hubo modificaciones. En caso de haberlas, </w:t>
+      </w:r>
+      <w:proofErr w:type="spellStart"/>
+      <w:r>
+        <w:rPr>
+          <w:highlight w:val="yellow"/>
+        </w:rPr>
+        <w:t>registarlas</w:t>
+      </w:r>
+      <w:proofErr w:type="spellEnd"/>
+      <w:r>
+        <w:rPr>
+          <w:highlight w:val="yellow"/>
+        </w:rPr>
+        <w:t>.</w:t>
       </w:r>
     </w:p>
     <w:p/>
@@ -4702,7 +6632,15 @@
     </w:p>
     <w:p>
       <w:r>
-        <w:t>En cuanto al modelo de predicción, se evaluaron diferentes algoritmos de clasificación mediante validación cruzada, utilizando las métricas f1-score y recall. Los resultados promedio obtenidos fueron los siguientes:</w:t>
+        <w:t xml:space="preserve">En cuanto al modelo de predicción, se evaluaron diferentes algoritmos de clasificación mediante validación cruzada, utilizando las métricas f1-score y </w:t>
+      </w:r>
+      <w:proofErr w:type="spellStart"/>
+      <w:r>
+        <w:t>recall</w:t>
+      </w:r>
+      <w:proofErr w:type="spellEnd"/>
+      <w:r>
+        <w:t>. Los resultados promedio obtenidos fueron los siguientes:</w:t>
       </w:r>
     </w:p>
     <w:tbl>
@@ -4749,7 +6687,27 @@
           </w:tcPr>
           <w:p>
             <w:r>
-              <w:t>F1 std</w:t>
+              <w:t xml:space="preserve">F1 </w:t>
+            </w:r>
+            <w:proofErr w:type="spellStart"/>
+            <w:r>
+              <w:t>std</w:t>
+            </w:r>
+            <w:proofErr w:type="spellEnd"/>
+          </w:p>
+        </w:tc>
+        <w:tc>
+          <w:tcPr>
+            <w:tcW w:w="1803" w:type="dxa"/>
+          </w:tcPr>
+          <w:p>
+            <w:proofErr w:type="spellStart"/>
+            <w:r>
+              <w:t>Recall</w:t>
+            </w:r>
+            <w:proofErr w:type="spellEnd"/>
+            <w:r>
+              <w:t xml:space="preserve"> mean</w:t>
             </w:r>
           </w:p>
         </w:tc>
@@ -4758,19 +6716,19 @@
             <w:tcW w:w="1803" w:type="dxa"/>
           </w:tcPr>
           <w:p>
+            <w:proofErr w:type="spellStart"/>
             <w:r>
-              <w:t>Recall mean</w:t>
+              <w:t>Recall</w:t>
             </w:r>
-          </w:p>
-        </w:tc>
-        <w:tc>
-          <w:tcPr>
-            <w:tcW w:w="1803" w:type="dxa"/>
-          </w:tcPr>
-          <w:p>
+            <w:proofErr w:type="spellEnd"/>
             <w:r>
-              <w:t>Recall std</w:t>
+              <w:t xml:space="preserve"> </w:t>
             </w:r>
+            <w:proofErr w:type="spellStart"/>
+            <w:r>
+              <w:t>std</w:t>
+            </w:r>
+            <w:proofErr w:type="spellEnd"/>
           </w:p>
         </w:tc>
       </w:tr>
@@ -4783,9 +6741,19 @@
             <w:tcW w:w="2230" w:type="dxa"/>
           </w:tcPr>
           <w:p>
+            <w:proofErr w:type="spellStart"/>
             <w:r>
-              <w:t>Logistic Regression</w:t>
+              <w:t>Logistic</w:t>
             </w:r>
+            <w:proofErr w:type="spellEnd"/>
+            <w:r>
+              <w:t xml:space="preserve"> </w:t>
+            </w:r>
+            <w:proofErr w:type="spellStart"/>
+            <w:r>
+              <w:t>Regression</w:t>
+            </w:r>
+            <w:proofErr w:type="spellEnd"/>
           </w:p>
         </w:tc>
         <w:tc>
@@ -4838,9 +6806,11 @@
             <w:tcW w:w="2230" w:type="dxa"/>
           </w:tcPr>
           <w:p>
+            <w:proofErr w:type="spellStart"/>
             <w:r>
               <w:t>LinearSVC</w:t>
             </w:r>
+            <w:proofErr w:type="spellEnd"/>
           </w:p>
         </w:tc>
         <w:tc>
@@ -4896,9 +6866,11 @@
             <w:tcW w:w="2230" w:type="dxa"/>
           </w:tcPr>
           <w:p>
+            <w:proofErr w:type="spellStart"/>
             <w:r>
               <w:t>KNeighborsClassifier</w:t>
             </w:r>
+            <w:proofErr w:type="spellEnd"/>
           </w:p>
         </w:tc>
         <w:tc>
@@ -4954,9 +6926,11 @@
             <w:tcW w:w="2230" w:type="dxa"/>
           </w:tcPr>
           <w:p>
+            <w:proofErr w:type="spellStart"/>
             <w:r>
               <w:t>DecisionTreeClassifier</w:t>
             </w:r>
+            <w:proofErr w:type="spellEnd"/>
           </w:p>
         </w:tc>
         <w:tc>
@@ -5004,7 +6978,15 @@
     <w:p/>
     <w:p>
       <w:r>
-        <w:t>El mejor desempeño se obtuvo con el DecisionTreeClassifier, que superó ampliamente al resto de los modelos en ambas métricas.</w:t>
+        <w:t xml:space="preserve">El mejor desempeño se obtuvo con el </w:t>
+      </w:r>
+      <w:proofErr w:type="spellStart"/>
+      <w:r>
+        <w:t>DecisionTreeClassifier</w:t>
+      </w:r>
+      <w:proofErr w:type="spellEnd"/>
+      <w:r>
+        <w:t>, que superó ampliamente al resto de los modelos en ambas métricas.</w:t>
       </w:r>
     </w:p>
     <w:p>
@@ -5025,7 +7007,15 @@
         <w:t>instancia</w:t>
       </w:r>
       <w:r>
-        <w:t xml:space="preserve"> de trabajo la decisión original del proyecto. Para garantizar que ante un re-entrenamiento del modelo el mismo mantenga su </w:t>
+        <w:t xml:space="preserve"> de trabajo la decisión original del proyecto. Para garantizar que ante un </w:t>
+      </w:r>
+      <w:proofErr w:type="spellStart"/>
+      <w:r>
+        <w:t>re-entrenamiento</w:t>
+      </w:r>
+      <w:proofErr w:type="spellEnd"/>
+      <w:r>
+        <w:t xml:space="preserve"> del modelo el mismo mantenga su </w:t>
       </w:r>
       <w:r>
         <w:t>rendimiento</w:t>
@@ -5174,9 +7164,11 @@
       <w:r>
         <w:t xml:space="preserve">l </w:t>
       </w:r>
+      <w:proofErr w:type="spellStart"/>
       <w:r>
         <w:t>dataset</w:t>
       </w:r>
+      <w:proofErr w:type="spellEnd"/>
       <w:r>
         <w:t xml:space="preserve"> original </w:t>
       </w:r>
@@ -5227,7 +7219,23 @@
         </w:numPr>
       </w:pPr>
       <w:r>
-        <w:t>Se ha registrado toda la experimentación realizada y la generación del modelo del árobl de decisión para el escenario en la librería MLFlow.</w:t>
+        <w:t xml:space="preserve">Se ha registrado toda la experimentación realizada y la generación del modelo del </w:t>
+      </w:r>
+      <w:proofErr w:type="spellStart"/>
+      <w:r>
+        <w:t>árobl</w:t>
+      </w:r>
+      <w:proofErr w:type="spellEnd"/>
+      <w:r>
+        <w:t xml:space="preserve"> de decisión para el escenario en la librería </w:t>
+      </w:r>
+      <w:proofErr w:type="spellStart"/>
+      <w:r>
+        <w:t>MLFlow</w:t>
+      </w:r>
+      <w:proofErr w:type="spellEnd"/>
+      <w:r>
+        <w:t>.</w:t>
       </w:r>
     </w:p>
     <w:p>
@@ -5251,7 +7259,15 @@
         </w:numPr>
       </w:pPr>
       <w:r>
-        <w:t>Una API implementada con FastAPI que permite utilizar el modelo de predicción generado</w:t>
+        <w:t xml:space="preserve">Una API implementada con </w:t>
+      </w:r>
+      <w:proofErr w:type="spellStart"/>
+      <w:r>
+        <w:t>FastAPI</w:t>
+      </w:r>
+      <w:proofErr w:type="spellEnd"/>
+      <w:r>
+        <w:t xml:space="preserve"> que permite utilizar el modelo de predicción generado</w:t>
       </w:r>
     </w:p>
     <w:p>
@@ -5263,7 +7279,15 @@
         </w:numPr>
       </w:pPr>
       <w:r>
-        <w:t>Una aplicación web con Streamlit que permite a un usuario final generar predicciones sobre datos nuevos utilizando el modelo disponible a través de la API.</w:t>
+        <w:t xml:space="preserve">Una aplicación web con </w:t>
+      </w:r>
+      <w:proofErr w:type="spellStart"/>
+      <w:r>
+        <w:t>Streamlit</w:t>
+      </w:r>
+      <w:proofErr w:type="spellEnd"/>
+      <w:r>
+        <w:t xml:space="preserve"> que permite a un usuario final generar predicciones sobre datos nuevos utilizando el modelo disponible a través de la API.</w:t>
       </w:r>
     </w:p>
     <w:p>
@@ -5328,7 +7352,31 @@
         </w:numPr>
       </w:pPr>
       <w:r>
-        <w:t>Optimizar los hiperparámetros del modelo de árbol de decisión y evaluar variantes como Random Forest o XGBoost para aumentar la capacidad de generalización.</w:t>
+        <w:t xml:space="preserve">Optimizar los </w:t>
+      </w:r>
+      <w:proofErr w:type="spellStart"/>
+      <w:r>
+        <w:t>hiperparámetros</w:t>
+      </w:r>
+      <w:proofErr w:type="spellEnd"/>
+      <w:r>
+        <w:t xml:space="preserve"> del modelo de árbol de decisión y evaluar variantes como </w:t>
+      </w:r>
+      <w:proofErr w:type="spellStart"/>
+      <w:r>
+        <w:t>Random</w:t>
+      </w:r>
+      <w:proofErr w:type="spellEnd"/>
+      <w:r>
+        <w:t xml:space="preserve"> Forest o </w:t>
+      </w:r>
+      <w:proofErr w:type="spellStart"/>
+      <w:r>
+        <w:t>XGBoost</w:t>
+      </w:r>
+      <w:proofErr w:type="spellEnd"/>
+      <w:r>
+        <w:t xml:space="preserve"> para aumentar la capacidad de generalización.</w:t>
       </w:r>
     </w:p>
     <w:p>
@@ -5525,7 +7573,15 @@
     </w:p>
     <w:p>
       <w:r>
-        <w:t>Con los productos generados para el uso del modelo de predicción por parte de los usuarios finales, se ha determinado realizar el despliegue de los mismos en un entrono web. Los productos se encuentran accesibles desde los siguientes enlaces:</w:t>
+        <w:t xml:space="preserve">Con los productos generados para el uso del modelo de predicción por parte de los usuarios finales, se ha determinado realizar el despliegue de los mismos en un </w:t>
+      </w:r>
+      <w:proofErr w:type="spellStart"/>
+      <w:r>
+        <w:t>entrono</w:t>
+      </w:r>
+      <w:proofErr w:type="spellEnd"/>
+      <w:r>
+        <w:t xml:space="preserve"> web. Los productos se encuentran accesibles desde los siguientes enlaces:</w:t>
       </w:r>
     </w:p>
     <w:p>
@@ -5551,7 +7607,7 @@
         </w:rPr>
         <w:t xml:space="preserve"> </w:t>
       </w:r>
-      <w:hyperlink r:id="rId14">
+      <w:hyperlink r:id="rId19">
         <w:r>
           <w:rPr>
             <w:rStyle w:val="Hyperlink"/>
@@ -5578,7 +7634,7 @@
       <w:r>
         <w:t xml:space="preserve">Aplicación web: </w:t>
       </w:r>
-      <w:hyperlink r:id="rId15">
+      <w:hyperlink r:id="rId20">
         <w:r>
           <w:rPr>
             <w:rStyle w:val="Hyperlink"/>
@@ -5602,7 +7658,23 @@
           <w:rFonts w:eastAsiaTheme="minorEastAsia"/>
           <w:highlight w:val="yellow"/>
         </w:rPr>
-        <w:t>[Agregar captuas de pantalla de ambos productos]</w:t>
+        <w:t xml:space="preserve">[Agregar </w:t>
+      </w:r>
+      <w:proofErr w:type="spellStart"/>
+      <w:r>
+        <w:rPr>
+          <w:rFonts w:eastAsiaTheme="minorEastAsia"/>
+          <w:highlight w:val="yellow"/>
+        </w:rPr>
+        <w:t>captuas</w:t>
+      </w:r>
+      <w:proofErr w:type="spellEnd"/>
+      <w:r>
+        <w:rPr>
+          <w:rFonts w:eastAsiaTheme="minorEastAsia"/>
+          <w:highlight w:val="yellow"/>
+        </w:rPr>
+        <w:t xml:space="preserve"> de pantalla de ambos productos]</w:t>
       </w:r>
     </w:p>
     <w:p/>
@@ -5668,7 +7740,15 @@
     </w:p>
     <w:p>
       <w:r>
-        <w:t>Con respecto al segundo punto, se ha avanzado en la generación de un pipeline aplicable a las tareas de generación del dataset de entrenamiento para el modelo y su validación, así como también para la generación y versionado del modelo.</w:t>
+        <w:t xml:space="preserve">Con respecto al segundo punto, se ha avanzado en la generación de un pipeline aplicable a las tareas de generación del </w:t>
+      </w:r>
+      <w:proofErr w:type="spellStart"/>
+      <w:r>
+        <w:t>dataset</w:t>
+      </w:r>
+      <w:proofErr w:type="spellEnd"/>
+      <w:r>
+        <w:t xml:space="preserve"> de entrenamiento para el modelo y su validación, así como también para la generación y versionado del modelo.</w:t>
       </w:r>
     </w:p>
     <w:p>
@@ -5901,7 +7981,23 @@
           <w:rFonts w:eastAsiaTheme="minorEastAsia"/>
           <w:highlight w:val="yellow"/>
         </w:rPr>
-        <w:t>[Agregar: Items desarrollados en el proyecto en estas dos iteraciones]</w:t>
+        <w:t xml:space="preserve">[Agregar: </w:t>
+      </w:r>
+      <w:proofErr w:type="spellStart"/>
+      <w:r>
+        <w:rPr>
+          <w:rFonts w:eastAsiaTheme="minorEastAsia"/>
+          <w:highlight w:val="yellow"/>
+        </w:rPr>
+        <w:t>Items</w:t>
+      </w:r>
+      <w:proofErr w:type="spellEnd"/>
+      <w:r>
+        <w:rPr>
+          <w:rFonts w:eastAsiaTheme="minorEastAsia"/>
+          <w:highlight w:val="yellow"/>
+        </w:rPr>
+        <w:t xml:space="preserve"> desarrollados en el proyecto en estas dos iteraciones]</w:t>
       </w:r>
     </w:p>
     <w:p>
@@ -5946,7 +8042,23 @@
           <w:rFonts w:eastAsiaTheme="minorEastAsia"/>
           <w:highlight w:val="yellow"/>
         </w:rPr>
-        <w:t>[Agregar: Items desarrollados en el proyecto en estas dos iteraciones]</w:t>
+        <w:t xml:space="preserve">[Agregar: </w:t>
+      </w:r>
+      <w:proofErr w:type="spellStart"/>
+      <w:r>
+        <w:rPr>
+          <w:rFonts w:eastAsiaTheme="minorEastAsia"/>
+          <w:highlight w:val="yellow"/>
+        </w:rPr>
+        <w:t>Items</w:t>
+      </w:r>
+      <w:proofErr w:type="spellEnd"/>
+      <w:r>
+        <w:rPr>
+          <w:rFonts w:eastAsiaTheme="minorEastAsia"/>
+          <w:highlight w:val="yellow"/>
+        </w:rPr>
+        <w:t xml:space="preserve"> desarrollados en el proyecto en estas dos iteraciones]</w:t>
       </w:r>
     </w:p>
     <w:p>
@@ -5955,8 +8067,8 @@
       </w:r>
     </w:p>
     <w:sectPr>
-      <w:headerReference w:type="default" r:id="rId16"/>
-      <w:footerReference w:type="default" r:id="rId17"/>
+      <w:headerReference w:type="default" r:id="rId21"/>
+      <w:footerReference w:type="default" r:id="rId22"/>
       <w:pgSz w:w="11906" w:h="16838"/>
       <w:pgMar w:top="1440" w:right="1440" w:bottom="1440" w:left="1440" w:header="720" w:footer="720" w:gutter="0"/>
       <w:cols w:space="720"/>
@@ -12819,6 +14931,119 @@
     </w:lvl>
   </w:abstractNum>
   <w:abstractNum w:abstractNumId="59" w15:restartNumberingAfterBreak="0">
+    <w:nsid w:val="725164EB"/>
+    <w:multiLevelType w:val="hybridMultilevel"/>
+    <w:tmpl w:val="20B407E2"/>
+    <w:lvl w:ilvl="0" w:tplc="08090001">
+      <w:start w:val="1"/>
+      <w:numFmt w:val="bullet"/>
+      <w:lvlText w:val=""/>
+      <w:lvlJc w:val="left"/>
+      <w:pPr>
+        <w:ind w:left="720" w:hanging="360"/>
+      </w:pPr>
+      <w:rPr>
+        <w:rFonts w:ascii="Symbol" w:hAnsi="Symbol" w:hint="default"/>
+      </w:rPr>
+    </w:lvl>
+    <w:lvl w:ilvl="1" w:tplc="08090003" w:tentative="1">
+      <w:start w:val="1"/>
+      <w:numFmt w:val="bullet"/>
+      <w:lvlText w:val="o"/>
+      <w:lvlJc w:val="left"/>
+      <w:pPr>
+        <w:ind w:left="1440" w:hanging="360"/>
+      </w:pPr>
+      <w:rPr>
+        <w:rFonts w:ascii="Courier New" w:hAnsi="Courier New" w:cs="Courier New" w:hint="default"/>
+      </w:rPr>
+    </w:lvl>
+    <w:lvl w:ilvl="2" w:tplc="08090005" w:tentative="1">
+      <w:start w:val="1"/>
+      <w:numFmt w:val="bullet"/>
+      <w:lvlText w:val=""/>
+      <w:lvlJc w:val="left"/>
+      <w:pPr>
+        <w:ind w:left="2160" w:hanging="360"/>
+      </w:pPr>
+      <w:rPr>
+        <w:rFonts w:ascii="Wingdings" w:hAnsi="Wingdings" w:hint="default"/>
+      </w:rPr>
+    </w:lvl>
+    <w:lvl w:ilvl="3" w:tplc="08090001" w:tentative="1">
+      <w:start w:val="1"/>
+      <w:numFmt w:val="bullet"/>
+      <w:lvlText w:val=""/>
+      <w:lvlJc w:val="left"/>
+      <w:pPr>
+        <w:ind w:left="2880" w:hanging="360"/>
+      </w:pPr>
+      <w:rPr>
+        <w:rFonts w:ascii="Symbol" w:hAnsi="Symbol" w:hint="default"/>
+      </w:rPr>
+    </w:lvl>
+    <w:lvl w:ilvl="4" w:tplc="08090003" w:tentative="1">
+      <w:start w:val="1"/>
+      <w:numFmt w:val="bullet"/>
+      <w:lvlText w:val="o"/>
+      <w:lvlJc w:val="left"/>
+      <w:pPr>
+        <w:ind w:left="3600" w:hanging="360"/>
+      </w:pPr>
+      <w:rPr>
+        <w:rFonts w:ascii="Courier New" w:hAnsi="Courier New" w:cs="Courier New" w:hint="default"/>
+      </w:rPr>
+    </w:lvl>
+    <w:lvl w:ilvl="5" w:tplc="08090005" w:tentative="1">
+      <w:start w:val="1"/>
+      <w:numFmt w:val="bullet"/>
+      <w:lvlText w:val=""/>
+      <w:lvlJc w:val="left"/>
+      <w:pPr>
+        <w:ind w:left="4320" w:hanging="360"/>
+      </w:pPr>
+      <w:rPr>
+        <w:rFonts w:ascii="Wingdings" w:hAnsi="Wingdings" w:hint="default"/>
+      </w:rPr>
+    </w:lvl>
+    <w:lvl w:ilvl="6" w:tplc="08090001" w:tentative="1">
+      <w:start w:val="1"/>
+      <w:numFmt w:val="bullet"/>
+      <w:lvlText w:val=""/>
+      <w:lvlJc w:val="left"/>
+      <w:pPr>
+        <w:ind w:left="5040" w:hanging="360"/>
+      </w:pPr>
+      <w:rPr>
+        <w:rFonts w:ascii="Symbol" w:hAnsi="Symbol" w:hint="default"/>
+      </w:rPr>
+    </w:lvl>
+    <w:lvl w:ilvl="7" w:tplc="08090003" w:tentative="1">
+      <w:start w:val="1"/>
+      <w:numFmt w:val="bullet"/>
+      <w:lvlText w:val="o"/>
+      <w:lvlJc w:val="left"/>
+      <w:pPr>
+        <w:ind w:left="5760" w:hanging="360"/>
+      </w:pPr>
+      <w:rPr>
+        <w:rFonts w:ascii="Courier New" w:hAnsi="Courier New" w:cs="Courier New" w:hint="default"/>
+      </w:rPr>
+    </w:lvl>
+    <w:lvl w:ilvl="8" w:tplc="08090005" w:tentative="1">
+      <w:start w:val="1"/>
+      <w:numFmt w:val="bullet"/>
+      <w:lvlText w:val=""/>
+      <w:lvlJc w:val="left"/>
+      <w:pPr>
+        <w:ind w:left="6480" w:hanging="360"/>
+      </w:pPr>
+      <w:rPr>
+        <w:rFonts w:ascii="Wingdings" w:hAnsi="Wingdings" w:hint="default"/>
+      </w:rPr>
+    </w:lvl>
+  </w:abstractNum>
+  <w:abstractNum w:abstractNumId="60" w15:restartNumberingAfterBreak="0">
     <w:nsid w:val="72CB13A5"/>
     <w:multiLevelType w:val="hybridMultilevel"/>
     <w:tmpl w:val="2E9ED66E"/>
@@ -12931,7 +15156,7 @@
       </w:rPr>
     </w:lvl>
   </w:abstractNum>
-  <w:abstractNum w:abstractNumId="60" w15:restartNumberingAfterBreak="0">
+  <w:abstractNum w:abstractNumId="61" w15:restartNumberingAfterBreak="0">
     <w:nsid w:val="74590B45"/>
     <w:multiLevelType w:val="hybridMultilevel"/>
     <w:tmpl w:val="2430C98C"/>
@@ -13044,7 +15269,7 @@
       </w:rPr>
     </w:lvl>
   </w:abstractNum>
-  <w:abstractNum w:abstractNumId="61" w15:restartNumberingAfterBreak="0">
+  <w:abstractNum w:abstractNumId="62" w15:restartNumberingAfterBreak="0">
     <w:nsid w:val="7C62E222"/>
     <w:multiLevelType w:val="hybridMultilevel"/>
     <w:tmpl w:val="9CA4D2C8"/>
@@ -13157,7 +15382,7 @@
       </w:rPr>
     </w:lvl>
   </w:abstractNum>
-  <w:abstractNum w:abstractNumId="62" w15:restartNumberingAfterBreak="0">
+  <w:abstractNum w:abstractNumId="63" w15:restartNumberingAfterBreak="0">
     <w:nsid w:val="7EEE737C"/>
     <w:multiLevelType w:val="hybridMultilevel"/>
     <w:tmpl w:val="3B0EDD8C"/>
@@ -13270,7 +15495,7 @@
       </w:rPr>
     </w:lvl>
   </w:abstractNum>
-  <w:abstractNum w:abstractNumId="63" w15:restartNumberingAfterBreak="0">
+  <w:abstractNum w:abstractNumId="64" w15:restartNumberingAfterBreak="0">
     <w:nsid w:val="7F45FA93"/>
     <w:multiLevelType w:val="hybridMultilevel"/>
     <w:tmpl w:val="B75CC686"/>
@@ -13396,7 +15621,7 @@
     <w:abstractNumId w:val="24"/>
   </w:num>
   <w:num w:numId="5" w16cid:durableId="1027801819">
-    <w:abstractNumId w:val="63"/>
+    <w:abstractNumId w:val="64"/>
   </w:num>
   <w:num w:numId="6" w16cid:durableId="2087263953">
     <w:abstractNumId w:val="49"/>
@@ -13426,7 +15651,7 @@
     <w:abstractNumId w:val="41"/>
   </w:num>
   <w:num w:numId="15" w16cid:durableId="1025400161">
-    <w:abstractNumId w:val="62"/>
+    <w:abstractNumId w:val="63"/>
   </w:num>
   <w:num w:numId="16" w16cid:durableId="1141581957">
     <w:abstractNumId w:val="4"/>
@@ -13501,7 +15726,7 @@
     <w:abstractNumId w:val="12"/>
   </w:num>
   <w:num w:numId="40" w16cid:durableId="1779983515">
-    <w:abstractNumId w:val="61"/>
+    <w:abstractNumId w:val="62"/>
   </w:num>
   <w:num w:numId="41" w16cid:durableId="684676877">
     <w:abstractNumId w:val="15"/>
@@ -13510,7 +15735,7 @@
     <w:abstractNumId w:val="6"/>
   </w:num>
   <w:num w:numId="43" w16cid:durableId="455683025">
-    <w:abstractNumId w:val="60"/>
+    <w:abstractNumId w:val="61"/>
   </w:num>
   <w:num w:numId="44" w16cid:durableId="253244846">
     <w:abstractNumId w:val="9"/>
@@ -13549,7 +15774,7 @@
     <w:abstractNumId w:val="32"/>
   </w:num>
   <w:num w:numId="56" w16cid:durableId="718819144">
-    <w:abstractNumId w:val="59"/>
+    <w:abstractNumId w:val="60"/>
   </w:num>
   <w:num w:numId="57" w16cid:durableId="1794666917">
     <w:abstractNumId w:val="45"/>
@@ -13574,6 +15799,9 @@
   </w:num>
   <w:num w:numId="64" w16cid:durableId="584072047">
     <w:abstractNumId w:val="36"/>
+  </w:num>
+  <w:num w:numId="65" w16cid:durableId="870146807">
+    <w:abstractNumId w:val="59"/>
   </w:num>
 </w:numbering>
 </file>

</xml_diff>

<commit_message>
- Se añaden cuaderno de limpieza del proyecto. - Se añade script con selección, limpieza, construcción y formateo de datos para pipeline. - Se actualiza el pipeline con la etapa de preprocesado (el descrito en el punto anterior) - Memoria del proyecto actualizada sobre sección de preparación de los datos. Actividad Práctica 1 lista. Closes #9 #10 #11 #13
</commit_message>
<xml_diff>
--- a/docs/13MBID - 0CT25-26 - Memoria de trabajo - Proyecto.docx
+++ b/docs/13MBID - 0CT25-26 - Memoria de trabajo - Proyecto.docx
@@ -38,30 +38,8 @@
         <w:rPr>
           <w:rFonts w:ascii="Calibri" w:eastAsia="Calibri" w:hAnsi="Calibri" w:cs="Calibri"/>
         </w:rPr>
-        <w:t xml:space="preserve"> en la integración planteada con </w:t>
-      </w:r>
-      <w:proofErr w:type="spellStart"/>
-      <w:r>
-        <w:rPr>
-          <w:rFonts w:ascii="Calibri" w:eastAsia="Calibri" w:hAnsi="Calibri" w:cs="Calibri"/>
-        </w:rPr>
-        <w:t>DataOps</w:t>
-      </w:r>
-      <w:proofErr w:type="spellEnd"/>
-      <w:r>
-        <w:rPr>
-          <w:rFonts w:ascii="Calibri" w:eastAsia="Calibri" w:hAnsi="Calibri" w:cs="Calibri"/>
-        </w:rPr>
-        <w:t xml:space="preserve"> y </w:t>
-      </w:r>
-      <w:proofErr w:type="spellStart"/>
-      <w:r>
-        <w:rPr>
-          <w:rFonts w:ascii="Calibri" w:eastAsia="Calibri" w:hAnsi="Calibri" w:cs="Calibri"/>
-        </w:rPr>
-        <w:t>MLOps</w:t>
-      </w:r>
-      <w:proofErr w:type="spellEnd"/>
+        <w:t xml:space="preserve"> en la integración planteada con DataOps y MLOps</w:t>
+      </w:r>
       <w:r>
         <w:rPr>
           <w:rFonts w:ascii="Calibri" w:eastAsia="Calibri" w:hAnsi="Calibri" w:cs="Calibri"/>
@@ -530,15 +508,7 @@
     </w:p>
     <w:p>
       <w:r>
-        <w:t xml:space="preserve">Se cuenta, para esta segunda etapa, con los archivos de la experimentación que han sido generados para el proyecto durante la construcción de la primera versión de su producto resultante (el modelo de predicción) y los resultados de su utilización en un nuevo </w:t>
-      </w:r>
-      <w:proofErr w:type="spellStart"/>
-      <w:r>
-        <w:t>dataset</w:t>
-      </w:r>
-      <w:proofErr w:type="spellEnd"/>
-      <w:r>
-        <w:t>.</w:t>
+        <w:t>Se cuenta, para esta segunda etapa, con los archivos de la experimentación que han sido generados para el proyecto durante la construcción de la primera versión de su producto resultante (el modelo de predicción) y los resultados de su utilización en un nuevo dataset.</w:t>
       </w:r>
     </w:p>
     <w:p>
@@ -680,55 +650,7 @@
           <w:rFonts w:ascii="Calibri" w:eastAsia="Calibri" w:hAnsi="Calibri" w:cs="Calibri"/>
           <w:color w:val="000000" w:themeColor="text1"/>
         </w:rPr>
-        <w:t xml:space="preserve">Implementar prácticas originadas en los modelos de </w:t>
-      </w:r>
-      <w:proofErr w:type="spellStart"/>
-      <w:r>
-        <w:rPr>
-          <w:rFonts w:ascii="Calibri" w:eastAsia="Calibri" w:hAnsi="Calibri" w:cs="Calibri"/>
-          <w:color w:val="000000" w:themeColor="text1"/>
-        </w:rPr>
-        <w:t>DataOps</w:t>
-      </w:r>
-      <w:proofErr w:type="spellEnd"/>
-      <w:r>
-        <w:rPr>
-          <w:rFonts w:ascii="Calibri" w:eastAsia="Calibri" w:hAnsi="Calibri" w:cs="Calibri"/>
-          <w:color w:val="000000" w:themeColor="text1"/>
-        </w:rPr>
-        <w:t xml:space="preserve"> y </w:t>
-      </w:r>
-      <w:proofErr w:type="spellStart"/>
-      <w:r>
-        <w:rPr>
-          <w:rFonts w:ascii="Calibri" w:eastAsia="Calibri" w:hAnsi="Calibri" w:cs="Calibri"/>
-          <w:color w:val="000000" w:themeColor="text1"/>
-        </w:rPr>
-        <w:t>MLOps</w:t>
-      </w:r>
-      <w:proofErr w:type="spellEnd"/>
-      <w:r>
-        <w:rPr>
-          <w:rFonts w:ascii="Calibri" w:eastAsia="Calibri" w:hAnsi="Calibri" w:cs="Calibri"/>
-          <w:color w:val="000000" w:themeColor="text1"/>
-        </w:rPr>
-        <w:t xml:space="preserve"> para automatizar ciertas cuestiones del proyecto y permitir la replicación de los resultados </w:t>
-      </w:r>
-      <w:proofErr w:type="gramStart"/>
-      <w:r>
-        <w:rPr>
-          <w:rFonts w:ascii="Calibri" w:eastAsia="Calibri" w:hAnsi="Calibri" w:cs="Calibri"/>
-          <w:color w:val="000000" w:themeColor="text1"/>
-        </w:rPr>
-        <w:t>del mismo</w:t>
-      </w:r>
-      <w:proofErr w:type="gramEnd"/>
-      <w:r>
-        <w:rPr>
-          <w:rFonts w:ascii="Calibri" w:eastAsia="Calibri" w:hAnsi="Calibri" w:cs="Calibri"/>
-          <w:color w:val="000000" w:themeColor="text1"/>
-        </w:rPr>
-        <w:t xml:space="preserve"> a lo largo del tiempo.</w:t>
+        <w:t>Implementar prácticas originadas en los modelos de DataOps y MLOps para automatizar ciertas cuestiones del proyecto y permitir la replicación de los resultados del mismo a lo largo del tiempo.</w:t>
       </w:r>
     </w:p>
     <w:p>
@@ -767,15 +689,7 @@
         </w:rPr>
       </w:pPr>
       <w:r>
-        <w:t xml:space="preserve">Definir plan del proyecto (tareas, recursos, </w:t>
-      </w:r>
-      <w:proofErr w:type="spellStart"/>
-      <w:r>
-        <w:t>etc</w:t>
-      </w:r>
-      <w:proofErr w:type="spellEnd"/>
-      <w:r>
-        <w:t>)</w:t>
+        <w:t>Definir plan del proyecto (tareas, recursos, etc)</w:t>
       </w:r>
     </w:p>
     <w:p/>
@@ -835,15 +749,7 @@
         </w:numPr>
       </w:pPr>
       <w:r>
-        <w:t xml:space="preserve">Resultados parciales sobre un </w:t>
-      </w:r>
-      <w:proofErr w:type="spellStart"/>
-      <w:r>
-        <w:t>dataset</w:t>
-      </w:r>
-      <w:proofErr w:type="spellEnd"/>
-      <w:r>
-        <w:t xml:space="preserve"> nuevo</w:t>
+        <w:t>Resultados parciales sobre un dataset nuevo</w:t>
       </w:r>
     </w:p>
     <w:p>
@@ -891,23 +797,7 @@
     </w:p>
     <w:p>
       <w:r>
-        <w:t xml:space="preserve">A continuación, se agregan los enlaces relacionados con la gestión de tareas del proyecto en </w:t>
-      </w:r>
-      <w:proofErr w:type="spellStart"/>
-      <w:r>
-        <w:t>Github</w:t>
-      </w:r>
-      <w:proofErr w:type="spellEnd"/>
-      <w:r>
-        <w:t xml:space="preserve"> </w:t>
-      </w:r>
-      <w:proofErr w:type="spellStart"/>
-      <w:r>
-        <w:t>Projects</w:t>
-      </w:r>
-      <w:proofErr w:type="spellEnd"/>
-      <w:r>
-        <w:t>, así como al repositorio donde se encuentran los archivos. Adicionalmente, se añaden evidencias del tablero de backlog generado:</w:t>
+        <w:t>A continuación, se agregan los enlaces relacionados con la gestión de tareas del proyecto en Github Projects, así como al repositorio donde se encuentran los archivos. Adicionalmente, se añaden evidencias del tablero de backlog generado:</w:t>
       </w:r>
     </w:p>
     <w:p>
@@ -921,19 +811,11 @@
           <w:lang w:val="en-GB"/>
         </w:rPr>
       </w:pPr>
-      <w:proofErr w:type="spellStart"/>
       <w:r>
         <w:rPr>
           <w:lang w:val="en-GB"/>
         </w:rPr>
-        <w:t>Github</w:t>
-      </w:r>
-      <w:proofErr w:type="spellEnd"/>
-      <w:r>
-        <w:rPr>
-          <w:lang w:val="en-GB"/>
-        </w:rPr>
-        <w:t xml:space="preserve"> P</w:t>
+        <w:t>Github P</w:t>
       </w:r>
       <w:r>
         <w:rPr>
@@ -962,13 +844,8 @@
       <w:r>
         <w:t xml:space="preserve">Repositorio </w:t>
       </w:r>
-      <w:proofErr w:type="spellStart"/>
-      <w:r>
-        <w:t>Github</w:t>
-      </w:r>
-      <w:proofErr w:type="spellEnd"/>
-      <w:r>
-        <w:t xml:space="preserve">: </w:t>
+      <w:r>
+        <w:t xml:space="preserve">Github: </w:t>
       </w:r>
       <w:hyperlink r:id="rId10" w:history="1">
         <w:r>
@@ -1103,11 +980,9 @@
       <w:r>
         <w:t xml:space="preserve">un </w:t>
       </w:r>
-      <w:proofErr w:type="spellStart"/>
       <w:r>
         <w:t>dataset</w:t>
       </w:r>
-      <w:proofErr w:type="spellEnd"/>
       <w:r>
         <w:t xml:space="preserve"> </w:t>
       </w:r>
@@ -1142,13 +1017,8 @@
         <w:t xml:space="preserve"> </w:t>
       </w:r>
       <w:r>
-        <w:t>en formato .</w:t>
-      </w:r>
-      <w:proofErr w:type="spellStart"/>
-      <w:r>
-        <w:t>csv</w:t>
-      </w:r>
-      <w:proofErr w:type="spellEnd"/>
+        <w:t>en formato .csv</w:t>
+      </w:r>
       <w:r>
         <w:t xml:space="preserve"> con las siguientes características</w:t>
       </w:r>
@@ -1264,23 +1134,7 @@
           <w:rFonts w:ascii="Calibri" w:eastAsia="Calibri" w:hAnsi="Calibri" w:cs="Calibri"/>
           <w:color w:val="000000" w:themeColor="text1"/>
         </w:rPr>
-        <w:t xml:space="preserve">Se han versionado los dos </w:t>
-      </w:r>
-      <w:proofErr w:type="spellStart"/>
-      <w:r>
-        <w:rPr>
-          <w:rFonts w:ascii="Calibri" w:eastAsia="Calibri" w:hAnsi="Calibri" w:cs="Calibri"/>
-          <w:color w:val="000000" w:themeColor="text1"/>
-        </w:rPr>
-        <w:t>datasets</w:t>
-      </w:r>
-      <w:proofErr w:type="spellEnd"/>
-      <w:r>
-        <w:rPr>
-          <w:rFonts w:ascii="Calibri" w:eastAsia="Calibri" w:hAnsi="Calibri" w:cs="Calibri"/>
-          <w:color w:val="000000" w:themeColor="text1"/>
-        </w:rPr>
-        <w:t xml:space="preserve"> iniciales (completo y datos nuevos sin etiquetar) utilizando la librería DVC.</w:t>
+        <w:t>Se han versionado los dos datasets iniciales (completo y datos nuevos sin etiquetar) utilizando la librería DVC.</w:t>
       </w:r>
     </w:p>
     <w:p>
@@ -1342,15 +1196,7 @@
         <w:t>l</w:t>
       </w:r>
       <w:r>
-        <w:t xml:space="preserve"> </w:t>
-      </w:r>
-      <w:proofErr w:type="spellStart"/>
-      <w:r>
-        <w:t>dataset</w:t>
-      </w:r>
-      <w:proofErr w:type="spellEnd"/>
-      <w:r>
-        <w:t>:</w:t>
+        <w:t xml:space="preserve"> dataset:</w:t>
       </w:r>
     </w:p>
     <w:p>
@@ -1379,13 +1225,8 @@
           <w:numId w:val="28"/>
         </w:numPr>
       </w:pPr>
-      <w:proofErr w:type="spellStart"/>
-      <w:r>
-        <w:t>age</w:t>
-      </w:r>
-      <w:proofErr w:type="spellEnd"/>
-      <w:r>
-        <w:t>: edad (numérica)</w:t>
+      <w:r>
+        <w:t>age: edad (numérica)</w:t>
       </w:r>
     </w:p>
     <w:p>
@@ -1403,49 +1244,7 @@
         <w:rPr>
           <w:lang w:val="en-US"/>
         </w:rPr>
-        <w:t xml:space="preserve">job: </w:t>
-      </w:r>
-      <w:proofErr w:type="spellStart"/>
-      <w:r>
-        <w:rPr>
-          <w:lang w:val="en-US"/>
-        </w:rPr>
-        <w:t>tipo</w:t>
-      </w:r>
-      <w:proofErr w:type="spellEnd"/>
-      <w:r>
-        <w:rPr>
-          <w:lang w:val="en-US"/>
-        </w:rPr>
-        <w:t xml:space="preserve"> de </w:t>
-      </w:r>
-      <w:proofErr w:type="spellStart"/>
-      <w:r>
-        <w:rPr>
-          <w:lang w:val="en-US"/>
-        </w:rPr>
-        <w:t>trabajo</w:t>
-      </w:r>
-      <w:proofErr w:type="spellEnd"/>
-      <w:r>
-        <w:rPr>
-          <w:lang w:val="en-US"/>
-        </w:rPr>
-        <w:t xml:space="preserve"> (</w:t>
-      </w:r>
-      <w:proofErr w:type="spellStart"/>
-      <w:r>
-        <w:rPr>
-          <w:lang w:val="en-US"/>
-        </w:rPr>
-        <w:t>categórica</w:t>
-      </w:r>
-      <w:proofErr w:type="spellEnd"/>
-      <w:r>
-        <w:rPr>
-          <w:lang w:val="en-US"/>
-        </w:rPr>
-        <w:t>: admin., blue-collar, entrepreneur, housemaid, management, retired, self-employed, services, student, technician, unemployed, unknown)</w:t>
+        <w:t>job: tipo de trabajo (categórica: admin., blue-collar, entrepreneur, housemaid, management, retired, self-employed, services, student, technician, unemployed, unknown)</w:t>
       </w:r>
     </w:p>
     <w:p>
@@ -1463,35 +1262,7 @@
         <w:rPr>
           <w:lang w:val="en-US"/>
         </w:rPr>
-        <w:t xml:space="preserve">marital: </w:t>
-      </w:r>
-      <w:proofErr w:type="spellStart"/>
-      <w:r>
-        <w:rPr>
-          <w:lang w:val="en-US"/>
-        </w:rPr>
-        <w:t>estado</w:t>
-      </w:r>
-      <w:proofErr w:type="spellEnd"/>
-      <w:r>
-        <w:rPr>
-          <w:lang w:val="en-US"/>
-        </w:rPr>
-        <w:t xml:space="preserve"> civil (</w:t>
-      </w:r>
-      <w:proofErr w:type="spellStart"/>
-      <w:r>
-        <w:rPr>
-          <w:lang w:val="en-US"/>
-        </w:rPr>
-        <w:t>categórica</w:t>
-      </w:r>
-      <w:proofErr w:type="spellEnd"/>
-      <w:r>
-        <w:rPr>
-          <w:lang w:val="en-US"/>
-        </w:rPr>
-        <w:t>: divorced, married, single, unknown)</w:t>
+        <w:t>marital: estado civil (categórica: divorced, married, single, unknown)</w:t>
       </w:r>
     </w:p>
     <w:p>
@@ -1509,97 +1280,7 @@
         <w:rPr>
           <w:lang w:val="en-GB"/>
         </w:rPr>
-        <w:t xml:space="preserve">education: </w:t>
-      </w:r>
-      <w:proofErr w:type="spellStart"/>
-      <w:r>
-        <w:rPr>
-          <w:lang w:val="en-GB"/>
-        </w:rPr>
-        <w:t>nivel</w:t>
-      </w:r>
-      <w:proofErr w:type="spellEnd"/>
-      <w:r>
-        <w:rPr>
-          <w:lang w:val="en-GB"/>
-        </w:rPr>
-        <w:t xml:space="preserve"> </w:t>
-      </w:r>
-      <w:proofErr w:type="spellStart"/>
-      <w:r>
-        <w:rPr>
-          <w:lang w:val="en-GB"/>
-        </w:rPr>
-        <w:t>educativo</w:t>
-      </w:r>
-      <w:proofErr w:type="spellEnd"/>
-      <w:r>
-        <w:rPr>
-          <w:lang w:val="en-GB"/>
-        </w:rPr>
-        <w:t xml:space="preserve"> (</w:t>
-      </w:r>
-      <w:proofErr w:type="spellStart"/>
-      <w:r>
-        <w:rPr>
-          <w:lang w:val="en-GB"/>
-        </w:rPr>
-        <w:t>categórica</w:t>
-      </w:r>
-      <w:proofErr w:type="spellEnd"/>
-      <w:r>
-        <w:rPr>
-          <w:lang w:val="en-GB"/>
-        </w:rPr>
-        <w:t xml:space="preserve">: basic.4y, basic.6y, basic.9y, </w:t>
-      </w:r>
-      <w:proofErr w:type="spellStart"/>
-      <w:proofErr w:type="gramStart"/>
-      <w:r>
-        <w:rPr>
-          <w:lang w:val="en-GB"/>
-        </w:rPr>
-        <w:t>high.school</w:t>
-      </w:r>
-      <w:proofErr w:type="spellEnd"/>
-      <w:proofErr w:type="gramEnd"/>
-      <w:r>
-        <w:rPr>
-          <w:lang w:val="en-GB"/>
-        </w:rPr>
-        <w:t xml:space="preserve">, illiterate, </w:t>
-      </w:r>
-      <w:proofErr w:type="spellStart"/>
-      <w:proofErr w:type="gramStart"/>
-      <w:r>
-        <w:rPr>
-          <w:lang w:val="en-GB"/>
-        </w:rPr>
-        <w:t>professional.course</w:t>
-      </w:r>
-      <w:proofErr w:type="spellEnd"/>
-      <w:proofErr w:type="gramEnd"/>
-      <w:r>
-        <w:rPr>
-          <w:lang w:val="en-GB"/>
-        </w:rPr>
-        <w:t xml:space="preserve">, </w:t>
-      </w:r>
-      <w:proofErr w:type="spellStart"/>
-      <w:proofErr w:type="gramStart"/>
-      <w:r>
-        <w:rPr>
-          <w:lang w:val="en-GB"/>
-        </w:rPr>
-        <w:t>university.degree</w:t>
-      </w:r>
-      <w:proofErr w:type="spellEnd"/>
-      <w:proofErr w:type="gramEnd"/>
-      <w:r>
-        <w:rPr>
-          <w:lang w:val="en-GB"/>
-        </w:rPr>
-        <w:t>, unknown)</w:t>
+        <w:t>education: nivel educativo (categórica: basic.4y, basic.6y, basic.9y, high.school, illiterate, professional.course, university.degree, unknown)</w:t>
       </w:r>
     </w:p>
     <w:p>
@@ -1611,15 +1292,7 @@
         </w:numPr>
       </w:pPr>
       <w:r>
-        <w:t xml:space="preserve">default: ¿tiene créditos en default? (yes, no, </w:t>
-      </w:r>
-      <w:proofErr w:type="spellStart"/>
-      <w:r>
-        <w:t>unknown</w:t>
-      </w:r>
-      <w:proofErr w:type="spellEnd"/>
-      <w:r>
-        <w:t>)</w:t>
+        <w:t>default: ¿tiene créditos en default? (yes, no, unknown)</w:t>
       </w:r>
     </w:p>
     <w:p>
@@ -1630,21 +1303,8 @@
           <w:numId w:val="28"/>
         </w:numPr>
       </w:pPr>
-      <w:proofErr w:type="spellStart"/>
-      <w:r>
-        <w:t>housing</w:t>
-      </w:r>
-      <w:proofErr w:type="spellEnd"/>
-      <w:r>
-        <w:t xml:space="preserve">: ¿tiene préstamo hipotecario? (yes, no, </w:t>
-      </w:r>
-      <w:proofErr w:type="spellStart"/>
-      <w:r>
-        <w:t>unknown</w:t>
-      </w:r>
-      <w:proofErr w:type="spellEnd"/>
-      <w:r>
-        <w:t>)</w:t>
+      <w:r>
+        <w:t>housing: ¿tiene préstamo hipotecario? (yes, no, unknown)</w:t>
       </w:r>
     </w:p>
     <w:p>
@@ -1656,15 +1316,7 @@
         </w:numPr>
       </w:pPr>
       <w:r>
-        <w:t xml:space="preserve">loan: ¿tiene préstamo personal? (yes, no, </w:t>
-      </w:r>
-      <w:proofErr w:type="spellStart"/>
-      <w:r>
-        <w:t>unknown</w:t>
-      </w:r>
-      <w:proofErr w:type="spellEnd"/>
-      <w:r>
-        <w:t>)</w:t>
+        <w:t>loan: ¿tiene préstamo personal? (yes, no, unknown)</w:t>
       </w:r>
     </w:p>
     <w:p>
@@ -1690,29 +1342,8 @@
           <w:numId w:val="27"/>
         </w:numPr>
       </w:pPr>
-      <w:proofErr w:type="spellStart"/>
-      <w:r>
-        <w:t>contact</w:t>
-      </w:r>
-      <w:proofErr w:type="spellEnd"/>
-      <w:r>
-        <w:t>: tipo de contacto (</w:t>
-      </w:r>
-      <w:proofErr w:type="spellStart"/>
-      <w:r>
-        <w:t>cellular</w:t>
-      </w:r>
-      <w:proofErr w:type="spellEnd"/>
-      <w:r>
-        <w:t xml:space="preserve">, </w:t>
-      </w:r>
-      <w:proofErr w:type="spellStart"/>
-      <w:r>
-        <w:t>telephone</w:t>
-      </w:r>
-      <w:proofErr w:type="spellEnd"/>
-      <w:r>
-        <w:t xml:space="preserve">) </w:t>
+      <w:r>
+        <w:t xml:space="preserve">contact: tipo de contacto (cellular, telephone) </w:t>
       </w:r>
     </w:p>
     <w:p>
@@ -1723,29 +1354,8 @@
           <w:numId w:val="27"/>
         </w:numPr>
       </w:pPr>
-      <w:proofErr w:type="spellStart"/>
-      <w:r>
-        <w:t>month</w:t>
-      </w:r>
-      <w:proofErr w:type="spellEnd"/>
-      <w:r>
-        <w:t>: mes del último contacto (</w:t>
-      </w:r>
-      <w:proofErr w:type="spellStart"/>
-      <w:r>
-        <w:t>jan</w:t>
-      </w:r>
-      <w:proofErr w:type="spellEnd"/>
-      <w:r>
-        <w:t xml:space="preserve">, feb, mar, …, nov, </w:t>
-      </w:r>
-      <w:proofErr w:type="spellStart"/>
-      <w:r>
-        <w:t>dec</w:t>
-      </w:r>
-      <w:proofErr w:type="spellEnd"/>
-      <w:r>
-        <w:t xml:space="preserve">) </w:t>
+      <w:r>
+        <w:t xml:space="preserve">month: mes del último contacto (jan, feb, mar, …, nov, dec) </w:t>
       </w:r>
     </w:p>
     <w:p>
@@ -1759,89 +1369,11 @@
           <w:lang w:val="en-GB"/>
         </w:rPr>
       </w:pPr>
-      <w:proofErr w:type="spellStart"/>
       <w:r>
         <w:rPr>
           <w:lang w:val="en-GB"/>
         </w:rPr>
-        <w:t>day_of_week</w:t>
-      </w:r>
-      <w:proofErr w:type="spellEnd"/>
-      <w:r>
-        <w:rPr>
-          <w:lang w:val="en-GB"/>
-        </w:rPr>
-        <w:t xml:space="preserve">: día de la </w:t>
-      </w:r>
-      <w:proofErr w:type="spellStart"/>
-      <w:r>
-        <w:rPr>
-          <w:lang w:val="en-GB"/>
-        </w:rPr>
-        <w:t>semana</w:t>
-      </w:r>
-      <w:proofErr w:type="spellEnd"/>
-      <w:r>
-        <w:rPr>
-          <w:lang w:val="en-GB"/>
-        </w:rPr>
-        <w:t xml:space="preserve"> (</w:t>
-      </w:r>
-      <w:proofErr w:type="spellStart"/>
-      <w:r>
-        <w:rPr>
-          <w:lang w:val="en-GB"/>
-        </w:rPr>
-        <w:t>mon</w:t>
-      </w:r>
-      <w:proofErr w:type="spellEnd"/>
-      <w:r>
-        <w:rPr>
-          <w:lang w:val="en-GB"/>
-        </w:rPr>
-        <w:t xml:space="preserve">, </w:t>
-      </w:r>
-      <w:proofErr w:type="spellStart"/>
-      <w:r>
-        <w:rPr>
-          <w:lang w:val="en-GB"/>
-        </w:rPr>
-        <w:t>tue</w:t>
-      </w:r>
-      <w:proofErr w:type="spellEnd"/>
-      <w:r>
-        <w:rPr>
-          <w:lang w:val="en-GB"/>
-        </w:rPr>
-        <w:t xml:space="preserve">, wed, </w:t>
-      </w:r>
-      <w:proofErr w:type="spellStart"/>
-      <w:r>
-        <w:rPr>
-          <w:lang w:val="en-GB"/>
-        </w:rPr>
-        <w:t>thu</w:t>
-      </w:r>
-      <w:proofErr w:type="spellEnd"/>
-      <w:r>
-        <w:rPr>
-          <w:lang w:val="en-GB"/>
-        </w:rPr>
-        <w:t xml:space="preserve">, </w:t>
-      </w:r>
-      <w:proofErr w:type="spellStart"/>
-      <w:r>
-        <w:rPr>
-          <w:lang w:val="en-GB"/>
-        </w:rPr>
-        <w:t>fri</w:t>
-      </w:r>
-      <w:proofErr w:type="spellEnd"/>
-      <w:r>
-        <w:rPr>
-          <w:lang w:val="en-GB"/>
-        </w:rPr>
-        <w:t xml:space="preserve">) </w:t>
+        <w:t xml:space="preserve">day_of_week: día de la semana (mon, tue, wed, thu, fri) </w:t>
       </w:r>
     </w:p>
     <w:p>
@@ -1852,13 +1384,8 @@
           <w:numId w:val="27"/>
         </w:numPr>
       </w:pPr>
-      <w:proofErr w:type="spellStart"/>
-      <w:r>
-        <w:t>duration</w:t>
-      </w:r>
-      <w:proofErr w:type="spellEnd"/>
-      <w:r>
-        <w:t xml:space="preserve">: duración del último contacto en segundos (numérica) </w:t>
+      <w:r>
+        <w:t xml:space="preserve">duration: duración del último contacto en segundos (numérica) </w:t>
       </w:r>
     </w:p>
     <w:p>
@@ -1889,14 +1416,9 @@
           <w:numId w:val="26"/>
         </w:numPr>
       </w:pPr>
-      <w:proofErr w:type="spellStart"/>
       <w:r>
         <w:lastRenderedPageBreak/>
-        <w:t>campaign</w:t>
-      </w:r>
-      <w:proofErr w:type="spellEnd"/>
-      <w:r>
-        <w:t xml:space="preserve">: número de contactos en esta campaña (numérica) </w:t>
+        <w:t xml:space="preserve">campaign: número de contactos en esta campaña (numérica) </w:t>
       </w:r>
     </w:p>
     <w:p>
@@ -1907,13 +1429,8 @@
           <w:numId w:val="26"/>
         </w:numPr>
       </w:pPr>
-      <w:proofErr w:type="spellStart"/>
-      <w:r>
-        <w:t>pdays</w:t>
-      </w:r>
-      <w:proofErr w:type="spellEnd"/>
-      <w:r>
-        <w:t xml:space="preserve">: días transcurridos desde el último contacto en campañas anteriores (numérica; 999 = nunca contactado) </w:t>
+      <w:r>
+        <w:t xml:space="preserve">pdays: días transcurridos desde el último contacto en campañas anteriores (numérica; 999 = nunca contactado) </w:t>
       </w:r>
     </w:p>
     <w:p>
@@ -1924,13 +1441,8 @@
           <w:numId w:val="26"/>
         </w:numPr>
       </w:pPr>
-      <w:proofErr w:type="spellStart"/>
-      <w:r>
-        <w:t>previous</w:t>
-      </w:r>
-      <w:proofErr w:type="spellEnd"/>
-      <w:r>
-        <w:t xml:space="preserve">: número de contactos previos a esta campaña (numérica) </w:t>
+      <w:r>
+        <w:t xml:space="preserve">previous: número de contactos previos a esta campaña (numérica) </w:t>
       </w:r>
     </w:p>
     <w:p>
@@ -1941,37 +1453,8 @@
           <w:numId w:val="26"/>
         </w:numPr>
       </w:pPr>
-      <w:proofErr w:type="spellStart"/>
-      <w:r>
-        <w:t>poutcome</w:t>
-      </w:r>
-      <w:proofErr w:type="spellEnd"/>
-      <w:r>
-        <w:t>: resultado de la campaña anterior (</w:t>
-      </w:r>
-      <w:proofErr w:type="spellStart"/>
-      <w:r>
-        <w:t>failure</w:t>
-      </w:r>
-      <w:proofErr w:type="spellEnd"/>
-      <w:r>
-        <w:t xml:space="preserve">, </w:t>
-      </w:r>
-      <w:proofErr w:type="spellStart"/>
-      <w:r>
-        <w:t>nonexistent</w:t>
-      </w:r>
-      <w:proofErr w:type="spellEnd"/>
-      <w:r>
-        <w:t xml:space="preserve">, </w:t>
-      </w:r>
-      <w:proofErr w:type="spellStart"/>
-      <w:r>
-        <w:t>success</w:t>
-      </w:r>
-      <w:proofErr w:type="spellEnd"/>
-      <w:r>
-        <w:t xml:space="preserve">) </w:t>
+      <w:r>
+        <w:t xml:space="preserve">poutcome: resultado de la campaña anterior (failure, nonexistent, success) </w:t>
       </w:r>
     </w:p>
     <w:p>
@@ -1997,15 +1480,8 @@
           <w:numId w:val="25"/>
         </w:numPr>
       </w:pPr>
-      <w:proofErr w:type="spellStart"/>
-      <w:proofErr w:type="gramStart"/>
-      <w:r>
-        <w:t>emp.var.rate</w:t>
-      </w:r>
-      <w:proofErr w:type="spellEnd"/>
-      <w:proofErr w:type="gramEnd"/>
-      <w:r>
-        <w:t xml:space="preserve">: tasa de variación del empleo – indicador trimestral (numérica) </w:t>
+      <w:r>
+        <w:t xml:space="preserve">emp.var.rate: tasa de variación del empleo – indicador trimestral (numérica) </w:t>
       </w:r>
     </w:p>
     <w:p>
@@ -2016,13 +1492,8 @@
           <w:numId w:val="25"/>
         </w:numPr>
       </w:pPr>
-      <w:proofErr w:type="spellStart"/>
-      <w:r>
-        <w:t>cons.price.idx</w:t>
-      </w:r>
-      <w:proofErr w:type="spellEnd"/>
-      <w:r>
-        <w:t xml:space="preserve">: índice de precios al consumidor – indicador mensual (numérica) </w:t>
+      <w:r>
+        <w:t xml:space="preserve">cons.price.idx: índice de precios al consumidor – indicador mensual (numérica) </w:t>
       </w:r>
     </w:p>
     <w:p>
@@ -2033,13 +1504,8 @@
           <w:numId w:val="25"/>
         </w:numPr>
       </w:pPr>
-      <w:proofErr w:type="spellStart"/>
-      <w:r>
-        <w:t>cons.conf.idx</w:t>
-      </w:r>
-      <w:proofErr w:type="spellEnd"/>
-      <w:r>
-        <w:t xml:space="preserve">: índice de confianza del consumidor – indicador mensual (numérica) </w:t>
+      <w:r>
+        <w:t xml:space="preserve">cons.conf.idx: índice de confianza del consumidor – indicador mensual (numérica) </w:t>
       </w:r>
     </w:p>
     <w:p>
@@ -2062,15 +1528,8 @@
           <w:numId w:val="25"/>
         </w:numPr>
       </w:pPr>
-      <w:proofErr w:type="spellStart"/>
-      <w:proofErr w:type="gramStart"/>
-      <w:r>
-        <w:t>nr.employed</w:t>
-      </w:r>
-      <w:proofErr w:type="spellEnd"/>
-      <w:proofErr w:type="gramEnd"/>
-      <w:r>
-        <w:t xml:space="preserve">: número de empleados – indicador trimestral (numérica) </w:t>
+      <w:r>
+        <w:t xml:space="preserve">nr.employed: número de empleados – indicador trimestral (numérica) </w:t>
       </w:r>
     </w:p>
     <w:p>
@@ -2107,15 +1566,7 @@
     </w:p>
     <w:p>
       <w:r>
-        <w:t xml:space="preserve">Se mantiene sin cambios el </w:t>
-      </w:r>
-      <w:proofErr w:type="spellStart"/>
-      <w:r>
-        <w:t>dataset</w:t>
-      </w:r>
-      <w:proofErr w:type="spellEnd"/>
-      <w:r>
-        <w:t xml:space="preserve"> del proyecto.</w:t>
+        <w:t>Se mantiene sin cambios el dataset del proyecto.</w:t>
       </w:r>
     </w:p>
     <w:p>
@@ -2140,15 +1591,7 @@
     <w:p/>
     <w:p>
       <w:r>
-        <w:t xml:space="preserve">En la exploración inicial se ha identificado principalmente un marcado desbalance en el atributo </w:t>
-      </w:r>
-      <w:proofErr w:type="gramStart"/>
-      <w:r>
-        <w:t>target</w:t>
-      </w:r>
-      <w:proofErr w:type="gramEnd"/>
-      <w:r>
-        <w:t>, este refleja que muy pocos clientes aceptan la apertura de un depósito a plazo.</w:t>
+        <w:t>En la exploración inicial se ha identificado principalmente un marcado desbalance en el atributo target, este refleja que muy pocos clientes aceptan la apertura de un depósito a plazo.</w:t>
       </w:r>
     </w:p>
     <w:p>
@@ -2200,21 +1643,12 @@
       <w:r>
         <w:t xml:space="preserve">genera gráficos en el directorio </w:t>
       </w:r>
-      <w:proofErr w:type="spellStart"/>
       <w:r>
         <w:rPr>
           <w:b/>
           <w:bCs/>
         </w:rPr>
-        <w:t>docs</w:t>
-      </w:r>
-      <w:proofErr w:type="spellEnd"/>
-      <w:r>
-        <w:rPr>
-          <w:b/>
-          <w:bCs/>
-        </w:rPr>
-        <w:t>/figures</w:t>
+        <w:t>docs/figures</w:t>
       </w:r>
       <w:r>
         <w:t xml:space="preserve"> del repositorio.</w:t>
@@ -2317,15 +1751,7 @@
         </w:numPr>
       </w:pPr>
       <w:r>
-        <w:t>Distribución de valores del atributo “</w:t>
-      </w:r>
-      <w:proofErr w:type="spellStart"/>
-      <w:r>
-        <w:t>education</w:t>
-      </w:r>
-      <w:proofErr w:type="spellEnd"/>
-      <w:r>
-        <w:t>” (nivel educativo alcanzado)</w:t>
+        <w:t>Distribución de valores del atributo “education” (nivel educativo alcanzado)</w:t>
       </w:r>
     </w:p>
     <w:p>
@@ -2390,15 +1816,7 @@
       </w:pPr>
       <w:r>
         <w:lastRenderedPageBreak/>
-        <w:t>Distribución de los valores del atributo ‘</w:t>
-      </w:r>
-      <w:proofErr w:type="spellStart"/>
-      <w:r>
-        <w:t>job</w:t>
-      </w:r>
-      <w:proofErr w:type="spellEnd"/>
-      <w:r>
-        <w:t>’ (tipo de trabajo)</w:t>
+        <w:t>Distribución de los valores del atributo ‘job’ (tipo de trabajo)</w:t>
       </w:r>
     </w:p>
     <w:p>
@@ -2521,15 +1939,7 @@
       </w:pPr>
       <w:r>
         <w:lastRenderedPageBreak/>
-        <w:t>Distribución del atributo ‘</w:t>
-      </w:r>
-      <w:proofErr w:type="spellStart"/>
-      <w:r>
-        <w:t>housing</w:t>
-      </w:r>
-      <w:proofErr w:type="spellEnd"/>
-      <w:r>
-        <w:t>’ (préstamos hipotecarios)</w:t>
+        <w:t>Distribución del atributo ‘housing’ (préstamos hipotecarios)</w:t>
       </w:r>
     </w:p>
     <w:p>
@@ -2589,13 +1999,8 @@
         </w:numPr>
       </w:pPr>
       <w:r>
-        <w:t xml:space="preserve">Matriz de correlación entre variables del </w:t>
-      </w:r>
-      <w:proofErr w:type="spellStart"/>
-      <w:r>
-        <w:t>dataset</w:t>
-      </w:r>
-      <w:proofErr w:type="spellEnd"/>
+        <w:t>Matriz de correlación entre variables del dataset</w:t>
+      </w:r>
     </w:p>
     <w:p>
       <w:r>
@@ -2666,7 +2071,6 @@
       <w:r>
         <w:t xml:space="preserve">(EDA) que queda almacenado en </w:t>
       </w:r>
-      <w:proofErr w:type="spellStart"/>
       <w:r>
         <w:rPr>
           <w:b/>
@@ -2674,23 +2078,13 @@
         </w:rPr>
         <w:t>docs</w:t>
       </w:r>
-      <w:proofErr w:type="spellEnd"/>
       <w:r>
         <w:rPr>
           <w:b/>
           <w:bCs/>
         </w:rPr>
-        <w:t>/</w:t>
-      </w:r>
-      <w:proofErr w:type="spellStart"/>
-      <w:r>
-        <w:rPr>
-          <w:b/>
-          <w:bCs/>
-        </w:rPr>
-        <w:t>reports</w:t>
-      </w:r>
-      <w:proofErr w:type="spellEnd"/>
+        <w:t>/reports</w:t>
+      </w:r>
       <w:r>
         <w:t>, bajo el nombre de “EDA</w:t>
       </w:r>
@@ -2764,7 +2158,6 @@
       <w:r>
         <w:t>Se ha verificado que algunas variables categóricas presentan valores faltantes representados como "</w:t>
       </w:r>
-      <w:proofErr w:type="spellStart"/>
       <w:r>
         <w:rPr>
           <w:b/>
@@ -2772,7 +2165,6 @@
         </w:rPr>
         <w:t>unknown</w:t>
       </w:r>
-      <w:proofErr w:type="spellEnd"/>
       <w:r>
         <w:t xml:space="preserve">". Se ha considerado que esto no es una categoría en sí misma y se determinó que serán considerados como valores nulos. </w:t>
       </w:r>
@@ -2803,15 +2195,7 @@
         <w:t>un umbral de corte para la eliminación de atributos con valores nulos del 20%</w:t>
       </w:r>
       <w:r>
-        <w:t xml:space="preserve"> que fue empleado en la fase siguiente para la limpieza del </w:t>
-      </w:r>
-      <w:proofErr w:type="spellStart"/>
-      <w:r>
-        <w:t>dataset</w:t>
-      </w:r>
-      <w:proofErr w:type="spellEnd"/>
-      <w:r>
-        <w:t>.</w:t>
+        <w:t xml:space="preserve"> que fue empleado en la fase siguiente para la limpieza del dataset.</w:t>
       </w:r>
     </w:p>
     <w:p>
@@ -3036,23 +2420,7 @@
                 <w:rFonts w:ascii="Calibri" w:eastAsia="Calibri" w:hAnsi="Calibri" w:cs="Calibri"/>
                 <w:color w:val="000000" w:themeColor="text1"/>
               </w:rPr>
-              <w:t xml:space="preserve">Grado en el que los datos de un registro tienen valores asociados a cada una de sus columnas y el </w:t>
-            </w:r>
-            <w:proofErr w:type="spellStart"/>
-            <w:r>
-              <w:rPr>
-                <w:rFonts w:ascii="Calibri" w:eastAsia="Calibri" w:hAnsi="Calibri" w:cs="Calibri"/>
-                <w:color w:val="000000" w:themeColor="text1"/>
-              </w:rPr>
-              <w:t>dataset</w:t>
-            </w:r>
-            <w:proofErr w:type="spellEnd"/>
-            <w:r>
-              <w:rPr>
-                <w:rFonts w:ascii="Calibri" w:eastAsia="Calibri" w:hAnsi="Calibri" w:cs="Calibri"/>
-                <w:color w:val="000000" w:themeColor="text1"/>
-              </w:rPr>
-              <w:t xml:space="preserve"> en general aplica el mismo criterio para todas sus filas.</w:t>
+              <w:t>Grado en el que los datos de un registro tienen valores asociados a cada una de sus columnas y el dataset en general aplica el mismo criterio para todas sus filas.</w:t>
             </w:r>
           </w:p>
         </w:tc>
@@ -3279,23 +2647,7 @@
                 <w:rFonts w:ascii="Calibri" w:eastAsia="Calibri" w:hAnsi="Calibri" w:cs="Calibri"/>
                 <w:color w:val="000000" w:themeColor="text1"/>
               </w:rPr>
-              <w:t xml:space="preserve">Composición del </w:t>
-            </w:r>
-            <w:proofErr w:type="spellStart"/>
-            <w:r>
-              <w:rPr>
-                <w:rFonts w:ascii="Calibri" w:eastAsia="Calibri" w:hAnsi="Calibri" w:cs="Calibri"/>
-                <w:color w:val="000000" w:themeColor="text1"/>
-              </w:rPr>
-              <w:t>dataset</w:t>
-            </w:r>
-            <w:proofErr w:type="spellEnd"/>
-            <w:r>
-              <w:rPr>
-                <w:rFonts w:ascii="Calibri" w:eastAsia="Calibri" w:hAnsi="Calibri" w:cs="Calibri"/>
-                <w:color w:val="000000" w:themeColor="text1"/>
-              </w:rPr>
-              <w:t xml:space="preserve"> (cantidad de columnas)</w:t>
+              <w:t>Composición del dataset (cantidad de columnas)</w:t>
             </w:r>
           </w:p>
           <w:p>
@@ -3316,23 +2668,7 @@
                 <w:rFonts w:ascii="Calibri" w:eastAsia="Calibri" w:hAnsi="Calibri" w:cs="Calibri"/>
                 <w:color w:val="000000" w:themeColor="text1"/>
               </w:rPr>
-              <w:t xml:space="preserve">Composición del </w:t>
-            </w:r>
-            <w:proofErr w:type="spellStart"/>
-            <w:r>
-              <w:rPr>
-                <w:rFonts w:ascii="Calibri" w:eastAsia="Calibri" w:hAnsi="Calibri" w:cs="Calibri"/>
-                <w:color w:val="000000" w:themeColor="text1"/>
-              </w:rPr>
-              <w:t>dataset</w:t>
-            </w:r>
-            <w:proofErr w:type="spellEnd"/>
-            <w:r>
-              <w:rPr>
-                <w:rFonts w:ascii="Calibri" w:eastAsia="Calibri" w:hAnsi="Calibri" w:cs="Calibri"/>
-                <w:color w:val="000000" w:themeColor="text1"/>
-              </w:rPr>
-              <w:t xml:space="preserve"> (tipo </w:t>
+              <w:t xml:space="preserve">Composición del dataset (tipo </w:t>
             </w:r>
             <w:r>
               <w:rPr>
@@ -3368,23 +2704,7 @@
               <w:t xml:space="preserve"> semánticamente no negativos</w:t>
             </w:r>
             <w:r>
-              <w:t xml:space="preserve"> como ‘</w:t>
-            </w:r>
-            <w:proofErr w:type="spellStart"/>
-            <w:r>
-              <w:t>age</w:t>
-            </w:r>
-            <w:proofErr w:type="spellEnd"/>
-            <w:r>
-              <w:t>’ o ‘</w:t>
-            </w:r>
-            <w:proofErr w:type="spellStart"/>
-            <w:r>
-              <w:t>duration</w:t>
-            </w:r>
-            <w:proofErr w:type="spellEnd"/>
-            <w:r>
-              <w:t>’.</w:t>
+              <w:t xml:space="preserve"> como ‘age’ o ‘duration’.</w:t>
             </w:r>
           </w:p>
         </w:tc>
@@ -3615,15 +2935,7 @@
               <w:spacing w:after="160" w:line="259" w:lineRule="auto"/>
             </w:pPr>
             <w:r>
-              <w:t>Valores de atributo ‘</w:t>
-            </w:r>
-            <w:proofErr w:type="spellStart"/>
-            <w:r>
-              <w:t>age</w:t>
-            </w:r>
-            <w:proofErr w:type="spellEnd"/>
-            <w:r>
-              <w:t>’ dentro de un rango entre la mayoría de edad</w:t>
+              <w:t>Valores de atributo ‘age’ dentro de un rango entre la mayoría de edad</w:t>
             </w:r>
             <w:r>
               <w:t xml:space="preserve"> (18)</w:t>
@@ -3655,15 +2967,7 @@
               <w:spacing w:after="160" w:line="259" w:lineRule="auto"/>
             </w:pPr>
             <w:r>
-              <w:t>Comprobación de inconsistencias entre variables relacionadas (</w:t>
-            </w:r>
-            <w:proofErr w:type="spellStart"/>
-            <w:r>
-              <w:t>ej</w:t>
-            </w:r>
-            <w:proofErr w:type="spellEnd"/>
-            <w:r>
-              <w:t>:  no contactado, pero duración de llamada mayor que 0).</w:t>
+              <w:t>Comprobación de inconsistencias entre variables relacionadas (ej:  no contactado, pero duración de llamada mayor que 0).</w:t>
             </w:r>
           </w:p>
           <w:p>
@@ -3690,23 +2994,7 @@
         </w:numPr>
       </w:pPr>
       <w:r>
-        <w:t xml:space="preserve">Se implementaron una serie de </w:t>
-      </w:r>
-      <w:proofErr w:type="spellStart"/>
-      <w:r>
-        <w:t>tests</w:t>
-      </w:r>
-      <w:proofErr w:type="spellEnd"/>
-      <w:r>
-        <w:t xml:space="preserve"> automatizables (a través de código) utilizando la librería </w:t>
-      </w:r>
-      <w:proofErr w:type="spellStart"/>
-      <w:r>
-        <w:t>PyTest</w:t>
-      </w:r>
-      <w:proofErr w:type="spellEnd"/>
-      <w:r>
-        <w:t xml:space="preserve">. En este caso se validaron aspectos de </w:t>
+        <w:t xml:space="preserve">Se implementaron una serie de tests automatizables (a través de código) utilizando la librería PyTest. En este caso se validaron aspectos de </w:t>
       </w:r>
       <w:r>
         <w:t>exactitud y completitud.</w:t>
@@ -3721,23 +3009,7 @@
         </w:numPr>
       </w:pPr>
       <w:r>
-        <w:t xml:space="preserve">Se implementaron una serie de </w:t>
-      </w:r>
-      <w:proofErr w:type="spellStart"/>
-      <w:r>
-        <w:t>tests</w:t>
-      </w:r>
-      <w:proofErr w:type="spellEnd"/>
-      <w:r>
-        <w:t xml:space="preserve"> utilizando la librería Great </w:t>
-      </w:r>
-      <w:proofErr w:type="spellStart"/>
-      <w:r>
-        <w:t>Expectations</w:t>
-      </w:r>
-      <w:proofErr w:type="spellEnd"/>
-      <w:r>
-        <w:t xml:space="preserve"> para validar cuestiones de consistencia.</w:t>
+        <w:t>Se implementaron una serie de tests utilizando la librería Great Expectations para validar cuestiones de consistencia.</w:t>
       </w:r>
     </w:p>
     <w:p>
@@ -3749,15 +3021,7 @@
         </w:numPr>
       </w:pPr>
       <w:r>
-        <w:t xml:space="preserve">Todos los </w:t>
-      </w:r>
-      <w:proofErr w:type="spellStart"/>
-      <w:r>
-        <w:t>tests</w:t>
-      </w:r>
-      <w:proofErr w:type="spellEnd"/>
-      <w:r>
-        <w:t xml:space="preserve"> se han incorporado a un pipeline gestionado mediante la librería DVC que permite su ejecución en forma secuencial y la generación de un reporte en formato HMTL que podría ser </w:t>
+        <w:t xml:space="preserve">Todos los tests se han incorporado a un pipeline gestionado mediante la librería DVC que permite su ejecución en forma secuencial y la generación de un reporte en formato HMTL que podría ser </w:t>
       </w:r>
       <w:r>
         <w:t>utilizado</w:t>
@@ -3788,64 +3052,29 @@
           <w:lang w:val="en-GB"/>
         </w:rPr>
       </w:pPr>
-      <w:proofErr w:type="spellStart"/>
       <w:r>
         <w:rPr>
           <w:lang w:val="en-GB"/>
         </w:rPr>
         <w:lastRenderedPageBreak/>
-        <w:t>Exactitud</w:t>
-      </w:r>
-      <w:proofErr w:type="spellEnd"/>
+        <w:t>Exactitud y completitud (te</w:t>
+      </w:r>
       <w:r>
         <w:rPr>
           <w:lang w:val="en-GB"/>
         </w:rPr>
-        <w:t xml:space="preserve"> y </w:t>
-      </w:r>
-      <w:proofErr w:type="spellStart"/>
-      <w:r>
+        <w:t>st_dataquality)</w:t>
+      </w:r>
+    </w:p>
+    <w:p>
+      <w:pPr>
         <w:rPr>
           <w:lang w:val="en-GB"/>
         </w:rPr>
-        <w:t>completitud</w:t>
-      </w:r>
-      <w:proofErr w:type="spellEnd"/>
-      <w:r>
-        <w:rPr>
-          <w:lang w:val="en-GB"/>
-        </w:rPr>
-        <w:t xml:space="preserve"> (</w:t>
-      </w:r>
-      <w:proofErr w:type="spellStart"/>
-      <w:r>
-        <w:rPr>
-          <w:lang w:val="en-GB"/>
-        </w:rPr>
-        <w:t>te</w:t>
-      </w:r>
-      <w:r>
-        <w:rPr>
-          <w:lang w:val="en-GB"/>
-        </w:rPr>
-        <w:t>st_dataquality</w:t>
-      </w:r>
-      <w:proofErr w:type="spellEnd"/>
-      <w:r>
-        <w:rPr>
-          <w:lang w:val="en-GB"/>
-        </w:rPr>
-        <w:t>)</w:t>
-      </w:r>
-    </w:p>
-    <w:p>
-      <w:pPr>
-        <w:rPr>
-          <w:lang w:val="en-GB"/>
-        </w:rPr>
-      </w:pPr>
-      <w:r>
-        <w:rPr>
+      </w:pPr>
+      <w:r>
+        <w:rPr>
+          <w:noProof/>
           <w:lang w:val="en-GB"/>
         </w:rPr>
         <w:drawing>
@@ -3966,44 +3195,23 @@
           <w:lang w:val="en-GB"/>
         </w:rPr>
       </w:pPr>
-      <w:proofErr w:type="spellStart"/>
       <w:r>
         <w:rPr>
           <w:lang w:val="en-GB"/>
         </w:rPr>
         <w:lastRenderedPageBreak/>
-        <w:t>Consistencia</w:t>
-      </w:r>
-      <w:proofErr w:type="spellEnd"/>
-      <w:r>
+        <w:t>Consistencia (test_data_gx)</w:t>
+      </w:r>
+    </w:p>
+    <w:p>
+      <w:pPr>
         <w:rPr>
           <w:lang w:val="en-GB"/>
         </w:rPr>
-        <w:t xml:space="preserve"> (</w:t>
-      </w:r>
-      <w:proofErr w:type="spellStart"/>
-      <w:r>
-        <w:rPr>
-          <w:lang w:val="en-GB"/>
-        </w:rPr>
-        <w:t>test_data_gx</w:t>
-      </w:r>
-      <w:proofErr w:type="spellEnd"/>
-      <w:r>
-        <w:rPr>
-          <w:lang w:val="en-GB"/>
-        </w:rPr>
-        <w:t>)</w:t>
-      </w:r>
-    </w:p>
-    <w:p>
-      <w:pPr>
-        <w:rPr>
-          <w:lang w:val="en-GB"/>
-        </w:rPr>
-      </w:pPr>
-      <w:r>
-        <w:rPr>
+      </w:pPr>
+      <w:r>
+        <w:rPr>
+          <w:noProof/>
           <w:lang w:val="en-GB"/>
         </w:rPr>
         <w:drawing>
@@ -4095,15 +3303,7 @@
     </w:p>
     <w:p>
       <w:r>
-        <w:t xml:space="preserve">En función de los resultados tanto del análisis de calidad de datos como de la exploración del </w:t>
-      </w:r>
-      <w:proofErr w:type="spellStart"/>
-      <w:r>
-        <w:t>dataset</w:t>
-      </w:r>
-      <w:proofErr w:type="spellEnd"/>
-      <w:r>
-        <w:t xml:space="preserve"> realizada, se ha determinado que los siguientes atributos serán eliminados:</w:t>
+        <w:t>En función de los resultados tanto del análisis de calidad de datos como de la exploración del dataset realizada, se ha determinado que los siguientes atributos serán eliminados:</w:t>
       </w:r>
     </w:p>
     <w:p>
@@ -4146,15 +3346,29 @@
         <w:t xml:space="preserve"> </w:t>
       </w:r>
       <w:r>
-        <w:t xml:space="preserve">no presentaba variedad en los datos con una clase teniendo el 99.9% de la frecuencia en el </w:t>
-      </w:r>
-      <w:proofErr w:type="spellStart"/>
-      <w:r>
-        <w:t>dataset</w:t>
-      </w:r>
-      <w:proofErr w:type="spellEnd"/>
-      <w:r>
-        <w:t>, además de presentar un alto valor de filas nulas (&gt;20%).</w:t>
+        <w:t>no presentaba variedad en los datos con una clase teniendo el 99.9% de la frecuencia en el dataset, además de presentar un alto valor de filas nulas (&gt;20%).</w:t>
+      </w:r>
+    </w:p>
+    <w:p>
+      <w:pPr>
+        <w:pStyle w:val="ListParagraph"/>
+        <w:numPr>
+          <w:ilvl w:val="0"/>
+          <w:numId w:val="32"/>
+        </w:numPr>
+      </w:pPr>
+      <w:r>
+        <w:rPr>
+          <w:b/>
+          <w:bCs/>
+        </w:rPr>
+        <w:t>“pdays”:</w:t>
+      </w:r>
+      <w:r>
+        <w:t xml:space="preserve"> presenta una variedad muy baja estableciéndose el valor “999” un 96.3% de las ocasiones. Además, demuestra incoherencia con la variable “duration” ya que el 99.99% de las filas que toman el valor “999” en “pdays” tienen una “duration” mayor que 0.</w:t>
+      </w:r>
+      <w:r>
+        <w:t xml:space="preserve"> La información de haber sido contactado queda contenida en “previous”.</w:t>
       </w:r>
     </w:p>
     <w:p>
@@ -4201,13 +3415,26 @@
         </w:numPr>
       </w:pPr>
       <w:r>
-        <w:t>Eliminación de filas nulas (2943 casos)</w:t>
-      </w:r>
-    </w:p>
-    <w:p>
-      <w:pPr>
-        <w:pStyle w:val="Heading3"/>
-      </w:pPr>
+        <w:t xml:space="preserve">Eliminación de filas </w:t>
+      </w:r>
+      <w:r>
+        <w:t xml:space="preserve">con valores </w:t>
+      </w:r>
+      <w:r>
+        <w:t>nul</w:t>
+      </w:r>
+      <w:r>
+        <w:t>o</w:t>
+      </w:r>
+      <w:r>
+        <w:t>s</w:t>
+      </w:r>
+      <w:r>
+        <w:t>, tras convertir “Unknown” a valores nulos</w:t>
+      </w:r>
+      <w:r>
+        <w:t xml:space="preserve"> (2943 casos)</w:t>
+      </w:r>
     </w:p>
     <w:p>
       <w:pPr>
@@ -4230,42 +3457,12 @@
     </w:p>
     <w:p>
       <w:r>
-        <w:t>Se han realizado las siguientes transformaciones en los datos:</w:t>
-      </w:r>
-    </w:p>
-    <w:p>
-      <w:pPr>
-        <w:pStyle w:val="ListParagraph"/>
-        <w:numPr>
-          <w:ilvl w:val="0"/>
-          <w:numId w:val="22"/>
-        </w:numPr>
-      </w:pPr>
-      <w:r>
-        <w:t>Binarización (yes / no) del atributo de contacto previo en función de los días desde el último contacto.</w:t>
-      </w:r>
-    </w:p>
-    <w:p>
-      <w:pPr>
-        <w:pStyle w:val="ListParagraph"/>
-        <w:numPr>
-          <w:ilvl w:val="0"/>
-          <w:numId w:val="22"/>
-        </w:numPr>
-      </w:pPr>
-      <w:r>
-        <w:t>Eliminación de la variable “</w:t>
-      </w:r>
-      <w:proofErr w:type="spellStart"/>
-      <w:r>
-        <w:t>pdays</w:t>
-      </w:r>
-      <w:proofErr w:type="spellEnd"/>
-      <w:r>
-        <w:t>” dado que fuera reemplazada por la del punto previo.</w:t>
-      </w:r>
-    </w:p>
-    <w:p/>
+        <w:t xml:space="preserve">En este escenario no ha sido necesario la integración de datos, </w:t>
+      </w:r>
+      <w:r>
+        <w:t>sin embargo se ha construido un nuevo atributo “contacts_diff” que representa la diferencia de contactos entre la campaña actual y la anterior.</w:t>
+      </w:r>
+    </w:p>
     <w:p>
       <w:pPr>
         <w:pStyle w:val="Heading3"/>
@@ -4281,15 +3478,7 @@
     </w:p>
     <w:p>
       <w:r>
-        <w:t xml:space="preserve">Finalizadas las operaciones de transformación de los datos, se ha obtenido un nuevo </w:t>
-      </w:r>
-      <w:proofErr w:type="spellStart"/>
-      <w:r>
-        <w:t>dataset</w:t>
-      </w:r>
-      <w:proofErr w:type="spellEnd"/>
-      <w:r>
-        <w:t xml:space="preserve"> sobre </w:t>
+        <w:t xml:space="preserve">Finalizadas las operaciones de transformación de los datos, se ha obtenido un nuevo dataset sobre </w:t>
       </w:r>
       <w:r>
         <w:t>el cual se aplicaron operaciones de normalización</w:t>
@@ -4302,6 +3491,74 @@
       </w:r>
     </w:p>
     <w:p>
+      <w:pPr>
+        <w:pStyle w:val="ListParagraph"/>
+        <w:numPr>
+          <w:ilvl w:val="0"/>
+          <w:numId w:val="22"/>
+        </w:numPr>
+      </w:pPr>
+      <w:r>
+        <w:t xml:space="preserve">Binarización </w:t>
+      </w:r>
+      <w:r>
+        <w:t>numérica de aquellas columnas que solo tienen como posibles etiquetas “yes” o “no”.</w:t>
+      </w:r>
+    </w:p>
+    <w:p>
+      <w:pPr>
+        <w:pStyle w:val="ListParagraph"/>
+        <w:numPr>
+          <w:ilvl w:val="0"/>
+          <w:numId w:val="22"/>
+        </w:numPr>
+      </w:pPr>
+      <w:r>
+        <w:t>Conversión de la columna “nr.employed” a valores enteros, ya que un punto flotante en personas no tiene sentido.</w:t>
+      </w:r>
+    </w:p>
+    <w:p>
+      <w:pPr>
+        <w:pStyle w:val="ListParagraph"/>
+        <w:numPr>
+          <w:ilvl w:val="0"/>
+          <w:numId w:val="22"/>
+        </w:numPr>
+      </w:pPr>
+      <w:r>
+        <w:t xml:space="preserve">Se sustituye </w:t>
+      </w:r>
+      <w:r>
+        <w:t xml:space="preserve">“.” por “_” para aplicar </w:t>
+      </w:r>
+      <w:r>
+        <w:rPr>
+          <w:i/>
+          <w:iCs/>
+        </w:rPr>
+        <w:t>snake_case</w:t>
+      </w:r>
+      <w:r>
+        <w:t xml:space="preserve"> en </w:t>
+      </w:r>
+      <w:r>
+        <w:t>los atributos</w:t>
+      </w:r>
+      <w:r>
+        <w:t xml:space="preserve"> afectad</w:t>
+      </w:r>
+      <w:r>
+        <w:t>o</w:t>
+      </w:r>
+      <w:r>
+        <w:t>s</w:t>
+      </w:r>
+      <w:r>
+        <w:t>.</w:t>
+      </w:r>
+    </w:p>
+    <w:p/>
+    <w:p>
       <w:r>
         <w:t>--</w:t>
       </w:r>
@@ -4312,105 +3569,189 @@
       </w:r>
     </w:p>
     <w:p>
-      <w:r>
-        <w:t>- Se reemplazaron los valores '</w:t>
-      </w:r>
-      <w:proofErr w:type="spellStart"/>
-      <w:r>
-        <w:t>unknown</w:t>
-      </w:r>
-      <w:proofErr w:type="spellEnd"/>
-      <w:r>
-        <w:t xml:space="preserve">' por </w:t>
-      </w:r>
-      <w:proofErr w:type="spellStart"/>
+      <w:pPr>
+        <w:pStyle w:val="ListParagraph"/>
+        <w:numPr>
+          <w:ilvl w:val="0"/>
+          <w:numId w:val="36"/>
+        </w:numPr>
+      </w:pPr>
+      <w:r>
+        <w:t>Sustitución de “.” por “_”</w:t>
+      </w:r>
+      <w:r>
+        <w:t>.</w:t>
+      </w:r>
+    </w:p>
+    <w:p>
+      <w:pPr>
+        <w:pStyle w:val="ListParagraph"/>
+        <w:numPr>
+          <w:ilvl w:val="0"/>
+          <w:numId w:val="36"/>
+        </w:numPr>
+      </w:pPr>
+      <w:r>
+        <w:t>Eliminación de columna “default”.</w:t>
+      </w:r>
+    </w:p>
+    <w:p>
+      <w:pPr>
+        <w:pStyle w:val="ListParagraph"/>
+        <w:numPr>
+          <w:ilvl w:val="0"/>
+          <w:numId w:val="36"/>
+        </w:numPr>
+      </w:pPr>
+      <w:r>
+        <w:t>Eliminación de filas duplicadas.</w:t>
+      </w:r>
+    </w:p>
+    <w:p>
+      <w:pPr>
+        <w:pStyle w:val="ListParagraph"/>
+        <w:numPr>
+          <w:ilvl w:val="0"/>
+          <w:numId w:val="36"/>
+        </w:numPr>
+      </w:pPr>
+      <w:r>
+        <w:t xml:space="preserve">Se reemplazaron los valores </w:t>
+      </w:r>
+      <w:r>
+        <w:t>“U</w:t>
+      </w:r>
+      <w:r>
+        <w:t>nknown</w:t>
+      </w:r>
+      <w:r>
+        <w:t>”</w:t>
+      </w:r>
+      <w:r>
+        <w:t xml:space="preserve"> por </w:t>
+      </w:r>
+      <w:r>
+        <w:t>“</w:t>
+      </w:r>
       <w:r>
         <w:t>NaN</w:t>
       </w:r>
-      <w:proofErr w:type="spellEnd"/>
-    </w:p>
-    <w:p>
-      <w:r>
-        <w:t>- Se eliminaron las filas con valores nulos</w:t>
-      </w:r>
-    </w:p>
-    <w:p>
-      <w:r>
-        <w:t>- Se eliminaron las filas duplicadas</w:t>
-      </w:r>
-    </w:p>
-    <w:p>
-      <w:r>
-        <w:t>- Se eliminó la columna 'default' debido a la alta cantidad de valores desconocidos</w:t>
-      </w:r>
-    </w:p>
-    <w:p>
-      <w:r>
-        <w:t>- Cantidad de filas finales: 38232</w:t>
-      </w:r>
-    </w:p>
-    <w:p>
-      <w:r>
-        <w:t>- Cantidad de columnas finales: 20</w:t>
-      </w:r>
-    </w:p>
-    <w:p/>
+      <w:r>
+        <w:t>”.</w:t>
+      </w:r>
+    </w:p>
+    <w:p>
+      <w:pPr>
+        <w:pStyle w:val="ListParagraph"/>
+        <w:numPr>
+          <w:ilvl w:val="0"/>
+          <w:numId w:val="36"/>
+        </w:numPr>
+      </w:pPr>
+      <w:r>
+        <w:t>Se eliminaron las filas con valores nulos</w:t>
+      </w:r>
+      <w:r>
+        <w:t>.</w:t>
+      </w:r>
+    </w:p>
+    <w:p>
+      <w:pPr>
+        <w:pStyle w:val="ListParagraph"/>
+        <w:numPr>
+          <w:ilvl w:val="0"/>
+          <w:numId w:val="36"/>
+        </w:numPr>
+      </w:pPr>
+      <w:r>
+        <w:t>Se eliminaron las filas duplicadas</w:t>
+      </w:r>
+      <w:r>
+        <w:t>.</w:t>
+      </w:r>
+    </w:p>
+    <w:p>
+      <w:r>
+        <w:t>Además se añaden las siguientes transformaciones complementarias:</w:t>
+      </w:r>
+    </w:p>
+    <w:p>
+      <w:pPr>
+        <w:pStyle w:val="ListParagraph"/>
+        <w:numPr>
+          <w:ilvl w:val="0"/>
+          <w:numId w:val="37"/>
+        </w:numPr>
+      </w:pPr>
+      <w:r>
+        <w:t>Eliminación de la columna “pdays”.</w:t>
+      </w:r>
+    </w:p>
+    <w:p>
+      <w:pPr>
+        <w:pStyle w:val="ListParagraph"/>
+        <w:numPr>
+          <w:ilvl w:val="0"/>
+          <w:numId w:val="37"/>
+        </w:numPr>
+      </w:pPr>
+      <w:r>
+        <w:lastRenderedPageBreak/>
+        <w:t>Creación de atributo “contacts_diff”</w:t>
+      </w:r>
+    </w:p>
+    <w:p>
+      <w:pPr>
+        <w:pStyle w:val="ListParagraph"/>
+        <w:numPr>
+          <w:ilvl w:val="0"/>
+          <w:numId w:val="37"/>
+        </w:numPr>
+      </w:pPr>
+      <w:r>
+        <w:t>Cambio de tipo en “nr_employed” de punto flotante a entero.</w:t>
+      </w:r>
+    </w:p>
+    <w:p>
+      <w:r>
+        <w:t>Las dimensiones del dataset resultante son:</w:t>
+      </w:r>
+    </w:p>
+    <w:p>
+      <w:pPr>
+        <w:pStyle w:val="ListParagraph"/>
+        <w:numPr>
+          <w:ilvl w:val="0"/>
+          <w:numId w:val="38"/>
+        </w:numPr>
+      </w:pPr>
+      <w:r>
+        <w:t>Cantidad de filas finales:</w:t>
+      </w:r>
+      <w:r>
+        <w:t xml:space="preserve"> </w:t>
+      </w:r>
+      <w:r>
+        <w:t>38232</w:t>
+      </w:r>
+    </w:p>
+    <w:p>
+      <w:pPr>
+        <w:pStyle w:val="ListParagraph"/>
+        <w:numPr>
+          <w:ilvl w:val="0"/>
+          <w:numId w:val="38"/>
+        </w:numPr>
+      </w:pPr>
+      <w:r>
+        <w:t>Cantidad de columnas finales: 20</w:t>
+      </w:r>
+    </w:p>
     <w:p>
       <w:r>
         <w:t>Se ha generado un script para estas tareas y el mismo se ha integrado al pipeline generado en la fase previa para visualización y evaluación de calidad de los datos.</w:t>
       </w:r>
     </w:p>
-    <w:p>
-      <w:pPr>
-        <w:rPr>
-          <w:highlight w:val="yellow"/>
-        </w:rPr>
-      </w:pPr>
-      <w:r>
-        <w:rPr>
-          <w:highlight w:val="yellow"/>
-        </w:rPr>
-        <w:t>Agregar:</w:t>
-      </w:r>
-    </w:p>
-    <w:p>
-      <w:pPr>
-        <w:pStyle w:val="ListParagraph"/>
-        <w:numPr>
-          <w:ilvl w:val="0"/>
-          <w:numId w:val="14"/>
-        </w:numPr>
-        <w:rPr>
-          <w:highlight w:val="yellow"/>
-        </w:rPr>
-      </w:pPr>
-      <w:r>
-        <w:rPr>
-          <w:highlight w:val="yellow"/>
-        </w:rPr>
-        <w:t>Otras transformaciones que se crean convenientes</w:t>
-      </w:r>
-    </w:p>
-    <w:p>
-      <w:pPr>
-        <w:pStyle w:val="ListParagraph"/>
-        <w:numPr>
-          <w:ilvl w:val="0"/>
-          <w:numId w:val="14"/>
-        </w:numPr>
-        <w:rPr>
-          <w:highlight w:val="yellow"/>
-        </w:rPr>
-      </w:pPr>
-      <w:r>
-        <w:rPr>
-          <w:highlight w:val="yellow"/>
-        </w:rPr>
-        <w:lastRenderedPageBreak/>
-        <w:t>Modificar, en caso de hacerlo, los resultados aquí registrados y el pipeline en el repositorio.</w:t>
-      </w:r>
-    </w:p>
-    <w:p/>
     <w:p>
       <w:r>
         <w:br w:type="page"/>
@@ -4507,11 +3848,9 @@
           <w:numId w:val="31"/>
         </w:numPr>
       </w:pPr>
-      <w:proofErr w:type="spellStart"/>
       <w:r>
         <w:t>LinearSVC</w:t>
       </w:r>
-      <w:proofErr w:type="spellEnd"/>
     </w:p>
     <w:p>
       <w:pPr>
@@ -4561,23 +3900,7 @@
     </w:p>
     <w:p>
       <w:r>
-        <w:t xml:space="preserve">En este caso, se va a utilizar una libreta de </w:t>
-      </w:r>
-      <w:proofErr w:type="spellStart"/>
-      <w:r>
-        <w:t>jupyter</w:t>
-      </w:r>
-      <w:proofErr w:type="spellEnd"/>
-      <w:r>
-        <w:t xml:space="preserve"> para el registro de la experimentación realidad con la modificación de integrar la misma a la librería </w:t>
-      </w:r>
-      <w:proofErr w:type="spellStart"/>
-      <w:r>
-        <w:t>MLFlow</w:t>
-      </w:r>
-      <w:proofErr w:type="spellEnd"/>
-      <w:r>
-        <w:t xml:space="preserve"> para que se dejen evidencias de:</w:t>
+        <w:t>En este caso, se va a utilizar una libreta de jupyter para el registro de la experimentación realidad con la modificación de integrar la misma a la librería MLFlow para que se dejen evidencias de:</w:t>
       </w:r>
     </w:p>
     <w:p>
@@ -4613,13 +3936,8 @@
         </w:numPr>
       </w:pPr>
       <w:r>
-        <w:t xml:space="preserve">Valores del </w:t>
-      </w:r>
-      <w:proofErr w:type="spellStart"/>
-      <w:r>
-        <w:t>dataset</w:t>
-      </w:r>
-      <w:proofErr w:type="spellEnd"/>
+        <w:t>Valores del dataset</w:t>
+      </w:r>
     </w:p>
     <w:p>
       <w:pPr>
@@ -4718,11 +4036,9 @@
       <w:r>
         <w:t xml:space="preserve">Aplicación de </w:t>
       </w:r>
-      <w:proofErr w:type="gramStart"/>
       <w:r>
         <w:t>sub muestreo</w:t>
       </w:r>
-      <w:proofErr w:type="gramEnd"/>
       <w:r>
         <w:t xml:space="preserve"> por la situación de desbalance entre clases.</w:t>
       </w:r>
@@ -4734,28 +4050,12 @@
     </w:p>
     <w:p>
       <w:r>
-        <w:t xml:space="preserve">Se va a aplicar el mismo criterio de la actividad anterior haciendo uso de </w:t>
-      </w:r>
-      <w:proofErr w:type="spellStart"/>
-      <w:r>
-        <w:t>MLFlow</w:t>
-      </w:r>
-      <w:proofErr w:type="spellEnd"/>
-      <w:r>
-        <w:t xml:space="preserve"> para el registro de la experimentación que fuera realizada. Los resultados quedarán disponibles en el mismo directorio del repositorio que contiene el código del proyecto.</w:t>
-      </w:r>
-    </w:p>
-    <w:p>
-      <w:r>
-        <w:t xml:space="preserve">En la siguiente tabla se documenta el detalle de la experimentación que ha sido registrada igualmente en </w:t>
-      </w:r>
-      <w:proofErr w:type="spellStart"/>
-      <w:r>
-        <w:t>mlflow</w:t>
-      </w:r>
-      <w:proofErr w:type="spellEnd"/>
-      <w:r>
-        <w:t>:</w:t>
+        <w:t>Se va a aplicar el mismo criterio de la actividad anterior haciendo uso de MLFlow para el registro de la experimentación que fuera realizada. Los resultados quedarán disponibles en el mismo directorio del repositorio que contiene el código del proyecto.</w:t>
+      </w:r>
+    </w:p>
+    <w:p>
+      <w:r>
+        <w:t>En la siguiente tabla se documenta el detalle de la experimentación que ha sido registrada igualmente en mlflow:</w:t>
       </w:r>
     </w:p>
     <w:tbl>
@@ -4847,19 +4147,9 @@
             <w:tcW w:w="3005" w:type="dxa"/>
           </w:tcPr>
           <w:p>
-            <w:proofErr w:type="spellStart"/>
             <w:r>
-              <w:t>Logistic</w:t>
+              <w:t>Logistic Regression</w:t>
             </w:r>
-            <w:proofErr w:type="spellEnd"/>
-            <w:r>
-              <w:t xml:space="preserve"> </w:t>
-            </w:r>
-            <w:proofErr w:type="spellStart"/>
-            <w:r>
-              <w:t>Regression</w:t>
-            </w:r>
-            <w:proofErr w:type="spellEnd"/>
           </w:p>
         </w:tc>
         <w:tc>
@@ -4872,19 +4162,11 @@
                 <w:lang w:val="en-GB"/>
               </w:rPr>
             </w:pPr>
-            <w:proofErr w:type="spellStart"/>
             <w:r>
               <w:rPr>
                 <w:lang w:val="en-GB"/>
               </w:rPr>
-              <w:t>n_jobs</w:t>
-            </w:r>
-            <w:proofErr w:type="spellEnd"/>
-            <w:r>
-              <w:rPr>
-                <w:lang w:val="en-GB"/>
-              </w:rPr>
-              <w:t>: None</w:t>
+              <w:t>n_jobs: None</w:t>
             </w:r>
           </w:p>
           <w:p>
@@ -4893,19 +4175,11 @@
                 <w:lang w:val="en-GB"/>
               </w:rPr>
             </w:pPr>
-            <w:proofErr w:type="spellStart"/>
             <w:r>
               <w:rPr>
                 <w:lang w:val="en-GB"/>
               </w:rPr>
-              <w:t>class_weight</w:t>
-            </w:r>
-            <w:proofErr w:type="spellEnd"/>
-            <w:r>
-              <w:rPr>
-                <w:lang w:val="en-GB"/>
-              </w:rPr>
-              <w:t>: None</w:t>
+              <w:t>class_weight: None</w:t>
             </w:r>
           </w:p>
           <w:p>
@@ -4927,83 +4201,11 @@
                 <w:lang w:val="en-GB"/>
               </w:rPr>
             </w:pPr>
-            <w:proofErr w:type="spellStart"/>
             <w:r>
               <w:rPr>
                 <w:lang w:val="en-GB"/>
               </w:rPr>
-              <w:t>test_samples</w:t>
-            </w:r>
-            <w:proofErr w:type="spellEnd"/>
-            <w:r>
-              <w:rPr>
-                <w:lang w:val="en-GB"/>
-              </w:rPr>
-              <w:t>: 7647</w:t>
-            </w:r>
-          </w:p>
-          <w:p>
-            <w:pPr>
-              <w:rPr>
-                <w:lang w:val="en-GB"/>
-              </w:rPr>
-            </w:pPr>
-            <w:proofErr w:type="spellStart"/>
-            <w:r>
-              <w:rPr>
-                <w:lang w:val="en-GB"/>
-              </w:rPr>
-              <w:t>max_iter</w:t>
-            </w:r>
-            <w:proofErr w:type="spellEnd"/>
-            <w:r>
-              <w:rPr>
-                <w:lang w:val="en-GB"/>
-              </w:rPr>
-              <w:t>: 100</w:t>
-            </w:r>
-          </w:p>
-          <w:p>
-            <w:pPr>
-              <w:rPr>
-                <w:lang w:val="en-GB"/>
-              </w:rPr>
-            </w:pPr>
-            <w:proofErr w:type="spellStart"/>
-            <w:r>
-              <w:rPr>
-                <w:lang w:val="en-GB"/>
-              </w:rPr>
-              <w:lastRenderedPageBreak/>
-              <w:t>cv_folds</w:t>
-            </w:r>
-            <w:proofErr w:type="spellEnd"/>
-            <w:r>
-              <w:rPr>
-                <w:lang w:val="en-GB"/>
-              </w:rPr>
-              <w:t>: 5</w:t>
-            </w:r>
-          </w:p>
-          <w:p>
-            <w:pPr>
-              <w:rPr>
-                <w:lang w:val="en-GB"/>
-              </w:rPr>
-            </w:pPr>
-            <w:proofErr w:type="spellStart"/>
-            <w:r>
-              <w:rPr>
-                <w:lang w:val="en-GB"/>
-              </w:rPr>
-              <w:t>multi_class</w:t>
-            </w:r>
-            <w:proofErr w:type="spellEnd"/>
-            <w:r>
-              <w:rPr>
-                <w:lang w:val="en-GB"/>
-              </w:rPr>
-              <w:t>: deprecated</w:t>
+              <w:t>test_samples: 7647</w:t>
             </w:r>
           </w:p>
           <w:p>
@@ -5016,16 +4218,8 @@
               <w:rPr>
                 <w:lang w:val="en-GB"/>
               </w:rPr>
-              <w:t xml:space="preserve">Solver: </w:t>
+              <w:t>max_iter: 100</w:t>
             </w:r>
-            <w:proofErr w:type="spellStart"/>
-            <w:r>
-              <w:rPr>
-                <w:lang w:val="en-GB"/>
-              </w:rPr>
-              <w:t>liblinear</w:t>
-            </w:r>
-            <w:proofErr w:type="spellEnd"/>
           </w:p>
           <w:p>
             <w:pPr>
@@ -5033,19 +4227,51 @@
                 <w:lang w:val="en-GB"/>
               </w:rPr>
             </w:pPr>
-            <w:proofErr w:type="spellStart"/>
             <w:r>
               <w:rPr>
                 <w:lang w:val="en-GB"/>
               </w:rPr>
-              <w:t>train_samples</w:t>
+              <w:lastRenderedPageBreak/>
+              <w:t>cv_folds: 5</w:t>
             </w:r>
-            <w:proofErr w:type="spellEnd"/>
+          </w:p>
+          <w:p>
+            <w:pPr>
+              <w:rPr>
+                <w:lang w:val="en-GB"/>
+              </w:rPr>
+            </w:pPr>
             <w:r>
               <w:rPr>
                 <w:lang w:val="en-GB"/>
               </w:rPr>
-              <w:t>: 5438</w:t>
+              <w:t>multi_class: deprecated</w:t>
+            </w:r>
+          </w:p>
+          <w:p>
+            <w:pPr>
+              <w:rPr>
+                <w:lang w:val="en-GB"/>
+              </w:rPr>
+            </w:pPr>
+            <w:r>
+              <w:rPr>
+                <w:lang w:val="en-GB"/>
+              </w:rPr>
+              <w:t>Solver: liblinear</w:t>
+            </w:r>
+          </w:p>
+          <w:p>
+            <w:pPr>
+              <w:rPr>
+                <w:lang w:val="en-GB"/>
+              </w:rPr>
+            </w:pPr>
+            <w:r>
+              <w:rPr>
+                <w:lang w:val="en-GB"/>
+              </w:rPr>
+              <w:t>train_samples: 5438</w:t>
             </w:r>
           </w:p>
           <w:p>
@@ -5093,19 +4319,11 @@
                 <w:lang w:val="en-GB"/>
               </w:rPr>
             </w:pPr>
-            <w:proofErr w:type="spellStart"/>
             <w:r>
               <w:rPr>
                 <w:lang w:val="en-GB"/>
               </w:rPr>
-              <w:t>random_state</w:t>
-            </w:r>
-            <w:proofErr w:type="spellEnd"/>
-            <w:r>
-              <w:rPr>
-                <w:lang w:val="en-GB"/>
-              </w:rPr>
-              <w:t>: 1</w:t>
+              <w:t>random_state: 1</w:t>
             </w:r>
           </w:p>
           <w:p>
@@ -5114,28 +4332,12 @@
                 <w:lang w:val="en-GB"/>
               </w:rPr>
             </w:pPr>
-            <w:proofErr w:type="spellStart"/>
             <w:r>
               <w:rPr>
                 <w:lang w:val="en-GB"/>
               </w:rPr>
-              <w:t>balancing_method</w:t>
+              <w:t>balancing_method: undersampling</w:t>
             </w:r>
-            <w:proofErr w:type="spellEnd"/>
-            <w:r>
-              <w:rPr>
-                <w:lang w:val="en-GB"/>
-              </w:rPr>
-              <w:t xml:space="preserve">: </w:t>
-            </w:r>
-            <w:proofErr w:type="spellStart"/>
-            <w:r>
-              <w:rPr>
-                <w:lang w:val="en-GB"/>
-              </w:rPr>
-              <w:t>undersampling</w:t>
-            </w:r>
-            <w:proofErr w:type="spellEnd"/>
           </w:p>
           <w:p>
             <w:pPr>
@@ -5156,19 +4358,11 @@
                 <w:lang w:val="en-GB"/>
               </w:rPr>
             </w:pPr>
-            <w:proofErr w:type="spellStart"/>
             <w:r>
               <w:rPr>
                 <w:lang w:val="en-GB"/>
               </w:rPr>
-              <w:t>intercept_scaling</w:t>
-            </w:r>
-            <w:proofErr w:type="spellEnd"/>
-            <w:r>
-              <w:rPr>
-                <w:lang w:val="en-GB"/>
-              </w:rPr>
-              <w:t>: 1</w:t>
+              <w:t>intercept_scaling: 1</w:t>
             </w:r>
           </w:p>
           <w:p>
@@ -5177,19 +4371,11 @@
                 <w:lang w:val="en-GB"/>
               </w:rPr>
             </w:pPr>
-            <w:proofErr w:type="spellStart"/>
             <w:r>
               <w:rPr>
                 <w:lang w:val="en-GB"/>
               </w:rPr>
-              <w:t>fit_intercept</w:t>
-            </w:r>
-            <w:proofErr w:type="spellEnd"/>
-            <w:r>
-              <w:rPr>
-                <w:lang w:val="en-GB"/>
-              </w:rPr>
-              <w:t>: True</w:t>
+              <w:t>fit_intercept: True</w:t>
             </w:r>
           </w:p>
           <w:p>
@@ -5206,13 +4392,8 @@
             </w:r>
           </w:p>
           <w:p>
-            <w:proofErr w:type="spellStart"/>
             <w:r>
-              <w:t>warm_start</w:t>
-            </w:r>
-            <w:proofErr w:type="spellEnd"/>
-            <w:r>
-              <w:t>: False</w:t>
+              <w:t>warm_start: False</w:t>
             </w:r>
           </w:p>
         </w:tc>
@@ -5228,161 +4409,22 @@
                 <w:lang w:val="en-US"/>
               </w:rPr>
             </w:pPr>
-            <w:proofErr w:type="spellStart"/>
             <w:r>
               <w:rPr>
                 <w:rFonts w:ascii="Calibri" w:eastAsia="Calibri" w:hAnsi="Calibri" w:cs="Calibri"/>
                 <w:lang w:val="en-US"/>
               </w:rPr>
               <w:lastRenderedPageBreak/>
-              <w:t>cv_recall_mean</w:t>
+              <w:t xml:space="preserve">cv_recall_mean: 0.5204162604268227 cv_f1_std: 0.014864271739294858 </w:t>
             </w:r>
-            <w:proofErr w:type="spellEnd"/>
-            <w:r>
-              <w:rPr>
-                <w:rFonts w:ascii="Calibri" w:eastAsia="Calibri" w:hAnsi="Calibri" w:cs="Calibri"/>
-                <w:lang w:val="en-US"/>
-              </w:rPr>
-              <w:t xml:space="preserve">: 0.5204162604268227 cv_f1_std: 0.014864271739294858 </w:t>
-            </w:r>
-            <w:proofErr w:type="spellStart"/>
             <w:r>
               <w:rPr>
                 <w:rFonts w:ascii="Calibri" w:eastAsia="Calibri" w:hAnsi="Calibri" w:cs="Calibri"/>
                 <w:lang w:val="en-US"/>
               </w:rPr>
               <w:lastRenderedPageBreak/>
-              <w:t>cv_accuracy_mean</w:t>
+              <w:t>cv_accuracy_mean: 0.5277624262676552 cv_precision_std: 0.023367665079500846 test_accuracy: 0.5216424741728782 test_precision: 0.0693464252838294 cv_precision_mean: 0.5289300713714633 cv_accuracy_std: 0.021251829345951337 test_f1: 0.10997566909975669 test_recall:  0.26556991774383076 cv_recall_std:  0.011290217723442728 cv_f1_mean:  0.5244457520113056</w:t>
             </w:r>
-            <w:proofErr w:type="spellEnd"/>
-            <w:r>
-              <w:rPr>
-                <w:rFonts w:ascii="Calibri" w:eastAsia="Calibri" w:hAnsi="Calibri" w:cs="Calibri"/>
-                <w:lang w:val="en-US"/>
-              </w:rPr>
-              <w:t xml:space="preserve">: 0.5277624262676552 </w:t>
-            </w:r>
-            <w:proofErr w:type="spellStart"/>
-            <w:r>
-              <w:rPr>
-                <w:rFonts w:ascii="Calibri" w:eastAsia="Calibri" w:hAnsi="Calibri" w:cs="Calibri"/>
-                <w:lang w:val="en-US"/>
-              </w:rPr>
-              <w:t>cv_precision_std</w:t>
-            </w:r>
-            <w:proofErr w:type="spellEnd"/>
-            <w:r>
-              <w:rPr>
-                <w:rFonts w:ascii="Calibri" w:eastAsia="Calibri" w:hAnsi="Calibri" w:cs="Calibri"/>
-                <w:lang w:val="en-US"/>
-              </w:rPr>
-              <w:t xml:space="preserve">: 0.023367665079500846 </w:t>
-            </w:r>
-            <w:proofErr w:type="spellStart"/>
-            <w:r>
-              <w:rPr>
-                <w:rFonts w:ascii="Calibri" w:eastAsia="Calibri" w:hAnsi="Calibri" w:cs="Calibri"/>
-                <w:lang w:val="en-US"/>
-              </w:rPr>
-              <w:t>test_accuracy</w:t>
-            </w:r>
-            <w:proofErr w:type="spellEnd"/>
-            <w:r>
-              <w:rPr>
-                <w:rFonts w:ascii="Calibri" w:eastAsia="Calibri" w:hAnsi="Calibri" w:cs="Calibri"/>
-                <w:lang w:val="en-US"/>
-              </w:rPr>
-              <w:t xml:space="preserve">: 0.5216424741728782 </w:t>
-            </w:r>
-            <w:proofErr w:type="spellStart"/>
-            <w:r>
-              <w:rPr>
-                <w:rFonts w:ascii="Calibri" w:eastAsia="Calibri" w:hAnsi="Calibri" w:cs="Calibri"/>
-                <w:lang w:val="en-US"/>
-              </w:rPr>
-              <w:t>test_precision</w:t>
-            </w:r>
-            <w:proofErr w:type="spellEnd"/>
-            <w:r>
-              <w:rPr>
-                <w:rFonts w:ascii="Calibri" w:eastAsia="Calibri" w:hAnsi="Calibri" w:cs="Calibri"/>
-                <w:lang w:val="en-US"/>
-              </w:rPr>
-              <w:t xml:space="preserve">: 0.0693464252838294 </w:t>
-            </w:r>
-            <w:proofErr w:type="spellStart"/>
-            <w:r>
-              <w:rPr>
-                <w:rFonts w:ascii="Calibri" w:eastAsia="Calibri" w:hAnsi="Calibri" w:cs="Calibri"/>
-                <w:lang w:val="en-US"/>
-              </w:rPr>
-              <w:t>cv_precision_mean</w:t>
-            </w:r>
-            <w:proofErr w:type="spellEnd"/>
-            <w:r>
-              <w:rPr>
-                <w:rFonts w:ascii="Calibri" w:eastAsia="Calibri" w:hAnsi="Calibri" w:cs="Calibri"/>
-                <w:lang w:val="en-US"/>
-              </w:rPr>
-              <w:t xml:space="preserve">: 0.5289300713714633 </w:t>
-            </w:r>
-            <w:proofErr w:type="spellStart"/>
-            <w:r>
-              <w:rPr>
-                <w:rFonts w:ascii="Calibri" w:eastAsia="Calibri" w:hAnsi="Calibri" w:cs="Calibri"/>
-                <w:lang w:val="en-US"/>
-              </w:rPr>
-              <w:t>cv_accuracy_std</w:t>
-            </w:r>
-            <w:proofErr w:type="spellEnd"/>
-            <w:r>
-              <w:rPr>
-                <w:rFonts w:ascii="Calibri" w:eastAsia="Calibri" w:hAnsi="Calibri" w:cs="Calibri"/>
-                <w:lang w:val="en-US"/>
-              </w:rPr>
-              <w:t xml:space="preserve">: </w:t>
-            </w:r>
-            <w:proofErr w:type="gramStart"/>
-            <w:r>
-              <w:rPr>
-                <w:rFonts w:ascii="Calibri" w:eastAsia="Calibri" w:hAnsi="Calibri" w:cs="Calibri"/>
-                <w:lang w:val="en-US"/>
-              </w:rPr>
-              <w:t xml:space="preserve">0.021251829345951337 test_f1: 0.10997566909975669 </w:t>
-            </w:r>
-            <w:proofErr w:type="spellStart"/>
-            <w:r>
-              <w:rPr>
-                <w:rFonts w:ascii="Calibri" w:eastAsia="Calibri" w:hAnsi="Calibri" w:cs="Calibri"/>
-                <w:lang w:val="en-US"/>
-              </w:rPr>
-              <w:t>test_recall</w:t>
-            </w:r>
-            <w:proofErr w:type="spellEnd"/>
-            <w:r>
-              <w:rPr>
-                <w:rFonts w:ascii="Calibri" w:eastAsia="Calibri" w:hAnsi="Calibri" w:cs="Calibri"/>
-                <w:lang w:val="en-US"/>
-              </w:rPr>
-              <w:t xml:space="preserve">:  0.26556991774383076 </w:t>
-            </w:r>
-            <w:proofErr w:type="spellStart"/>
-            <w:r>
-              <w:rPr>
-                <w:rFonts w:ascii="Calibri" w:eastAsia="Calibri" w:hAnsi="Calibri" w:cs="Calibri"/>
-                <w:lang w:val="en-US"/>
-              </w:rPr>
-              <w:t>cv_recall_std</w:t>
-            </w:r>
-            <w:proofErr w:type="spellEnd"/>
-            <w:r>
-              <w:rPr>
-                <w:rFonts w:ascii="Calibri" w:eastAsia="Calibri" w:hAnsi="Calibri" w:cs="Calibri"/>
-                <w:lang w:val="en-US"/>
-              </w:rPr>
-              <w:t>:  0.011290217723442728 cv_f1_mean:  0.5244457520113056</w:t>
-            </w:r>
-            <w:proofErr w:type="gramEnd"/>
           </w:p>
           <w:p>
             <w:pPr>
@@ -5526,21 +4568,11 @@
           <w:lang w:val="en-US"/>
         </w:rPr>
       </w:pPr>
-      <w:proofErr w:type="spellStart"/>
-      <w:proofErr w:type="gramStart"/>
       <w:r>
         <w:rPr>
           <w:lang w:val="en-US"/>
         </w:rPr>
-        <w:t>LogisticRegression</w:t>
-      </w:r>
-      <w:proofErr w:type="spellEnd"/>
-      <w:proofErr w:type="gramEnd"/>
-      <w:r>
-        <w:rPr>
-          <w:lang w:val="en-US"/>
-        </w:rPr>
-        <w:t xml:space="preserve"> </w:t>
+        <w:t xml:space="preserve">LogisticRegression </w:t>
       </w:r>
     </w:p>
     <w:p>
@@ -5591,21 +4623,7 @@
         <w:rPr>
           <w:lang w:val="en-US"/>
         </w:rPr>
-        <w:t>solver='</w:t>
-      </w:r>
-      <w:proofErr w:type="spellStart"/>
-      <w:r>
-        <w:rPr>
-          <w:lang w:val="en-US"/>
-        </w:rPr>
-        <w:t>liblinear</w:t>
-      </w:r>
-      <w:proofErr w:type="spellEnd"/>
-      <w:r>
-        <w:rPr>
-          <w:lang w:val="en-US"/>
-        </w:rPr>
-        <w:t>',</w:t>
+        <w:t>solver='liblinear',</w:t>
       </w:r>
     </w:p>
     <w:p>
@@ -5616,19 +4634,11 @@
           <w:numId w:val="20"/>
         </w:numPr>
       </w:pPr>
-      <w:proofErr w:type="spellStart"/>
       <w:r>
         <w:rPr>
           <w:lang w:val="en-US"/>
         </w:rPr>
-        <w:t>random_state</w:t>
-      </w:r>
-      <w:proofErr w:type="spellEnd"/>
-      <w:r>
-        <w:rPr>
-          <w:lang w:val="en-US"/>
-        </w:rPr>
-        <w:t>=1,</w:t>
+        <w:t>random_state=1,</w:t>
       </w:r>
     </w:p>
     <w:p>
@@ -5639,19 +4649,11 @@
           <w:numId w:val="20"/>
         </w:numPr>
       </w:pPr>
-      <w:proofErr w:type="spellStart"/>
       <w:r>
         <w:rPr>
           <w:lang w:val="en-US"/>
         </w:rPr>
-        <w:t>max_iter</w:t>
-      </w:r>
-      <w:proofErr w:type="spellEnd"/>
-      <w:r>
-        <w:rPr>
-          <w:lang w:val="en-US"/>
-        </w:rPr>
-        <w:t>=100,</w:t>
+        <w:t>max_iter=100,</w:t>
       </w:r>
     </w:p>
     <w:p>
@@ -5662,19 +4664,11 @@
           <w:numId w:val="20"/>
         </w:numPr>
       </w:pPr>
-      <w:proofErr w:type="spellStart"/>
       <w:r>
         <w:rPr>
           <w:lang w:val="en-US"/>
         </w:rPr>
-        <w:t>tol</w:t>
-      </w:r>
-      <w:proofErr w:type="spellEnd"/>
-      <w:r>
-        <w:rPr>
-          <w:lang w:val="en-US"/>
-        </w:rPr>
-        <w:t>=0.000000001</w:t>
+        <w:t>tol=0.000000001</w:t>
       </w:r>
     </w:p>
     <w:p>
@@ -5685,11 +4679,9 @@
           <w:numId w:val="20"/>
         </w:numPr>
       </w:pPr>
-      <w:proofErr w:type="spellStart"/>
       <w:r>
         <w:t>LinearSVC</w:t>
       </w:r>
-      <w:proofErr w:type="spellEnd"/>
     </w:p>
     <w:p>
       <w:pPr>
@@ -5699,13 +4691,8 @@
           <w:numId w:val="20"/>
         </w:numPr>
       </w:pPr>
-      <w:proofErr w:type="spellStart"/>
-      <w:r>
-        <w:t>max_iter</w:t>
-      </w:r>
-      <w:proofErr w:type="spellEnd"/>
-      <w:r>
-        <w:t>=10000,</w:t>
+      <w:r>
+        <w:t>max_iter=10000,</w:t>
       </w:r>
     </w:p>
     <w:p>
@@ -5728,11 +4715,9 @@
           <w:numId w:val="20"/>
         </w:numPr>
       </w:pPr>
-      <w:proofErr w:type="spellStart"/>
       <w:r>
         <w:t>KNeighborsClassifier</w:t>
       </w:r>
-      <w:proofErr w:type="spellEnd"/>
     </w:p>
     <w:p>
       <w:pPr>
@@ -5742,13 +4727,8 @@
           <w:numId w:val="20"/>
         </w:numPr>
       </w:pPr>
-      <w:proofErr w:type="spellStart"/>
-      <w:r>
-        <w:t>n_neighbors</w:t>
-      </w:r>
-      <w:proofErr w:type="spellEnd"/>
-      <w:r>
-        <w:t>=7</w:t>
+      <w:r>
+        <w:t>n_neighbors=7</w:t>
       </w:r>
     </w:p>
     <w:p>
@@ -5759,11 +4739,9 @@
           <w:numId w:val="20"/>
         </w:numPr>
       </w:pPr>
-      <w:proofErr w:type="spellStart"/>
       <w:r>
         <w:t>DecisionTreeClassifier</w:t>
       </w:r>
-      <w:proofErr w:type="spellEnd"/>
     </w:p>
     <w:p>
       <w:pPr>
@@ -5842,20 +4820,7 @@
         </w:numPr>
       </w:pPr>
       <w:r>
-        <w:t xml:space="preserve">Exportación a un </w:t>
-      </w:r>
-      <w:proofErr w:type="gramStart"/>
-      <w:r>
-        <w:t>archivo .</w:t>
-      </w:r>
-      <w:proofErr w:type="spellStart"/>
-      <w:r>
-        <w:t>pkl</w:t>
-      </w:r>
-      <w:proofErr w:type="spellEnd"/>
-      <w:proofErr w:type="gramEnd"/>
-      <w:r>
-        <w:t xml:space="preserve"> del modelo en cuestión</w:t>
+        <w:t>Exportación a un archivo .pkl del modelo en cuestión</w:t>
       </w:r>
     </w:p>
     <w:p>
@@ -5867,13 +4832,8 @@
         </w:numPr>
       </w:pPr>
       <w:r>
-        <w:t xml:space="preserve">Registro de todas las operaciones en </w:t>
-      </w:r>
-      <w:proofErr w:type="spellStart"/>
-      <w:r>
-        <w:t>mlflow</w:t>
-      </w:r>
-      <w:proofErr w:type="spellEnd"/>
+        <w:t>Registro de todas las operaciones en mlflow</w:t>
+      </w:r>
     </w:p>
     <w:p>
       <w:pPr>
@@ -5884,20 +4844,7 @@
         </w:numPr>
       </w:pPr>
       <w:r>
-        <w:t xml:space="preserve">Exportación a un </w:t>
-      </w:r>
-      <w:proofErr w:type="gramStart"/>
-      <w:r>
-        <w:t>archivo .</w:t>
-      </w:r>
-      <w:proofErr w:type="spellStart"/>
-      <w:r>
-        <w:t>json</w:t>
-      </w:r>
-      <w:proofErr w:type="spellEnd"/>
-      <w:proofErr w:type="gramEnd"/>
-      <w:r>
-        <w:t xml:space="preserve"> de las métricas obtenidas ante el entrenamiento.</w:t>
+        <w:t>Exportación a un archivo .json de las métricas obtenidas ante el entrenamiento.</w:t>
       </w:r>
     </w:p>
     <w:p>
@@ -5939,21 +4886,11 @@
           <w:lang w:val="en-US"/>
         </w:rPr>
       </w:pPr>
-      <w:proofErr w:type="spellStart"/>
-      <w:proofErr w:type="gramStart"/>
       <w:r>
         <w:rPr>
           <w:lang w:val="en-US"/>
         </w:rPr>
-        <w:t>LogisticRegression</w:t>
-      </w:r>
-      <w:proofErr w:type="spellEnd"/>
-      <w:proofErr w:type="gramEnd"/>
-      <w:r>
-        <w:rPr>
-          <w:lang w:val="en-US"/>
-        </w:rPr>
-        <w:t xml:space="preserve"> </w:t>
+        <w:t xml:space="preserve">LogisticRegression </w:t>
       </w:r>
     </w:p>
     <w:p>
@@ -5964,29 +4901,8 @@
           <w:numId w:val="20"/>
         </w:numPr>
       </w:pPr>
-      <w:proofErr w:type="spellStart"/>
-      <w:r>
-        <w:t>cross</w:t>
-      </w:r>
-      <w:proofErr w:type="spellEnd"/>
-      <w:r>
-        <w:t xml:space="preserve"> </w:t>
-      </w:r>
-      <w:proofErr w:type="spellStart"/>
-      <w:r>
-        <w:t>validation</w:t>
-      </w:r>
-      <w:proofErr w:type="spellEnd"/>
-      <w:r>
-        <w:t xml:space="preserve"> f1 scores [47.68946396 51.57116451 49.29709466 49.</w:t>
-      </w:r>
-      <w:proofErr w:type="gramStart"/>
-      <w:r>
-        <w:t>5412844  50.72727273</w:t>
-      </w:r>
-      <w:proofErr w:type="gramEnd"/>
-      <w:r>
-        <w:t>]</w:t>
+      <w:r>
+        <w:t>cross validation f1 scores [47.68946396 51.57116451 49.29709466 49.5412844  50.72727273]</w:t>
       </w:r>
     </w:p>
     <w:p>
@@ -5998,21 +4914,8 @@
         </w:numPr>
         <w:spacing w:before="240" w:after="240"/>
       </w:pPr>
-      <w:proofErr w:type="spellStart"/>
-      <w:r>
-        <w:t>cross</w:t>
-      </w:r>
-      <w:proofErr w:type="spellEnd"/>
-      <w:r>
-        <w:t xml:space="preserve"> </w:t>
-      </w:r>
-      <w:proofErr w:type="spellStart"/>
-      <w:r>
-        <w:t>validation</w:t>
-      </w:r>
-      <w:proofErr w:type="spellEnd"/>
-      <w:r>
-        <w:t xml:space="preserve"> f1 mean 49.76525605093318</w:t>
+      <w:r>
+        <w:t>cross validation f1 mean 49.76525605093318</w:t>
       </w:r>
     </w:p>
     <w:p>
@@ -6024,29 +4927,8 @@
         </w:numPr>
         <w:spacing w:before="240" w:after="240"/>
       </w:pPr>
-      <w:proofErr w:type="spellStart"/>
-      <w:r>
-        <w:t>cross</w:t>
-      </w:r>
-      <w:proofErr w:type="spellEnd"/>
-      <w:r>
-        <w:t xml:space="preserve"> </w:t>
-      </w:r>
-      <w:proofErr w:type="spellStart"/>
-      <w:r>
-        <w:t>validation</w:t>
-      </w:r>
-      <w:proofErr w:type="spellEnd"/>
-      <w:r>
-        <w:t xml:space="preserve"> f1 </w:t>
-      </w:r>
-      <w:proofErr w:type="spellStart"/>
-      <w:r>
-        <w:t>std</w:t>
-      </w:r>
-      <w:proofErr w:type="spellEnd"/>
-      <w:r>
-        <w:t xml:space="preserve"> 0.0132401153018114</w:t>
+      <w:r>
+        <w:t>cross validation f1 std 0.0132401153018114</w:t>
       </w:r>
     </w:p>
     <w:p>
@@ -6058,37 +4940,8 @@
         </w:numPr>
         <w:spacing w:before="240" w:after="240"/>
       </w:pPr>
-      <w:proofErr w:type="spellStart"/>
-      <w:r>
-        <w:t>cross</w:t>
-      </w:r>
-      <w:proofErr w:type="spellEnd"/>
-      <w:r>
-        <w:t xml:space="preserve"> </w:t>
-      </w:r>
-      <w:proofErr w:type="spellStart"/>
-      <w:r>
-        <w:t>validation</w:t>
-      </w:r>
-      <w:proofErr w:type="spellEnd"/>
-      <w:r>
-        <w:t xml:space="preserve"> </w:t>
-      </w:r>
-      <w:proofErr w:type="spellStart"/>
-      <w:r>
-        <w:t>recall</w:t>
-      </w:r>
-      <w:proofErr w:type="spellEnd"/>
-      <w:r>
-        <w:t xml:space="preserve"> scores [47.33944954 51.19266055 48.25688073 49.</w:t>
-      </w:r>
-      <w:proofErr w:type="gramStart"/>
-      <w:r>
-        <w:t>5412844  51.19266055</w:t>
-      </w:r>
-      <w:proofErr w:type="gramEnd"/>
-      <w:r>
-        <w:t>]</w:t>
+      <w:r>
+        <w:t>cross validation recall scores [47.33944954 51.19266055 48.25688073 49.5412844  51.19266055]</w:t>
       </w:r>
     </w:p>
     <w:p>
@@ -6100,29 +4953,8 @@
         </w:numPr>
         <w:spacing w:before="240" w:after="240"/>
       </w:pPr>
-      <w:proofErr w:type="spellStart"/>
-      <w:r>
-        <w:t>cross</w:t>
-      </w:r>
-      <w:proofErr w:type="spellEnd"/>
-      <w:r>
-        <w:t xml:space="preserve"> </w:t>
-      </w:r>
-      <w:proofErr w:type="spellStart"/>
-      <w:r>
-        <w:t>validation</w:t>
-      </w:r>
-      <w:proofErr w:type="spellEnd"/>
-      <w:r>
-        <w:t xml:space="preserve"> </w:t>
-      </w:r>
-      <w:proofErr w:type="spellStart"/>
-      <w:r>
-        <w:t>recall</w:t>
-      </w:r>
-      <w:proofErr w:type="spellEnd"/>
-      <w:r>
-        <w:t xml:space="preserve"> mean 49.50458715596331</w:t>
+      <w:r>
+        <w:t>cross validation recall mean 49.50458715596331</w:t>
       </w:r>
     </w:p>
     <w:p>
@@ -6133,37 +4965,8 @@
           <w:numId w:val="20"/>
         </w:numPr>
       </w:pPr>
-      <w:proofErr w:type="spellStart"/>
-      <w:r>
-        <w:t>cross</w:t>
-      </w:r>
-      <w:proofErr w:type="spellEnd"/>
-      <w:r>
-        <w:t xml:space="preserve"> </w:t>
-      </w:r>
-      <w:proofErr w:type="spellStart"/>
-      <w:r>
-        <w:t>validation</w:t>
-      </w:r>
-      <w:proofErr w:type="spellEnd"/>
-      <w:r>
-        <w:t xml:space="preserve"> </w:t>
-      </w:r>
-      <w:proofErr w:type="spellStart"/>
-      <w:r>
-        <w:t>recall</w:t>
-      </w:r>
-      <w:proofErr w:type="spellEnd"/>
-      <w:r>
-        <w:t xml:space="preserve"> </w:t>
-      </w:r>
-      <w:proofErr w:type="spellStart"/>
-      <w:r>
-        <w:t>std</w:t>
-      </w:r>
-      <w:proofErr w:type="spellEnd"/>
-      <w:r>
-        <w:t xml:space="preserve"> 0.01545646949625883</w:t>
+      <w:r>
+        <w:t>cross validation recall std 0.01545646949625883</w:t>
       </w:r>
     </w:p>
     <w:p>
@@ -6174,11 +4977,9 @@
           <w:numId w:val="20"/>
         </w:numPr>
       </w:pPr>
-      <w:proofErr w:type="spellStart"/>
       <w:r>
         <w:t>LinearSVC</w:t>
       </w:r>
-      <w:proofErr w:type="spellEnd"/>
     </w:p>
     <w:p>
       <w:pPr>
@@ -6188,21 +4989,8 @@
           <w:numId w:val="20"/>
         </w:numPr>
       </w:pPr>
-      <w:proofErr w:type="spellStart"/>
-      <w:r>
-        <w:t>cross</w:t>
-      </w:r>
-      <w:proofErr w:type="spellEnd"/>
-      <w:r>
-        <w:t xml:space="preserve"> </w:t>
-      </w:r>
-      <w:proofErr w:type="spellStart"/>
-      <w:r>
-        <w:t>validation</w:t>
-      </w:r>
-      <w:proofErr w:type="spellEnd"/>
-      <w:r>
-        <w:t xml:space="preserve"> f1 scores [47.75022957 51.84501845 50.27932961 49.72273567 50.77343039]</w:t>
+      <w:r>
+        <w:t>cross validation f1 scores [47.75022957 51.84501845 50.27932961 49.72273567 50.77343039]</w:t>
       </w:r>
     </w:p>
     <w:p>
@@ -6214,21 +5002,8 @@
         </w:numPr>
         <w:spacing w:before="240" w:after="240"/>
       </w:pPr>
-      <w:proofErr w:type="spellStart"/>
-      <w:r>
-        <w:t>cross</w:t>
-      </w:r>
-      <w:proofErr w:type="spellEnd"/>
-      <w:r>
-        <w:t xml:space="preserve"> </w:t>
-      </w:r>
-      <w:proofErr w:type="spellStart"/>
-      <w:r>
-        <w:t>validation</w:t>
-      </w:r>
-      <w:proofErr w:type="spellEnd"/>
-      <w:r>
-        <w:t xml:space="preserve"> f1 mean 50.07414873869516</w:t>
+      <w:r>
+        <w:t>cross validation f1 mean 50.07414873869516</w:t>
       </w:r>
     </w:p>
     <w:p>
@@ -6240,29 +5015,8 @@
         </w:numPr>
         <w:spacing w:before="240" w:after="240"/>
       </w:pPr>
-      <w:proofErr w:type="spellStart"/>
-      <w:r>
-        <w:t>cross</w:t>
-      </w:r>
-      <w:proofErr w:type="spellEnd"/>
-      <w:r>
-        <w:t xml:space="preserve"> </w:t>
-      </w:r>
-      <w:proofErr w:type="spellStart"/>
-      <w:r>
-        <w:t>validation</w:t>
-      </w:r>
-      <w:proofErr w:type="spellEnd"/>
-      <w:r>
-        <w:t xml:space="preserve"> f1 </w:t>
-      </w:r>
-      <w:proofErr w:type="spellStart"/>
-      <w:r>
-        <w:t>std</w:t>
-      </w:r>
-      <w:proofErr w:type="spellEnd"/>
-      <w:r>
-        <w:t xml:space="preserve"> 0.01355814515763869</w:t>
+      <w:r>
+        <w:t>cross validation f1 std 0.01355814515763869</w:t>
       </w:r>
     </w:p>
     <w:p>
@@ -6274,37 +5028,8 @@
         </w:numPr>
         <w:spacing w:before="240" w:after="240"/>
       </w:pPr>
-      <w:proofErr w:type="spellStart"/>
-      <w:r>
-        <w:t>cross</w:t>
-      </w:r>
-      <w:proofErr w:type="spellEnd"/>
-      <w:r>
-        <w:t xml:space="preserve"> </w:t>
-      </w:r>
-      <w:proofErr w:type="spellStart"/>
-      <w:r>
-        <w:t>validation</w:t>
-      </w:r>
-      <w:proofErr w:type="spellEnd"/>
-      <w:r>
-        <w:t xml:space="preserve"> </w:t>
-      </w:r>
-      <w:proofErr w:type="spellStart"/>
-      <w:r>
-        <w:t>recall</w:t>
-      </w:r>
-      <w:proofErr w:type="spellEnd"/>
-      <w:r>
-        <w:t xml:space="preserve"> scores [47.70642202 51.55963303 </w:t>
-      </w:r>
-      <w:proofErr w:type="gramStart"/>
-      <w:r>
-        <w:t>49.5412844  49.35779817</w:t>
-      </w:r>
-      <w:proofErr w:type="gramEnd"/>
-      <w:r>
-        <w:t xml:space="preserve"> 51.19266055]</w:t>
+      <w:r>
+        <w:t>cross validation recall scores [47.70642202 51.55963303 49.5412844  49.35779817 51.19266055]</w:t>
       </w:r>
     </w:p>
     <w:p>
@@ -6316,29 +5041,8 @@
         </w:numPr>
         <w:spacing w:before="240" w:after="240"/>
       </w:pPr>
-      <w:proofErr w:type="spellStart"/>
-      <w:r>
-        <w:t>cross</w:t>
-      </w:r>
-      <w:proofErr w:type="spellEnd"/>
-      <w:r>
-        <w:t xml:space="preserve"> </w:t>
-      </w:r>
-      <w:proofErr w:type="spellStart"/>
-      <w:r>
-        <w:t>validation</w:t>
-      </w:r>
-      <w:proofErr w:type="spellEnd"/>
-      <w:r>
-        <w:t xml:space="preserve"> </w:t>
-      </w:r>
-      <w:proofErr w:type="spellStart"/>
-      <w:r>
-        <w:t>recall</w:t>
-      </w:r>
-      <w:proofErr w:type="spellEnd"/>
-      <w:r>
-        <w:t xml:space="preserve"> mean 49.871559633027516</w:t>
+      <w:r>
+        <w:t>cross validation recall mean 49.871559633027516</w:t>
       </w:r>
     </w:p>
     <w:p>
@@ -6349,37 +5053,8 @@
           <w:numId w:val="20"/>
         </w:numPr>
       </w:pPr>
-      <w:proofErr w:type="spellStart"/>
-      <w:r>
-        <w:t>cross</w:t>
-      </w:r>
-      <w:proofErr w:type="spellEnd"/>
-      <w:r>
-        <w:t xml:space="preserve"> </w:t>
-      </w:r>
-      <w:proofErr w:type="spellStart"/>
-      <w:r>
-        <w:t>validation</w:t>
-      </w:r>
-      <w:proofErr w:type="spellEnd"/>
-      <w:r>
-        <w:t xml:space="preserve"> </w:t>
-      </w:r>
-      <w:proofErr w:type="spellStart"/>
-      <w:r>
-        <w:t>recall</w:t>
-      </w:r>
-      <w:proofErr w:type="spellEnd"/>
-      <w:r>
-        <w:t xml:space="preserve"> </w:t>
-      </w:r>
-      <w:proofErr w:type="spellStart"/>
-      <w:r>
-        <w:t>std</w:t>
-      </w:r>
-      <w:proofErr w:type="spellEnd"/>
-      <w:r>
-        <w:t xml:space="preserve"> 0.013896584388081803</w:t>
+      <w:r>
+        <w:t>cross validation recall std 0.013896584388081803</w:t>
       </w:r>
     </w:p>
     <w:p>
@@ -6390,11 +5065,9 @@
           <w:numId w:val="20"/>
         </w:numPr>
       </w:pPr>
-      <w:proofErr w:type="spellStart"/>
       <w:r>
         <w:t>KNeighborsClassifier</w:t>
       </w:r>
-      <w:proofErr w:type="spellEnd"/>
     </w:p>
     <w:p>
       <w:pPr>
@@ -6404,29 +5077,8 @@
           <w:numId w:val="20"/>
         </w:numPr>
       </w:pPr>
-      <w:proofErr w:type="spellStart"/>
-      <w:r>
-        <w:t>cross</w:t>
-      </w:r>
-      <w:proofErr w:type="spellEnd"/>
-      <w:r>
-        <w:t xml:space="preserve"> </w:t>
-      </w:r>
-      <w:proofErr w:type="spellStart"/>
-      <w:r>
-        <w:t>validation</w:t>
-      </w:r>
-      <w:proofErr w:type="spellEnd"/>
-      <w:r>
-        <w:t xml:space="preserve"> f1 scores [</w:t>
-      </w:r>
-      <w:proofErr w:type="gramStart"/>
-      <w:r>
-        <w:t>60.0896861  57.96579658</w:t>
-      </w:r>
-      <w:proofErr w:type="gramEnd"/>
-      <w:r>
-        <w:t xml:space="preserve"> 59.35030729 54.34583715 57.96579658]</w:t>
+      <w:r>
+        <w:t>cross validation f1 scores [60.0896861  57.96579658 59.35030729 54.34583715 57.96579658]</w:t>
       </w:r>
     </w:p>
     <w:p>
@@ -6438,21 +5090,8 @@
         </w:numPr>
         <w:spacing w:before="240" w:after="240"/>
       </w:pPr>
-      <w:proofErr w:type="spellStart"/>
-      <w:r>
-        <w:t>cross</w:t>
-      </w:r>
-      <w:proofErr w:type="spellEnd"/>
-      <w:r>
-        <w:t xml:space="preserve"> </w:t>
-      </w:r>
-      <w:proofErr w:type="spellStart"/>
-      <w:r>
-        <w:t>validation</w:t>
-      </w:r>
-      <w:proofErr w:type="spellEnd"/>
-      <w:r>
-        <w:t xml:space="preserve"> f1 mean 57.94348473810715</w:t>
+      <w:r>
+        <w:t>cross validation f1 mean 57.94348473810715</w:t>
       </w:r>
     </w:p>
     <w:p>
@@ -6464,29 +5103,8 @@
         </w:numPr>
         <w:spacing w:before="240" w:after="240"/>
       </w:pPr>
-      <w:proofErr w:type="spellStart"/>
-      <w:r>
-        <w:t>cross</w:t>
-      </w:r>
-      <w:proofErr w:type="spellEnd"/>
-      <w:r>
-        <w:t xml:space="preserve"> </w:t>
-      </w:r>
-      <w:proofErr w:type="spellStart"/>
-      <w:r>
-        <w:t>validation</w:t>
-      </w:r>
-      <w:proofErr w:type="spellEnd"/>
-      <w:r>
-        <w:t xml:space="preserve"> f1 </w:t>
-      </w:r>
-      <w:proofErr w:type="spellStart"/>
-      <w:r>
-        <w:t>std</w:t>
-      </w:r>
-      <w:proofErr w:type="spellEnd"/>
-      <w:r>
-        <w:t xml:space="preserve"> 0.019763296183430562</w:t>
+      <w:r>
+        <w:t>cross validation f1 std 0.019763296183430562</w:t>
       </w:r>
     </w:p>
     <w:p>
@@ -6498,29 +5116,8 @@
         </w:numPr>
         <w:spacing w:before="240" w:after="240"/>
       </w:pPr>
-      <w:proofErr w:type="spellStart"/>
-      <w:r>
-        <w:t>cross</w:t>
-      </w:r>
-      <w:proofErr w:type="spellEnd"/>
-      <w:r>
-        <w:t xml:space="preserve"> </w:t>
-      </w:r>
-      <w:proofErr w:type="spellStart"/>
-      <w:r>
-        <w:t>validation</w:t>
-      </w:r>
-      <w:proofErr w:type="spellEnd"/>
-      <w:r>
-        <w:t xml:space="preserve"> </w:t>
-      </w:r>
-      <w:proofErr w:type="spellStart"/>
-      <w:r>
-        <w:t>recall</w:t>
-      </w:r>
-      <w:proofErr w:type="spellEnd"/>
-      <w:r>
-        <w:t xml:space="preserve"> scores [61.46788991 59.08256881 62.01834862 54.49541284 59.08256881]</w:t>
+      <w:r>
+        <w:t>cross validation recall scores [61.46788991 59.08256881 62.01834862 54.49541284 59.08256881]</w:t>
       </w:r>
     </w:p>
     <w:p>
@@ -6532,29 +5129,8 @@
         </w:numPr>
         <w:spacing w:before="240" w:after="240"/>
       </w:pPr>
-      <w:proofErr w:type="spellStart"/>
-      <w:r>
-        <w:t>cross</w:t>
-      </w:r>
-      <w:proofErr w:type="spellEnd"/>
-      <w:r>
-        <w:t xml:space="preserve"> </w:t>
-      </w:r>
-      <w:proofErr w:type="spellStart"/>
-      <w:r>
-        <w:t>validation</w:t>
-      </w:r>
-      <w:proofErr w:type="spellEnd"/>
-      <w:r>
-        <w:t xml:space="preserve"> </w:t>
-      </w:r>
-      <w:proofErr w:type="spellStart"/>
-      <w:r>
-        <w:t>recall</w:t>
-      </w:r>
-      <w:proofErr w:type="spellEnd"/>
-      <w:r>
-        <w:t xml:space="preserve"> mean 59.22935779816514</w:t>
+      <w:r>
+        <w:t>cross validation recall mean 59.22935779816514</w:t>
       </w:r>
     </w:p>
     <w:p>
@@ -6565,37 +5141,8 @@
           <w:numId w:val="20"/>
         </w:numPr>
       </w:pPr>
-      <w:proofErr w:type="spellStart"/>
-      <w:r>
-        <w:t>cross</w:t>
-      </w:r>
-      <w:proofErr w:type="spellEnd"/>
-      <w:r>
-        <w:t xml:space="preserve"> </w:t>
-      </w:r>
-      <w:proofErr w:type="spellStart"/>
-      <w:r>
-        <w:t>validation</w:t>
-      </w:r>
-      <w:proofErr w:type="spellEnd"/>
-      <w:r>
-        <w:t xml:space="preserve"> </w:t>
-      </w:r>
-      <w:proofErr w:type="spellStart"/>
-      <w:r>
-        <w:t>recall</w:t>
-      </w:r>
-      <w:proofErr w:type="spellEnd"/>
-      <w:r>
-        <w:t xml:space="preserve"> </w:t>
-      </w:r>
-      <w:proofErr w:type="spellStart"/>
-      <w:r>
-        <w:t>std</w:t>
-      </w:r>
-      <w:proofErr w:type="spellEnd"/>
-      <w:r>
-        <w:t xml:space="preserve"> 0.02654913357458485</w:t>
+      <w:r>
+        <w:t>cross validation recall std 0.02654913357458485</w:t>
       </w:r>
     </w:p>
     <w:p>
@@ -6606,11 +5153,9 @@
           <w:numId w:val="20"/>
         </w:numPr>
       </w:pPr>
-      <w:proofErr w:type="spellStart"/>
       <w:r>
         <w:t>DecisionTreeClassifier</w:t>
       </w:r>
-      <w:proofErr w:type="spellEnd"/>
     </w:p>
     <w:p>
       <w:pPr>
@@ -6620,21 +5165,8 @@
           <w:numId w:val="20"/>
         </w:numPr>
       </w:pPr>
-      <w:proofErr w:type="spellStart"/>
-      <w:r>
-        <w:t>cross</w:t>
-      </w:r>
-      <w:proofErr w:type="spellEnd"/>
-      <w:r>
-        <w:t xml:space="preserve"> </w:t>
-      </w:r>
-      <w:proofErr w:type="spellStart"/>
-      <w:r>
-        <w:t>validation</w:t>
-      </w:r>
-      <w:proofErr w:type="spellEnd"/>
-      <w:r>
-        <w:t xml:space="preserve"> f1 scores [70.83685545 69.40874036 69.59517657 70.68965517 72.26596675]</w:t>
+      <w:r>
+        <w:t>cross validation f1 scores [70.83685545 69.40874036 69.59517657 70.68965517 72.26596675]</w:t>
       </w:r>
     </w:p>
     <w:p>
@@ -6646,22 +5178,9 @@
         </w:numPr>
         <w:spacing w:before="240" w:after="240"/>
       </w:pPr>
-      <w:proofErr w:type="spellStart"/>
       <w:r>
         <w:lastRenderedPageBreak/>
-        <w:t>cross</w:t>
-      </w:r>
-      <w:proofErr w:type="spellEnd"/>
-      <w:r>
-        <w:t xml:space="preserve"> </w:t>
-      </w:r>
-      <w:proofErr w:type="spellStart"/>
-      <w:r>
-        <w:t>validation</w:t>
-      </w:r>
-      <w:proofErr w:type="spellEnd"/>
-      <w:r>
-        <w:t xml:space="preserve"> f1 mean 70.5592788621255</w:t>
+        <w:t>cross validation f1 mean 70.5592788621255</w:t>
       </w:r>
     </w:p>
     <w:p>
@@ -6673,29 +5192,8 @@
         </w:numPr>
         <w:spacing w:before="240" w:after="240"/>
       </w:pPr>
-      <w:proofErr w:type="spellStart"/>
-      <w:r>
-        <w:t>cross</w:t>
-      </w:r>
-      <w:proofErr w:type="spellEnd"/>
-      <w:r>
-        <w:t xml:space="preserve"> </w:t>
-      </w:r>
-      <w:proofErr w:type="spellStart"/>
-      <w:r>
-        <w:t>validation</w:t>
-      </w:r>
-      <w:proofErr w:type="spellEnd"/>
-      <w:r>
-        <w:t xml:space="preserve"> f1 </w:t>
-      </w:r>
-      <w:proofErr w:type="spellStart"/>
-      <w:r>
-        <w:t>std</w:t>
-      </w:r>
-      <w:proofErr w:type="spellEnd"/>
-      <w:r>
-        <w:t xml:space="preserve"> 0.010256765940153307</w:t>
+      <w:r>
+        <w:t>cross validation f1 std 0.010256765940153307</w:t>
       </w:r>
     </w:p>
     <w:p>
@@ -6707,37 +5205,8 @@
         </w:numPr>
         <w:spacing w:before="240" w:after="240"/>
       </w:pPr>
-      <w:proofErr w:type="spellStart"/>
-      <w:r>
-        <w:t>cross</w:t>
-      </w:r>
-      <w:proofErr w:type="spellEnd"/>
-      <w:r>
-        <w:t xml:space="preserve"> </w:t>
-      </w:r>
-      <w:proofErr w:type="spellStart"/>
-      <w:r>
-        <w:t>validation</w:t>
-      </w:r>
-      <w:proofErr w:type="spellEnd"/>
-      <w:r>
-        <w:t xml:space="preserve"> </w:t>
-      </w:r>
-      <w:proofErr w:type="spellStart"/>
-      <w:r>
-        <w:t>recall</w:t>
-      </w:r>
-      <w:proofErr w:type="spellEnd"/>
-      <w:r>
-        <w:t xml:space="preserve"> scores [75.41284404 72.66055046 74.67889908 75.</w:t>
-      </w:r>
-      <w:proofErr w:type="gramStart"/>
-      <w:r>
-        <w:t>2293578  75.41284404</w:t>
-      </w:r>
-      <w:proofErr w:type="gramEnd"/>
-      <w:r>
-        <w:t>]</w:t>
+      <w:r>
+        <w:t>cross validation recall scores [75.41284404 72.66055046 74.67889908 75.2293578  75.41284404]</w:t>
       </w:r>
     </w:p>
     <w:p>
@@ -6749,29 +5218,8 @@
         </w:numPr>
         <w:spacing w:before="240" w:after="240"/>
       </w:pPr>
-      <w:proofErr w:type="spellStart"/>
-      <w:r>
-        <w:t>cross</w:t>
-      </w:r>
-      <w:proofErr w:type="spellEnd"/>
-      <w:r>
-        <w:t xml:space="preserve"> </w:t>
-      </w:r>
-      <w:proofErr w:type="spellStart"/>
-      <w:r>
-        <w:t>validation</w:t>
-      </w:r>
-      <w:proofErr w:type="spellEnd"/>
-      <w:r>
-        <w:t xml:space="preserve"> </w:t>
-      </w:r>
-      <w:proofErr w:type="spellStart"/>
-      <w:r>
-        <w:t>recall</w:t>
-      </w:r>
-      <w:proofErr w:type="spellEnd"/>
-      <w:r>
-        <w:t xml:space="preserve"> mean 74.6788990825688</w:t>
+      <w:r>
+        <w:t>cross validation recall mean 74.6788990825688</w:t>
       </w:r>
     </w:p>
     <w:p>
@@ -6782,37 +5230,8 @@
           <w:numId w:val="20"/>
         </w:numPr>
       </w:pPr>
-      <w:proofErr w:type="spellStart"/>
-      <w:r>
-        <w:t>cross</w:t>
-      </w:r>
-      <w:proofErr w:type="spellEnd"/>
-      <w:r>
-        <w:t xml:space="preserve"> </w:t>
-      </w:r>
-      <w:proofErr w:type="spellStart"/>
-      <w:r>
-        <w:t>validation</w:t>
-      </w:r>
-      <w:proofErr w:type="spellEnd"/>
-      <w:r>
-        <w:t xml:space="preserve"> </w:t>
-      </w:r>
-      <w:proofErr w:type="spellStart"/>
-      <w:r>
-        <w:t>recall</w:t>
-      </w:r>
-      <w:proofErr w:type="spellEnd"/>
-      <w:r>
-        <w:t xml:space="preserve"> </w:t>
-      </w:r>
-      <w:proofErr w:type="spellStart"/>
-      <w:r>
-        <w:t>std</w:t>
-      </w:r>
-      <w:proofErr w:type="spellEnd"/>
-      <w:r>
-        <w:t xml:space="preserve"> 0.010444219795051512</w:t>
+      <w:r>
+        <w:t>cross validation recall std 0.010444219795051512</w:t>
       </w:r>
     </w:p>
     <w:p/>
@@ -6855,35 +5274,7 @@
         <w:rPr>
           <w:highlight w:val="yellow"/>
         </w:rPr>
-        <w:t>Corroborar los valores resultantes de la experimentación (</w:t>
-      </w:r>
-      <w:proofErr w:type="spellStart"/>
-      <w:r>
-        <w:rPr>
-          <w:highlight w:val="yellow"/>
-        </w:rPr>
-        <w:t>acutalizada</w:t>
-      </w:r>
-      <w:proofErr w:type="spellEnd"/>
-      <w:r>
-        <w:rPr>
-          <w:highlight w:val="yellow"/>
-        </w:rPr>
-        <w:t xml:space="preserve">) contra los documentados aquí y determinar si hubo modificaciones. En caso de haberlas, </w:t>
-      </w:r>
-      <w:proofErr w:type="spellStart"/>
-      <w:r>
-        <w:rPr>
-          <w:highlight w:val="yellow"/>
-        </w:rPr>
-        <w:t>registarlas</w:t>
-      </w:r>
-      <w:proofErr w:type="spellEnd"/>
-      <w:r>
-        <w:rPr>
-          <w:highlight w:val="yellow"/>
-        </w:rPr>
-        <w:t>.</w:t>
+        <w:t>Corroborar los valores resultantes de la experimentación (acutalizada) contra los documentados aquí y determinar si hubo modificaciones. En caso de haberlas, registarlas.</w:t>
       </w:r>
     </w:p>
     <w:p/>
@@ -6946,15 +5337,7 @@
     </w:p>
     <w:p>
       <w:r>
-        <w:t xml:space="preserve">En cuanto al modelo de predicción, se evaluaron diferentes algoritmos de clasificación mediante validación cruzada, utilizando las métricas f1-score y </w:t>
-      </w:r>
-      <w:proofErr w:type="spellStart"/>
-      <w:r>
-        <w:t>recall</w:t>
-      </w:r>
-      <w:proofErr w:type="spellEnd"/>
-      <w:r>
-        <w:t>. Los resultados promedio obtenidos fueron los siguientes:</w:t>
+        <w:t>En cuanto al modelo de predicción, se evaluaron diferentes algoritmos de clasificación mediante validación cruzada, utilizando las métricas f1-score y recall. Los resultados promedio obtenidos fueron los siguientes:</w:t>
       </w:r>
     </w:p>
     <w:tbl>
@@ -7001,27 +5384,7 @@
           </w:tcPr>
           <w:p>
             <w:r>
-              <w:t xml:space="preserve">F1 </w:t>
-            </w:r>
-            <w:proofErr w:type="spellStart"/>
-            <w:r>
-              <w:t>std</w:t>
-            </w:r>
-            <w:proofErr w:type="spellEnd"/>
-          </w:p>
-        </w:tc>
-        <w:tc>
-          <w:tcPr>
-            <w:tcW w:w="1803" w:type="dxa"/>
-          </w:tcPr>
-          <w:p>
-            <w:proofErr w:type="spellStart"/>
-            <w:r>
-              <w:t>Recall</w:t>
-            </w:r>
-            <w:proofErr w:type="spellEnd"/>
-            <w:r>
-              <w:t xml:space="preserve"> mean</w:t>
+              <w:t>F1 std</w:t>
             </w:r>
           </w:p>
         </w:tc>
@@ -7030,19 +5393,19 @@
             <w:tcW w:w="1803" w:type="dxa"/>
           </w:tcPr>
           <w:p>
-            <w:proofErr w:type="spellStart"/>
             <w:r>
-              <w:t>Recall</w:t>
+              <w:t>Recall mean</w:t>
             </w:r>
-            <w:proofErr w:type="spellEnd"/>
+          </w:p>
+        </w:tc>
+        <w:tc>
+          <w:tcPr>
+            <w:tcW w:w="1803" w:type="dxa"/>
+          </w:tcPr>
+          <w:p>
             <w:r>
-              <w:t xml:space="preserve"> </w:t>
+              <w:t>Recall std</w:t>
             </w:r>
-            <w:proofErr w:type="spellStart"/>
-            <w:r>
-              <w:t>std</w:t>
-            </w:r>
-            <w:proofErr w:type="spellEnd"/>
           </w:p>
         </w:tc>
       </w:tr>
@@ -7055,19 +5418,9 @@
             <w:tcW w:w="2230" w:type="dxa"/>
           </w:tcPr>
           <w:p>
-            <w:proofErr w:type="spellStart"/>
             <w:r>
-              <w:t>Logistic</w:t>
+              <w:t>Logistic Regression</w:t>
             </w:r>
-            <w:proofErr w:type="spellEnd"/>
-            <w:r>
-              <w:t xml:space="preserve"> </w:t>
-            </w:r>
-            <w:proofErr w:type="spellStart"/>
-            <w:r>
-              <w:t>Regression</w:t>
-            </w:r>
-            <w:proofErr w:type="spellEnd"/>
           </w:p>
         </w:tc>
         <w:tc>
@@ -7120,11 +5473,9 @@
             <w:tcW w:w="2230" w:type="dxa"/>
           </w:tcPr>
           <w:p>
-            <w:proofErr w:type="spellStart"/>
             <w:r>
               <w:t>LinearSVC</w:t>
             </w:r>
-            <w:proofErr w:type="spellEnd"/>
           </w:p>
         </w:tc>
         <w:tc>
@@ -7180,11 +5531,9 @@
             <w:tcW w:w="2230" w:type="dxa"/>
           </w:tcPr>
           <w:p>
-            <w:proofErr w:type="spellStart"/>
             <w:r>
               <w:t>KNeighborsClassifier</w:t>
             </w:r>
-            <w:proofErr w:type="spellEnd"/>
           </w:p>
         </w:tc>
         <w:tc>
@@ -7240,11 +5589,9 @@
             <w:tcW w:w="2230" w:type="dxa"/>
           </w:tcPr>
           <w:p>
-            <w:proofErr w:type="spellStart"/>
             <w:r>
               <w:t>DecisionTreeClassifier</w:t>
             </w:r>
-            <w:proofErr w:type="spellEnd"/>
           </w:p>
         </w:tc>
         <w:tc>
@@ -7292,15 +5639,7 @@
     <w:p/>
     <w:p>
       <w:r>
-        <w:t xml:space="preserve">El mejor desempeño se obtuvo con el </w:t>
-      </w:r>
-      <w:proofErr w:type="spellStart"/>
-      <w:r>
-        <w:t>DecisionTreeClassifier</w:t>
-      </w:r>
-      <w:proofErr w:type="spellEnd"/>
-      <w:r>
-        <w:t>, que superó ampliamente al resto de los modelos en ambas métricas.</w:t>
+        <w:t>El mejor desempeño se obtuvo con el DecisionTreeClassifier, que superó ampliamente al resto de los modelos en ambas métricas.</w:t>
       </w:r>
     </w:p>
     <w:p>
@@ -7321,15 +5660,7 @@
         <w:t>instancia</w:t>
       </w:r>
       <w:r>
-        <w:t xml:space="preserve"> de trabajo la decisión original del proyecto. Para garantizar que ante un </w:t>
-      </w:r>
-      <w:proofErr w:type="spellStart"/>
-      <w:r>
-        <w:t>re-entrenamiento</w:t>
-      </w:r>
-      <w:proofErr w:type="spellEnd"/>
-      <w:r>
-        <w:t xml:space="preserve"> del modelo el mismo mantenga su </w:t>
+        <w:t xml:space="preserve"> de trabajo la decisión original del proyecto. Para garantizar que ante un re-entrenamiento del modelo el mismo mantenga su </w:t>
       </w:r>
       <w:r>
         <w:t>rendimiento</w:t>
@@ -7391,23 +5722,7 @@
           <w:rFonts w:eastAsiaTheme="minorEastAsia"/>
           <w:highlight w:val="yellow"/>
         </w:rPr>
-        <w:t xml:space="preserve">Agregar la ejecución de </w:t>
-      </w:r>
-      <w:proofErr w:type="gramStart"/>
-      <w:r>
-        <w:rPr>
-          <w:rFonts w:eastAsiaTheme="minorEastAsia"/>
-          <w:highlight w:val="yellow"/>
-        </w:rPr>
-        <w:t>este test</w:t>
-      </w:r>
-      <w:proofErr w:type="gramEnd"/>
-      <w:r>
-        <w:rPr>
-          <w:rFonts w:eastAsiaTheme="minorEastAsia"/>
-          <w:highlight w:val="yellow"/>
-        </w:rPr>
-        <w:t xml:space="preserve"> al pipeline con DVC</w:t>
+        <w:t>Agregar la ejecución de este test al pipeline con DVC</w:t>
       </w:r>
     </w:p>
     <w:p>
@@ -7494,11 +5809,9 @@
       <w:r>
         <w:t xml:space="preserve">l </w:t>
       </w:r>
-      <w:proofErr w:type="spellStart"/>
       <w:r>
         <w:t>dataset</w:t>
       </w:r>
-      <w:proofErr w:type="spellEnd"/>
       <w:r>
         <w:t xml:space="preserve"> original </w:t>
       </w:r>
@@ -7549,23 +5862,7 @@
         </w:numPr>
       </w:pPr>
       <w:r>
-        <w:t xml:space="preserve">Se ha registrado toda la experimentación realizada y la generación del modelo del </w:t>
-      </w:r>
-      <w:proofErr w:type="spellStart"/>
-      <w:r>
-        <w:t>árobl</w:t>
-      </w:r>
-      <w:proofErr w:type="spellEnd"/>
-      <w:r>
-        <w:t xml:space="preserve"> de decisión para el escenario en la librería </w:t>
-      </w:r>
-      <w:proofErr w:type="spellStart"/>
-      <w:r>
-        <w:t>MLFlow</w:t>
-      </w:r>
-      <w:proofErr w:type="spellEnd"/>
-      <w:r>
-        <w:t>.</w:t>
+        <w:t>Se ha registrado toda la experimentación realizada y la generación del modelo del árobl de decisión para el escenario en la librería MLFlow.</w:t>
       </w:r>
     </w:p>
     <w:p>
@@ -7589,15 +5886,7 @@
         </w:numPr>
       </w:pPr>
       <w:r>
-        <w:t xml:space="preserve">Una API implementada con </w:t>
-      </w:r>
-      <w:proofErr w:type="spellStart"/>
-      <w:r>
-        <w:t>FastAPI</w:t>
-      </w:r>
-      <w:proofErr w:type="spellEnd"/>
-      <w:r>
-        <w:t xml:space="preserve"> que permite utilizar el modelo de predicción generado</w:t>
+        <w:t>Una API implementada con FastAPI que permite utilizar el modelo de predicción generado</w:t>
       </w:r>
     </w:p>
     <w:p>
@@ -7609,15 +5898,7 @@
         </w:numPr>
       </w:pPr>
       <w:r>
-        <w:t xml:space="preserve">Una aplicación web con </w:t>
-      </w:r>
-      <w:proofErr w:type="spellStart"/>
-      <w:r>
-        <w:t>Streamlit</w:t>
-      </w:r>
-      <w:proofErr w:type="spellEnd"/>
-      <w:r>
-        <w:t xml:space="preserve"> que permite a un usuario final generar predicciones sobre datos nuevos utilizando el modelo disponible a través de la API.</w:t>
+        <w:t>Una aplicación web con Streamlit que permite a un usuario final generar predicciones sobre datos nuevos utilizando el modelo disponible a través de la API.</w:t>
       </w:r>
     </w:p>
     <w:p>
@@ -7658,15 +5939,7 @@
         </w:numPr>
       </w:pPr>
       <w:r>
-        <w:t xml:space="preserve">Determinar viabilidad de implementación de mejoras en las prácticas de gestión de los datos y en el proceso en sí para asegurar la capacidad de reproducción de </w:t>
-      </w:r>
-      <w:proofErr w:type="gramStart"/>
-      <w:r>
-        <w:t>los mismos</w:t>
-      </w:r>
-      <w:proofErr w:type="gramEnd"/>
-      <w:r>
-        <w:t>.</w:t>
+        <w:t>Determinar viabilidad de implementación de mejoras en las prácticas de gestión de los datos y en el proceso en sí para asegurar la capacidad de reproducción de los mismos.</w:t>
       </w:r>
     </w:p>
     <w:p>
@@ -7690,31 +5963,7 @@
         </w:numPr>
       </w:pPr>
       <w:r>
-        <w:t xml:space="preserve">Optimizar los </w:t>
-      </w:r>
-      <w:proofErr w:type="spellStart"/>
-      <w:r>
-        <w:t>hiperparámetros</w:t>
-      </w:r>
-      <w:proofErr w:type="spellEnd"/>
-      <w:r>
-        <w:t xml:space="preserve"> del modelo de árbol de decisión y evaluar variantes como </w:t>
-      </w:r>
-      <w:proofErr w:type="spellStart"/>
-      <w:r>
-        <w:t>Random</w:t>
-      </w:r>
-      <w:proofErr w:type="spellEnd"/>
-      <w:r>
-        <w:t xml:space="preserve"> Forest o </w:t>
-      </w:r>
-      <w:proofErr w:type="spellStart"/>
-      <w:r>
-        <w:t>XGBoost</w:t>
-      </w:r>
-      <w:proofErr w:type="spellEnd"/>
-      <w:r>
-        <w:t xml:space="preserve"> para aumentar la capacidad de generalización.</w:t>
+        <w:t>Optimizar los hiperparámetros del modelo de árbol de decisión y evaluar variantes como Random Forest o XGBoost para aumentar la capacidad de generalización.</w:t>
       </w:r>
     </w:p>
     <w:p>
@@ -7911,23 +6160,7 @@
     </w:p>
     <w:p>
       <w:r>
-        <w:t xml:space="preserve">Con los productos generados para el uso del modelo de predicción por parte de los usuarios finales, se ha determinado realizar el despliegue de </w:t>
-      </w:r>
-      <w:proofErr w:type="gramStart"/>
-      <w:r>
-        <w:t>los mismos</w:t>
-      </w:r>
-      <w:proofErr w:type="gramEnd"/>
-      <w:r>
-        <w:t xml:space="preserve"> en un </w:t>
-      </w:r>
-      <w:proofErr w:type="spellStart"/>
-      <w:r>
-        <w:t>entrono</w:t>
-      </w:r>
-      <w:proofErr w:type="spellEnd"/>
-      <w:r>
-        <w:t xml:space="preserve"> web. Los productos se encuentran accesibles desde los siguientes enlaces:</w:t>
+        <w:t>Con los productos generados para el uso del modelo de predicción por parte de los usuarios finales, se ha determinado realizar el despliegue de los mismos en un entrono web. Los productos se encuentran accesibles desde los siguientes enlaces:</w:t>
       </w:r>
     </w:p>
     <w:p>
@@ -8004,23 +6237,7 @@
           <w:rFonts w:eastAsiaTheme="minorEastAsia"/>
           <w:highlight w:val="yellow"/>
         </w:rPr>
-        <w:t xml:space="preserve">[Agregar </w:t>
-      </w:r>
-      <w:proofErr w:type="spellStart"/>
-      <w:r>
-        <w:rPr>
-          <w:rFonts w:eastAsiaTheme="minorEastAsia"/>
-          <w:highlight w:val="yellow"/>
-        </w:rPr>
-        <w:t>captuas</w:t>
-      </w:r>
-      <w:proofErr w:type="spellEnd"/>
-      <w:r>
-        <w:rPr>
-          <w:rFonts w:eastAsiaTheme="minorEastAsia"/>
-          <w:highlight w:val="yellow"/>
-        </w:rPr>
-        <w:t xml:space="preserve"> de pantalla de ambos productos]</w:t>
+        <w:t>[Agregar captuas de pantalla de ambos productos]</w:t>
       </w:r>
     </w:p>
     <w:p/>
@@ -8086,15 +6303,7 @@
     </w:p>
     <w:p>
       <w:r>
-        <w:t xml:space="preserve">Con respecto al segundo punto, se ha avanzado en la generación de un pipeline aplicable a las tareas de generación del </w:t>
-      </w:r>
-      <w:proofErr w:type="spellStart"/>
-      <w:r>
-        <w:t>dataset</w:t>
-      </w:r>
-      <w:proofErr w:type="spellEnd"/>
-      <w:r>
-        <w:t xml:space="preserve"> de entrenamiento para el modelo y su validación, así como también para la generación y versionado del modelo.</w:t>
+        <w:t>Con respecto al segundo punto, se ha avanzado en la generación de un pipeline aplicable a las tareas de generación del dataset de entrenamiento para el modelo y su validación, así como también para la generación y versionado del modelo.</w:t>
       </w:r>
     </w:p>
     <w:p>
@@ -8172,15 +6381,7 @@
     </w:p>
     <w:p>
       <w:r>
-        <w:t xml:space="preserve">Los resultados de esta etapa del proyecto serán presentados ante las autoridades para que se pueda </w:t>
-      </w:r>
-      <w:proofErr w:type="gramStart"/>
-      <w:r>
-        <w:t>dar inicio a</w:t>
-      </w:r>
-      <w:proofErr w:type="gramEnd"/>
-      <w:r>
-        <w:t xml:space="preserve"> una etapa de verificación del modelo </w:t>
+        <w:t xml:space="preserve">Los resultados de esta etapa del proyecto serán presentados ante las autoridades para que se pueda dar inicio a una etapa de verificación del modelo </w:t>
       </w:r>
       <w:r>
         <w:t>generado,</w:t>
@@ -8335,28 +6536,32 @@
           <w:rFonts w:eastAsiaTheme="minorEastAsia"/>
           <w:highlight w:val="yellow"/>
         </w:rPr>
-        <w:t xml:space="preserve">[Agregar: </w:t>
-      </w:r>
-      <w:proofErr w:type="spellStart"/>
-      <w:r>
+        <w:t>[Agregar: Items desarrollados en el proyecto en estas dos iteraciones]</w:t>
+      </w:r>
+    </w:p>
+    <w:p>
+      <w:r>
+        <w:t>Como cuestiones a revisar para una siguiente iteración se mencionan:</w:t>
+      </w:r>
+    </w:p>
+    <w:p>
+      <w:pPr>
+        <w:pStyle w:val="ListParagraph"/>
+        <w:numPr>
+          <w:ilvl w:val="0"/>
+          <w:numId w:val="1"/>
+        </w:numPr>
         <w:rPr>
           <w:rFonts w:eastAsiaTheme="minorEastAsia"/>
           <w:highlight w:val="yellow"/>
         </w:rPr>
-        <w:t>Items</w:t>
-      </w:r>
-      <w:proofErr w:type="spellEnd"/>
+      </w:pPr>
       <w:r>
         <w:rPr>
           <w:rFonts w:eastAsiaTheme="minorEastAsia"/>
           <w:highlight w:val="yellow"/>
         </w:rPr>
-        <w:t xml:space="preserve"> desarrollados en el proyecto en estas dos iteraciones]</w:t>
-      </w:r>
-    </w:p>
-    <w:p>
-      <w:r>
-        <w:t>Como cuestiones a revisar para una siguiente iteración se mencionan:</w:t>
+        <w:t>[ejemplo: Capacitación en metodologías ágiles]</w:t>
       </w:r>
     </w:p>
     <w:p>
@@ -8376,43 +6581,7 @@
           <w:rFonts w:eastAsiaTheme="minorEastAsia"/>
           <w:highlight w:val="yellow"/>
         </w:rPr>
-        <w:t>[ejemplo: Capacitación en metodologías ágiles]</w:t>
-      </w:r>
-    </w:p>
-    <w:p>
-      <w:pPr>
-        <w:pStyle w:val="ListParagraph"/>
-        <w:numPr>
-          <w:ilvl w:val="0"/>
-          <w:numId w:val="1"/>
-        </w:numPr>
-        <w:rPr>
-          <w:rFonts w:eastAsiaTheme="minorEastAsia"/>
-          <w:highlight w:val="yellow"/>
-        </w:rPr>
-      </w:pPr>
-      <w:r>
-        <w:rPr>
-          <w:rFonts w:eastAsiaTheme="minorEastAsia"/>
-          <w:highlight w:val="yellow"/>
-        </w:rPr>
-        <w:t xml:space="preserve">[Agregar: </w:t>
-      </w:r>
-      <w:proofErr w:type="spellStart"/>
-      <w:r>
-        <w:rPr>
-          <w:rFonts w:eastAsiaTheme="minorEastAsia"/>
-          <w:highlight w:val="yellow"/>
-        </w:rPr>
-        <w:t>Items</w:t>
-      </w:r>
-      <w:proofErr w:type="spellEnd"/>
-      <w:r>
-        <w:rPr>
-          <w:rFonts w:eastAsiaTheme="minorEastAsia"/>
-          <w:highlight w:val="yellow"/>
-        </w:rPr>
-        <w:t xml:space="preserve"> desarrollados en el proyecto en estas dos iteraciones]</w:t>
+        <w:t>[Agregar: Items desarrollados en el proyecto en estas dos iteraciones]</w:t>
       </w:r>
     </w:p>
     <w:p>
@@ -9011,6 +7180,119 @@
     </w:lvl>
   </w:abstractNum>
   <w:abstractNum w:abstractNumId="3" w15:restartNumberingAfterBreak="0">
+    <w:nsid w:val="1CC56209"/>
+    <w:multiLevelType w:val="hybridMultilevel"/>
+    <w:tmpl w:val="9C6ED940"/>
+    <w:lvl w:ilvl="0" w:tplc="08090001">
+      <w:start w:val="1"/>
+      <w:numFmt w:val="bullet"/>
+      <w:lvlText w:val=""/>
+      <w:lvlJc w:val="left"/>
+      <w:pPr>
+        <w:ind w:left="720" w:hanging="360"/>
+      </w:pPr>
+      <w:rPr>
+        <w:rFonts w:ascii="Symbol" w:hAnsi="Symbol" w:hint="default"/>
+      </w:rPr>
+    </w:lvl>
+    <w:lvl w:ilvl="1" w:tplc="08090003" w:tentative="1">
+      <w:start w:val="1"/>
+      <w:numFmt w:val="bullet"/>
+      <w:lvlText w:val="o"/>
+      <w:lvlJc w:val="left"/>
+      <w:pPr>
+        <w:ind w:left="1440" w:hanging="360"/>
+      </w:pPr>
+      <w:rPr>
+        <w:rFonts w:ascii="Courier New" w:hAnsi="Courier New" w:cs="Courier New" w:hint="default"/>
+      </w:rPr>
+    </w:lvl>
+    <w:lvl w:ilvl="2" w:tplc="08090005" w:tentative="1">
+      <w:start w:val="1"/>
+      <w:numFmt w:val="bullet"/>
+      <w:lvlText w:val=""/>
+      <w:lvlJc w:val="left"/>
+      <w:pPr>
+        <w:ind w:left="2160" w:hanging="360"/>
+      </w:pPr>
+      <w:rPr>
+        <w:rFonts w:ascii="Wingdings" w:hAnsi="Wingdings" w:hint="default"/>
+      </w:rPr>
+    </w:lvl>
+    <w:lvl w:ilvl="3" w:tplc="08090001" w:tentative="1">
+      <w:start w:val="1"/>
+      <w:numFmt w:val="bullet"/>
+      <w:lvlText w:val=""/>
+      <w:lvlJc w:val="left"/>
+      <w:pPr>
+        <w:ind w:left="2880" w:hanging="360"/>
+      </w:pPr>
+      <w:rPr>
+        <w:rFonts w:ascii="Symbol" w:hAnsi="Symbol" w:hint="default"/>
+      </w:rPr>
+    </w:lvl>
+    <w:lvl w:ilvl="4" w:tplc="08090003" w:tentative="1">
+      <w:start w:val="1"/>
+      <w:numFmt w:val="bullet"/>
+      <w:lvlText w:val="o"/>
+      <w:lvlJc w:val="left"/>
+      <w:pPr>
+        <w:ind w:left="3600" w:hanging="360"/>
+      </w:pPr>
+      <w:rPr>
+        <w:rFonts w:ascii="Courier New" w:hAnsi="Courier New" w:cs="Courier New" w:hint="default"/>
+      </w:rPr>
+    </w:lvl>
+    <w:lvl w:ilvl="5" w:tplc="08090005" w:tentative="1">
+      <w:start w:val="1"/>
+      <w:numFmt w:val="bullet"/>
+      <w:lvlText w:val=""/>
+      <w:lvlJc w:val="left"/>
+      <w:pPr>
+        <w:ind w:left="4320" w:hanging="360"/>
+      </w:pPr>
+      <w:rPr>
+        <w:rFonts w:ascii="Wingdings" w:hAnsi="Wingdings" w:hint="default"/>
+      </w:rPr>
+    </w:lvl>
+    <w:lvl w:ilvl="6" w:tplc="08090001" w:tentative="1">
+      <w:start w:val="1"/>
+      <w:numFmt w:val="bullet"/>
+      <w:lvlText w:val=""/>
+      <w:lvlJc w:val="left"/>
+      <w:pPr>
+        <w:ind w:left="5040" w:hanging="360"/>
+      </w:pPr>
+      <w:rPr>
+        <w:rFonts w:ascii="Symbol" w:hAnsi="Symbol" w:hint="default"/>
+      </w:rPr>
+    </w:lvl>
+    <w:lvl w:ilvl="7" w:tplc="08090003" w:tentative="1">
+      <w:start w:val="1"/>
+      <w:numFmt w:val="bullet"/>
+      <w:lvlText w:val="o"/>
+      <w:lvlJc w:val="left"/>
+      <w:pPr>
+        <w:ind w:left="5760" w:hanging="360"/>
+      </w:pPr>
+      <w:rPr>
+        <w:rFonts w:ascii="Courier New" w:hAnsi="Courier New" w:cs="Courier New" w:hint="default"/>
+      </w:rPr>
+    </w:lvl>
+    <w:lvl w:ilvl="8" w:tplc="08090005" w:tentative="1">
+      <w:start w:val="1"/>
+      <w:numFmt w:val="bullet"/>
+      <w:lvlText w:val=""/>
+      <w:lvlJc w:val="left"/>
+      <w:pPr>
+        <w:ind w:left="6480" w:hanging="360"/>
+      </w:pPr>
+      <w:rPr>
+        <w:rFonts w:ascii="Wingdings" w:hAnsi="Wingdings" w:hint="default"/>
+      </w:rPr>
+    </w:lvl>
+  </w:abstractNum>
+  <w:abstractNum w:abstractNumId="4" w15:restartNumberingAfterBreak="0">
     <w:nsid w:val="1D07F4F5"/>
     <w:multiLevelType w:val="hybridMultilevel"/>
     <w:tmpl w:val="24285866"/>
@@ -9123,7 +7405,7 @@
       </w:rPr>
     </w:lvl>
   </w:abstractNum>
-  <w:abstractNum w:abstractNumId="4" w15:restartNumberingAfterBreak="0">
+  <w:abstractNum w:abstractNumId="5" w15:restartNumberingAfterBreak="0">
     <w:nsid w:val="21BB6ABF"/>
     <w:multiLevelType w:val="hybridMultilevel"/>
     <w:tmpl w:val="BC7C5B76"/>
@@ -9209,7 +7491,7 @@
       </w:pPr>
     </w:lvl>
   </w:abstractNum>
-  <w:abstractNum w:abstractNumId="5" w15:restartNumberingAfterBreak="0">
+  <w:abstractNum w:abstractNumId="6" w15:restartNumberingAfterBreak="0">
     <w:nsid w:val="2327F564"/>
     <w:multiLevelType w:val="hybridMultilevel"/>
     <w:tmpl w:val="C3589BC6"/>
@@ -9322,7 +7604,7 @@
       </w:rPr>
     </w:lvl>
   </w:abstractNum>
-  <w:abstractNum w:abstractNumId="6" w15:restartNumberingAfterBreak="0">
+  <w:abstractNum w:abstractNumId="7" w15:restartNumberingAfterBreak="0">
     <w:nsid w:val="261F86D8"/>
     <w:multiLevelType w:val="hybridMultilevel"/>
     <w:tmpl w:val="C09E09A6"/>
@@ -9435,7 +7717,7 @@
       </w:rPr>
     </w:lvl>
   </w:abstractNum>
-  <w:abstractNum w:abstractNumId="7" w15:restartNumberingAfterBreak="0">
+  <w:abstractNum w:abstractNumId="8" w15:restartNumberingAfterBreak="0">
     <w:nsid w:val="28A4D1D9"/>
     <w:multiLevelType w:val="hybridMultilevel"/>
     <w:tmpl w:val="155EF8F4"/>
@@ -9548,7 +7830,7 @@
       </w:rPr>
     </w:lvl>
   </w:abstractNum>
-  <w:abstractNum w:abstractNumId="8" w15:restartNumberingAfterBreak="0">
+  <w:abstractNum w:abstractNumId="9" w15:restartNumberingAfterBreak="0">
     <w:nsid w:val="2E5E53CC"/>
     <w:multiLevelType w:val="hybridMultilevel"/>
     <w:tmpl w:val="2D825222"/>
@@ -9661,7 +7943,7 @@
       </w:rPr>
     </w:lvl>
   </w:abstractNum>
-  <w:abstractNum w:abstractNumId="9" w15:restartNumberingAfterBreak="0">
+  <w:abstractNum w:abstractNumId="10" w15:restartNumberingAfterBreak="0">
     <w:nsid w:val="3184E913"/>
     <w:multiLevelType w:val="hybridMultilevel"/>
     <w:tmpl w:val="338E386A"/>
@@ -9774,7 +8056,7 @@
       </w:rPr>
     </w:lvl>
   </w:abstractNum>
-  <w:abstractNum w:abstractNumId="10" w15:restartNumberingAfterBreak="0">
+  <w:abstractNum w:abstractNumId="11" w15:restartNumberingAfterBreak="0">
     <w:nsid w:val="321D42BA"/>
     <w:multiLevelType w:val="hybridMultilevel"/>
     <w:tmpl w:val="B114FEA8"/>
@@ -9887,7 +8169,7 @@
       </w:rPr>
     </w:lvl>
   </w:abstractNum>
-  <w:abstractNum w:abstractNumId="11" w15:restartNumberingAfterBreak="0">
+  <w:abstractNum w:abstractNumId="12" w15:restartNumberingAfterBreak="0">
     <w:nsid w:val="3434B219"/>
     <w:multiLevelType w:val="hybridMultilevel"/>
     <w:tmpl w:val="974A63F8"/>
@@ -10000,7 +8282,7 @@
       </w:rPr>
     </w:lvl>
   </w:abstractNum>
-  <w:abstractNum w:abstractNumId="12" w15:restartNumberingAfterBreak="0">
+  <w:abstractNum w:abstractNumId="13" w15:restartNumberingAfterBreak="0">
     <w:nsid w:val="3494348C"/>
     <w:multiLevelType w:val="hybridMultilevel"/>
     <w:tmpl w:val="F04A0268"/>
@@ -10113,7 +8395,7 @@
       </w:rPr>
     </w:lvl>
   </w:abstractNum>
-  <w:abstractNum w:abstractNumId="13" w15:restartNumberingAfterBreak="0">
+  <w:abstractNum w:abstractNumId="14" w15:restartNumberingAfterBreak="0">
     <w:nsid w:val="3532BBF8"/>
     <w:multiLevelType w:val="hybridMultilevel"/>
     <w:tmpl w:val="3F8643AA"/>
@@ -10226,7 +8508,7 @@
       </w:rPr>
     </w:lvl>
   </w:abstractNum>
-  <w:abstractNum w:abstractNumId="14" w15:restartNumberingAfterBreak="0">
+  <w:abstractNum w:abstractNumId="15" w15:restartNumberingAfterBreak="0">
     <w:nsid w:val="362BBAD3"/>
     <w:multiLevelType w:val="hybridMultilevel"/>
     <w:tmpl w:val="96E6A016"/>
@@ -10339,7 +8621,7 @@
       </w:rPr>
     </w:lvl>
   </w:abstractNum>
-  <w:abstractNum w:abstractNumId="15" w15:restartNumberingAfterBreak="0">
+  <w:abstractNum w:abstractNumId="16" w15:restartNumberingAfterBreak="0">
     <w:nsid w:val="3BE57AA5"/>
     <w:multiLevelType w:val="hybridMultilevel"/>
     <w:tmpl w:val="72F8F84A"/>
@@ -10452,7 +8734,120 @@
       </w:rPr>
     </w:lvl>
   </w:abstractNum>
-  <w:abstractNum w:abstractNumId="16" w15:restartNumberingAfterBreak="0">
+  <w:abstractNum w:abstractNumId="17" w15:restartNumberingAfterBreak="0">
+    <w:nsid w:val="3E481C8D"/>
+    <w:multiLevelType w:val="hybridMultilevel"/>
+    <w:tmpl w:val="05A275E8"/>
+    <w:lvl w:ilvl="0" w:tplc="08090001">
+      <w:start w:val="1"/>
+      <w:numFmt w:val="bullet"/>
+      <w:lvlText w:val=""/>
+      <w:lvlJc w:val="left"/>
+      <w:pPr>
+        <w:ind w:left="720" w:hanging="360"/>
+      </w:pPr>
+      <w:rPr>
+        <w:rFonts w:ascii="Symbol" w:hAnsi="Symbol" w:hint="default"/>
+      </w:rPr>
+    </w:lvl>
+    <w:lvl w:ilvl="1" w:tplc="08090003" w:tentative="1">
+      <w:start w:val="1"/>
+      <w:numFmt w:val="bullet"/>
+      <w:lvlText w:val="o"/>
+      <w:lvlJc w:val="left"/>
+      <w:pPr>
+        <w:ind w:left="1440" w:hanging="360"/>
+      </w:pPr>
+      <w:rPr>
+        <w:rFonts w:ascii="Courier New" w:hAnsi="Courier New" w:cs="Courier New" w:hint="default"/>
+      </w:rPr>
+    </w:lvl>
+    <w:lvl w:ilvl="2" w:tplc="08090005" w:tentative="1">
+      <w:start w:val="1"/>
+      <w:numFmt w:val="bullet"/>
+      <w:lvlText w:val=""/>
+      <w:lvlJc w:val="left"/>
+      <w:pPr>
+        <w:ind w:left="2160" w:hanging="360"/>
+      </w:pPr>
+      <w:rPr>
+        <w:rFonts w:ascii="Wingdings" w:hAnsi="Wingdings" w:hint="default"/>
+      </w:rPr>
+    </w:lvl>
+    <w:lvl w:ilvl="3" w:tplc="08090001" w:tentative="1">
+      <w:start w:val="1"/>
+      <w:numFmt w:val="bullet"/>
+      <w:lvlText w:val=""/>
+      <w:lvlJc w:val="left"/>
+      <w:pPr>
+        <w:ind w:left="2880" w:hanging="360"/>
+      </w:pPr>
+      <w:rPr>
+        <w:rFonts w:ascii="Symbol" w:hAnsi="Symbol" w:hint="default"/>
+      </w:rPr>
+    </w:lvl>
+    <w:lvl w:ilvl="4" w:tplc="08090003" w:tentative="1">
+      <w:start w:val="1"/>
+      <w:numFmt w:val="bullet"/>
+      <w:lvlText w:val="o"/>
+      <w:lvlJc w:val="left"/>
+      <w:pPr>
+        <w:ind w:left="3600" w:hanging="360"/>
+      </w:pPr>
+      <w:rPr>
+        <w:rFonts w:ascii="Courier New" w:hAnsi="Courier New" w:cs="Courier New" w:hint="default"/>
+      </w:rPr>
+    </w:lvl>
+    <w:lvl w:ilvl="5" w:tplc="08090005" w:tentative="1">
+      <w:start w:val="1"/>
+      <w:numFmt w:val="bullet"/>
+      <w:lvlText w:val=""/>
+      <w:lvlJc w:val="left"/>
+      <w:pPr>
+        <w:ind w:left="4320" w:hanging="360"/>
+      </w:pPr>
+      <w:rPr>
+        <w:rFonts w:ascii="Wingdings" w:hAnsi="Wingdings" w:hint="default"/>
+      </w:rPr>
+    </w:lvl>
+    <w:lvl w:ilvl="6" w:tplc="08090001" w:tentative="1">
+      <w:start w:val="1"/>
+      <w:numFmt w:val="bullet"/>
+      <w:lvlText w:val=""/>
+      <w:lvlJc w:val="left"/>
+      <w:pPr>
+        <w:ind w:left="5040" w:hanging="360"/>
+      </w:pPr>
+      <w:rPr>
+        <w:rFonts w:ascii="Symbol" w:hAnsi="Symbol" w:hint="default"/>
+      </w:rPr>
+    </w:lvl>
+    <w:lvl w:ilvl="7" w:tplc="08090003" w:tentative="1">
+      <w:start w:val="1"/>
+      <w:numFmt w:val="bullet"/>
+      <w:lvlText w:val="o"/>
+      <w:lvlJc w:val="left"/>
+      <w:pPr>
+        <w:ind w:left="5760" w:hanging="360"/>
+      </w:pPr>
+      <w:rPr>
+        <w:rFonts w:ascii="Courier New" w:hAnsi="Courier New" w:cs="Courier New" w:hint="default"/>
+      </w:rPr>
+    </w:lvl>
+    <w:lvl w:ilvl="8" w:tplc="08090005" w:tentative="1">
+      <w:start w:val="1"/>
+      <w:numFmt w:val="bullet"/>
+      <w:lvlText w:val=""/>
+      <w:lvlJc w:val="left"/>
+      <w:pPr>
+        <w:ind w:left="6480" w:hanging="360"/>
+      </w:pPr>
+      <w:rPr>
+        <w:rFonts w:ascii="Wingdings" w:hAnsi="Wingdings" w:hint="default"/>
+      </w:rPr>
+    </w:lvl>
+  </w:abstractNum>
+  <w:abstractNum w:abstractNumId="18" w15:restartNumberingAfterBreak="0">
     <w:nsid w:val="401F9094"/>
     <w:multiLevelType w:val="hybridMultilevel"/>
     <w:tmpl w:val="02B07A48"/>
@@ -10565,7 +8960,7 @@
       </w:rPr>
     </w:lvl>
   </w:abstractNum>
-  <w:abstractNum w:abstractNumId="17" w15:restartNumberingAfterBreak="0">
+  <w:abstractNum w:abstractNumId="19" w15:restartNumberingAfterBreak="0">
     <w:nsid w:val="40D47964"/>
     <w:multiLevelType w:val="hybridMultilevel"/>
     <w:tmpl w:val="118C6A16"/>
@@ -10678,7 +9073,7 @@
       </w:rPr>
     </w:lvl>
   </w:abstractNum>
-  <w:abstractNum w:abstractNumId="18" w15:restartNumberingAfterBreak="0">
+  <w:abstractNum w:abstractNumId="20" w15:restartNumberingAfterBreak="0">
     <w:nsid w:val="445C95D2"/>
     <w:multiLevelType w:val="hybridMultilevel"/>
     <w:tmpl w:val="9B0C8686"/>
@@ -10791,7 +9186,7 @@
       </w:rPr>
     </w:lvl>
   </w:abstractNum>
-  <w:abstractNum w:abstractNumId="19" w15:restartNumberingAfterBreak="0">
+  <w:abstractNum w:abstractNumId="21" w15:restartNumberingAfterBreak="0">
     <w:nsid w:val="47007C42"/>
     <w:multiLevelType w:val="hybridMultilevel"/>
     <w:tmpl w:val="75443824"/>
@@ -10904,7 +9299,7 @@
       </w:rPr>
     </w:lvl>
   </w:abstractNum>
-  <w:abstractNum w:abstractNumId="20" w15:restartNumberingAfterBreak="0">
+  <w:abstractNum w:abstractNumId="22" w15:restartNumberingAfterBreak="0">
     <w:nsid w:val="4CBEF331"/>
     <w:multiLevelType w:val="hybridMultilevel"/>
     <w:tmpl w:val="629C5D98"/>
@@ -11017,7 +9412,7 @@
       </w:rPr>
     </w:lvl>
   </w:abstractNum>
-  <w:abstractNum w:abstractNumId="21" w15:restartNumberingAfterBreak="0">
+  <w:abstractNum w:abstractNumId="23" w15:restartNumberingAfterBreak="0">
     <w:nsid w:val="4D6D99C5"/>
     <w:multiLevelType w:val="hybridMultilevel"/>
     <w:tmpl w:val="7CD09AAE"/>
@@ -11130,7 +9525,7 @@
       </w:rPr>
     </w:lvl>
   </w:abstractNum>
-  <w:abstractNum w:abstractNumId="22" w15:restartNumberingAfterBreak="0">
+  <w:abstractNum w:abstractNumId="24" w15:restartNumberingAfterBreak="0">
     <w:nsid w:val="57893EEE"/>
     <w:multiLevelType w:val="hybridMultilevel"/>
     <w:tmpl w:val="FBCED5B8"/>
@@ -11243,7 +9638,7 @@
       </w:rPr>
     </w:lvl>
   </w:abstractNum>
-  <w:abstractNum w:abstractNumId="23" w15:restartNumberingAfterBreak="0">
+  <w:abstractNum w:abstractNumId="25" w15:restartNumberingAfterBreak="0">
     <w:nsid w:val="5BD010ED"/>
     <w:multiLevelType w:val="hybridMultilevel"/>
     <w:tmpl w:val="928CAA0A"/>
@@ -11356,7 +9751,7 @@
       </w:rPr>
     </w:lvl>
   </w:abstractNum>
-  <w:abstractNum w:abstractNumId="24" w15:restartNumberingAfterBreak="0">
+  <w:abstractNum w:abstractNumId="26" w15:restartNumberingAfterBreak="0">
     <w:nsid w:val="5CA668DC"/>
     <w:multiLevelType w:val="hybridMultilevel"/>
     <w:tmpl w:val="AC3AC3D0"/>
@@ -11469,7 +9864,7 @@
       </w:rPr>
     </w:lvl>
   </w:abstractNum>
-  <w:abstractNum w:abstractNumId="25" w15:restartNumberingAfterBreak="0">
+  <w:abstractNum w:abstractNumId="27" w15:restartNumberingAfterBreak="0">
     <w:nsid w:val="5E026BE9"/>
     <w:multiLevelType w:val="hybridMultilevel"/>
     <w:tmpl w:val="8DCA0508"/>
@@ -11582,7 +9977,7 @@
       </w:rPr>
     </w:lvl>
   </w:abstractNum>
-  <w:abstractNum w:abstractNumId="26" w15:restartNumberingAfterBreak="0">
+  <w:abstractNum w:abstractNumId="28" w15:restartNumberingAfterBreak="0">
     <w:nsid w:val="5FC45226"/>
     <w:multiLevelType w:val="hybridMultilevel"/>
     <w:tmpl w:val="91DAD356"/>
@@ -11695,7 +10090,7 @@
       </w:rPr>
     </w:lvl>
   </w:abstractNum>
-  <w:abstractNum w:abstractNumId="27" w15:restartNumberingAfterBreak="0">
+  <w:abstractNum w:abstractNumId="29" w15:restartNumberingAfterBreak="0">
     <w:nsid w:val="69E027A2"/>
     <w:multiLevelType w:val="hybridMultilevel"/>
     <w:tmpl w:val="F5D8FAB0"/>
@@ -11808,7 +10203,7 @@
       </w:rPr>
     </w:lvl>
   </w:abstractNum>
-  <w:abstractNum w:abstractNumId="28" w15:restartNumberingAfterBreak="0">
+  <w:abstractNum w:abstractNumId="30" w15:restartNumberingAfterBreak="0">
     <w:nsid w:val="6A762236"/>
     <w:multiLevelType w:val="hybridMultilevel"/>
     <w:tmpl w:val="A948AF20"/>
@@ -11921,7 +10316,7 @@
       </w:rPr>
     </w:lvl>
   </w:abstractNum>
-  <w:abstractNum w:abstractNumId="29" w15:restartNumberingAfterBreak="0">
+  <w:abstractNum w:abstractNumId="31" w15:restartNumberingAfterBreak="0">
     <w:nsid w:val="6BCD440C"/>
     <w:multiLevelType w:val="hybridMultilevel"/>
     <w:tmpl w:val="B0265236"/>
@@ -12034,7 +10429,7 @@
       </w:rPr>
     </w:lvl>
   </w:abstractNum>
-  <w:abstractNum w:abstractNumId="30" w15:restartNumberingAfterBreak="0">
+  <w:abstractNum w:abstractNumId="32" w15:restartNumberingAfterBreak="0">
     <w:nsid w:val="6C1BD37C"/>
     <w:multiLevelType w:val="hybridMultilevel"/>
     <w:tmpl w:val="E19E1484"/>
@@ -12147,7 +10542,7 @@
       </w:rPr>
     </w:lvl>
   </w:abstractNum>
-  <w:abstractNum w:abstractNumId="31" w15:restartNumberingAfterBreak="0">
+  <w:abstractNum w:abstractNumId="33" w15:restartNumberingAfterBreak="0">
     <w:nsid w:val="70164586"/>
     <w:multiLevelType w:val="hybridMultilevel"/>
     <w:tmpl w:val="3676A272"/>
@@ -12260,7 +10655,7 @@
       </w:rPr>
     </w:lvl>
   </w:abstractNum>
-  <w:abstractNum w:abstractNumId="32" w15:restartNumberingAfterBreak="0">
+  <w:abstractNum w:abstractNumId="34" w15:restartNumberingAfterBreak="0">
     <w:nsid w:val="704DA7C0"/>
     <w:multiLevelType w:val="hybridMultilevel"/>
     <w:tmpl w:val="23B095E8"/>
@@ -12373,10 +10768,10 @@
       </w:rPr>
     </w:lvl>
   </w:abstractNum>
-  <w:abstractNum w:abstractNumId="33" w15:restartNumberingAfterBreak="0">
+  <w:abstractNum w:abstractNumId="35" w15:restartNumberingAfterBreak="0">
     <w:nsid w:val="725164EB"/>
     <w:multiLevelType w:val="hybridMultilevel"/>
-    <w:tmpl w:val="09E627CC"/>
+    <w:tmpl w:val="058C2876"/>
     <w:lvl w:ilvl="0" w:tplc="08090001">
       <w:start w:val="1"/>
       <w:numFmt w:val="bullet"/>
@@ -12486,7 +10881,7 @@
       </w:rPr>
     </w:lvl>
   </w:abstractNum>
-  <w:abstractNum w:abstractNumId="34" w15:restartNumberingAfterBreak="0">
+  <w:abstractNum w:abstractNumId="36" w15:restartNumberingAfterBreak="0">
     <w:nsid w:val="7EEE737C"/>
     <w:multiLevelType w:val="hybridMultilevel"/>
     <w:tmpl w:val="3B0EDD8C"/>
@@ -12599,7 +10994,7 @@
       </w:rPr>
     </w:lvl>
   </w:abstractNum>
-  <w:abstractNum w:abstractNumId="35" w15:restartNumberingAfterBreak="0">
+  <w:abstractNum w:abstractNumId="37" w15:restartNumberingAfterBreak="0">
     <w:nsid w:val="7F45FA93"/>
     <w:multiLevelType w:val="hybridMultilevel"/>
     <w:tmpl w:val="B75CC686"/>
@@ -12713,112 +11108,118 @@
     </w:lvl>
   </w:abstractNum>
   <w:num w:numId="1" w16cid:durableId="735978475">
-    <w:abstractNumId w:val="18"/>
+    <w:abstractNumId w:val="20"/>
   </w:num>
   <w:num w:numId="2" w16cid:durableId="1474366344">
+    <w:abstractNumId w:val="6"/>
+  </w:num>
+  <w:num w:numId="3" w16cid:durableId="914898776">
+    <w:abstractNumId w:val="8"/>
+  </w:num>
+  <w:num w:numId="4" w16cid:durableId="403845044">
+    <w:abstractNumId w:val="11"/>
+  </w:num>
+  <w:num w:numId="5" w16cid:durableId="1027801819">
+    <w:abstractNumId w:val="37"/>
+  </w:num>
+  <w:num w:numId="6" w16cid:durableId="2087263953">
+    <w:abstractNumId w:val="27"/>
+  </w:num>
+  <w:num w:numId="7" w16cid:durableId="135531027">
+    <w:abstractNumId w:val="34"/>
+  </w:num>
+  <w:num w:numId="8" w16cid:durableId="1798832347">
     <w:abstractNumId w:val="5"/>
   </w:num>
-  <w:num w:numId="3" w16cid:durableId="914898776">
-    <w:abstractNumId w:val="7"/>
-  </w:num>
-  <w:num w:numId="4" w16cid:durableId="403845044">
-    <w:abstractNumId w:val="10"/>
-  </w:num>
-  <w:num w:numId="5" w16cid:durableId="1027801819">
-    <w:abstractNumId w:val="35"/>
-  </w:num>
-  <w:num w:numId="6" w16cid:durableId="2087263953">
-    <w:abstractNumId w:val="25"/>
-  </w:num>
-  <w:num w:numId="7" w16cid:durableId="135531027">
+  <w:num w:numId="9" w16cid:durableId="708336540">
     <w:abstractNumId w:val="32"/>
   </w:num>
-  <w:num w:numId="8" w16cid:durableId="1798832347">
-    <w:abstractNumId w:val="4"/>
-  </w:num>
-  <w:num w:numId="9" w16cid:durableId="708336540">
-    <w:abstractNumId w:val="30"/>
-  </w:num>
   <w:num w:numId="10" w16cid:durableId="992441462">
-    <w:abstractNumId w:val="11"/>
+    <w:abstractNumId w:val="12"/>
   </w:num>
   <w:num w:numId="11" w16cid:durableId="1749108674">
-    <w:abstractNumId w:val="24"/>
+    <w:abstractNumId w:val="26"/>
   </w:num>
   <w:num w:numId="12" w16cid:durableId="2050910823">
     <w:abstractNumId w:val="0"/>
   </w:num>
   <w:num w:numId="13" w16cid:durableId="1014572579">
-    <w:abstractNumId w:val="13"/>
+    <w:abstractNumId w:val="14"/>
   </w:num>
   <w:num w:numId="14" w16cid:durableId="239682918">
-    <w:abstractNumId w:val="20"/>
+    <w:abstractNumId w:val="22"/>
   </w:num>
   <w:num w:numId="15" w16cid:durableId="1025400161">
-    <w:abstractNumId w:val="34"/>
+    <w:abstractNumId w:val="36"/>
   </w:num>
   <w:num w:numId="16" w16cid:durableId="1141581957">
     <w:abstractNumId w:val="1"/>
   </w:num>
   <w:num w:numId="17" w16cid:durableId="1739353166">
-    <w:abstractNumId w:val="19"/>
+    <w:abstractNumId w:val="21"/>
   </w:num>
   <w:num w:numId="18" w16cid:durableId="1430126907">
-    <w:abstractNumId w:val="26"/>
+    <w:abstractNumId w:val="28"/>
   </w:num>
   <w:num w:numId="19" w16cid:durableId="1856113293">
-    <w:abstractNumId w:val="29"/>
+    <w:abstractNumId w:val="31"/>
   </w:num>
   <w:num w:numId="20" w16cid:durableId="1037588309">
     <w:abstractNumId w:val="2"/>
   </w:num>
   <w:num w:numId="21" w16cid:durableId="2109890275">
+    <w:abstractNumId w:val="25"/>
+  </w:num>
+  <w:num w:numId="22" w16cid:durableId="890654856">
     <w:abstractNumId w:val="23"/>
   </w:num>
-  <w:num w:numId="22" w16cid:durableId="890654856">
-    <w:abstractNumId w:val="21"/>
+  <w:num w:numId="23" w16cid:durableId="821314832">
+    <w:abstractNumId w:val="10"/>
   </w:num>
-  <w:num w:numId="23" w16cid:durableId="821314832">
+  <w:num w:numId="24" w16cid:durableId="2144808822">
+    <w:abstractNumId w:val="15"/>
+  </w:num>
+  <w:num w:numId="25" w16cid:durableId="2061974195">
+    <w:abstractNumId w:val="30"/>
+  </w:num>
+  <w:num w:numId="26" w16cid:durableId="1243829079">
+    <w:abstractNumId w:val="33"/>
+  </w:num>
+  <w:num w:numId="27" w16cid:durableId="1608348957">
+    <w:abstractNumId w:val="18"/>
+  </w:num>
+  <w:num w:numId="28" w16cid:durableId="710307759">
+    <w:abstractNumId w:val="4"/>
+  </w:num>
+  <w:num w:numId="29" w16cid:durableId="238251190">
+    <w:abstractNumId w:val="29"/>
+  </w:num>
+  <w:num w:numId="30" w16cid:durableId="1519463330">
     <w:abstractNumId w:val="9"/>
   </w:num>
-  <w:num w:numId="24" w16cid:durableId="2144808822">
-    <w:abstractNumId w:val="14"/>
+  <w:num w:numId="31" w16cid:durableId="684676877">
+    <w:abstractNumId w:val="7"/>
   </w:num>
-  <w:num w:numId="25" w16cid:durableId="2061974195">
-    <w:abstractNumId w:val="28"/>
+  <w:num w:numId="32" w16cid:durableId="1593466184">
+    <w:abstractNumId w:val="24"/>
   </w:num>
-  <w:num w:numId="26" w16cid:durableId="1243829079">
-    <w:abstractNumId w:val="31"/>
-  </w:num>
-  <w:num w:numId="27" w16cid:durableId="1608348957">
+  <w:num w:numId="33" w16cid:durableId="1500072115">
     <w:abstractNumId w:val="16"/>
   </w:num>
-  <w:num w:numId="28" w16cid:durableId="710307759">
+  <w:num w:numId="34" w16cid:durableId="2123574219">
+    <w:abstractNumId w:val="19"/>
+  </w:num>
+  <w:num w:numId="35" w16cid:durableId="1360203795">
+    <w:abstractNumId w:val="13"/>
+  </w:num>
+  <w:num w:numId="36" w16cid:durableId="870146807">
+    <w:abstractNumId w:val="35"/>
+  </w:num>
+  <w:num w:numId="37" w16cid:durableId="1310404618">
     <w:abstractNumId w:val="3"/>
   </w:num>
-  <w:num w:numId="29" w16cid:durableId="238251190">
-    <w:abstractNumId w:val="27"/>
-  </w:num>
-  <w:num w:numId="30" w16cid:durableId="1519463330">
-    <w:abstractNumId w:val="8"/>
-  </w:num>
-  <w:num w:numId="31" w16cid:durableId="684676877">
-    <w:abstractNumId w:val="6"/>
-  </w:num>
-  <w:num w:numId="32" w16cid:durableId="1593466184">
-    <w:abstractNumId w:val="22"/>
-  </w:num>
-  <w:num w:numId="33" w16cid:durableId="1500072115">
-    <w:abstractNumId w:val="15"/>
-  </w:num>
-  <w:num w:numId="34" w16cid:durableId="2123574219">
+  <w:num w:numId="38" w16cid:durableId="1447626726">
     <w:abstractNumId w:val="17"/>
-  </w:num>
-  <w:num w:numId="35" w16cid:durableId="1360203795">
-    <w:abstractNumId w:val="12"/>
-  </w:num>
-  <w:num w:numId="36" w16cid:durableId="870146807">
-    <w:abstractNumId w:val="33"/>
   </w:num>
   <w:numIdMacAtCleanup w:val="36"/>
 </w:numbering>
@@ -13309,7 +11710,6 @@
   <w:style w:type="character" w:default="1" w:styleId="DefaultParagraphFont">
     <w:name w:val="Default Paragraph Font"/>
     <w:uiPriority w:val="1"/>
-    <w:semiHidden/>
     <w:unhideWhenUsed/>
   </w:style>
   <w:style w:type="table" w:default="1" w:styleId="TableNormal">

</xml_diff>

<commit_message>
Se ha actualizado la sección de evaluación de resultados de la memoria con los datos obtenidos. #18
</commit_message>
<xml_diff>
--- a/docs/13MBID - 0CT25-26 - Memoria de trabajo - Proyecto.docx
+++ b/docs/13MBID - 0CT25-26 - Memoria de trabajo - Proyecto.docx
@@ -5047,6 +5047,9 @@
     </w:p>
     <w:p>
       <w:r>
+        <w:rPr>
+          <w:noProof/>
+        </w:rPr>
         <w:drawing>
           <wp:inline distT="0" distB="0" distL="0" distR="0" wp14:anchorId="0EDB7BA9" wp14:editId="43289801">
             <wp:extent cx="5991225" cy="3642129"/>
@@ -5108,6 +5111,9 @@
     </w:p>
     <w:p>
       <w:r>
+        <w:rPr>
+          <w:noProof/>
+        </w:rPr>
         <w:drawing>
           <wp:inline distT="0" distB="0" distL="0" distR="0" wp14:anchorId="02B3BB9D" wp14:editId="31EA0C1A">
             <wp:extent cx="6005513" cy="4028737"/>
@@ -5161,6 +5167,9 @@
     </w:p>
     <w:p>
       <w:r>
+        <w:rPr>
+          <w:noProof/>
+        </w:rPr>
         <w:drawing>
           <wp:inline distT="0" distB="0" distL="0" distR="0" wp14:anchorId="7141DF23" wp14:editId="4F2EC5AA">
             <wp:extent cx="6072188" cy="3493560"/>
@@ -5225,6 +5234,9 @@
     </w:p>
     <w:p>
       <w:r>
+        <w:rPr>
+          <w:noProof/>
+        </w:rPr>
         <w:drawing>
           <wp:inline distT="0" distB="0" distL="0" distR="0" wp14:anchorId="6767BE63" wp14:editId="472F5054">
             <wp:extent cx="6062663" cy="2880873"/>
@@ -6718,13 +6730,7 @@
         <w:t xml:space="preserve"> f1 mean </w:t>
       </w:r>
       <w:r>
-        <w:t>52</w:t>
-      </w:r>
-      <w:r>
-        <w:t>.</w:t>
-      </w:r>
-      <w:r>
-        <w:t>45425903575143</w:t>
+        <w:t>52.45425903575143</w:t>
       </w:r>
     </w:p>
     <w:p>
@@ -6927,13 +6933,7 @@
         <w:t xml:space="preserve"> mean </w:t>
       </w:r>
       <w:r>
-        <w:t>52</w:t>
-      </w:r>
-      <w:r>
-        <w:t>.</w:t>
-      </w:r>
-      <w:r>
-        <w:t>0415583360416</w:t>
+        <w:t>52.0415583360416</w:t>
       </w:r>
     </w:p>
     <w:p>
@@ -7134,13 +7134,7 @@
         <w:t xml:space="preserve"> f1 mean </w:t>
       </w:r>
       <w:r>
-        <w:t>57</w:t>
-      </w:r>
-      <w:r>
-        <w:t>.</w:t>
-      </w:r>
-      <w:r>
-        <w:t>90902244677432</w:t>
+        <w:t>57.90902244677432</w:t>
       </w:r>
     </w:p>
     <w:p>
@@ -7343,13 +7337,7 @@
         <w:t xml:space="preserve"> mean </w:t>
       </w:r>
       <w:r>
-        <w:t>59</w:t>
-      </w:r>
-      <w:r>
-        <w:t>.</w:t>
-      </w:r>
-      <w:r>
-        <w:t>58225002708265</w:t>
+        <w:t>59.58225002708265</w:t>
       </w:r>
     </w:p>
     <w:p>
@@ -7586,7 +7574,10 @@
           </w:tcPr>
           <w:p>
             <w:r>
-              <w:t>49.77%</w:t>
+              <w:t>52.40</w:t>
+            </w:r>
+            <w:r>
+              <w:t>%</w:t>
             </w:r>
           </w:p>
         </w:tc>
@@ -7596,7 +7587,7 @@
           </w:tcPr>
           <w:p>
             <w:r>
-              <w:t>0.0132</w:t>
+              <w:t>0.0139</w:t>
             </w:r>
           </w:p>
         </w:tc>
@@ -7606,7 +7597,10 @@
           </w:tcPr>
           <w:p>
             <w:r>
-              <w:t>49.50%</w:t>
+              <w:t>51.97</w:t>
+            </w:r>
+            <w:r>
+              <w:t>%</w:t>
             </w:r>
           </w:p>
         </w:tc>
@@ -7616,7 +7610,10 @@
           </w:tcPr>
           <w:p>
             <w:r>
-              <w:t>0.0155</w:t>
+              <w:t>0.</w:t>
+            </w:r>
+            <w:r>
+              <w:t>0098</w:t>
             </w:r>
           </w:p>
         </w:tc>
@@ -7643,7 +7640,10 @@
           </w:tcPr>
           <w:p>
             <w:r>
-              <w:t>50.07%</w:t>
+              <w:t>52.45</w:t>
+            </w:r>
+            <w:r>
+              <w:t>%</w:t>
             </w:r>
           </w:p>
         </w:tc>
@@ -7653,7 +7653,7 @@
           </w:tcPr>
           <w:p>
             <w:r>
-              <w:t>0.0136</w:t>
+              <w:t>0.0126</w:t>
             </w:r>
           </w:p>
         </w:tc>
@@ -7663,7 +7663,10 @@
           </w:tcPr>
           <w:p>
             <w:r>
-              <w:t>49.87%</w:t>
+              <w:t>52.04</w:t>
+            </w:r>
+            <w:r>
+              <w:t>%</w:t>
             </w:r>
             <w:r>
               <w:tab/>
@@ -7676,7 +7679,10 @@
           </w:tcPr>
           <w:p>
             <w:r>
-              <w:t>0.0139</w:t>
+              <w:t>0.0</w:t>
+            </w:r>
+            <w:r>
+              <w:t>092</w:t>
             </w:r>
           </w:p>
         </w:tc>
@@ -7703,7 +7709,10 @@
           </w:tcPr>
           <w:p>
             <w:r>
-              <w:t>57.94%</w:t>
+              <w:t>57.91</w:t>
+            </w:r>
+            <w:r>
+              <w:t>%</w:t>
             </w:r>
             <w:r>
               <w:tab/>
@@ -7716,7 +7725,10 @@
           </w:tcPr>
           <w:p>
             <w:r>
-              <w:t>0.0198</w:t>
+              <w:t>0.01</w:t>
+            </w:r>
+            <w:r>
+              <w:t>73</w:t>
             </w:r>
           </w:p>
         </w:tc>
@@ -7726,7 +7738,10 @@
           </w:tcPr>
           <w:p>
             <w:r>
-              <w:t>59.23%</w:t>
+              <w:t>59.58</w:t>
+            </w:r>
+            <w:r>
+              <w:t>%</w:t>
             </w:r>
           </w:p>
         </w:tc>
@@ -7736,7 +7751,10 @@
           </w:tcPr>
           <w:p>
             <w:r>
-              <w:t>0.0265</w:t>
+              <w:t>0.02</w:t>
+            </w:r>
+            <w:r>
+              <w:t>37</w:t>
             </w:r>
           </w:p>
         </w:tc>
@@ -7763,7 +7781,7 @@
           </w:tcPr>
           <w:p>
             <w:r>
-              <w:t>70.56%</w:t>
+              <w:t>69.85%</w:t>
             </w:r>
           </w:p>
         </w:tc>
@@ -7773,7 +7791,10 @@
           </w:tcPr>
           <w:p>
             <w:r>
-              <w:t>0.0103</w:t>
+              <w:t>0.0</w:t>
+            </w:r>
+            <w:r>
+              <w:t>096</w:t>
             </w:r>
           </w:p>
         </w:tc>
@@ -7783,7 +7804,10 @@
           </w:tcPr>
           <w:p>
             <w:r>
-              <w:t>74.68%</w:t>
+              <w:t>74.27</w:t>
+            </w:r>
+            <w:r>
+              <w:t>%</w:t>
             </w:r>
           </w:p>
         </w:tc>
@@ -7793,7 +7817,10 @@
           </w:tcPr>
           <w:p>
             <w:r>
-              <w:t>0.0104</w:t>
+              <w:t>0.0</w:t>
+            </w:r>
+            <w:r>
+              <w:t>140</w:t>
             </w:r>
           </w:p>
         </w:tc>
@@ -7872,65 +7899,9 @@
       </w:r>
     </w:p>
     <w:p>
-      <w:pPr>
-        <w:rPr>
-          <w:highlight w:val="yellow"/>
-        </w:rPr>
-      </w:pPr>
-      <w:r>
-        <w:rPr>
-          <w:rFonts w:eastAsiaTheme="minorEastAsia"/>
-          <w:highlight w:val="yellow"/>
-        </w:rPr>
-        <w:t>Agregar / pendiente:</w:t>
-      </w:r>
-    </w:p>
-    <w:p>
-      <w:pPr>
-        <w:pStyle w:val="ListParagraph"/>
-        <w:numPr>
-          <w:ilvl w:val="0"/>
-          <w:numId w:val="5"/>
-        </w:numPr>
-        <w:rPr>
-          <w:highlight w:val="yellow"/>
-        </w:rPr>
-      </w:pPr>
-      <w:r>
-        <w:rPr>
-          <w:rFonts w:eastAsiaTheme="minorEastAsia"/>
-          <w:highlight w:val="yellow"/>
-        </w:rPr>
-        <w:t xml:space="preserve">Agregar la ejecución de </w:t>
-      </w:r>
-      <w:proofErr w:type="gramStart"/>
-      <w:r>
-        <w:rPr>
-          <w:rFonts w:eastAsiaTheme="minorEastAsia"/>
-          <w:highlight w:val="yellow"/>
-        </w:rPr>
-        <w:t>este test</w:t>
-      </w:r>
-      <w:proofErr w:type="gramEnd"/>
-      <w:r>
-        <w:rPr>
-          <w:rFonts w:eastAsiaTheme="minorEastAsia"/>
-          <w:highlight w:val="yellow"/>
-        </w:rPr>
-        <w:t xml:space="preserve"> al pipeline con DVC</w:t>
-      </w:r>
-    </w:p>
-    <w:p>
-      <w:r>
-        <w:lastRenderedPageBreak/>
+      <w:r>
         <w:t>--</w:t>
       </w:r>
-    </w:p>
-    <w:p/>
-    <w:p>
-      <w:pPr>
-        <w:pStyle w:val="Heading3"/>
-      </w:pPr>
     </w:p>
     <w:p>
       <w:r>
@@ -14168,6 +14139,7 @@
   <w:style w:type="character" w:default="1" w:styleId="DefaultParagraphFont">
     <w:name w:val="Default Paragraph Font"/>
     <w:uiPriority w:val="1"/>
+    <w:semiHidden/>
     <w:unhideWhenUsed/>
   </w:style>
   <w:style w:type="table" w:default="1" w:styleId="TableNormal">

</xml_diff>

<commit_message>
#20 #21 #22 #23 Se han actualizado las secciones correspondientes a las tareas asociadas. Queda pendiente actualizar "revisión del proyecto"
</commit_message>
<xml_diff>
--- a/docs/13MBID - 0CT25-26 - Memoria de trabajo - Proyecto.docx
+++ b/docs/13MBID - 0CT25-26 - Memoria de trabajo - Proyecto.docx
@@ -8228,17 +8228,199 @@
           <w:ilvl w:val="0"/>
           <w:numId w:val="3"/>
         </w:numPr>
-        <w:rPr>
-          <w:rFonts w:eastAsiaTheme="minorEastAsia"/>
-          <w:highlight w:val="yellow"/>
-        </w:rPr>
-      </w:pPr>
-      <w:r>
-        <w:rPr>
-          <w:rFonts w:eastAsiaTheme="minorEastAsia"/>
-          <w:highlight w:val="yellow"/>
-        </w:rPr>
-        <w:t>[otros] (AGREGAR)</w:t>
+      </w:pPr>
+      <w:r>
+        <w:t xml:space="preserve">Hacer uso de sistemas de búsqueda de </w:t>
+      </w:r>
+      <w:proofErr w:type="spellStart"/>
+      <w:r>
+        <w:t>hiperparámetros</w:t>
+      </w:r>
+      <w:proofErr w:type="spellEnd"/>
+      <w:r>
+        <w:t xml:space="preserve"> que permitan encontrar la mejor configuración de los modelos para la selección.</w:t>
+      </w:r>
+    </w:p>
+    <w:p>
+      <w:pPr>
+        <w:pStyle w:val="ListParagraph"/>
+        <w:numPr>
+          <w:ilvl w:val="0"/>
+          <w:numId w:val="3"/>
+        </w:numPr>
+      </w:pPr>
+      <w:r>
+        <w:t>Añadir un chequeo de consistencia de los datos, ya que algunas variables como “</w:t>
+      </w:r>
+      <w:proofErr w:type="spellStart"/>
+      <w:r>
+        <w:t>duration</w:t>
+      </w:r>
+      <w:proofErr w:type="spellEnd"/>
+      <w:r>
+        <w:t>” y “</w:t>
+      </w:r>
+      <w:proofErr w:type="spellStart"/>
+      <w:r>
+        <w:t>contacted_before</w:t>
+      </w:r>
+      <w:proofErr w:type="spellEnd"/>
+      <w:r>
+        <w:t>” no pueden tener valores libremente elegidos si quiere mantener la coherencia.</w:t>
+      </w:r>
+    </w:p>
+    <w:p>
+      <w:pPr>
+        <w:pStyle w:val="ListParagraph"/>
+        <w:numPr>
+          <w:ilvl w:val="0"/>
+          <w:numId w:val="3"/>
+        </w:numPr>
+      </w:pPr>
+      <w:r>
+        <w:t>Sistema de imputación de datos, en vez de la eliminación directa para mantener la cantidad de información introducida.</w:t>
+      </w:r>
+    </w:p>
+    <w:p>
+      <w:pPr>
+        <w:pStyle w:val="ListParagraph"/>
+        <w:numPr>
+          <w:ilvl w:val="0"/>
+          <w:numId w:val="3"/>
+        </w:numPr>
+      </w:pPr>
+      <w:proofErr w:type="gramStart"/>
+      <w:r>
+        <w:lastRenderedPageBreak/>
+        <w:t>El test</w:t>
+      </w:r>
+      <w:proofErr w:type="gramEnd"/>
+      <w:r>
+        <w:t xml:space="preserve"> de regresión debería fallar solo ante un modelo que tiene unos resultados peores que el ya establecido. Encontrar un mejor modelo es siempre mejor opción.</w:t>
+      </w:r>
+    </w:p>
+    <w:p>
+      <w:pPr>
+        <w:pStyle w:val="ListParagraph"/>
+        <w:numPr>
+          <w:ilvl w:val="0"/>
+          <w:numId w:val="3"/>
+        </w:numPr>
+      </w:pPr>
+      <w:r>
+        <w:t xml:space="preserve">Tratamiento de los scripts, </w:t>
+      </w:r>
+      <w:proofErr w:type="spellStart"/>
+      <w:r>
+        <w:t>backend</w:t>
+      </w:r>
+      <w:proofErr w:type="spellEnd"/>
+      <w:r>
+        <w:t xml:space="preserve"> y </w:t>
+      </w:r>
+      <w:proofErr w:type="spellStart"/>
+      <w:r>
+        <w:t>frontend</w:t>
+      </w:r>
+      <w:proofErr w:type="spellEnd"/>
+      <w:r>
+        <w:t xml:space="preserve"> como lenguaje orientado a objetos, incluyendo el polimorfismo para facilitar la expansión de funcionalidades en el sistema.</w:t>
+      </w:r>
+    </w:p>
+    <w:p>
+      <w:pPr>
+        <w:pStyle w:val="ListParagraph"/>
+        <w:numPr>
+          <w:ilvl w:val="0"/>
+          <w:numId w:val="3"/>
+        </w:numPr>
+      </w:pPr>
+      <w:r>
+        <w:t xml:space="preserve">Hacer uso de herramientas como Jenkins que permitan el </w:t>
+      </w:r>
+      <w:proofErr w:type="spellStart"/>
+      <w:r>
+        <w:t>Continuous</w:t>
+      </w:r>
+      <w:proofErr w:type="spellEnd"/>
+      <w:r>
+        <w:t xml:space="preserve"> </w:t>
+      </w:r>
+      <w:proofErr w:type="spellStart"/>
+      <w:r>
+        <w:t>Integration</w:t>
+      </w:r>
+      <w:proofErr w:type="spellEnd"/>
+      <w:r>
+        <w:t xml:space="preserve"> sobre el código y así evitar un </w:t>
+      </w:r>
+      <w:proofErr w:type="spellStart"/>
+      <w:r>
+        <w:t>merge</w:t>
+      </w:r>
+      <w:proofErr w:type="spellEnd"/>
+      <w:r>
+        <w:t xml:space="preserve"> en el repositorio que provoque la caída del servicio.</w:t>
+      </w:r>
+    </w:p>
+    <w:p>
+      <w:pPr>
+        <w:pStyle w:val="ListParagraph"/>
+        <w:numPr>
+          <w:ilvl w:val="0"/>
+          <w:numId w:val="3"/>
+        </w:numPr>
+      </w:pPr>
+      <w:r>
+        <w:t xml:space="preserve">Implementar </w:t>
+      </w:r>
+      <w:proofErr w:type="gramStart"/>
+      <w:r>
+        <w:t>un test</w:t>
+      </w:r>
+      <w:proofErr w:type="gramEnd"/>
+      <w:r>
+        <w:t xml:space="preserve"> de calidad del código que permita verificar si existe código muerto, vulnerabilidades o si el estilo entorpece el desarrollo.</w:t>
+      </w:r>
+    </w:p>
+    <w:p>
+      <w:pPr>
+        <w:pStyle w:val="ListParagraph"/>
+        <w:numPr>
+          <w:ilvl w:val="0"/>
+          <w:numId w:val="3"/>
+        </w:numPr>
+      </w:pPr>
+      <w:r>
+        <w:t>Automatización de ingesta de datos hacia la API que permita tomar periódicamente la información y realizar las predicciones sin necesidad de introducción manual.</w:t>
+      </w:r>
+    </w:p>
+    <w:p>
+      <w:pPr>
+        <w:pStyle w:val="ListParagraph"/>
+        <w:numPr>
+          <w:ilvl w:val="0"/>
+          <w:numId w:val="3"/>
+        </w:numPr>
+      </w:pPr>
+      <w:r>
+        <w:t xml:space="preserve">Generar un </w:t>
+      </w:r>
+      <w:proofErr w:type="spellStart"/>
+      <w:r>
+        <w:t>dashboard</w:t>
+      </w:r>
+      <w:proofErr w:type="spellEnd"/>
+      <w:r>
+        <w:t xml:space="preserve"> que permita ver los resultados por campaña, haciendo una comparativa entre valores predichos y reales que servirán también para estudiar cómo mejorar el modelo de predicción.</w:t>
+      </w:r>
+    </w:p>
+    <w:p>
+      <w:pPr>
+        <w:ind w:left="360"/>
+      </w:pPr>
+      <w:r>
+        <w:t>Estos son solo ejemplos de tareas, pero realmente se podrían incluir muchas más.</w:t>
       </w:r>
     </w:p>
     <w:p>
@@ -8435,21 +8617,15 @@
         </w:rPr>
         <w:t xml:space="preserve"> </w:t>
       </w:r>
-      <w:hyperlink r:id="rId25">
+      <w:hyperlink r:id="rId25" w:history="1">
         <w:r>
           <w:rPr>
             <w:rStyle w:val="Hyperlink"/>
             <w:lang w:val="en-GB"/>
           </w:rPr>
-          <w:t>https://api-13mbid-z0bv.onrender.com/</w:t>
+          <w:t>https://api-13mbid-m21x.onrender.com</w:t>
         </w:r>
       </w:hyperlink>
-      <w:r>
-        <w:rPr>
-          <w:lang w:val="en-GB"/>
-        </w:rPr>
-        <w:t xml:space="preserve"> </w:t>
-      </w:r>
     </w:p>
     <w:p>
       <w:pPr>
@@ -8462,50 +8638,110 @@
       <w:r>
         <w:t xml:space="preserve">Aplicación web: </w:t>
       </w:r>
-      <w:hyperlink r:id="rId26">
+      <w:hyperlink r:id="rId26" w:history="1">
         <w:r>
           <w:rPr>
             <w:rStyle w:val="Hyperlink"/>
           </w:rPr>
-          <w:t>https://13mbid-abr2526.streamlit.app/</w:t>
+          <w:t>https://13mbid-apr2526.streamlit.app</w:t>
         </w:r>
       </w:hyperlink>
-      <w:r>
-        <w:t xml:space="preserve"> </w:t>
-      </w:r>
-    </w:p>
-    <w:p>
-      <w:pPr>
-        <w:rPr>
-          <w:rFonts w:eastAsiaTheme="minorEastAsia"/>
-          <w:highlight w:val="yellow"/>
-        </w:rPr>
-      </w:pPr>
-      <w:r>
-        <w:rPr>
-          <w:rFonts w:eastAsiaTheme="minorEastAsia"/>
-          <w:highlight w:val="yellow"/>
-        </w:rPr>
-        <w:t xml:space="preserve">[Agregar </w:t>
-      </w:r>
-      <w:proofErr w:type="spellStart"/>
-      <w:r>
-        <w:rPr>
-          <w:rFonts w:eastAsiaTheme="minorEastAsia"/>
-          <w:highlight w:val="yellow"/>
-        </w:rPr>
-        <w:t>captuas</w:t>
-      </w:r>
-      <w:proofErr w:type="spellEnd"/>
-      <w:r>
-        <w:rPr>
-          <w:rFonts w:eastAsiaTheme="minorEastAsia"/>
-          <w:highlight w:val="yellow"/>
-        </w:rPr>
-        <w:t xml:space="preserve"> de pantalla de ambos productos]</w:t>
-      </w:r>
-    </w:p>
-    <w:p/>
+    </w:p>
+    <w:p>
+      <w:r>
+        <w:t>Captura de la API:</w:t>
+      </w:r>
+    </w:p>
+    <w:p>
+      <w:r>
+        <w:rPr>
+          <w:noProof/>
+        </w:rPr>
+        <w:drawing>
+          <wp:inline distT="0" distB="0" distL="0" distR="0" wp14:anchorId="3ECFC251" wp14:editId="67E1977C">
+            <wp:extent cx="4943902" cy="4962525"/>
+            <wp:effectExtent l="0" t="0" r="9525" b="0"/>
+            <wp:docPr id="1111409026" name="Picture 1" descr="A screenshot of a computer&#10;&#10;AI-generated content may be incorrect."/>
+            <wp:cNvGraphicFramePr>
+              <a:graphicFrameLocks xmlns:a="http://schemas.openxmlformats.org/drawingml/2006/main" noChangeAspect="1"/>
+            </wp:cNvGraphicFramePr>
+            <a:graphic xmlns:a="http://schemas.openxmlformats.org/drawingml/2006/main">
+              <a:graphicData uri="http://schemas.openxmlformats.org/drawingml/2006/picture">
+                <pic:pic xmlns:pic="http://schemas.openxmlformats.org/drawingml/2006/picture">
+                  <pic:nvPicPr>
+                    <pic:cNvPr id="1111409026" name="Picture 1" descr="A screenshot of a computer&#10;&#10;AI-generated content may be incorrect."/>
+                    <pic:cNvPicPr/>
+                  </pic:nvPicPr>
+                  <pic:blipFill>
+                    <a:blip r:embed="rId27"/>
+                    <a:stretch>
+                      <a:fillRect/>
+                    </a:stretch>
+                  </pic:blipFill>
+                  <pic:spPr>
+                    <a:xfrm>
+                      <a:off x="0" y="0"/>
+                      <a:ext cx="4948884" cy="4967526"/>
+                    </a:xfrm>
+                    <a:prstGeom prst="rect">
+                      <a:avLst/>
+                    </a:prstGeom>
+                  </pic:spPr>
+                </pic:pic>
+              </a:graphicData>
+            </a:graphic>
+          </wp:inline>
+        </w:drawing>
+      </w:r>
+    </w:p>
+    <w:p>
+      <w:r>
+        <w:lastRenderedPageBreak/>
+        <w:t>Captura de la aplicación web.</w:t>
+      </w:r>
+    </w:p>
+    <w:p>
+      <w:r>
+        <w:rPr>
+          <w:noProof/>
+        </w:rPr>
+        <w:drawing>
+          <wp:inline distT="0" distB="0" distL="0" distR="0" wp14:anchorId="2C208644" wp14:editId="6C24FED6">
+            <wp:extent cx="5731510" cy="7344410"/>
+            <wp:effectExtent l="0" t="0" r="2540" b="8890"/>
+            <wp:docPr id="591162208" name="Picture 1" descr="A screenshot of a computer&#10;&#10;AI-generated content may be incorrect."/>
+            <wp:cNvGraphicFramePr>
+              <a:graphicFrameLocks xmlns:a="http://schemas.openxmlformats.org/drawingml/2006/main" noChangeAspect="1"/>
+            </wp:cNvGraphicFramePr>
+            <a:graphic xmlns:a="http://schemas.openxmlformats.org/drawingml/2006/main">
+              <a:graphicData uri="http://schemas.openxmlformats.org/drawingml/2006/picture">
+                <pic:pic xmlns:pic="http://schemas.openxmlformats.org/drawingml/2006/picture">
+                  <pic:nvPicPr>
+                    <pic:cNvPr id="591162208" name="Picture 1" descr="A screenshot of a computer&#10;&#10;AI-generated content may be incorrect."/>
+                    <pic:cNvPicPr/>
+                  </pic:nvPicPr>
+                  <pic:blipFill>
+                    <a:blip r:embed="rId28"/>
+                    <a:stretch>
+                      <a:fillRect/>
+                    </a:stretch>
+                  </pic:blipFill>
+                  <pic:spPr>
+                    <a:xfrm>
+                      <a:off x="0" y="0"/>
+                      <a:ext cx="5731510" cy="7344410"/>
+                    </a:xfrm>
+                    <a:prstGeom prst="rect">
+                      <a:avLst/>
+                    </a:prstGeom>
+                  </pic:spPr>
+                </pic:pic>
+              </a:graphicData>
+            </a:graphic>
+          </wp:inline>
+        </w:drawing>
+      </w:r>
+    </w:p>
     <w:p>
       <w:r>
         <w:t>--</w:t>
@@ -8541,6 +8777,7 @@
         </w:numPr>
       </w:pPr>
       <w:r>
+        <w:lastRenderedPageBreak/>
         <w:t>Generar una herramienta de interacción para predicciones.</w:t>
       </w:r>
     </w:p>
@@ -8582,21 +8819,6 @@
     <w:p>
       <w:r>
         <w:t>Resta implementar mediante acciones de seguimiento el monitoreo de la calidad de las predicciones del modelo para determinar las reglas de su actualización en caso de corresponder.</w:t>
-      </w:r>
-    </w:p>
-    <w:p>
-      <w:pPr>
-        <w:rPr>
-          <w:rFonts w:eastAsiaTheme="minorEastAsia"/>
-          <w:highlight w:val="yellow"/>
-        </w:rPr>
-      </w:pPr>
-      <w:r>
-        <w:rPr>
-          <w:rFonts w:eastAsiaTheme="minorEastAsia"/>
-          <w:highlight w:val="yellow"/>
-        </w:rPr>
-        <w:t>[+pueden utilizar este espacio para sumar otras opciones de seguimiento / monitoreo]</w:t>
       </w:r>
     </w:p>
     <w:p>
@@ -8656,11 +8878,9 @@
       <w:r>
         <w:t xml:space="preserve">Los resultados de esta etapa del proyecto serán presentados ante las autoridades para que se pueda </w:t>
       </w:r>
-      <w:proofErr w:type="gramStart"/>
-      <w:r>
-        <w:t>dar inicio a</w:t>
-      </w:r>
-      <w:proofErr w:type="gramEnd"/>
+      <w:r>
+        <w:t>iniciar</w:t>
+      </w:r>
       <w:r>
         <w:t xml:space="preserve"> una etapa de verificación del modelo </w:t>
       </w:r>
@@ -8678,15 +8898,19 @@
       <w:pPr>
         <w:rPr>
           <w:rFonts w:eastAsiaTheme="minorEastAsia"/>
-          <w:highlight w:val="yellow"/>
         </w:rPr>
       </w:pPr>
       <w:r>
         <w:rPr>
           <w:rFonts w:eastAsiaTheme="minorEastAsia"/>
-          <w:highlight w:val="yellow"/>
-        </w:rPr>
-        <w:t>[+pueden utilizar este espacio para sumar otras opciones de seguimiento / monitoreo]</w:t>
+        </w:rPr>
+        <w:t>Además, se deberá</w:t>
+      </w:r>
+      <w:r>
+        <w:rPr>
+          <w:rFonts w:eastAsiaTheme="minorEastAsia"/>
+        </w:rPr>
+        <w:t xml:space="preserve"> hacer una revisión metodológica sobre el marco de trabajo Agile, en el que identificar aspectos a mejorar del proceso o el seguimiento del procedimiento por parte de los integrantes del proyecto, a fin de mejorar, ya sea con retrospectivas o de otra manera, la efectividad del marco de trabajo.</w:t>
       </w:r>
     </w:p>
     <w:p>
@@ -8757,7 +8981,22 @@
         </w:numPr>
       </w:pPr>
       <w:r>
-        <w:t>No realizará un depósito: 7 clientes (77.8%)</w:t>
+        <w:t>Sí</w:t>
+      </w:r>
+      <w:r>
+        <w:t xml:space="preserve"> realizará un depósito: </w:t>
+      </w:r>
+      <w:r>
+        <w:t>4</w:t>
+      </w:r>
+      <w:r>
+        <w:t xml:space="preserve"> clientes (</w:t>
+      </w:r>
+      <w:r>
+        <w:t>44.4</w:t>
+      </w:r>
+      <w:r>
+        <w:t>%)</w:t>
       </w:r>
     </w:p>
     <w:p>
@@ -8769,13 +9008,22 @@
         </w:numPr>
       </w:pPr>
       <w:r>
-        <w:t xml:space="preserve"> </w:t>
-      </w:r>
-      <w:r>
-        <w:t>Sí,</w:t>
-      </w:r>
-      <w:r>
-        <w:t xml:space="preserve"> realizará un depósito: 2 clientes (22.2%)</w:t>
+        <w:t>No</w:t>
+      </w:r>
+      <w:r>
+        <w:t xml:space="preserve"> realizará un depósito: </w:t>
+      </w:r>
+      <w:r>
+        <w:t>5</w:t>
+      </w:r>
+      <w:r>
+        <w:t xml:space="preserve"> clientes (</w:t>
+      </w:r>
+      <w:r>
+        <w:t>55.6</w:t>
+      </w:r>
+      <w:r>
+        <w:t>%)</w:t>
       </w:r>
     </w:p>
     <w:p>
@@ -8903,8 +9151,8 @@
       </w:r>
     </w:p>
     <w:sectPr>
-      <w:headerReference w:type="default" r:id="rId27"/>
-      <w:footerReference w:type="default" r:id="rId28"/>
+      <w:headerReference w:type="default" r:id="rId29"/>
+      <w:footerReference w:type="default" r:id="rId30"/>
       <w:pgSz w:w="11906" w:h="16838"/>
       <w:pgMar w:top="1440" w:right="1440" w:bottom="1440" w:left="1440" w:header="720" w:footer="720" w:gutter="0"/>
       <w:cols w:space="720"/>

</xml_diff>

<commit_message>
#24 Finalización de revisión del proyecto y memoria de trabajo completada. Se ha generado pdf para la entrega.
</commit_message>
<xml_diff>
--- a/docs/13MBID - 0CT25-26 - Memoria de trabajo - Proyecto.docx
+++ b/docs/13MBID - 0CT25-26 - Memoria de trabajo - Proyecto.docx
@@ -2,6 +2,994 @@
 <file path=word/document.xml><?xml version="1.0" encoding="utf-8"?>
 <w:document xmlns:wpc="http://schemas.microsoft.com/office/word/2010/wordprocessingCanvas" xmlns:cx="http://schemas.microsoft.com/office/drawing/2014/chartex" xmlns:cx1="http://schemas.microsoft.com/office/drawing/2015/9/8/chartex" xmlns:cx2="http://schemas.microsoft.com/office/drawing/2015/10/21/chartex" xmlns:cx3="http://schemas.microsoft.com/office/drawing/2016/5/9/chartex" xmlns:cx4="http://schemas.microsoft.com/office/drawing/2016/5/10/chartex" xmlns:cx5="http://schemas.microsoft.com/office/drawing/2016/5/11/chartex" xmlns:cx6="http://schemas.microsoft.com/office/drawing/2016/5/12/chartex" xmlns:cx7="http://schemas.microsoft.com/office/drawing/2016/5/13/chartex" xmlns:cx8="http://schemas.microsoft.com/office/drawing/2016/5/14/chartex" xmlns:mc="http://schemas.openxmlformats.org/markup-compatibility/2006" xmlns:aink="http://schemas.microsoft.com/office/drawing/2016/ink" xmlns:am3d="http://schemas.microsoft.com/office/drawing/2017/model3d" xmlns:o="urn:schemas-microsoft-com:office:office" xmlns:oel="http://schemas.microsoft.com/office/2019/extlst" xmlns:r="http://schemas.openxmlformats.org/officeDocument/2006/relationships" xmlns:m="http://schemas.openxmlformats.org/officeDocument/2006/math" xmlns:v="urn:schemas-microsoft-com:vml" xmlns:wp14="http://schemas.microsoft.com/office/word/2010/wordprocessingDrawing" xmlns:wp="http://schemas.openxmlformats.org/drawingml/2006/wordprocessingDrawing" xmlns:w10="urn:schemas-microsoft-com:office:word" xmlns:w="http://schemas.openxmlformats.org/wordprocessingml/2006/main" xmlns:w14="http://schemas.microsoft.com/office/word/2010/wordml" xmlns:w15="http://schemas.microsoft.com/office/word/2012/wordml" xmlns:w16cex="http://schemas.microsoft.com/office/word/2018/wordml/cex" xmlns:w16cid="http://schemas.microsoft.com/office/word/2016/wordml/cid" xmlns:w16="http://schemas.microsoft.com/office/word/2018/wordml" xmlns:w16du="http://schemas.microsoft.com/office/word/2023/wordml/word16du" xmlns:w16sdtdh="http://schemas.microsoft.com/office/word/2020/wordml/sdtdatahash" xmlns:w16sdtfl="http://schemas.microsoft.com/office/word/2024/wordml/sdtformatlock" xmlns:w16se="http://schemas.microsoft.com/office/word/2015/wordml/symex" xmlns:wpg="http://schemas.microsoft.com/office/word/2010/wordprocessingGroup" xmlns:wpi="http://schemas.microsoft.com/office/word/2010/wordprocessingInk" xmlns:wne="http://schemas.microsoft.com/office/word/2006/wordml" xmlns:wps="http://schemas.microsoft.com/office/word/2010/wordprocessingShape" mc:Ignorable="w14 w15 w16se w16cid w16 w16cex w16sdtdh w16sdtfl w16du wp14">
   <w:body>
+    <w:sdt>
+      <w:sdtPr>
+        <w:id w:val="-483553453"/>
+        <w:docPartObj>
+          <w:docPartGallery w:val="Cover Pages"/>
+          <w:docPartUnique/>
+        </w:docPartObj>
+      </w:sdtPr>
+      <w:sdtContent>
+        <w:p/>
+        <w:p>
+          <w:r>
+            <w:rPr>
+              <w:noProof/>
+            </w:rPr>
+            <mc:AlternateContent>
+              <mc:Choice Requires="wps">
+                <w:drawing>
+                  <wp:anchor distT="0" distB="0" distL="114300" distR="114300" simplePos="0" relativeHeight="251662336" behindDoc="0" locked="0" layoutInCell="1" allowOverlap="1" wp14:anchorId="61DDE5BB" wp14:editId="18C3174B">
+                    <wp:simplePos x="0" y="0"/>
+                    <mc:AlternateContent>
+                      <mc:Choice Requires="wp14">
+                        <wp:positionH relativeFrom="page">
+                          <wp14:pctPosHOffset>15000</wp14:pctPosHOffset>
+                        </wp:positionH>
+                      </mc:Choice>
+                      <mc:Fallback>
+                        <wp:positionH relativeFrom="page">
+                          <wp:posOffset>1133475</wp:posOffset>
+                        </wp:positionH>
+                      </mc:Fallback>
+                    </mc:AlternateContent>
+                    <mc:AlternateContent>
+                      <mc:Choice Requires="wp14">
+                        <wp:positionV relativeFrom="page">
+                          <wp14:pctPosVOffset>9100</wp14:pctPosVOffset>
+                        </wp:positionV>
+                      </mc:Choice>
+                      <mc:Fallback>
+                        <wp:positionV relativeFrom="page">
+                          <wp:posOffset>972820</wp:posOffset>
+                        </wp:positionV>
+                      </mc:Fallback>
+                    </mc:AlternateContent>
+                    <wp:extent cx="3660775" cy="3651250"/>
+                    <wp:effectExtent l="0" t="0" r="10160" b="7620"/>
+                    <wp:wrapSquare wrapText="bothSides"/>
+                    <wp:docPr id="111" name="Text Box 111"/>
+                    <wp:cNvGraphicFramePr/>
+                    <a:graphic xmlns:a="http://schemas.openxmlformats.org/drawingml/2006/main">
+                      <a:graphicData uri="http://schemas.microsoft.com/office/word/2010/wordprocessingShape">
+                        <wps:wsp>
+                          <wps:cNvSpPr txBox="1"/>
+                          <wps:spPr>
+                            <a:xfrm>
+                              <a:off x="0" y="0"/>
+                              <a:ext cx="3660775" cy="3651250"/>
+                            </a:xfrm>
+                            <a:prstGeom prst="rect">
+                              <a:avLst/>
+                            </a:prstGeom>
+                            <a:noFill/>
+                            <a:ln w="6350">
+                              <a:noFill/>
+                            </a:ln>
+                            <a:effectLst/>
+                          </wps:spPr>
+                          <wps:style>
+                            <a:lnRef idx="0">
+                              <a:schemeClr val="accent1"/>
+                            </a:lnRef>
+                            <a:fillRef idx="0">
+                              <a:schemeClr val="accent1"/>
+                            </a:fillRef>
+                            <a:effectRef idx="0">
+                              <a:schemeClr val="accent1"/>
+                            </a:effectRef>
+                            <a:fontRef idx="minor">
+                              <a:schemeClr val="dk1"/>
+                            </a:fontRef>
+                          </wps:style>
+                          <wps:txbx>
+                            <w:txbxContent>
+                              <w:sdt>
+                                <w:sdtPr>
+                                  <w:rPr>
+                                    <w:caps/>
+                                    <w:color w:val="323E4F" w:themeColor="text2" w:themeShade="BF"/>
+                                    <w:sz w:val="40"/>
+                                    <w:szCs w:val="40"/>
+                                  </w:rPr>
+                                  <w:alias w:val="Publish Date"/>
+                                  <w:tag w:val=""/>
+                                  <w:id w:val="400952559"/>
+                                  <w:dataBinding w:prefixMappings="xmlns:ns0='http://schemas.microsoft.com/office/2006/coverPageProps' " w:xpath="/ns0:CoverPageProperties[1]/ns0:PublishDate[1]" w:storeItemID="{55AF091B-3C7A-41E3-B477-F2FDAA23CFDA}"/>
+                                  <w:date w:fullDate="2025-11-14T00:00:00Z">
+                                    <w:dateFormat w:val="MMMM d, yyyy"/>
+                                    <w:lid w:val="en-US"/>
+                                    <w:storeMappedDataAs w:val="dateTime"/>
+                                    <w:calendar w:val="gregorian"/>
+                                  </w:date>
+                                </w:sdtPr>
+                                <w:sdtContent>
+                                  <w:p>
+                                    <w:pPr>
+                                      <w:pStyle w:val="NoSpacing"/>
+                                      <w:jc w:val="right"/>
+                                      <w:rPr>
+                                        <w:caps/>
+                                        <w:color w:val="323E4F" w:themeColor="text2" w:themeShade="BF"/>
+                                        <w:sz w:val="40"/>
+                                        <w:szCs w:val="40"/>
+                                      </w:rPr>
+                                    </w:pPr>
+                                    <w:r>
+                                      <w:rPr>
+                                        <w:caps/>
+                                        <w:color w:val="323E4F" w:themeColor="text2" w:themeShade="BF"/>
+                                        <w:sz w:val="40"/>
+                                        <w:szCs w:val="40"/>
+                                      </w:rPr>
+                                      <w:t>November 14, 2025</w:t>
+                                    </w:r>
+                                  </w:p>
+                                </w:sdtContent>
+                              </w:sdt>
+                            </w:txbxContent>
+                          </wps:txbx>
+                          <wps:bodyPr rot="0" spcFirstLastPara="0" vertOverflow="overflow" horzOverflow="overflow" vert="horz" wrap="square" lIns="0" tIns="0" rIns="0" bIns="0" numCol="1" spcCol="0" rtlCol="0" fromWordArt="0" anchor="b" anchorCtr="0" forceAA="0" compatLnSpc="1">
+                            <a:prstTxWarp prst="textNoShape">
+                              <a:avLst/>
+                            </a:prstTxWarp>
+                            <a:spAutoFit/>
+                          </wps:bodyPr>
+                        </wps:wsp>
+                      </a:graphicData>
+                    </a:graphic>
+                    <wp14:sizeRelH relativeFrom="page">
+                      <wp14:pctWidth>73400</wp14:pctWidth>
+                    </wp14:sizeRelH>
+                    <wp14:sizeRelV relativeFrom="page">
+                      <wp14:pctHeight>36300</wp14:pctHeight>
+                    </wp14:sizeRelV>
+                  </wp:anchor>
+                </w:drawing>
+              </mc:Choice>
+              <mc:Fallback>
+                <w:pict>
+                  <v:shapetype w14:anchorId="61DDE5BB" id="_x0000_t202" coordsize="21600,21600" o:spt="202" path="m,l,21600r21600,l21600,xe">
+                    <v:stroke joinstyle="miter"/>
+                    <v:path gradientshapeok="t" o:connecttype="rect"/>
+                  </v:shapetype>
+                  <v:shape id="Text Box 111" o:spid="_x0000_s1026" type="#_x0000_t202" style="position:absolute;margin-left:0;margin-top:0;width:288.25pt;height:287.5pt;z-index:251662336;visibility:visible;mso-wrap-style:square;mso-width-percent:734;mso-height-percent:363;mso-left-percent:150;mso-top-percent:91;mso-wrap-distance-left:9pt;mso-wrap-distance-top:0;mso-wrap-distance-right:9pt;mso-wrap-distance-bottom:0;mso-position-horizontal-relative:page;mso-position-vertical-relative:page;mso-width-percent:734;mso-height-percent:363;mso-left-percent:150;mso-top-percent:91;mso-width-relative:page;mso-height-relative:page;v-text-anchor:bottom" o:gfxdata="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" filled="f" stroked="f" strokeweight=".5pt">
+                    <v:textbox style="mso-fit-shape-to-text:t" inset="0,0,0,0">
+                      <w:txbxContent>
+                        <w:sdt>
+                          <w:sdtPr>
+                            <w:rPr>
+                              <w:caps/>
+                              <w:color w:val="323E4F" w:themeColor="text2" w:themeShade="BF"/>
+                              <w:sz w:val="40"/>
+                              <w:szCs w:val="40"/>
+                            </w:rPr>
+                            <w:alias w:val="Publish Date"/>
+                            <w:tag w:val=""/>
+                            <w:id w:val="400952559"/>
+                            <w:dataBinding w:prefixMappings="xmlns:ns0='http://schemas.microsoft.com/office/2006/coverPageProps' " w:xpath="/ns0:CoverPageProperties[1]/ns0:PublishDate[1]" w:storeItemID="{55AF091B-3C7A-41E3-B477-F2FDAA23CFDA}"/>
+                            <w:date w:fullDate="2025-11-14T00:00:00Z">
+                              <w:dateFormat w:val="MMMM d, yyyy"/>
+                              <w:lid w:val="en-US"/>
+                              <w:storeMappedDataAs w:val="dateTime"/>
+                              <w:calendar w:val="gregorian"/>
+                            </w:date>
+                          </w:sdtPr>
+                          <w:sdtContent>
+                            <w:p>
+                              <w:pPr>
+                                <w:pStyle w:val="NoSpacing"/>
+                                <w:jc w:val="right"/>
+                                <w:rPr>
+                                  <w:caps/>
+                                  <w:color w:val="323E4F" w:themeColor="text2" w:themeShade="BF"/>
+                                  <w:sz w:val="40"/>
+                                  <w:szCs w:val="40"/>
+                                </w:rPr>
+                              </w:pPr>
+                              <w:r>
+                                <w:rPr>
+                                  <w:caps/>
+                                  <w:color w:val="323E4F" w:themeColor="text2" w:themeShade="BF"/>
+                                  <w:sz w:val="40"/>
+                                  <w:szCs w:val="40"/>
+                                </w:rPr>
+                                <w:t>November 14, 2025</w:t>
+                              </w:r>
+                            </w:p>
+                          </w:sdtContent>
+                        </w:sdt>
+                      </w:txbxContent>
+                    </v:textbox>
+                    <w10:wrap type="square" anchorx="page" anchory="page"/>
+                  </v:shape>
+                </w:pict>
+              </mc:Fallback>
+            </mc:AlternateContent>
+          </w:r>
+          <w:r>
+            <w:rPr>
+              <w:noProof/>
+            </w:rPr>
+            <mc:AlternateContent>
+              <mc:Choice Requires="wps">
+                <w:drawing>
+                  <wp:anchor distT="0" distB="0" distL="114300" distR="114300" simplePos="0" relativeHeight="251661312" behindDoc="0" locked="0" layoutInCell="1" allowOverlap="1" wp14:anchorId="0F61625A" wp14:editId="2606E2D3">
+                    <wp:simplePos x="0" y="0"/>
+                    <mc:AlternateContent>
+                      <mc:Choice Requires="wp14">
+                        <wp:positionH relativeFrom="page">
+                          <wp14:pctPosHOffset>15000</wp14:pctPosHOffset>
+                        </wp:positionH>
+                      </mc:Choice>
+                      <mc:Fallback>
+                        <wp:positionH relativeFrom="page">
+                          <wp:posOffset>1133475</wp:posOffset>
+                        </wp:positionH>
+                      </mc:Fallback>
+                    </mc:AlternateContent>
+                    <mc:AlternateContent>
+                      <mc:Choice Requires="wp14">
+                        <wp:positionV relativeFrom="page">
+                          <wp14:pctPosVOffset>83700</wp14:pctPosVOffset>
+                        </wp:positionV>
+                      </mc:Choice>
+                      <mc:Fallback>
+                        <wp:positionV relativeFrom="page">
+                          <wp:posOffset>8949055</wp:posOffset>
+                        </wp:positionV>
+                      </mc:Fallback>
+                    </mc:AlternateContent>
+                    <wp:extent cx="5753100" cy="652780"/>
+                    <wp:effectExtent l="0" t="0" r="10160" b="14605"/>
+                    <wp:wrapSquare wrapText="bothSides"/>
+                    <wp:docPr id="112" name="Text Box 112"/>
+                    <wp:cNvGraphicFramePr/>
+                    <a:graphic xmlns:a="http://schemas.openxmlformats.org/drawingml/2006/main">
+                      <a:graphicData uri="http://schemas.microsoft.com/office/word/2010/wordprocessingShape">
+                        <wps:wsp>
+                          <wps:cNvSpPr txBox="1"/>
+                          <wps:spPr>
+                            <a:xfrm>
+                              <a:off x="0" y="0"/>
+                              <a:ext cx="5753100" cy="652780"/>
+                            </a:xfrm>
+                            <a:prstGeom prst="rect">
+                              <a:avLst/>
+                            </a:prstGeom>
+                            <a:noFill/>
+                            <a:ln w="6350">
+                              <a:noFill/>
+                            </a:ln>
+                            <a:effectLst/>
+                          </wps:spPr>
+                          <wps:style>
+                            <a:lnRef idx="0">
+                              <a:schemeClr val="accent1"/>
+                            </a:lnRef>
+                            <a:fillRef idx="0">
+                              <a:schemeClr val="accent1"/>
+                            </a:fillRef>
+                            <a:effectRef idx="0">
+                              <a:schemeClr val="accent1"/>
+                            </a:effectRef>
+                            <a:fontRef idx="minor">
+                              <a:schemeClr val="dk1"/>
+                            </a:fontRef>
+                          </wps:style>
+                          <wps:txbx>
+                            <w:txbxContent>
+                              <w:sdt>
+                                <w:sdtPr>
+                                  <w:rPr>
+                                    <w:caps/>
+                                    <w:color w:val="262626" w:themeColor="text1" w:themeTint="D9"/>
+                                    <w:sz w:val="28"/>
+                                    <w:szCs w:val="28"/>
+                                    <w:lang w:val="es-ES"/>
+                                  </w:rPr>
+                                  <w:alias w:val="Author"/>
+                                  <w:tag w:val=""/>
+                                  <w:id w:val="1901796142"/>
+                                  <w:dataBinding w:prefixMappings="xmlns:ns0='http://purl.org/dc/elements/1.1/' xmlns:ns1='http://schemas.openxmlformats.org/package/2006/metadata/core-properties' " w:xpath="/ns1:coreProperties[1]/ns0:creator[1]" w:storeItemID="{6C3C8BC8-F283-45AE-878A-BAB7291924A1}"/>
+                                  <w:text/>
+                                </w:sdtPr>
+                                <w:sdtContent>
+                                  <w:p>
+                                    <w:pPr>
+                                      <w:pStyle w:val="NoSpacing"/>
+                                      <w:jc w:val="right"/>
+                                      <w:rPr>
+                                        <w:caps/>
+                                        <w:color w:val="262626" w:themeColor="text1" w:themeTint="D9"/>
+                                        <w:sz w:val="28"/>
+                                        <w:szCs w:val="28"/>
+                                        <w:lang w:val="es-ES"/>
+                                      </w:rPr>
+                                    </w:pPr>
+                                    <w:r>
+                                      <w:rPr>
+                                        <w:caps/>
+                                        <w:color w:val="262626" w:themeColor="text1" w:themeTint="D9"/>
+                                        <w:sz w:val="28"/>
+                                        <w:szCs w:val="28"/>
+                                        <w:lang w:val="es-ES"/>
+                                      </w:rPr>
+                                      <w:t>Juan Francisco mateo garrido</w:t>
+                                    </w:r>
+                                  </w:p>
+                                </w:sdtContent>
+                              </w:sdt>
+                              <w:p>
+                                <w:pPr>
+                                  <w:pStyle w:val="NoSpacing"/>
+                                  <w:jc w:val="right"/>
+                                  <w:rPr>
+                                    <w:caps/>
+                                    <w:color w:val="262626" w:themeColor="text1" w:themeTint="D9"/>
+                                    <w:sz w:val="20"/>
+                                    <w:szCs w:val="20"/>
+                                    <w:lang w:val="es-ES"/>
+                                  </w:rPr>
+                                </w:pPr>
+                                <w:sdt>
+                                  <w:sdtPr>
+                                    <w:rPr>
+                                      <w:caps/>
+                                      <w:color w:val="262626" w:themeColor="text1" w:themeTint="D9"/>
+                                      <w:sz w:val="20"/>
+                                      <w:szCs w:val="20"/>
+                                    </w:rPr>
+                                    <w:alias w:val="Company"/>
+                                    <w:tag w:val=""/>
+                                    <w:id w:val="-661235724"/>
+                                    <w:showingPlcHdr/>
+                                    <w:dataBinding w:prefixMappings="xmlns:ns0='http://schemas.openxmlformats.org/officeDocument/2006/extended-properties' " w:xpath="/ns0:Properties[1]/ns0:Company[1]" w:storeItemID="{6668398D-A668-4E3E-A5EB-62B293D839F1}"/>
+                                    <w:text/>
+                                  </w:sdtPr>
+                                  <w:sdtContent>
+                                    <w:r>
+                                      <w:rPr>
+                                        <w:caps/>
+                                        <w:color w:val="262626" w:themeColor="text1" w:themeTint="D9"/>
+                                        <w:sz w:val="20"/>
+                                        <w:szCs w:val="20"/>
+                                      </w:rPr>
+                                      <w:t xml:space="preserve">     </w:t>
+                                    </w:r>
+                                  </w:sdtContent>
+                                </w:sdt>
+                              </w:p>
+                              <w:p>
+                                <w:pPr>
+                                  <w:pStyle w:val="NoSpacing"/>
+                                  <w:jc w:val="right"/>
+                                  <w:rPr>
+                                    <w:caps/>
+                                    <w:color w:val="262626" w:themeColor="text1" w:themeTint="D9"/>
+                                    <w:sz w:val="20"/>
+                                    <w:szCs w:val="20"/>
+                                  </w:rPr>
+                                </w:pPr>
+                                <w:sdt>
+                                  <w:sdtPr>
+                                    <w:rPr>
+                                      <w:color w:val="262626" w:themeColor="text1" w:themeTint="D9"/>
+                                      <w:sz w:val="20"/>
+                                      <w:szCs w:val="20"/>
+                                    </w:rPr>
+                                    <w:alias w:val="Address"/>
+                                    <w:tag w:val=""/>
+                                    <w:id w:val="171227497"/>
+                                    <w:showingPlcHdr/>
+                                    <w:dataBinding w:prefixMappings="xmlns:ns0='http://schemas.microsoft.com/office/2006/coverPageProps' " w:xpath="/ns0:CoverPageProperties[1]/ns0:CompanyAddress[1]" w:storeItemID="{55AF091B-3C7A-41E3-B477-F2FDAA23CFDA}"/>
+                                    <w:text/>
+                                  </w:sdtPr>
+                                  <w:sdtContent>
+                                    <w:r>
+                                      <w:rPr>
+                                        <w:color w:val="262626" w:themeColor="text1" w:themeTint="D9"/>
+                                        <w:sz w:val="20"/>
+                                        <w:szCs w:val="20"/>
+                                      </w:rPr>
+                                      <w:t xml:space="preserve">     </w:t>
+                                    </w:r>
+                                  </w:sdtContent>
+                                </w:sdt>
+                                <w:r>
+                                  <w:rPr>
+                                    <w:color w:val="262626" w:themeColor="text1" w:themeTint="D9"/>
+                                    <w:sz w:val="20"/>
+                                    <w:szCs w:val="20"/>
+                                  </w:rPr>
+                                  <w:t xml:space="preserve"> </w:t>
+                                </w:r>
+                              </w:p>
+                            </w:txbxContent>
+                          </wps:txbx>
+                          <wps:bodyPr rot="0" spcFirstLastPara="0" vertOverflow="overflow" horzOverflow="overflow" vert="horz" wrap="square" lIns="0" tIns="0" rIns="0" bIns="0" numCol="1" spcCol="0" rtlCol="0" fromWordArt="0" anchor="b" anchorCtr="0" forceAA="0" compatLnSpc="1">
+                            <a:prstTxWarp prst="textNoShape">
+                              <a:avLst/>
+                            </a:prstTxWarp>
+                            <a:noAutofit/>
+                          </wps:bodyPr>
+                        </wps:wsp>
+                      </a:graphicData>
+                    </a:graphic>
+                    <wp14:sizeRelH relativeFrom="page">
+                      <wp14:pctWidth>73400</wp14:pctWidth>
+                    </wp14:sizeRelH>
+                    <wp14:sizeRelV relativeFrom="page">
+                      <wp14:pctHeight>8000</wp14:pctHeight>
+                    </wp14:sizeRelV>
+                  </wp:anchor>
+                </w:drawing>
+              </mc:Choice>
+              <mc:Fallback>
+                <w:pict>
+                  <v:shape w14:anchorId="0F61625A" id="Text Box 112" o:spid="_x0000_s1027" type="#_x0000_t202" style="position:absolute;margin-left:0;margin-top:0;width:453pt;height:51.4pt;z-index:251661312;visibility:visible;mso-wrap-style:square;mso-width-percent:734;mso-height-percent:80;mso-left-percent:150;mso-top-percent:837;mso-wrap-distance-left:9pt;mso-wrap-distance-top:0;mso-wrap-distance-right:9pt;mso-wrap-distance-bottom:0;mso-position-horizontal-relative:page;mso-position-vertical-relative:page;mso-width-percent:734;mso-height-percent:80;mso-left-percent:150;mso-top-percent:837;mso-width-relative:page;mso-height-relative:page;v-text-anchor:bottom" o:gfxdata="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" filled="f" stroked="f" strokeweight=".5pt">
+                    <v:textbox inset="0,0,0,0">
+                      <w:txbxContent>
+                        <w:sdt>
+                          <w:sdtPr>
+                            <w:rPr>
+                              <w:caps/>
+                              <w:color w:val="262626" w:themeColor="text1" w:themeTint="D9"/>
+                              <w:sz w:val="28"/>
+                              <w:szCs w:val="28"/>
+                              <w:lang w:val="es-ES"/>
+                            </w:rPr>
+                            <w:alias w:val="Author"/>
+                            <w:tag w:val=""/>
+                            <w:id w:val="1901796142"/>
+                            <w:dataBinding w:prefixMappings="xmlns:ns0='http://purl.org/dc/elements/1.1/' xmlns:ns1='http://schemas.openxmlformats.org/package/2006/metadata/core-properties' " w:xpath="/ns1:coreProperties[1]/ns0:creator[1]" w:storeItemID="{6C3C8BC8-F283-45AE-878A-BAB7291924A1}"/>
+                            <w:text/>
+                          </w:sdtPr>
+                          <w:sdtContent>
+                            <w:p>
+                              <w:pPr>
+                                <w:pStyle w:val="NoSpacing"/>
+                                <w:jc w:val="right"/>
+                                <w:rPr>
+                                  <w:caps/>
+                                  <w:color w:val="262626" w:themeColor="text1" w:themeTint="D9"/>
+                                  <w:sz w:val="28"/>
+                                  <w:szCs w:val="28"/>
+                                  <w:lang w:val="es-ES"/>
+                                </w:rPr>
+                              </w:pPr>
+                              <w:r>
+                                <w:rPr>
+                                  <w:caps/>
+                                  <w:color w:val="262626" w:themeColor="text1" w:themeTint="D9"/>
+                                  <w:sz w:val="28"/>
+                                  <w:szCs w:val="28"/>
+                                  <w:lang w:val="es-ES"/>
+                                </w:rPr>
+                                <w:t>Juan Francisco mateo garrido</w:t>
+                              </w:r>
+                            </w:p>
+                          </w:sdtContent>
+                        </w:sdt>
+                        <w:p>
+                          <w:pPr>
+                            <w:pStyle w:val="NoSpacing"/>
+                            <w:jc w:val="right"/>
+                            <w:rPr>
+                              <w:caps/>
+                              <w:color w:val="262626" w:themeColor="text1" w:themeTint="D9"/>
+                              <w:sz w:val="20"/>
+                              <w:szCs w:val="20"/>
+                              <w:lang w:val="es-ES"/>
+                            </w:rPr>
+                          </w:pPr>
+                          <w:sdt>
+                            <w:sdtPr>
+                              <w:rPr>
+                                <w:caps/>
+                                <w:color w:val="262626" w:themeColor="text1" w:themeTint="D9"/>
+                                <w:sz w:val="20"/>
+                                <w:szCs w:val="20"/>
+                              </w:rPr>
+                              <w:alias w:val="Company"/>
+                              <w:tag w:val=""/>
+                              <w:id w:val="-661235724"/>
+                              <w:showingPlcHdr/>
+                              <w:dataBinding w:prefixMappings="xmlns:ns0='http://schemas.openxmlformats.org/officeDocument/2006/extended-properties' " w:xpath="/ns0:Properties[1]/ns0:Company[1]" w:storeItemID="{6668398D-A668-4E3E-A5EB-62B293D839F1}"/>
+                              <w:text/>
+                            </w:sdtPr>
+                            <w:sdtContent>
+                              <w:r>
+                                <w:rPr>
+                                  <w:caps/>
+                                  <w:color w:val="262626" w:themeColor="text1" w:themeTint="D9"/>
+                                  <w:sz w:val="20"/>
+                                  <w:szCs w:val="20"/>
+                                </w:rPr>
+                                <w:t xml:space="preserve">     </w:t>
+                              </w:r>
+                            </w:sdtContent>
+                          </w:sdt>
+                        </w:p>
+                        <w:p>
+                          <w:pPr>
+                            <w:pStyle w:val="NoSpacing"/>
+                            <w:jc w:val="right"/>
+                            <w:rPr>
+                              <w:caps/>
+                              <w:color w:val="262626" w:themeColor="text1" w:themeTint="D9"/>
+                              <w:sz w:val="20"/>
+                              <w:szCs w:val="20"/>
+                            </w:rPr>
+                          </w:pPr>
+                          <w:sdt>
+                            <w:sdtPr>
+                              <w:rPr>
+                                <w:color w:val="262626" w:themeColor="text1" w:themeTint="D9"/>
+                                <w:sz w:val="20"/>
+                                <w:szCs w:val="20"/>
+                              </w:rPr>
+                              <w:alias w:val="Address"/>
+                              <w:tag w:val=""/>
+                              <w:id w:val="171227497"/>
+                              <w:showingPlcHdr/>
+                              <w:dataBinding w:prefixMappings="xmlns:ns0='http://schemas.microsoft.com/office/2006/coverPageProps' " w:xpath="/ns0:CoverPageProperties[1]/ns0:CompanyAddress[1]" w:storeItemID="{55AF091B-3C7A-41E3-B477-F2FDAA23CFDA}"/>
+                              <w:text/>
+                            </w:sdtPr>
+                            <w:sdtContent>
+                              <w:r>
+                                <w:rPr>
+                                  <w:color w:val="262626" w:themeColor="text1" w:themeTint="D9"/>
+                                  <w:sz w:val="20"/>
+                                  <w:szCs w:val="20"/>
+                                </w:rPr>
+                                <w:t xml:space="preserve">     </w:t>
+                              </w:r>
+                            </w:sdtContent>
+                          </w:sdt>
+                          <w:r>
+                            <w:rPr>
+                              <w:color w:val="262626" w:themeColor="text1" w:themeTint="D9"/>
+                              <w:sz w:val="20"/>
+                              <w:szCs w:val="20"/>
+                            </w:rPr>
+                            <w:t xml:space="preserve"> </w:t>
+                          </w:r>
+                        </w:p>
+                      </w:txbxContent>
+                    </v:textbox>
+                    <w10:wrap type="square" anchorx="page" anchory="page"/>
+                  </v:shape>
+                </w:pict>
+              </mc:Fallback>
+            </mc:AlternateContent>
+          </w:r>
+          <w:r>
+            <w:rPr>
+              <w:noProof/>
+            </w:rPr>
+            <mc:AlternateContent>
+              <mc:Choice Requires="wps">
+                <w:drawing>
+                  <wp:anchor distT="0" distB="0" distL="114300" distR="114300" simplePos="0" relativeHeight="251660288" behindDoc="0" locked="0" layoutInCell="1" allowOverlap="1" wp14:anchorId="7138811B" wp14:editId="1FBDDB74">
+                    <wp:simplePos x="0" y="0"/>
+                    <mc:AlternateContent>
+                      <mc:Choice Requires="wp14">
+                        <wp:positionH relativeFrom="page">
+                          <wp14:pctPosHOffset>15000</wp14:pctPosHOffset>
+                        </wp:positionH>
+                      </mc:Choice>
+                      <mc:Fallback>
+                        <wp:positionH relativeFrom="page">
+                          <wp:posOffset>1133475</wp:posOffset>
+                        </wp:positionH>
+                      </mc:Fallback>
+                    </mc:AlternateContent>
+                    <mc:AlternateContent>
+                      <mc:Choice Requires="wp14">
+                        <wp:positionV relativeFrom="page">
+                          <wp14:pctPosVOffset>45500</wp14:pctPosVOffset>
+                        </wp:positionV>
+                      </mc:Choice>
+                      <mc:Fallback>
+                        <wp:positionV relativeFrom="page">
+                          <wp:posOffset>4864735</wp:posOffset>
+                        </wp:positionV>
+                      </mc:Fallback>
+                    </mc:AlternateContent>
+                    <wp:extent cx="5753100" cy="525780"/>
+                    <wp:effectExtent l="0" t="0" r="10160" b="6350"/>
+                    <wp:wrapSquare wrapText="bothSides"/>
+                    <wp:docPr id="113" name="Text Box 113"/>
+                    <wp:cNvGraphicFramePr/>
+                    <a:graphic xmlns:a="http://schemas.openxmlformats.org/drawingml/2006/main">
+                      <a:graphicData uri="http://schemas.microsoft.com/office/word/2010/wordprocessingShape">
+                        <wps:wsp>
+                          <wps:cNvSpPr txBox="1"/>
+                          <wps:spPr>
+                            <a:xfrm>
+                              <a:off x="0" y="0"/>
+                              <a:ext cx="5753100" cy="525780"/>
+                            </a:xfrm>
+                            <a:prstGeom prst="rect">
+                              <a:avLst/>
+                            </a:prstGeom>
+                            <a:noFill/>
+                            <a:ln w="6350">
+                              <a:noFill/>
+                            </a:ln>
+                            <a:effectLst/>
+                          </wps:spPr>
+                          <wps:style>
+                            <a:lnRef idx="0">
+                              <a:schemeClr val="accent1"/>
+                            </a:lnRef>
+                            <a:fillRef idx="0">
+                              <a:schemeClr val="accent1"/>
+                            </a:fillRef>
+                            <a:effectRef idx="0">
+                              <a:schemeClr val="accent1"/>
+                            </a:effectRef>
+                            <a:fontRef idx="minor">
+                              <a:schemeClr val="dk1"/>
+                            </a:fontRef>
+                          </wps:style>
+                          <wps:txbx>
+                            <w:txbxContent>
+                              <w:p>
+                                <w:pPr>
+                                  <w:pStyle w:val="NoSpacing"/>
+                                  <w:jc w:val="right"/>
+                                  <w:rPr>
+                                    <w:caps/>
+                                    <w:color w:val="323E4F" w:themeColor="text2" w:themeShade="BF"/>
+                                    <w:sz w:val="52"/>
+                                    <w:szCs w:val="52"/>
+                                    <w:lang w:val="es-ES"/>
+                                  </w:rPr>
+                                </w:pPr>
+                                <w:sdt>
+                                  <w:sdtPr>
+                                    <w:rPr>
+                                      <w:caps/>
+                                      <w:color w:val="323E4F" w:themeColor="text2" w:themeShade="BF"/>
+                                      <w:sz w:val="52"/>
+                                      <w:szCs w:val="52"/>
+                                      <w:lang w:val="es-ES"/>
+                                    </w:rPr>
+                                    <w:alias w:val="Title"/>
+                                    <w:tag w:val=""/>
+                                    <w:id w:val="-1315561441"/>
+                                    <w:dataBinding w:prefixMappings="xmlns:ns0='http://purl.org/dc/elements/1.1/' xmlns:ns1='http://schemas.openxmlformats.org/package/2006/metadata/core-properties' " w:xpath="/ns1:coreProperties[1]/ns0:title[1]" w:storeItemID="{6C3C8BC8-F283-45AE-878A-BAB7291924A1}"/>
+                                    <w:text w:multiLine="1"/>
+                                  </w:sdtPr>
+                                  <w:sdtContent>
+                                    <w:r>
+                                      <w:rPr>
+                                        <w:caps/>
+                                        <w:color w:val="323E4F" w:themeColor="text2" w:themeShade="BF"/>
+                                        <w:sz w:val="52"/>
+                                        <w:szCs w:val="52"/>
+                                        <w:lang w:val="es-ES"/>
+                                      </w:rPr>
+                                      <w:t xml:space="preserve">Memoria de Trabajo de actividades 1 y 2 </w:t>
+                                    </w:r>
+                                  </w:sdtContent>
+                                </w:sdt>
+                              </w:p>
+                              <w:sdt>
+                                <w:sdtPr>
+                                  <w:rPr>
+                                    <w:smallCaps/>
+                                    <w:color w:val="44546A" w:themeColor="text2"/>
+                                    <w:sz w:val="36"/>
+                                    <w:szCs w:val="36"/>
+                                    <w:lang w:val="es-ES"/>
+                                  </w:rPr>
+                                  <w:alias w:val="Subtitle"/>
+                                  <w:tag w:val=""/>
+                                  <w:id w:val="1615247542"/>
+                                  <w:dataBinding w:prefixMappings="xmlns:ns0='http://purl.org/dc/elements/1.1/' xmlns:ns1='http://schemas.openxmlformats.org/package/2006/metadata/core-properties' " w:xpath="/ns1:coreProperties[1]/ns0:subject[1]" w:storeItemID="{6C3C8BC8-F283-45AE-878A-BAB7291924A1}"/>
+                                  <w:text/>
+                                </w:sdtPr>
+                                <w:sdtContent>
+                                  <w:p>
+                                    <w:pPr>
+                                      <w:pStyle w:val="NoSpacing"/>
+                                      <w:jc w:val="right"/>
+                                      <w:rPr>
+                                        <w:smallCaps/>
+                                        <w:color w:val="44546A" w:themeColor="text2"/>
+                                        <w:sz w:val="36"/>
+                                        <w:szCs w:val="36"/>
+                                        <w:lang w:val="es-ES"/>
+                                      </w:rPr>
+                                    </w:pPr>
+                                    <w:r>
+                                      <w:rPr>
+                                        <w:smallCaps/>
+                                        <w:color w:val="44546A" w:themeColor="text2"/>
+                                        <w:sz w:val="36"/>
+                                        <w:szCs w:val="36"/>
+                                        <w:lang w:val="es-ES"/>
+                                      </w:rPr>
+                                      <w:t xml:space="preserve">13MBID – Metodologías de gestión y diseño de proyectos Big Data </w:t>
+                                    </w:r>
+                                  </w:p>
+                                </w:sdtContent>
+                              </w:sdt>
+                            </w:txbxContent>
+                          </wps:txbx>
+                          <wps:bodyPr rot="0" spcFirstLastPara="0" vertOverflow="overflow" horzOverflow="overflow" vert="horz" wrap="square" lIns="0" tIns="0" rIns="0" bIns="0" numCol="1" spcCol="0" rtlCol="0" fromWordArt="0" anchor="b" anchorCtr="0" forceAA="0" compatLnSpc="1">
+                            <a:prstTxWarp prst="textNoShape">
+                              <a:avLst/>
+                            </a:prstTxWarp>
+                            <a:noAutofit/>
+                          </wps:bodyPr>
+                        </wps:wsp>
+                      </a:graphicData>
+                    </a:graphic>
+                    <wp14:sizeRelH relativeFrom="page">
+                      <wp14:pctWidth>73400</wp14:pctWidth>
+                    </wp14:sizeRelH>
+                    <wp14:sizeRelV relativeFrom="page">
+                      <wp14:pctHeight>36300</wp14:pctHeight>
+                    </wp14:sizeRelV>
+                  </wp:anchor>
+                </w:drawing>
+              </mc:Choice>
+              <mc:Fallback>
+                <w:pict>
+                  <v:shape w14:anchorId="7138811B" id="Text Box 113" o:spid="_x0000_s1028" type="#_x0000_t202" style="position:absolute;margin-left:0;margin-top:0;width:453pt;height:41.4pt;z-index:251660288;visibility:visible;mso-wrap-style:square;mso-width-percent:734;mso-height-percent:363;mso-left-percent:150;mso-top-percent:455;mso-wrap-distance-left:9pt;mso-wrap-distance-top:0;mso-wrap-distance-right:9pt;mso-wrap-distance-bottom:0;mso-position-horizontal-relative:page;mso-position-vertical-relative:page;mso-width-percent:734;mso-height-percent:363;mso-left-percent:150;mso-top-percent:455;mso-width-relative:page;mso-height-relative:page;v-text-anchor:bottom" o:gfxdata="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" filled="f" stroked="f" strokeweight=".5pt">
+                    <v:textbox inset="0,0,0,0">
+                      <w:txbxContent>
+                        <w:p>
+                          <w:pPr>
+                            <w:pStyle w:val="NoSpacing"/>
+                            <w:jc w:val="right"/>
+                            <w:rPr>
+                              <w:caps/>
+                              <w:color w:val="323E4F" w:themeColor="text2" w:themeShade="BF"/>
+                              <w:sz w:val="52"/>
+                              <w:szCs w:val="52"/>
+                              <w:lang w:val="es-ES"/>
+                            </w:rPr>
+                          </w:pPr>
+                          <w:sdt>
+                            <w:sdtPr>
+                              <w:rPr>
+                                <w:caps/>
+                                <w:color w:val="323E4F" w:themeColor="text2" w:themeShade="BF"/>
+                                <w:sz w:val="52"/>
+                                <w:szCs w:val="52"/>
+                                <w:lang w:val="es-ES"/>
+                              </w:rPr>
+                              <w:alias w:val="Title"/>
+                              <w:tag w:val=""/>
+                              <w:id w:val="-1315561441"/>
+                              <w:dataBinding w:prefixMappings="xmlns:ns0='http://purl.org/dc/elements/1.1/' xmlns:ns1='http://schemas.openxmlformats.org/package/2006/metadata/core-properties' " w:xpath="/ns1:coreProperties[1]/ns0:title[1]" w:storeItemID="{6C3C8BC8-F283-45AE-878A-BAB7291924A1}"/>
+                              <w:text w:multiLine="1"/>
+                            </w:sdtPr>
+                            <w:sdtContent>
+                              <w:r>
+                                <w:rPr>
+                                  <w:caps/>
+                                  <w:color w:val="323E4F" w:themeColor="text2" w:themeShade="BF"/>
+                                  <w:sz w:val="52"/>
+                                  <w:szCs w:val="52"/>
+                                  <w:lang w:val="es-ES"/>
+                                </w:rPr>
+                                <w:t xml:space="preserve">Memoria de Trabajo de actividades 1 y 2 </w:t>
+                              </w:r>
+                            </w:sdtContent>
+                          </w:sdt>
+                        </w:p>
+                        <w:sdt>
+                          <w:sdtPr>
+                            <w:rPr>
+                              <w:smallCaps/>
+                              <w:color w:val="44546A" w:themeColor="text2"/>
+                              <w:sz w:val="36"/>
+                              <w:szCs w:val="36"/>
+                              <w:lang w:val="es-ES"/>
+                            </w:rPr>
+                            <w:alias w:val="Subtitle"/>
+                            <w:tag w:val=""/>
+                            <w:id w:val="1615247542"/>
+                            <w:dataBinding w:prefixMappings="xmlns:ns0='http://purl.org/dc/elements/1.1/' xmlns:ns1='http://schemas.openxmlformats.org/package/2006/metadata/core-properties' " w:xpath="/ns1:coreProperties[1]/ns0:subject[1]" w:storeItemID="{6C3C8BC8-F283-45AE-878A-BAB7291924A1}"/>
+                            <w:text/>
+                          </w:sdtPr>
+                          <w:sdtContent>
+                            <w:p>
+                              <w:pPr>
+                                <w:pStyle w:val="NoSpacing"/>
+                                <w:jc w:val="right"/>
+                                <w:rPr>
+                                  <w:smallCaps/>
+                                  <w:color w:val="44546A" w:themeColor="text2"/>
+                                  <w:sz w:val="36"/>
+                                  <w:szCs w:val="36"/>
+                                  <w:lang w:val="es-ES"/>
+                                </w:rPr>
+                              </w:pPr>
+                              <w:r>
+                                <w:rPr>
+                                  <w:smallCaps/>
+                                  <w:color w:val="44546A" w:themeColor="text2"/>
+                                  <w:sz w:val="36"/>
+                                  <w:szCs w:val="36"/>
+                                  <w:lang w:val="es-ES"/>
+                                </w:rPr>
+                                <w:t xml:space="preserve">13MBID – Metodologías de gestión y diseño de proyectos Big Data </w:t>
+                              </w:r>
+                            </w:p>
+                          </w:sdtContent>
+                        </w:sdt>
+                      </w:txbxContent>
+                    </v:textbox>
+                    <w10:wrap type="square" anchorx="page" anchory="page"/>
+                  </v:shape>
+                </w:pict>
+              </mc:Fallback>
+            </mc:AlternateContent>
+          </w:r>
+          <w:r>
+            <w:rPr>
+              <w:noProof/>
+            </w:rPr>
+            <mc:AlternateContent>
+              <mc:Choice Requires="wpg">
+                <w:drawing>
+                  <wp:anchor distT="0" distB="0" distL="114300" distR="114300" simplePos="0" relativeHeight="251659264" behindDoc="0" locked="0" layoutInCell="1" allowOverlap="1" wp14:anchorId="5198A152" wp14:editId="677198C2">
+                    <wp:simplePos x="0" y="0"/>
+                    <mc:AlternateContent>
+                      <mc:Choice Requires="wp14">
+                        <wp:positionH relativeFrom="page">
+                          <wp14:pctPosHOffset>4500</wp14:pctPosHOffset>
+                        </wp:positionH>
+                      </mc:Choice>
+                      <mc:Fallback>
+                        <wp:positionH relativeFrom="page">
+                          <wp:posOffset>339725</wp:posOffset>
+                        </wp:positionH>
+                      </mc:Fallback>
+                    </mc:AlternateContent>
+                    <wp:positionV relativeFrom="page">
+                      <wp:align>center</wp:align>
+                    </wp:positionV>
+                    <wp:extent cx="228600" cy="9144000"/>
+                    <wp:effectExtent l="0" t="0" r="3175" b="635"/>
+                    <wp:wrapNone/>
+                    <wp:docPr id="114" name="Group 115"/>
+                    <wp:cNvGraphicFramePr/>
+                    <a:graphic xmlns:a="http://schemas.openxmlformats.org/drawingml/2006/main">
+                      <a:graphicData uri="http://schemas.microsoft.com/office/word/2010/wordprocessingGroup">
+                        <wpg:wgp>
+                          <wpg:cNvGrpSpPr/>
+                          <wpg:grpSpPr>
+                            <a:xfrm>
+                              <a:off x="0" y="0"/>
+                              <a:ext cx="228600" cy="9144000"/>
+                              <a:chOff x="0" y="0"/>
+                              <a:chExt cx="228600" cy="9144000"/>
+                            </a:xfrm>
+                          </wpg:grpSpPr>
+                          <wps:wsp>
+                            <wps:cNvPr id="115" name="Rectangle 115"/>
+                            <wps:cNvSpPr/>
+                            <wps:spPr>
+                              <a:xfrm>
+                                <a:off x="0" y="0"/>
+                                <a:ext cx="228600" cy="8782050"/>
+                              </a:xfrm>
+                              <a:prstGeom prst="rect">
+                                <a:avLst/>
+                              </a:prstGeom>
+                              <a:solidFill>
+                                <a:schemeClr val="accent2"/>
+                              </a:solidFill>
+                              <a:ln>
+                                <a:noFill/>
+                              </a:ln>
+                            </wps:spPr>
+                            <wps:style>
+                              <a:lnRef idx="2">
+                                <a:schemeClr val="accent1">
+                                  <a:shade val="50000"/>
+                                </a:schemeClr>
+                              </a:lnRef>
+                              <a:fillRef idx="1">
+                                <a:schemeClr val="accent1"/>
+                              </a:fillRef>
+                              <a:effectRef idx="0">
+                                <a:schemeClr val="accent1"/>
+                              </a:effectRef>
+                              <a:fontRef idx="minor">
+                                <a:schemeClr val="lt1"/>
+                              </a:fontRef>
+                            </wps:style>
+                            <wps:bodyPr rot="0" spcFirstLastPara="0" vertOverflow="overflow" horzOverflow="overflow" vert="horz" wrap="square" lIns="91440" tIns="45720" rIns="91440" bIns="45720" numCol="1" spcCol="0" rtlCol="0" fromWordArt="0" anchor="ctr" anchorCtr="0" forceAA="0" compatLnSpc="1">
+                              <a:prstTxWarp prst="textNoShape">
+                                <a:avLst/>
+                              </a:prstTxWarp>
+                              <a:noAutofit/>
+                            </wps:bodyPr>
+                          </wps:wsp>
+                          <wps:wsp>
+                            <wps:cNvPr id="116" name="Rectangle 116"/>
+                            <wps:cNvSpPr>
+                              <a:spLocks noChangeAspect="1"/>
+                            </wps:cNvSpPr>
+                            <wps:spPr>
+                              <a:xfrm>
+                                <a:off x="0" y="8915400"/>
+                                <a:ext cx="228600" cy="228600"/>
+                              </a:xfrm>
+                              <a:prstGeom prst="rect">
+                                <a:avLst/>
+                              </a:prstGeom>
+                              <a:solidFill>
+                                <a:schemeClr val="accent1"/>
+                              </a:solidFill>
+                              <a:ln>
+                                <a:noFill/>
+                              </a:ln>
+                            </wps:spPr>
+                            <wps:style>
+                              <a:lnRef idx="2">
+                                <a:schemeClr val="accent1">
+                                  <a:shade val="50000"/>
+                                </a:schemeClr>
+                              </a:lnRef>
+                              <a:fillRef idx="1">
+                                <a:schemeClr val="accent1"/>
+                              </a:fillRef>
+                              <a:effectRef idx="0">
+                                <a:schemeClr val="accent1"/>
+                              </a:effectRef>
+                              <a:fontRef idx="minor">
+                                <a:schemeClr val="lt1"/>
+                              </a:fontRef>
+                            </wps:style>
+                            <wps:bodyPr rot="0" spcFirstLastPara="0" vertOverflow="overflow" horzOverflow="overflow" vert="horz" wrap="square" lIns="91440" tIns="45720" rIns="91440" bIns="45720" numCol="1" spcCol="0" rtlCol="0" fromWordArt="0" anchor="ctr" anchorCtr="0" forceAA="0" compatLnSpc="1">
+                              <a:prstTxWarp prst="textNoShape">
+                                <a:avLst/>
+                              </a:prstTxWarp>
+                              <a:noAutofit/>
+                            </wps:bodyPr>
+                          </wps:wsp>
+                        </wpg:wgp>
+                      </a:graphicData>
+                    </a:graphic>
+                    <wp14:sizeRelH relativeFrom="page">
+                      <wp14:pctWidth>2900</wp14:pctWidth>
+                    </wp14:sizeRelH>
+                    <wp14:sizeRelV relativeFrom="page">
+                      <wp14:pctHeight>90900</wp14:pctHeight>
+                    </wp14:sizeRelV>
+                  </wp:anchor>
+                </w:drawing>
+              </mc:Choice>
+              <mc:Fallback>
+                <w:pict>
+                  <v:group w14:anchorId="489505B9" id="Group 115" o:spid="_x0000_s1026" style="position:absolute;margin-left:0;margin-top:0;width:18pt;height:10in;z-index:251659264;mso-width-percent:29;mso-height-percent:909;mso-left-percent:45;mso-position-horizontal-relative:page;mso-position-vertical:center;mso-position-vertical-relative:page;mso-width-percent:29;mso-height-percent:909;mso-left-percent:45" coordsize="2286,91440" o:gfxdata="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">
+                    <v:rect id="Rectangle 115" o:spid="_x0000_s1027" style="position:absolute;width:2286;height:87820;visibility:visible;mso-wrap-style:square;v-text-anchor:middle" o:gfxdata="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" fillcolor="#ed7d31 [3205]" stroked="f" strokeweight="1pt"/>
+                    <v:rect id="Rectangle 116" o:spid="_x0000_s1028" style="position:absolute;top:89154;width:2286;height:2286;visibility:visible;mso-wrap-style:square;v-text-anchor:middle" o:gfxdata="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" fillcolor="#4472c4 [3204]" stroked="f" strokeweight="1pt">
+                      <o:lock v:ext="edit" aspectratio="t"/>
+                    </v:rect>
+                    <w10:wrap anchorx="page" anchory="page"/>
+                  </v:group>
+                </w:pict>
+              </mc:Fallback>
+            </mc:AlternateContent>
+          </w:r>
+          <w:r>
+            <w:br w:type="page"/>
+          </w:r>
+        </w:p>
+      </w:sdtContent>
+    </w:sdt>
     <w:p>
       <w:pPr>
         <w:pStyle w:val="Heading1"/>
@@ -11,6 +999,7 @@
         </w:rPr>
       </w:pPr>
       <w:r>
+        <w:lastRenderedPageBreak/>
         <w:t>Actividades Práctica</w:t>
       </w:r>
       <w:r>
@@ -93,7 +1082,7 @@
                     <pic:cNvPicPr/>
                   </pic:nvPicPr>
                   <pic:blipFill>
-                    <a:blip r:embed="rId8">
+                    <a:blip r:embed="rId9">
                       <a:extLst>
                         <a:ext uri="{28A0092B-C50C-407E-A947-70E740481C1C}">
                           <a14:useLocalDpi xmlns:a14="http://schemas.microsoft.com/office/drawing/2010/main" val="0"/>
@@ -142,11 +1131,20 @@
         <w:ind w:left="708"/>
       </w:pPr>
     </w:p>
-    <w:p>
-      <w:r>
-        <w:br w:type="page"/>
-      </w:r>
-    </w:p>
+    <w:p/>
+    <w:p/>
+    <w:p/>
+    <w:p/>
+    <w:p/>
+    <w:p/>
+    <w:p/>
+    <w:p/>
+    <w:p/>
+    <w:p/>
+    <w:p/>
+    <w:p/>
+    <w:p/>
+    <w:p/>
     <w:p>
       <w:pPr>
         <w:pStyle w:val="Heading2"/>
@@ -548,11 +1546,6 @@
     </w:p>
     <w:p>
       <w:pPr>
-        <w:spacing w:after="0"/>
-      </w:pPr>
-    </w:p>
-    <w:p>
-      <w:pPr>
         <w:pStyle w:val="Heading3"/>
         <w:rPr>
           <w:rFonts w:ascii="Calibri" w:eastAsia="Calibri" w:hAnsi="Calibri" w:cs="Calibri"/>
@@ -563,6 +1556,7 @@
         </w:rPr>
       </w:pPr>
       <w:r>
+        <w:lastRenderedPageBreak/>
         <w:t>Determinación de los objetivos del proyecto</w:t>
       </w:r>
     </w:p>
@@ -941,7 +1935,7 @@
         </w:rPr>
         <w:t xml:space="preserve">rojects: </w:t>
       </w:r>
-      <w:hyperlink r:id="rId9" w:history="1">
+      <w:hyperlink r:id="rId10" w:history="1">
         <w:r>
           <w:rPr>
             <w:rStyle w:val="Hyperlink"/>
@@ -970,7 +1964,7 @@
       <w:r>
         <w:t xml:space="preserve">: </w:t>
       </w:r>
-      <w:hyperlink r:id="rId10" w:history="1">
+      <w:hyperlink r:id="rId11" w:history="1">
         <w:r>
           <w:rPr>
             <w:rStyle w:val="Hyperlink"/>
@@ -1001,7 +1995,7 @@
                     <pic:cNvPicPr/>
                   </pic:nvPicPr>
                   <pic:blipFill>
-                    <a:blip r:embed="rId11" cstate="print">
+                    <a:blip r:embed="rId12" cstate="print">
                       <a:extLst>
                         <a:ext uri="{28A0092B-C50C-407E-A947-70E740481C1C}">
                           <a14:useLocalDpi xmlns:a14="http://schemas.microsoft.com/office/drawing/2010/main" val="0"/>
@@ -1032,11 +2026,19 @@
       </w:r>
     </w:p>
     <w:p/>
-    <w:p>
-      <w:r>
-        <w:br w:type="page"/>
-      </w:r>
-    </w:p>
+    <w:p/>
+    <w:p/>
+    <w:p/>
+    <w:p/>
+    <w:p/>
+    <w:p/>
+    <w:p/>
+    <w:p/>
+    <w:p/>
+    <w:p/>
+    <w:p/>
+    <w:p/>
+    <w:p/>
     <w:p>
       <w:pPr>
         <w:pStyle w:val="Heading2"/>
@@ -2280,7 +3282,7 @@
                     <pic:cNvPicPr/>
                   </pic:nvPicPr>
                   <pic:blipFill>
-                    <a:blip r:embed="rId12">
+                    <a:blip r:embed="rId13">
                       <a:extLst>
                         <a:ext uri="{28A0092B-C50C-407E-A947-70E740481C1C}">
                           <a14:useLocalDpi xmlns:a14="http://schemas.microsoft.com/office/drawing/2010/main"/>
@@ -2349,7 +3351,7 @@
                     <pic:cNvPicPr/>
                   </pic:nvPicPr>
                   <pic:blipFill>
-                    <a:blip r:embed="rId13">
+                    <a:blip r:embed="rId14">
                       <a:extLst>
                         <a:ext uri="{28A0092B-C50C-407E-A947-70E740481C1C}">
                           <a14:useLocalDpi xmlns:a14="http://schemas.microsoft.com/office/drawing/2010/main"/>
@@ -2419,66 +3421,6 @@
                 <pic:pic xmlns:pic="http://schemas.openxmlformats.org/drawingml/2006/picture">
                   <pic:nvPicPr>
                     <pic:cNvPr id="1903441777" name="Picture 1" descr="A graph of a number of people&#10;&#10;AI-generated content may be incorrect."/>
-                    <pic:cNvPicPr/>
-                  </pic:nvPicPr>
-                  <pic:blipFill>
-                    <a:blip r:embed="rId14">
-                      <a:extLst>
-                        <a:ext uri="{28A0092B-C50C-407E-A947-70E740481C1C}">
-                          <a14:useLocalDpi xmlns:a14="http://schemas.microsoft.com/office/drawing/2010/main" val="0"/>
-                        </a:ext>
-                      </a:extLst>
-                    </a:blip>
-                    <a:stretch>
-                      <a:fillRect/>
-                    </a:stretch>
-                  </pic:blipFill>
-                  <pic:spPr>
-                    <a:xfrm>
-                      <a:off x="0" y="0"/>
-                      <a:ext cx="5486411" cy="3657607"/>
-                    </a:xfrm>
-                    <a:prstGeom prst="rect">
-                      <a:avLst/>
-                    </a:prstGeom>
-                  </pic:spPr>
-                </pic:pic>
-              </a:graphicData>
-            </a:graphic>
-          </wp:inline>
-        </w:drawing>
-      </w:r>
-    </w:p>
-    <w:p>
-      <w:pPr>
-        <w:pStyle w:val="ListParagraph"/>
-        <w:numPr>
-          <w:ilvl w:val="0"/>
-          <w:numId w:val="36"/>
-        </w:numPr>
-      </w:pPr>
-      <w:r>
-        <w:t>Distribución del atributo ‘loan’ (préstamos personales)</w:t>
-      </w:r>
-    </w:p>
-    <w:p>
-      <w:r>
-        <w:rPr>
-          <w:noProof/>
-        </w:rPr>
-        <w:drawing>
-          <wp:inline distT="0" distB="0" distL="0" distR="0" wp14:anchorId="09395202" wp14:editId="078649F1">
-            <wp:extent cx="5486411" cy="3657607"/>
-            <wp:effectExtent l="0" t="0" r="0" b="0"/>
-            <wp:docPr id="1763311297" name="Picture 2" descr="A graph with blue squares&#10;&#10;AI-generated content may be incorrect."/>
-            <wp:cNvGraphicFramePr>
-              <a:graphicFrameLocks xmlns:a="http://schemas.openxmlformats.org/drawingml/2006/main" noChangeAspect="1"/>
-            </wp:cNvGraphicFramePr>
-            <a:graphic xmlns:a="http://schemas.openxmlformats.org/drawingml/2006/main">
-              <a:graphicData uri="http://schemas.openxmlformats.org/drawingml/2006/picture">
-                <pic:pic xmlns:pic="http://schemas.openxmlformats.org/drawingml/2006/picture">
-                  <pic:nvPicPr>
-                    <pic:cNvPr id="1763311297" name="Picture 2" descr="A graph with blue squares&#10;&#10;AI-generated content may be incorrect."/>
                     <pic:cNvPicPr/>
                   </pic:nvPicPr>
                   <pic:blipFill>
@@ -2509,6 +3451,66 @@
         </w:drawing>
       </w:r>
     </w:p>
+    <w:p>
+      <w:pPr>
+        <w:pStyle w:val="ListParagraph"/>
+        <w:numPr>
+          <w:ilvl w:val="0"/>
+          <w:numId w:val="36"/>
+        </w:numPr>
+      </w:pPr>
+      <w:r>
+        <w:t>Distribución del atributo ‘loan’ (préstamos personales)</w:t>
+      </w:r>
+    </w:p>
+    <w:p>
+      <w:r>
+        <w:rPr>
+          <w:noProof/>
+        </w:rPr>
+        <w:drawing>
+          <wp:inline distT="0" distB="0" distL="0" distR="0" wp14:anchorId="09395202" wp14:editId="078649F1">
+            <wp:extent cx="5486411" cy="3657607"/>
+            <wp:effectExtent l="0" t="0" r="0" b="0"/>
+            <wp:docPr id="1763311297" name="Picture 2" descr="A graph with blue squares&#10;&#10;AI-generated content may be incorrect."/>
+            <wp:cNvGraphicFramePr>
+              <a:graphicFrameLocks xmlns:a="http://schemas.openxmlformats.org/drawingml/2006/main" noChangeAspect="1"/>
+            </wp:cNvGraphicFramePr>
+            <a:graphic xmlns:a="http://schemas.openxmlformats.org/drawingml/2006/main">
+              <a:graphicData uri="http://schemas.openxmlformats.org/drawingml/2006/picture">
+                <pic:pic xmlns:pic="http://schemas.openxmlformats.org/drawingml/2006/picture">
+                  <pic:nvPicPr>
+                    <pic:cNvPr id="1763311297" name="Picture 2" descr="A graph with blue squares&#10;&#10;AI-generated content may be incorrect."/>
+                    <pic:cNvPicPr/>
+                  </pic:nvPicPr>
+                  <pic:blipFill>
+                    <a:blip r:embed="rId16">
+                      <a:extLst>
+                        <a:ext uri="{28A0092B-C50C-407E-A947-70E740481C1C}">
+                          <a14:useLocalDpi xmlns:a14="http://schemas.microsoft.com/office/drawing/2010/main" val="0"/>
+                        </a:ext>
+                      </a:extLst>
+                    </a:blip>
+                    <a:stretch>
+                      <a:fillRect/>
+                    </a:stretch>
+                  </pic:blipFill>
+                  <pic:spPr>
+                    <a:xfrm>
+                      <a:off x="0" y="0"/>
+                      <a:ext cx="5486411" cy="3657607"/>
+                    </a:xfrm>
+                    <a:prstGeom prst="rect">
+                      <a:avLst/>
+                    </a:prstGeom>
+                  </pic:spPr>
+                </pic:pic>
+              </a:graphicData>
+            </a:graphic>
+          </wp:inline>
+        </w:drawing>
+      </w:r>
+    </w:p>
     <w:p/>
     <w:p/>
     <w:p>
@@ -2553,7 +3555,7 @@
                     <pic:cNvPicPr/>
                   </pic:nvPicPr>
                   <pic:blipFill>
-                    <a:blip r:embed="rId16">
+                    <a:blip r:embed="rId17">
                       <a:extLst>
                         <a:ext uri="{28A0092B-C50C-407E-A947-70E740481C1C}">
                           <a14:useLocalDpi xmlns:a14="http://schemas.microsoft.com/office/drawing/2010/main" val="0"/>
@@ -2618,7 +3620,7 @@
                     <pic:cNvPicPr/>
                   </pic:nvPicPr>
                   <pic:blipFill>
-                    <a:blip r:embed="rId17">
+                    <a:blip r:embed="rId18">
                       <a:extLst>
                         <a:ext uri="{28A0092B-C50C-407E-A947-70E740481C1C}">
                           <a14:useLocalDpi xmlns:a14="http://schemas.microsoft.com/office/drawing/2010/main" val="0"/>
@@ -2725,7 +3727,7 @@
                     <pic:cNvPicPr/>
                   </pic:nvPicPr>
                   <pic:blipFill>
-                    <a:blip r:embed="rId18"/>
+                    <a:blip r:embed="rId19"/>
                     <a:stretch>
                       <a:fillRect/>
                     </a:stretch>
@@ -2819,8 +3821,12 @@
         <w:t>--</w:t>
       </w:r>
     </w:p>
-    <w:p>
-      <w:r>
+    <w:p/>
+    <w:p/>
+    <w:p/>
+    <w:p>
+      <w:r>
+        <w:lastRenderedPageBreak/>
         <w:t xml:space="preserve">El análisis de calidad </w:t>
       </w:r>
       <w:r>
@@ -3007,7 +4013,6 @@
                 <w:rFonts w:ascii="Calibri" w:eastAsia="Calibri" w:hAnsi="Calibri" w:cs="Calibri"/>
                 <w:color w:val="000000" w:themeColor="text1"/>
               </w:rPr>
-              <w:lastRenderedPageBreak/>
               <w:t>Completitud</w:t>
             </w:r>
           </w:p>
@@ -3768,6 +4773,7 @@
     </w:p>
     <w:p>
       <w:r>
+        <w:lastRenderedPageBreak/>
         <w:t>Estas prácticas permitirán la replicación de la validación con nuevos conjuntos de datos a medida que el proyecto evolucione.</w:t>
       </w:r>
     </w:p>
@@ -3793,7 +4799,6 @@
         <w:rPr>
           <w:lang w:val="en-GB"/>
         </w:rPr>
-        <w:lastRenderedPageBreak/>
         <w:t>Exactitud</w:t>
       </w:r>
       <w:proofErr w:type="spellEnd"/>
@@ -3865,7 +4870,7 @@
                     <pic:cNvPicPr/>
                   </pic:nvPicPr>
                   <pic:blipFill>
-                    <a:blip r:embed="rId19"/>
+                    <a:blip r:embed="rId20"/>
                     <a:stretch>
                       <a:fillRect/>
                     </a:stretch>
@@ -3937,27 +4942,6 @@
     </w:p>
     <w:p>
       <w:pPr>
-        <w:rPr>
-          <w:lang w:val="en-GB"/>
-        </w:rPr>
-      </w:pPr>
-    </w:p>
-    <w:p>
-      <w:pPr>
-        <w:rPr>
-          <w:lang w:val="en-GB"/>
-        </w:rPr>
-      </w:pPr>
-    </w:p>
-    <w:p>
-      <w:pPr>
-        <w:rPr>
-          <w:lang w:val="en-GB"/>
-        </w:rPr>
-      </w:pPr>
-    </w:p>
-    <w:p>
-      <w:pPr>
         <w:pStyle w:val="ListParagraph"/>
         <w:numPr>
           <w:ilvl w:val="0"/>
@@ -3972,7 +4956,6 @@
         <w:rPr>
           <w:lang w:val="en-GB"/>
         </w:rPr>
-        <w:lastRenderedPageBreak/>
         <w:t>Consistencia</w:t>
       </w:r>
       <w:proofErr w:type="spellEnd"/>
@@ -4024,7 +5007,7 @@
                     <pic:cNvPicPr/>
                   </pic:nvPicPr>
                   <pic:blipFill>
-                    <a:blip r:embed="rId20"/>
+                    <a:blip r:embed="rId21"/>
                     <a:stretch>
                       <a:fillRect/>
                     </a:stretch>
@@ -4561,9 +5544,12 @@
         <w:t>.</w:t>
       </w:r>
     </w:p>
+    <w:p/>
+    <w:p/>
     <w:p>
       <w:proofErr w:type="gramStart"/>
       <w:r>
+        <w:lastRenderedPageBreak/>
         <w:t>Además</w:t>
       </w:r>
       <w:proofErr w:type="gramEnd"/>
@@ -4600,7 +5586,6 @@
         </w:numPr>
       </w:pPr>
       <w:r>
-        <w:lastRenderedPageBreak/>
         <w:t>Creación de atributo “</w:t>
       </w:r>
       <w:proofErr w:type="spellStart"/>
@@ -5066,7 +6051,7 @@
                     <pic:cNvPicPr/>
                   </pic:nvPicPr>
                   <pic:blipFill>
-                    <a:blip r:embed="rId21"/>
+                    <a:blip r:embed="rId22"/>
                     <a:stretch>
                       <a:fillRect/>
                     </a:stretch>
@@ -5130,7 +6115,7 @@
                     <pic:cNvPicPr/>
                   </pic:nvPicPr>
                   <pic:blipFill>
-                    <a:blip r:embed="rId22"/>
+                    <a:blip r:embed="rId23"/>
                     <a:stretch>
                       <a:fillRect/>
                     </a:stretch>
@@ -5186,7 +6171,7 @@
                     <pic:cNvPicPr/>
                   </pic:nvPicPr>
                   <pic:blipFill>
-                    <a:blip r:embed="rId23"/>
+                    <a:blip r:embed="rId24"/>
                     <a:stretch>
                       <a:fillRect/>
                     </a:stretch>
@@ -5253,7 +6238,7 @@
                     <pic:cNvPicPr/>
                   </pic:nvPicPr>
                   <pic:blipFill>
-                    <a:blip r:embed="rId24"/>
+                    <a:blip r:embed="rId25"/>
                     <a:stretch>
                       <a:fillRect/>
                     </a:stretch>
@@ -8617,7 +9602,7 @@
         </w:rPr>
         <w:t xml:space="preserve"> </w:t>
       </w:r>
-      <w:hyperlink r:id="rId25" w:history="1">
+      <w:hyperlink r:id="rId26" w:history="1">
         <w:r>
           <w:rPr>
             <w:rStyle w:val="Hyperlink"/>
@@ -8638,7 +9623,7 @@
       <w:r>
         <w:t xml:space="preserve">Aplicación web: </w:t>
       </w:r>
-      <w:hyperlink r:id="rId26" w:history="1">
+      <w:hyperlink r:id="rId27" w:history="1">
         <w:r>
           <w:rPr>
             <w:rStyle w:val="Hyperlink"/>
@@ -8673,7 +9658,7 @@
                     <pic:cNvPicPr/>
                   </pic:nvPicPr>
                   <pic:blipFill>
-                    <a:blip r:embed="rId27"/>
+                    <a:blip r:embed="rId28"/>
                     <a:stretch>
                       <a:fillRect/>
                     </a:stretch>
@@ -8721,7 +9706,7 @@
                     <pic:cNvPicPr/>
                   </pic:nvPicPr>
                   <pic:blipFill>
-                    <a:blip r:embed="rId28"/>
+                    <a:blip r:embed="rId29"/>
                     <a:stretch>
                       <a:fillRect/>
                     </a:stretch>
@@ -9055,38 +10040,42 @@
           <w:ilvl w:val="0"/>
           <w:numId w:val="1"/>
         </w:numPr>
-        <w:rPr>
-          <w:rFonts w:eastAsiaTheme="minorEastAsia"/>
-          <w:highlight w:val="yellow"/>
-        </w:rPr>
-      </w:pPr>
-      <w:r>
-        <w:rPr>
-          <w:rFonts w:eastAsiaTheme="minorEastAsia"/>
-          <w:highlight w:val="yellow"/>
-        </w:rPr>
-        <w:t xml:space="preserve">[Agregar: </w:t>
-      </w:r>
-      <w:proofErr w:type="spellStart"/>
-      <w:r>
-        <w:rPr>
-          <w:rFonts w:eastAsiaTheme="minorEastAsia"/>
-          <w:highlight w:val="yellow"/>
-        </w:rPr>
-        <w:t>Items</w:t>
-      </w:r>
-      <w:proofErr w:type="spellEnd"/>
-      <w:r>
-        <w:rPr>
-          <w:rFonts w:eastAsiaTheme="minorEastAsia"/>
-          <w:highlight w:val="yellow"/>
-        </w:rPr>
-        <w:t xml:space="preserve"> desarrollados en el proyecto en estas dos iteraciones]</w:t>
-      </w:r>
-    </w:p>
-    <w:p>
-      <w:r>
-        <w:t>Como cuestiones a revisar para una siguiente iteración se mencionan:</w:t>
+      </w:pPr>
+      <w:r>
+        <w:t xml:space="preserve">Un registro de las actividades realizadas que permite la trazabilidad del trabajo seguido en este documento en </w:t>
+      </w:r>
+      <w:proofErr w:type="spellStart"/>
+      <w:r>
+        <w:t>Github</w:t>
+      </w:r>
+      <w:proofErr w:type="spellEnd"/>
+      <w:r>
+        <w:t xml:space="preserve"> </w:t>
+      </w:r>
+      <w:proofErr w:type="spellStart"/>
+      <w:r>
+        <w:t>Projects</w:t>
+      </w:r>
+      <w:proofErr w:type="spellEnd"/>
+      <w:r>
+        <w:t xml:space="preserve">, cuyo enlace se encuentra en la sección </w:t>
+      </w:r>
+      <w:r>
+        <w:rPr>
+          <w:i/>
+          <w:iCs/>
+        </w:rPr>
+        <w:t>Definir plan del proyecto</w:t>
+      </w:r>
+      <w:r>
+        <w:rPr>
+          <w:i/>
+          <w:iCs/>
+        </w:rPr>
+        <w:t xml:space="preserve"> </w:t>
+      </w:r>
+      <w:r>
+        <w:t>que sigue la misma estructura que este documento.</w:t>
       </w:r>
     </w:p>
     <w:p>
@@ -9096,17 +10085,33 @@
           <w:ilvl w:val="0"/>
           <w:numId w:val="1"/>
         </w:numPr>
-        <w:rPr>
-          <w:rFonts w:eastAsiaTheme="minorEastAsia"/>
-          <w:highlight w:val="yellow"/>
-        </w:rPr>
-      </w:pPr>
-      <w:r>
-        <w:rPr>
-          <w:rFonts w:eastAsiaTheme="minorEastAsia"/>
-          <w:highlight w:val="yellow"/>
-        </w:rPr>
-        <w:t>[ejemplo: Capacitación en metodologías ágiles]</w:t>
+      </w:pPr>
+      <w:r>
+        <w:t>Se ha llevado a cabo un versionado de los datos y los elementos de ejecución de este proyecto a nivel técnico para mantener la integridad tanto de los datos, como de la trazabilidad del trabajo realizado. Se han utilizado 2 métodos:</w:t>
+      </w:r>
+    </w:p>
+    <w:p>
+      <w:pPr>
+        <w:pStyle w:val="ListParagraph"/>
+        <w:numPr>
+          <w:ilvl w:val="1"/>
+          <w:numId w:val="1"/>
+        </w:numPr>
+      </w:pPr>
+      <w:r>
+        <w:t>Git – versionado de documentos</w:t>
+      </w:r>
+    </w:p>
+    <w:p>
+      <w:pPr>
+        <w:pStyle w:val="ListParagraph"/>
+        <w:numPr>
+          <w:ilvl w:val="1"/>
+          <w:numId w:val="1"/>
+        </w:numPr>
+      </w:pPr>
+      <w:r>
+        <w:t>DVC – versionado de datos</w:t>
       </w:r>
     </w:p>
     <w:p>
@@ -9116,33 +10121,1020 @@
           <w:ilvl w:val="0"/>
           <w:numId w:val="1"/>
         </w:numPr>
+      </w:pPr>
+      <w:r>
+        <w:t xml:space="preserve">La generación de un repositorio que permite mantener la trazabilidad, el versionado y el trabajo colaborativo en </w:t>
+      </w:r>
+      <w:proofErr w:type="spellStart"/>
+      <w:r>
+        <w:t>Github</w:t>
+      </w:r>
+      <w:proofErr w:type="spellEnd"/>
+      <w:r>
+        <w:t xml:space="preserve">. El enlace se encuentra en la sección </w:t>
+      </w:r>
+      <w:r>
+        <w:rPr>
+          <w:i/>
+          <w:iCs/>
+        </w:rPr>
+        <w:t>Definir plan del proyecto</w:t>
+      </w:r>
+      <w:r>
+        <w:rPr>
+          <w:i/>
+          <w:iCs/>
+        </w:rPr>
+        <w:t>.</w:t>
+      </w:r>
+    </w:p>
+    <w:p>
+      <w:pPr>
+        <w:pStyle w:val="ListParagraph"/>
+        <w:numPr>
+          <w:ilvl w:val="0"/>
+          <w:numId w:val="1"/>
+        </w:numPr>
+      </w:pPr>
+      <w:r>
+        <w:t>De las distintas etapas definidas en este proyecto, los elementos clave que permiten la ejecución exitosa son:</w:t>
+      </w:r>
+    </w:p>
+    <w:p>
+      <w:pPr>
+        <w:pStyle w:val="ListParagraph"/>
+        <w:numPr>
+          <w:ilvl w:val="1"/>
+          <w:numId w:val="1"/>
+        </w:numPr>
+      </w:pPr>
+      <w:r>
+        <w:lastRenderedPageBreak/>
+        <w:t xml:space="preserve">Modificación y generación de nueva libreta de experimentación: </w:t>
+      </w:r>
+      <w:r>
+        <w:rPr>
+          <w:i/>
+          <w:iCs/>
+        </w:rPr>
+        <w:t>MD01_Experimentacion.ipynb</w:t>
+      </w:r>
+      <w:r>
+        <w:rPr>
+          <w:i/>
+          <w:iCs/>
+        </w:rPr>
+        <w:t xml:space="preserve"> </w:t>
+      </w:r>
+      <w:r>
+        <w:t>y</w:t>
+      </w:r>
+      <w:r>
+        <w:t xml:space="preserve"> </w:t>
+      </w:r>
+      <w:r>
+        <w:rPr>
+          <w:i/>
+          <w:iCs/>
+        </w:rPr>
+        <w:t>MD01_Experimentacion_MLFlow.ipynb</w:t>
+      </w:r>
+    </w:p>
+    <w:p>
+      <w:pPr>
+        <w:pStyle w:val="ListParagraph"/>
+        <w:numPr>
+          <w:ilvl w:val="1"/>
+          <w:numId w:val="1"/>
+        </w:numPr>
+      </w:pPr>
+      <w:r>
+        <w:t xml:space="preserve">scripts de tratamiento de datos y entrenamiento: </w:t>
+      </w:r>
+      <w:r>
+        <w:rPr>
+          <w:i/>
+          <w:iCs/>
+        </w:rPr>
+        <w:t>data_preprocessing.py</w:t>
+      </w:r>
+      <w:r>
+        <w:t xml:space="preserve">, </w:t>
+      </w:r>
+      <w:r>
+        <w:rPr>
+          <w:i/>
+          <w:iCs/>
+        </w:rPr>
+        <w:t>data_visualization_and_EDA.py</w:t>
+      </w:r>
+      <w:r>
+        <w:t xml:space="preserve"> y </w:t>
+      </w:r>
+      <w:r>
+        <w:rPr>
+          <w:i/>
+          <w:iCs/>
+        </w:rPr>
+        <w:t>train_model.py</w:t>
+      </w:r>
+    </w:p>
+    <w:p>
+      <w:pPr>
+        <w:pStyle w:val="ListParagraph"/>
+        <w:numPr>
+          <w:ilvl w:val="1"/>
+          <w:numId w:val="1"/>
+        </w:numPr>
+        <w:rPr>
+          <w:lang w:val="en-GB"/>
+        </w:rPr>
+      </w:pPr>
+      <w:r>
+        <w:rPr>
+          <w:lang w:val="en-GB"/>
+        </w:rPr>
+        <w:t xml:space="preserve">Test para </w:t>
+      </w:r>
+      <w:proofErr w:type="spellStart"/>
+      <w:r>
+        <w:rPr>
+          <w:lang w:val="en-GB"/>
+        </w:rPr>
+        <w:t>corroborar</w:t>
+      </w:r>
+      <w:proofErr w:type="spellEnd"/>
+      <w:r>
+        <w:rPr>
+          <w:lang w:val="en-GB"/>
+        </w:rPr>
+        <w:t xml:space="preserve"> la </w:t>
+      </w:r>
+      <w:proofErr w:type="spellStart"/>
+      <w:r>
+        <w:rPr>
+          <w:lang w:val="en-GB"/>
+        </w:rPr>
+        <w:t>correcta</w:t>
+      </w:r>
+      <w:proofErr w:type="spellEnd"/>
+      <w:r>
+        <w:rPr>
+          <w:lang w:val="en-GB"/>
+        </w:rPr>
+        <w:t xml:space="preserve"> </w:t>
+      </w:r>
+      <w:proofErr w:type="spellStart"/>
+      <w:r>
+        <w:rPr>
+          <w:lang w:val="en-GB"/>
+        </w:rPr>
+        <w:t>ejecución</w:t>
+      </w:r>
+      <w:proofErr w:type="spellEnd"/>
+      <w:r>
+        <w:rPr>
+          <w:lang w:val="en-GB"/>
+        </w:rPr>
+        <w:t xml:space="preserve"> de </w:t>
+      </w:r>
+      <w:proofErr w:type="spellStart"/>
+      <w:r>
+        <w:rPr>
+          <w:lang w:val="en-GB"/>
+        </w:rPr>
+        <w:t>cada</w:t>
+      </w:r>
+      <w:proofErr w:type="spellEnd"/>
+      <w:r>
+        <w:rPr>
+          <w:lang w:val="en-GB"/>
+        </w:rPr>
+        <w:t xml:space="preserve"> script: </w:t>
+      </w:r>
+      <w:r>
+        <w:rPr>
+          <w:i/>
+          <w:iCs/>
+          <w:lang w:val="en-GB"/>
+        </w:rPr>
+        <w:t>test_dataquality.py</w:t>
+      </w:r>
+      <w:r>
+        <w:rPr>
+          <w:lang w:val="en-GB"/>
+        </w:rPr>
+        <w:t xml:space="preserve">, </w:t>
+      </w:r>
+      <w:r>
+        <w:rPr>
+          <w:i/>
+          <w:iCs/>
+          <w:lang w:val="en-GB"/>
+        </w:rPr>
+        <w:t>test_data_gx.py</w:t>
+      </w:r>
+      <w:r>
+        <w:rPr>
+          <w:lang w:val="en-GB"/>
+        </w:rPr>
+        <w:t xml:space="preserve">, </w:t>
+      </w:r>
+      <w:r>
+        <w:rPr>
+          <w:i/>
+          <w:iCs/>
+          <w:lang w:val="en-GB"/>
+        </w:rPr>
+        <w:t>test_training.</w:t>
+      </w:r>
+      <w:r>
+        <w:rPr>
+          <w:i/>
+          <w:iCs/>
+          <w:lang w:val="en-GB"/>
+        </w:rPr>
+        <w:t>py</w:t>
+      </w:r>
+      <w:r>
+        <w:rPr>
+          <w:lang w:val="en-GB"/>
+        </w:rPr>
+        <w:t>.</w:t>
+      </w:r>
+    </w:p>
+    <w:p>
+      <w:pPr>
+        <w:pStyle w:val="ListParagraph"/>
+        <w:numPr>
+          <w:ilvl w:val="1"/>
+          <w:numId w:val="1"/>
+        </w:numPr>
+      </w:pPr>
+      <w:r>
+        <w:t xml:space="preserve">Scripts que permiten mantener un servicio web de despliegue: </w:t>
+      </w:r>
+      <w:r>
+        <w:rPr>
+          <w:i/>
+          <w:iCs/>
+        </w:rPr>
+        <w:t>main.py</w:t>
+      </w:r>
+      <w:r>
+        <w:t xml:space="preserve"> y </w:t>
+      </w:r>
+      <w:r>
+        <w:rPr>
+          <w:i/>
+          <w:iCs/>
+        </w:rPr>
+        <w:t>ui.py</w:t>
+      </w:r>
+    </w:p>
+    <w:p>
+      <w:pPr>
+        <w:pStyle w:val="ListParagraph"/>
+        <w:numPr>
+          <w:ilvl w:val="0"/>
+          <w:numId w:val="1"/>
+        </w:numPr>
+      </w:pPr>
+      <w:r>
+        <w:t>De los archivos del punto anterior, se generan los siguientes productos:</w:t>
+      </w:r>
+    </w:p>
+    <w:p>
+      <w:pPr>
+        <w:pStyle w:val="ListParagraph"/>
+        <w:numPr>
+          <w:ilvl w:val="1"/>
+          <w:numId w:val="1"/>
+        </w:numPr>
+      </w:pPr>
+      <w:r>
+        <w:t xml:space="preserve">Gráficos sobre la exploración de datos en </w:t>
+      </w:r>
+      <w:proofErr w:type="spellStart"/>
+      <w:r>
+        <w:rPr>
+          <w:i/>
+          <w:iCs/>
+        </w:rPr>
+        <w:t>docs</w:t>
+      </w:r>
+      <w:proofErr w:type="spellEnd"/>
+      <w:r>
+        <w:rPr>
+          <w:i/>
+          <w:iCs/>
+        </w:rPr>
+        <w:t>/figures</w:t>
+      </w:r>
+    </w:p>
+    <w:p>
+      <w:pPr>
+        <w:pStyle w:val="ListParagraph"/>
+        <w:numPr>
+          <w:ilvl w:val="1"/>
+          <w:numId w:val="1"/>
+        </w:numPr>
+      </w:pPr>
+      <w:r>
+        <w:t xml:space="preserve">Reporte EDA en </w:t>
+      </w:r>
+      <w:proofErr w:type="spellStart"/>
+      <w:r>
+        <w:rPr>
+          <w:i/>
+          <w:iCs/>
+        </w:rPr>
+        <w:t>docs</w:t>
+      </w:r>
+      <w:proofErr w:type="spellEnd"/>
+      <w:r>
+        <w:rPr>
+          <w:i/>
+          <w:iCs/>
+        </w:rPr>
+        <w:t>/</w:t>
+      </w:r>
+      <w:proofErr w:type="spellStart"/>
+      <w:r>
+        <w:rPr>
+          <w:i/>
+          <w:iCs/>
+        </w:rPr>
+        <w:t>reports</w:t>
+      </w:r>
+      <w:proofErr w:type="spellEnd"/>
+    </w:p>
+    <w:p>
+      <w:pPr>
+        <w:pStyle w:val="ListParagraph"/>
+        <w:numPr>
+          <w:ilvl w:val="1"/>
+          <w:numId w:val="1"/>
+        </w:numPr>
+      </w:pPr>
+      <w:r>
+        <w:t xml:space="preserve">Reporte de los </w:t>
+      </w:r>
+      <w:proofErr w:type="spellStart"/>
+      <w:r>
+        <w:t>tests</w:t>
+      </w:r>
+      <w:proofErr w:type="spellEnd"/>
+      <w:r>
+        <w:t xml:space="preserve"> en </w:t>
+      </w:r>
+      <w:proofErr w:type="spellStart"/>
+      <w:r>
+        <w:rPr>
+          <w:i/>
+          <w:iCs/>
+        </w:rPr>
+        <w:t>docs</w:t>
+      </w:r>
+      <w:proofErr w:type="spellEnd"/>
+      <w:r>
+        <w:rPr>
+          <w:i/>
+          <w:iCs/>
+        </w:rPr>
+        <w:t>/</w:t>
+      </w:r>
+      <w:proofErr w:type="spellStart"/>
+      <w:r>
+        <w:rPr>
+          <w:i/>
+          <w:iCs/>
+        </w:rPr>
+        <w:t>test_results</w:t>
+      </w:r>
+      <w:proofErr w:type="spellEnd"/>
+    </w:p>
+    <w:p>
+      <w:pPr>
+        <w:pStyle w:val="ListParagraph"/>
+        <w:numPr>
+          <w:ilvl w:val="1"/>
+          <w:numId w:val="1"/>
+        </w:numPr>
+      </w:pPr>
+      <w:r>
+        <w:t xml:space="preserve">Un listado de las transformaciones de preprocesado llamado </w:t>
+      </w:r>
+      <w:r>
+        <w:rPr>
+          <w:i/>
+          <w:iCs/>
+        </w:rPr>
+        <w:t>transformaciones_dataset.md</w:t>
+      </w:r>
+      <w:r>
+        <w:t xml:space="preserve"> en </w:t>
+      </w:r>
+      <w:proofErr w:type="spellStart"/>
+      <w:r>
+        <w:rPr>
+          <w:i/>
+          <w:iCs/>
+        </w:rPr>
+        <w:t>docs</w:t>
+      </w:r>
+      <w:proofErr w:type="spellEnd"/>
+      <w:r>
+        <w:rPr>
+          <w:i/>
+          <w:iCs/>
+        </w:rPr>
+        <w:t>/</w:t>
+      </w:r>
+    </w:p>
+    <w:p>
+      <w:pPr>
+        <w:pStyle w:val="ListParagraph"/>
+        <w:numPr>
+          <w:ilvl w:val="1"/>
+          <w:numId w:val="1"/>
+        </w:numPr>
+        <w:rPr>
+          <w:i/>
+          <w:iCs/>
+          <w:lang w:val="en-GB"/>
+        </w:rPr>
+      </w:pPr>
+      <w:r>
+        <w:rPr>
+          <w:lang w:val="en-GB"/>
+        </w:rPr>
+        <w:t xml:space="preserve">El dataset </w:t>
+      </w:r>
+      <w:proofErr w:type="spellStart"/>
+      <w:r>
+        <w:rPr>
+          <w:lang w:val="en-GB"/>
+        </w:rPr>
+        <w:t>preprocesado</w:t>
+      </w:r>
+      <w:proofErr w:type="spellEnd"/>
+      <w:r>
+        <w:rPr>
+          <w:lang w:val="en-GB"/>
+        </w:rPr>
+        <w:t xml:space="preserve"> </w:t>
+      </w:r>
+      <w:proofErr w:type="spellStart"/>
+      <w:r>
+        <w:rPr>
+          <w:lang w:val="en-GB"/>
+        </w:rPr>
+        <w:t>en</w:t>
+      </w:r>
+      <w:proofErr w:type="spellEnd"/>
+      <w:r>
+        <w:rPr>
+          <w:lang w:val="en-GB"/>
+        </w:rPr>
+        <w:t xml:space="preserve"> </w:t>
+      </w:r>
+      <w:r>
+        <w:rPr>
+          <w:i/>
+          <w:iCs/>
+          <w:lang w:val="en-GB"/>
+        </w:rPr>
+        <w:t>data/processed</w:t>
+      </w:r>
+      <w:r>
+        <w:rPr>
+          <w:lang w:val="en-GB"/>
+        </w:rPr>
+        <w:t xml:space="preserve"> </w:t>
+      </w:r>
+      <w:proofErr w:type="spellStart"/>
+      <w:r>
+        <w:rPr>
+          <w:lang w:val="en-GB"/>
+        </w:rPr>
+        <w:t>como</w:t>
+      </w:r>
+      <w:proofErr w:type="spellEnd"/>
+      <w:r>
+        <w:rPr>
+          <w:lang w:val="en-GB"/>
+        </w:rPr>
+        <w:t xml:space="preserve"> </w:t>
+      </w:r>
+      <w:r>
+        <w:rPr>
+          <w:i/>
+          <w:iCs/>
+          <w:lang w:val="en-GB"/>
+        </w:rPr>
+        <w:t>bank-additional-full_preprocessed.csv</w:t>
+      </w:r>
+    </w:p>
+    <w:p>
+      <w:pPr>
+        <w:pStyle w:val="ListParagraph"/>
+        <w:numPr>
+          <w:ilvl w:val="1"/>
+          <w:numId w:val="1"/>
+        </w:numPr>
+        <w:rPr>
+          <w:i/>
+          <w:iCs/>
+        </w:rPr>
+      </w:pPr>
+      <w:r>
+        <w:t>El modelo y su p</w:t>
+      </w:r>
+      <w:r>
+        <w:t xml:space="preserve">reprocesador para producción llamados </w:t>
+      </w:r>
+      <w:proofErr w:type="spellStart"/>
+      <w:r>
+        <w:rPr>
+          <w:i/>
+          <w:iCs/>
+        </w:rPr>
+        <w:t>decisión_tree_model.pkl</w:t>
+      </w:r>
+      <w:proofErr w:type="spellEnd"/>
+      <w:r>
+        <w:t xml:space="preserve"> y </w:t>
+      </w:r>
+      <w:proofErr w:type="spellStart"/>
+      <w:r>
+        <w:rPr>
+          <w:i/>
+          <w:iCs/>
+        </w:rPr>
+        <w:t>preprocessor.pkl</w:t>
+      </w:r>
+      <w:proofErr w:type="spellEnd"/>
+      <w:r>
+        <w:t xml:space="preserve"> en </w:t>
+      </w:r>
+      <w:proofErr w:type="spellStart"/>
+      <w:r>
+        <w:rPr>
+          <w:i/>
+          <w:iCs/>
+        </w:rPr>
+        <w:t>models</w:t>
+      </w:r>
+      <w:proofErr w:type="spellEnd"/>
+      <w:r>
+        <w:rPr>
+          <w:i/>
+          <w:iCs/>
+        </w:rPr>
+        <w:t>/</w:t>
+      </w:r>
+    </w:p>
+    <w:p>
+      <w:pPr>
+        <w:pStyle w:val="ListParagraph"/>
+        <w:numPr>
+          <w:ilvl w:val="1"/>
+          <w:numId w:val="1"/>
+        </w:numPr>
+      </w:pPr>
+      <w:r>
+        <w:t xml:space="preserve">Las métricas del modelo </w:t>
+      </w:r>
+      <w:proofErr w:type="spellStart"/>
+      <w:r>
+        <w:rPr>
+          <w:i/>
+          <w:iCs/>
+        </w:rPr>
+        <w:t>model_</w:t>
+      </w:r>
+      <w:proofErr w:type="gramStart"/>
+      <w:r>
+        <w:rPr>
+          <w:i/>
+          <w:iCs/>
+        </w:rPr>
+        <w:t>metrics.json</w:t>
+      </w:r>
+      <w:proofErr w:type="spellEnd"/>
+      <w:proofErr w:type="gramEnd"/>
+      <w:r>
+        <w:t xml:space="preserve"> en </w:t>
+      </w:r>
+      <w:proofErr w:type="spellStart"/>
+      <w:r>
+        <w:rPr>
+          <w:i/>
+          <w:iCs/>
+        </w:rPr>
+        <w:t>metrics</w:t>
+      </w:r>
+      <w:proofErr w:type="spellEnd"/>
+      <w:r>
+        <w:rPr>
+          <w:i/>
+          <w:iCs/>
+        </w:rPr>
+        <w:t>/</w:t>
+      </w:r>
+    </w:p>
+    <w:p>
+      <w:pPr>
+        <w:pStyle w:val="ListParagraph"/>
+        <w:numPr>
+          <w:ilvl w:val="0"/>
+          <w:numId w:val="1"/>
+        </w:numPr>
+        <w:rPr>
+          <w:i/>
+          <w:iCs/>
+        </w:rPr>
+      </w:pPr>
+      <w:r>
+        <w:t>Un servicio web básico como despliegue de la aplicación desarrollada.</w:t>
+      </w:r>
+    </w:p>
+    <w:p>
+      <w:pPr>
+        <w:pStyle w:val="ListParagraph"/>
+        <w:numPr>
+          <w:ilvl w:val="0"/>
+          <w:numId w:val="1"/>
+        </w:numPr>
+        <w:rPr>
+          <w:i/>
+          <w:iCs/>
+        </w:rPr>
+      </w:pPr>
+      <w:r>
+        <w:t>La memoria del trabajo que es, precisamente, este documento.</w:t>
+      </w:r>
+    </w:p>
+    <w:p>
+      <w:r>
+        <w:t>Como cuestiones a revisar para una siguiente iteración se mencionan:</w:t>
+      </w:r>
+    </w:p>
+    <w:p>
+      <w:pPr>
+        <w:pStyle w:val="ListParagraph"/>
+        <w:numPr>
+          <w:ilvl w:val="0"/>
+          <w:numId w:val="1"/>
+        </w:numPr>
+      </w:pPr>
+      <w:r>
+        <w:t xml:space="preserve">Una guía de actuación para el trabajo colaborativo en el repositorio de </w:t>
+      </w:r>
+      <w:proofErr w:type="spellStart"/>
+      <w:r>
+        <w:t>Github</w:t>
+      </w:r>
+      <w:proofErr w:type="spellEnd"/>
+      <w:r>
+        <w:t xml:space="preserve">, que permita trabajar en ramas y mantener solo </w:t>
+      </w:r>
+      <w:proofErr w:type="spellStart"/>
+      <w:r>
+        <w:t>main</w:t>
+      </w:r>
+      <w:proofErr w:type="spellEnd"/>
+      <w:r>
+        <w:t xml:space="preserve"> como la rama de producción.</w:t>
+      </w:r>
+    </w:p>
+    <w:p>
+      <w:pPr>
+        <w:pStyle w:val="ListParagraph"/>
+        <w:numPr>
+          <w:ilvl w:val="0"/>
+          <w:numId w:val="1"/>
+        </w:numPr>
         <w:rPr>
           <w:rFonts w:eastAsiaTheme="minorEastAsia"/>
-          <w:highlight w:val="yellow"/>
         </w:rPr>
       </w:pPr>
       <w:r>
         <w:rPr>
           <w:rFonts w:eastAsiaTheme="minorEastAsia"/>
-          <w:highlight w:val="yellow"/>
-        </w:rPr>
-        <w:t xml:space="preserve">[Agregar: </w:t>
-      </w:r>
-      <w:proofErr w:type="spellStart"/>
-      <w:r>
+        </w:rPr>
+        <w:t>La generación de un archivo que funcione a nivel de “inventario” que describa los documentos del proyecto, quién es responsable de ellos y con qué herramientas se relaciona.</w:t>
+      </w:r>
+    </w:p>
+    <w:p>
+      <w:pPr>
+        <w:pStyle w:val="ListParagraph"/>
+        <w:numPr>
+          <w:ilvl w:val="0"/>
+          <w:numId w:val="1"/>
+        </w:numPr>
         <w:rPr>
           <w:rFonts w:eastAsiaTheme="minorEastAsia"/>
-          <w:highlight w:val="yellow"/>
-        </w:rPr>
-        <w:t>Items</w:t>
-      </w:r>
-      <w:proofErr w:type="spellEnd"/>
+        </w:rPr>
+      </w:pPr>
       <w:r>
         <w:rPr>
           <w:rFonts w:eastAsiaTheme="minorEastAsia"/>
-          <w:highlight w:val="yellow"/>
-        </w:rPr>
-        <w:t xml:space="preserve"> desarrollados en el proyecto en estas dos iteraciones]</w:t>
+        </w:rPr>
+        <w:t>Revisiones de código basados en estándares como PEP para asegurar la calidad del trabajo realizado</w:t>
+      </w:r>
+    </w:p>
+    <w:p>
+      <w:pPr>
+        <w:pStyle w:val="ListParagraph"/>
+        <w:numPr>
+          <w:ilvl w:val="0"/>
+          <w:numId w:val="1"/>
+        </w:numPr>
+        <w:rPr>
+          <w:rFonts w:eastAsiaTheme="minorEastAsia"/>
+        </w:rPr>
+      </w:pPr>
+      <w:r>
+        <w:rPr>
+          <w:rFonts w:eastAsiaTheme="minorEastAsia"/>
+        </w:rPr>
+        <w:t>El establecimiento de reuniones para seguimiento del trabajo y las expectativas de cada sprint. Además, se deben generar minutas por trazabilidad.</w:t>
+      </w:r>
+    </w:p>
+    <w:p>
+      <w:pPr>
+        <w:pStyle w:val="ListParagraph"/>
+        <w:numPr>
+          <w:ilvl w:val="0"/>
+          <w:numId w:val="1"/>
+        </w:numPr>
+        <w:rPr>
+          <w:rFonts w:eastAsiaTheme="minorEastAsia"/>
+        </w:rPr>
+      </w:pPr>
+      <w:r>
+        <w:rPr>
+          <w:rFonts w:eastAsiaTheme="minorEastAsia"/>
+        </w:rPr>
+        <w:t xml:space="preserve">Una reunión de retrospectiva que permita realizar una mejora continua sobre </w:t>
+      </w:r>
+      <w:r>
+        <w:rPr>
+          <w:rFonts w:eastAsiaTheme="minorEastAsia"/>
+        </w:rPr>
+        <w:t>la forma de trabajar para aumentar la eficiencia del proceso.</w:t>
+      </w:r>
+    </w:p>
+    <w:p>
+      <w:pPr>
+        <w:pStyle w:val="ListParagraph"/>
+        <w:numPr>
+          <w:ilvl w:val="0"/>
+          <w:numId w:val="1"/>
+        </w:numPr>
+        <w:rPr>
+          <w:rFonts w:eastAsiaTheme="minorEastAsia"/>
+        </w:rPr>
+      </w:pPr>
+      <w:r>
+        <w:rPr>
+          <w:rFonts w:eastAsiaTheme="minorEastAsia"/>
+        </w:rPr>
+        <w:t xml:space="preserve">La definición formal de </w:t>
+      </w:r>
+      <w:proofErr w:type="spellStart"/>
+      <w:r>
+        <w:rPr>
+          <w:rFonts w:eastAsiaTheme="minorEastAsia"/>
+        </w:rPr>
+        <w:t>tests</w:t>
+      </w:r>
+      <w:proofErr w:type="spellEnd"/>
+      <w:r>
+        <w:rPr>
+          <w:rFonts w:eastAsiaTheme="minorEastAsia"/>
+        </w:rPr>
+        <w:t xml:space="preserve"> sobre los archivos programáticos, distinguiendo su nivel de criticidad, funcionalidad y cobertura de código.</w:t>
+      </w:r>
+    </w:p>
+    <w:p>
+      <w:pPr>
+        <w:pStyle w:val="ListParagraph"/>
+        <w:numPr>
+          <w:ilvl w:val="0"/>
+          <w:numId w:val="1"/>
+        </w:numPr>
+        <w:rPr>
+          <w:rFonts w:eastAsiaTheme="minorEastAsia"/>
+        </w:rPr>
+      </w:pPr>
+      <w:r>
+        <w:rPr>
+          <w:rFonts w:eastAsiaTheme="minorEastAsia"/>
+        </w:rPr>
+        <w:t xml:space="preserve">La separación de repositorios entre la aplicación que sirve como servicio web y la parte más pura de la ciencia de datos. El repositorio de la aplicación deberá estar incluido dentro del repositorio general. </w:t>
+      </w:r>
+    </w:p>
+    <w:p>
+      <w:pPr>
+        <w:pStyle w:val="ListParagraph"/>
+        <w:numPr>
+          <w:ilvl w:val="0"/>
+          <w:numId w:val="1"/>
+        </w:numPr>
+        <w:rPr>
+          <w:rFonts w:eastAsiaTheme="minorEastAsia"/>
+        </w:rPr>
+      </w:pPr>
+      <w:r>
+        <w:rPr>
+          <w:rFonts w:eastAsiaTheme="minorEastAsia"/>
+        </w:rPr>
+        <w:t>Añadir un sistema de integración continua como Jenkins para verificar que la aplicación se construye y ejecuta correctamente previo a cualquier cambio en el código de producción.</w:t>
+      </w:r>
+    </w:p>
+    <w:p>
+      <w:pPr>
+        <w:pStyle w:val="ListParagraph"/>
+        <w:numPr>
+          <w:ilvl w:val="0"/>
+          <w:numId w:val="1"/>
+        </w:numPr>
+        <w:rPr>
+          <w:rFonts w:eastAsiaTheme="minorEastAsia"/>
+        </w:rPr>
+      </w:pPr>
+      <w:r>
+        <w:rPr>
+          <w:rFonts w:eastAsiaTheme="minorEastAsia"/>
+        </w:rPr>
+        <w:t>La exclusión de los datos en el repositorio para incluirlos en una plataforma destinada al guardado y gestión de los datos, como por ejemplo MongoDB.</w:t>
+      </w:r>
+    </w:p>
+    <w:p>
+      <w:pPr>
+        <w:pStyle w:val="ListParagraph"/>
+        <w:numPr>
+          <w:ilvl w:val="0"/>
+          <w:numId w:val="1"/>
+        </w:numPr>
+        <w:rPr>
+          <w:rFonts w:eastAsiaTheme="minorEastAsia"/>
+        </w:rPr>
+      </w:pPr>
+      <w:r>
+        <w:rPr>
+          <w:rFonts w:eastAsiaTheme="minorEastAsia"/>
+        </w:rPr>
+        <w:t xml:space="preserve">Añadir un sistema de búsqueda de </w:t>
+      </w:r>
+      <w:proofErr w:type="spellStart"/>
+      <w:r>
+        <w:rPr>
+          <w:rFonts w:eastAsiaTheme="minorEastAsia"/>
+        </w:rPr>
+        <w:t>hiperparámetros</w:t>
+      </w:r>
+      <w:proofErr w:type="spellEnd"/>
+      <w:r>
+        <w:rPr>
+          <w:rFonts w:eastAsiaTheme="minorEastAsia"/>
+        </w:rPr>
+        <w:t xml:space="preserve"> para optimizar el rendimiento del modelo.</w:t>
+      </w:r>
+    </w:p>
+    <w:p>
+      <w:pPr>
+        <w:pStyle w:val="ListParagraph"/>
+        <w:numPr>
+          <w:ilvl w:val="0"/>
+          <w:numId w:val="1"/>
+        </w:numPr>
+        <w:rPr>
+          <w:rFonts w:eastAsiaTheme="minorEastAsia"/>
+        </w:rPr>
+      </w:pPr>
+      <w:r>
+        <w:rPr>
+          <w:rFonts w:eastAsiaTheme="minorEastAsia"/>
+        </w:rPr>
+        <w:t xml:space="preserve">Mejorar </w:t>
+      </w:r>
+      <w:proofErr w:type="gramStart"/>
+      <w:r>
+        <w:rPr>
+          <w:rFonts w:eastAsiaTheme="minorEastAsia"/>
+        </w:rPr>
+        <w:t>el test</w:t>
+      </w:r>
+      <w:proofErr w:type="gramEnd"/>
+      <w:r>
+        <w:rPr>
+          <w:rFonts w:eastAsiaTheme="minorEastAsia"/>
+        </w:rPr>
+        <w:t xml:space="preserve"> de regresión, de manera que solo falle cuando el rendimiento empeora.</w:t>
+      </w:r>
+    </w:p>
+    <w:p>
+      <w:pPr>
+        <w:pStyle w:val="ListParagraph"/>
+        <w:numPr>
+          <w:ilvl w:val="0"/>
+          <w:numId w:val="1"/>
+        </w:numPr>
+        <w:rPr>
+          <w:rFonts w:eastAsiaTheme="minorEastAsia"/>
+        </w:rPr>
+      </w:pPr>
+      <w:r>
+        <w:rPr>
+          <w:rFonts w:eastAsiaTheme="minorEastAsia"/>
+        </w:rPr>
+        <w:t>Añadir la funcionalidad de entrenamiento automatizado, haciendo que el sistema ante la alerta de nuevos datos en el banco de datos pueda realizar todas las pruebas.</w:t>
+      </w:r>
+    </w:p>
+    <w:p>
+      <w:pPr>
+        <w:pStyle w:val="ListParagraph"/>
+        <w:numPr>
+          <w:ilvl w:val="0"/>
+          <w:numId w:val="1"/>
+        </w:numPr>
+        <w:rPr>
+          <w:rFonts w:eastAsiaTheme="minorEastAsia"/>
+        </w:rPr>
+      </w:pPr>
+      <w:r>
+        <w:rPr>
+          <w:rFonts w:eastAsiaTheme="minorEastAsia"/>
+        </w:rPr>
+        <w:lastRenderedPageBreak/>
+        <w:t xml:space="preserve">Generar un </w:t>
+      </w:r>
+      <w:proofErr w:type="spellStart"/>
+      <w:r>
+        <w:rPr>
+          <w:rFonts w:eastAsiaTheme="minorEastAsia"/>
+        </w:rPr>
+        <w:t>dashboard</w:t>
+      </w:r>
+      <w:proofErr w:type="spellEnd"/>
+      <w:r>
+        <w:rPr>
+          <w:rFonts w:eastAsiaTheme="minorEastAsia"/>
+        </w:rPr>
+        <w:t xml:space="preserve"> que permita monitorear la evolución del rendimiento del algoritmo.</w:t>
+      </w:r>
+    </w:p>
+    <w:p>
+      <w:pPr>
+        <w:pStyle w:val="ListParagraph"/>
+        <w:numPr>
+          <w:ilvl w:val="0"/>
+          <w:numId w:val="1"/>
+        </w:numPr>
+        <w:rPr>
+          <w:rFonts w:eastAsiaTheme="minorEastAsia"/>
+        </w:rPr>
+      </w:pPr>
+      <w:r>
+        <w:rPr>
+          <w:rFonts w:eastAsiaTheme="minorEastAsia"/>
+        </w:rPr>
+        <w:t>Generar una línea cronológica de actuación de alto nivel sobre el proyecto, que permita tener una idea generalizada del trabajo pendiente.</w:t>
+      </w:r>
+    </w:p>
+    <w:p>
+      <w:pPr>
+        <w:pStyle w:val="ListParagraph"/>
+        <w:numPr>
+          <w:ilvl w:val="0"/>
+          <w:numId w:val="1"/>
+        </w:numPr>
+        <w:rPr>
+          <w:rFonts w:eastAsiaTheme="minorEastAsia"/>
+        </w:rPr>
+      </w:pPr>
+      <w:r>
+        <w:rPr>
+          <w:rFonts w:eastAsiaTheme="minorEastAsia"/>
+        </w:rPr>
+        <w:t>Etc.</w:t>
+      </w:r>
+    </w:p>
+    <w:p>
+      <w:pPr>
+        <w:rPr>
+          <w:rFonts w:eastAsiaTheme="minorEastAsia"/>
+        </w:rPr>
+      </w:pPr>
+      <w:r>
+        <w:rPr>
+          <w:rFonts w:eastAsiaTheme="minorEastAsia"/>
+        </w:rPr>
+        <w:t>A pesar de la larga lista, el proyecto se encuentra en un estado inicial y se podrían añadir más tareas que quedarían para otras iteraciones futuras.</w:t>
       </w:r>
     </w:p>
     <w:p>
@@ -9151,11 +11143,13 @@
       </w:r>
     </w:p>
     <w:sectPr>
-      <w:headerReference w:type="default" r:id="rId29"/>
-      <w:footerReference w:type="default" r:id="rId30"/>
+      <w:headerReference w:type="default" r:id="rId30"/>
+      <w:footerReference w:type="default" r:id="rId31"/>
       <w:pgSz w:w="11906" w:h="16838"/>
       <w:pgMar w:top="1440" w:right="1440" w:bottom="1440" w:left="1440" w:header="720" w:footer="720" w:gutter="0"/>
+      <w:pgNumType w:start="0"/>
       <w:cols w:space="720"/>
+      <w:titlePg/>
       <w:docGrid w:linePitch="360"/>
     </w:sectPr>
   </w:body>
@@ -9741,6 +11735,119 @@
     </w:lvl>
   </w:abstractNum>
   <w:abstractNum w:abstractNumId="3" w15:restartNumberingAfterBreak="0">
+    <w:nsid w:val="171664AB"/>
+    <w:multiLevelType w:val="hybridMultilevel"/>
+    <w:tmpl w:val="A606C758"/>
+    <w:lvl w:ilvl="0" w:tplc="CA64E138">
+      <w:start w:val="1"/>
+      <w:numFmt w:val="bullet"/>
+      <w:lvlText w:val="o"/>
+      <w:lvlJc w:val="left"/>
+      <w:pPr>
+        <w:ind w:left="1080" w:hanging="360"/>
+      </w:pPr>
+      <w:rPr>
+        <w:rFonts w:ascii="Courier New" w:hAnsi="Courier New" w:hint="default"/>
+      </w:rPr>
+    </w:lvl>
+    <w:lvl w:ilvl="1" w:tplc="08090003" w:tentative="1">
+      <w:start w:val="1"/>
+      <w:numFmt w:val="bullet"/>
+      <w:lvlText w:val="o"/>
+      <w:lvlJc w:val="left"/>
+      <w:pPr>
+        <w:ind w:left="1080" w:hanging="360"/>
+      </w:pPr>
+      <w:rPr>
+        <w:rFonts w:ascii="Courier New" w:hAnsi="Courier New" w:cs="Courier New" w:hint="default"/>
+      </w:rPr>
+    </w:lvl>
+    <w:lvl w:ilvl="2" w:tplc="08090005" w:tentative="1">
+      <w:start w:val="1"/>
+      <w:numFmt w:val="bullet"/>
+      <w:lvlText w:val=""/>
+      <w:lvlJc w:val="left"/>
+      <w:pPr>
+        <w:ind w:left="1800" w:hanging="360"/>
+      </w:pPr>
+      <w:rPr>
+        <w:rFonts w:ascii="Wingdings" w:hAnsi="Wingdings" w:hint="default"/>
+      </w:rPr>
+    </w:lvl>
+    <w:lvl w:ilvl="3" w:tplc="08090001" w:tentative="1">
+      <w:start w:val="1"/>
+      <w:numFmt w:val="bullet"/>
+      <w:lvlText w:val=""/>
+      <w:lvlJc w:val="left"/>
+      <w:pPr>
+        <w:ind w:left="2520" w:hanging="360"/>
+      </w:pPr>
+      <w:rPr>
+        <w:rFonts w:ascii="Symbol" w:hAnsi="Symbol" w:hint="default"/>
+      </w:rPr>
+    </w:lvl>
+    <w:lvl w:ilvl="4" w:tplc="08090003" w:tentative="1">
+      <w:start w:val="1"/>
+      <w:numFmt w:val="bullet"/>
+      <w:lvlText w:val="o"/>
+      <w:lvlJc w:val="left"/>
+      <w:pPr>
+        <w:ind w:left="3240" w:hanging="360"/>
+      </w:pPr>
+      <w:rPr>
+        <w:rFonts w:ascii="Courier New" w:hAnsi="Courier New" w:cs="Courier New" w:hint="default"/>
+      </w:rPr>
+    </w:lvl>
+    <w:lvl w:ilvl="5" w:tplc="08090005" w:tentative="1">
+      <w:start w:val="1"/>
+      <w:numFmt w:val="bullet"/>
+      <w:lvlText w:val=""/>
+      <w:lvlJc w:val="left"/>
+      <w:pPr>
+        <w:ind w:left="3960" w:hanging="360"/>
+      </w:pPr>
+      <w:rPr>
+        <w:rFonts w:ascii="Wingdings" w:hAnsi="Wingdings" w:hint="default"/>
+      </w:rPr>
+    </w:lvl>
+    <w:lvl w:ilvl="6" w:tplc="08090001" w:tentative="1">
+      <w:start w:val="1"/>
+      <w:numFmt w:val="bullet"/>
+      <w:lvlText w:val=""/>
+      <w:lvlJc w:val="left"/>
+      <w:pPr>
+        <w:ind w:left="4680" w:hanging="360"/>
+      </w:pPr>
+      <w:rPr>
+        <w:rFonts w:ascii="Symbol" w:hAnsi="Symbol" w:hint="default"/>
+      </w:rPr>
+    </w:lvl>
+    <w:lvl w:ilvl="7" w:tplc="08090003" w:tentative="1">
+      <w:start w:val="1"/>
+      <w:numFmt w:val="bullet"/>
+      <w:lvlText w:val="o"/>
+      <w:lvlJc w:val="left"/>
+      <w:pPr>
+        <w:ind w:left="5400" w:hanging="360"/>
+      </w:pPr>
+      <w:rPr>
+        <w:rFonts w:ascii="Courier New" w:hAnsi="Courier New" w:cs="Courier New" w:hint="default"/>
+      </w:rPr>
+    </w:lvl>
+    <w:lvl w:ilvl="8" w:tplc="08090005" w:tentative="1">
+      <w:start w:val="1"/>
+      <w:numFmt w:val="bullet"/>
+      <w:lvlText w:val=""/>
+      <w:lvlJc w:val="left"/>
+      <w:pPr>
+        <w:ind w:left="6120" w:hanging="360"/>
+      </w:pPr>
+      <w:rPr>
+        <w:rFonts w:ascii="Wingdings" w:hAnsi="Wingdings" w:hint="default"/>
+      </w:rPr>
+    </w:lvl>
+  </w:abstractNum>
+  <w:abstractNum w:abstractNumId="4" w15:restartNumberingAfterBreak="0">
     <w:nsid w:val="1CC56209"/>
     <w:multiLevelType w:val="hybridMultilevel"/>
     <w:tmpl w:val="9C6ED940"/>
@@ -9853,7 +11960,7 @@
       </w:rPr>
     </w:lvl>
   </w:abstractNum>
-  <w:abstractNum w:abstractNumId="4" w15:restartNumberingAfterBreak="0">
+  <w:abstractNum w:abstractNumId="5" w15:restartNumberingAfterBreak="0">
     <w:nsid w:val="1D07F4F5"/>
     <w:multiLevelType w:val="hybridMultilevel"/>
     <w:tmpl w:val="24285866"/>
@@ -9966,7 +12073,7 @@
       </w:rPr>
     </w:lvl>
   </w:abstractNum>
-  <w:abstractNum w:abstractNumId="5" w15:restartNumberingAfterBreak="0">
+  <w:abstractNum w:abstractNumId="6" w15:restartNumberingAfterBreak="0">
     <w:nsid w:val="21BB6ABF"/>
     <w:multiLevelType w:val="hybridMultilevel"/>
     <w:tmpl w:val="BC7C5B76"/>
@@ -10052,7 +12159,7 @@
       </w:pPr>
     </w:lvl>
   </w:abstractNum>
-  <w:abstractNum w:abstractNumId="6" w15:restartNumberingAfterBreak="0">
+  <w:abstractNum w:abstractNumId="7" w15:restartNumberingAfterBreak="0">
     <w:nsid w:val="2327F564"/>
     <w:multiLevelType w:val="hybridMultilevel"/>
     <w:tmpl w:val="C3589BC6"/>
@@ -10165,7 +12272,7 @@
       </w:rPr>
     </w:lvl>
   </w:abstractNum>
-  <w:abstractNum w:abstractNumId="7" w15:restartNumberingAfterBreak="0">
+  <w:abstractNum w:abstractNumId="8" w15:restartNumberingAfterBreak="0">
     <w:nsid w:val="261F86D8"/>
     <w:multiLevelType w:val="hybridMultilevel"/>
     <w:tmpl w:val="C09E09A6"/>
@@ -10278,7 +12385,7 @@
       </w:rPr>
     </w:lvl>
   </w:abstractNum>
-  <w:abstractNum w:abstractNumId="8" w15:restartNumberingAfterBreak="0">
+  <w:abstractNum w:abstractNumId="9" w15:restartNumberingAfterBreak="0">
     <w:nsid w:val="28A4D1D9"/>
     <w:multiLevelType w:val="hybridMultilevel"/>
     <w:tmpl w:val="155EF8F4"/>
@@ -10391,7 +12498,7 @@
       </w:rPr>
     </w:lvl>
   </w:abstractNum>
-  <w:abstractNum w:abstractNumId="9" w15:restartNumberingAfterBreak="0">
+  <w:abstractNum w:abstractNumId="10" w15:restartNumberingAfterBreak="0">
     <w:nsid w:val="2E5E53CC"/>
     <w:multiLevelType w:val="hybridMultilevel"/>
     <w:tmpl w:val="2D825222"/>
@@ -10504,7 +12611,7 @@
       </w:rPr>
     </w:lvl>
   </w:abstractNum>
-  <w:abstractNum w:abstractNumId="10" w15:restartNumberingAfterBreak="0">
+  <w:abstractNum w:abstractNumId="11" w15:restartNumberingAfterBreak="0">
     <w:nsid w:val="3184E913"/>
     <w:multiLevelType w:val="hybridMultilevel"/>
     <w:tmpl w:val="338E386A"/>
@@ -10617,7 +12724,7 @@
       </w:rPr>
     </w:lvl>
   </w:abstractNum>
-  <w:abstractNum w:abstractNumId="11" w15:restartNumberingAfterBreak="0">
+  <w:abstractNum w:abstractNumId="12" w15:restartNumberingAfterBreak="0">
     <w:nsid w:val="321D42BA"/>
     <w:multiLevelType w:val="hybridMultilevel"/>
     <w:tmpl w:val="B114FEA8"/>
@@ -10730,7 +12837,7 @@
       </w:rPr>
     </w:lvl>
   </w:abstractNum>
-  <w:abstractNum w:abstractNumId="12" w15:restartNumberingAfterBreak="0">
+  <w:abstractNum w:abstractNumId="13" w15:restartNumberingAfterBreak="0">
     <w:nsid w:val="3434B219"/>
     <w:multiLevelType w:val="hybridMultilevel"/>
     <w:tmpl w:val="974A63F8"/>
@@ -10843,7 +12950,7 @@
       </w:rPr>
     </w:lvl>
   </w:abstractNum>
-  <w:abstractNum w:abstractNumId="13" w15:restartNumberingAfterBreak="0">
+  <w:abstractNum w:abstractNumId="14" w15:restartNumberingAfterBreak="0">
     <w:nsid w:val="3494348C"/>
     <w:multiLevelType w:val="hybridMultilevel"/>
     <w:tmpl w:val="F04A0268"/>
@@ -10956,7 +13063,7 @@
       </w:rPr>
     </w:lvl>
   </w:abstractNum>
-  <w:abstractNum w:abstractNumId="14" w15:restartNumberingAfterBreak="0">
+  <w:abstractNum w:abstractNumId="15" w15:restartNumberingAfterBreak="0">
     <w:nsid w:val="3532BBF8"/>
     <w:multiLevelType w:val="hybridMultilevel"/>
     <w:tmpl w:val="3F8643AA"/>
@@ -11069,7 +13176,7 @@
       </w:rPr>
     </w:lvl>
   </w:abstractNum>
-  <w:abstractNum w:abstractNumId="15" w15:restartNumberingAfterBreak="0">
+  <w:abstractNum w:abstractNumId="16" w15:restartNumberingAfterBreak="0">
     <w:nsid w:val="362BBAD3"/>
     <w:multiLevelType w:val="hybridMultilevel"/>
     <w:tmpl w:val="96E6A016"/>
@@ -11182,7 +13289,7 @@
       </w:rPr>
     </w:lvl>
   </w:abstractNum>
-  <w:abstractNum w:abstractNumId="16" w15:restartNumberingAfterBreak="0">
+  <w:abstractNum w:abstractNumId="17" w15:restartNumberingAfterBreak="0">
     <w:nsid w:val="3BE57AA5"/>
     <w:multiLevelType w:val="hybridMultilevel"/>
     <w:tmpl w:val="72F8F84A"/>
@@ -11295,7 +13402,7 @@
       </w:rPr>
     </w:lvl>
   </w:abstractNum>
-  <w:abstractNum w:abstractNumId="17" w15:restartNumberingAfterBreak="0">
+  <w:abstractNum w:abstractNumId="18" w15:restartNumberingAfterBreak="0">
     <w:nsid w:val="3E481C8D"/>
     <w:multiLevelType w:val="hybridMultilevel"/>
     <w:tmpl w:val="05A275E8"/>
@@ -11408,7 +13515,7 @@
       </w:rPr>
     </w:lvl>
   </w:abstractNum>
-  <w:abstractNum w:abstractNumId="18" w15:restartNumberingAfterBreak="0">
+  <w:abstractNum w:abstractNumId="19" w15:restartNumberingAfterBreak="0">
     <w:nsid w:val="401F9094"/>
     <w:multiLevelType w:val="hybridMultilevel"/>
     <w:tmpl w:val="02B07A48"/>
@@ -11521,7 +13628,7 @@
       </w:rPr>
     </w:lvl>
   </w:abstractNum>
-  <w:abstractNum w:abstractNumId="19" w15:restartNumberingAfterBreak="0">
+  <w:abstractNum w:abstractNumId="20" w15:restartNumberingAfterBreak="0">
     <w:nsid w:val="40D47964"/>
     <w:multiLevelType w:val="hybridMultilevel"/>
     <w:tmpl w:val="118C6A16"/>
@@ -11634,10 +13741,10 @@
       </w:rPr>
     </w:lvl>
   </w:abstractNum>
-  <w:abstractNum w:abstractNumId="20" w15:restartNumberingAfterBreak="0">
+  <w:abstractNum w:abstractNumId="21" w15:restartNumberingAfterBreak="0">
     <w:nsid w:val="445C95D2"/>
     <w:multiLevelType w:val="hybridMultilevel"/>
-    <w:tmpl w:val="9B0C8686"/>
+    <w:tmpl w:val="439ACD52"/>
     <w:lvl w:ilvl="0" w:tplc="4B66E7E4">
       <w:start w:val="1"/>
       <w:numFmt w:val="bullet"/>
@@ -11747,7 +13854,7 @@
       </w:rPr>
     </w:lvl>
   </w:abstractNum>
-  <w:abstractNum w:abstractNumId="21" w15:restartNumberingAfterBreak="0">
+  <w:abstractNum w:abstractNumId="22" w15:restartNumberingAfterBreak="0">
     <w:nsid w:val="47007C42"/>
     <w:multiLevelType w:val="hybridMultilevel"/>
     <w:tmpl w:val="75443824"/>
@@ -11860,7 +13967,7 @@
       </w:rPr>
     </w:lvl>
   </w:abstractNum>
-  <w:abstractNum w:abstractNumId="22" w15:restartNumberingAfterBreak="0">
+  <w:abstractNum w:abstractNumId="23" w15:restartNumberingAfterBreak="0">
     <w:nsid w:val="4CBEF331"/>
     <w:multiLevelType w:val="hybridMultilevel"/>
     <w:tmpl w:val="629C5D98"/>
@@ -11973,7 +14080,7 @@
       </w:rPr>
     </w:lvl>
   </w:abstractNum>
-  <w:abstractNum w:abstractNumId="23" w15:restartNumberingAfterBreak="0">
+  <w:abstractNum w:abstractNumId="24" w15:restartNumberingAfterBreak="0">
     <w:nsid w:val="4D6D99C5"/>
     <w:multiLevelType w:val="hybridMultilevel"/>
     <w:tmpl w:val="7CD09AAE"/>
@@ -12086,7 +14193,7 @@
       </w:rPr>
     </w:lvl>
   </w:abstractNum>
-  <w:abstractNum w:abstractNumId="24" w15:restartNumberingAfterBreak="0">
+  <w:abstractNum w:abstractNumId="25" w15:restartNumberingAfterBreak="0">
     <w:nsid w:val="57893EEE"/>
     <w:multiLevelType w:val="hybridMultilevel"/>
     <w:tmpl w:val="FBCED5B8"/>
@@ -12199,7 +14306,7 @@
       </w:rPr>
     </w:lvl>
   </w:abstractNum>
-  <w:abstractNum w:abstractNumId="25" w15:restartNumberingAfterBreak="0">
+  <w:abstractNum w:abstractNumId="26" w15:restartNumberingAfterBreak="0">
     <w:nsid w:val="5BD010ED"/>
     <w:multiLevelType w:val="hybridMultilevel"/>
     <w:tmpl w:val="928CAA0A"/>
@@ -12312,7 +14419,7 @@
       </w:rPr>
     </w:lvl>
   </w:abstractNum>
-  <w:abstractNum w:abstractNumId="26" w15:restartNumberingAfterBreak="0">
+  <w:abstractNum w:abstractNumId="27" w15:restartNumberingAfterBreak="0">
     <w:nsid w:val="5CA668DC"/>
     <w:multiLevelType w:val="hybridMultilevel"/>
     <w:tmpl w:val="AC3AC3D0"/>
@@ -12425,7 +14532,7 @@
       </w:rPr>
     </w:lvl>
   </w:abstractNum>
-  <w:abstractNum w:abstractNumId="27" w15:restartNumberingAfterBreak="0">
+  <w:abstractNum w:abstractNumId="28" w15:restartNumberingAfterBreak="0">
     <w:nsid w:val="5E026BE9"/>
     <w:multiLevelType w:val="hybridMultilevel"/>
     <w:tmpl w:val="8DCA0508"/>
@@ -12538,7 +14645,7 @@
       </w:rPr>
     </w:lvl>
   </w:abstractNum>
-  <w:abstractNum w:abstractNumId="28" w15:restartNumberingAfterBreak="0">
+  <w:abstractNum w:abstractNumId="29" w15:restartNumberingAfterBreak="0">
     <w:nsid w:val="5FC45226"/>
     <w:multiLevelType w:val="hybridMultilevel"/>
     <w:tmpl w:val="91DAD356"/>
@@ -12651,7 +14758,7 @@
       </w:rPr>
     </w:lvl>
   </w:abstractNum>
-  <w:abstractNum w:abstractNumId="29" w15:restartNumberingAfterBreak="0">
+  <w:abstractNum w:abstractNumId="30" w15:restartNumberingAfterBreak="0">
     <w:nsid w:val="67CF2C18"/>
     <w:multiLevelType w:val="hybridMultilevel"/>
     <w:tmpl w:val="8002668E"/>
@@ -12764,7 +14871,7 @@
       </w:rPr>
     </w:lvl>
   </w:abstractNum>
-  <w:abstractNum w:abstractNumId="30" w15:restartNumberingAfterBreak="0">
+  <w:abstractNum w:abstractNumId="31" w15:restartNumberingAfterBreak="0">
     <w:nsid w:val="69E027A2"/>
     <w:multiLevelType w:val="hybridMultilevel"/>
     <w:tmpl w:val="F5D8FAB0"/>
@@ -12877,7 +14984,7 @@
       </w:rPr>
     </w:lvl>
   </w:abstractNum>
-  <w:abstractNum w:abstractNumId="31" w15:restartNumberingAfterBreak="0">
+  <w:abstractNum w:abstractNumId="32" w15:restartNumberingAfterBreak="0">
     <w:nsid w:val="6A762236"/>
     <w:multiLevelType w:val="hybridMultilevel"/>
     <w:tmpl w:val="A948AF20"/>
@@ -12990,7 +15097,7 @@
       </w:rPr>
     </w:lvl>
   </w:abstractNum>
-  <w:abstractNum w:abstractNumId="32" w15:restartNumberingAfterBreak="0">
+  <w:abstractNum w:abstractNumId="33" w15:restartNumberingAfterBreak="0">
     <w:nsid w:val="6BCD440C"/>
     <w:multiLevelType w:val="hybridMultilevel"/>
     <w:tmpl w:val="B0265236"/>
@@ -13103,7 +15210,7 @@
       </w:rPr>
     </w:lvl>
   </w:abstractNum>
-  <w:abstractNum w:abstractNumId="33" w15:restartNumberingAfterBreak="0">
+  <w:abstractNum w:abstractNumId="34" w15:restartNumberingAfterBreak="0">
     <w:nsid w:val="6C1BD37C"/>
     <w:multiLevelType w:val="hybridMultilevel"/>
     <w:tmpl w:val="E19E1484"/>
@@ -13216,7 +15323,7 @@
       </w:rPr>
     </w:lvl>
   </w:abstractNum>
-  <w:abstractNum w:abstractNumId="34" w15:restartNumberingAfterBreak="0">
+  <w:abstractNum w:abstractNumId="35" w15:restartNumberingAfterBreak="0">
     <w:nsid w:val="70164586"/>
     <w:multiLevelType w:val="hybridMultilevel"/>
     <w:tmpl w:val="3676A272"/>
@@ -13329,7 +15436,7 @@
       </w:rPr>
     </w:lvl>
   </w:abstractNum>
-  <w:abstractNum w:abstractNumId="35" w15:restartNumberingAfterBreak="0">
+  <w:abstractNum w:abstractNumId="36" w15:restartNumberingAfterBreak="0">
     <w:nsid w:val="704DA7C0"/>
     <w:multiLevelType w:val="hybridMultilevel"/>
     <w:tmpl w:val="23B095E8"/>
@@ -13442,7 +15549,7 @@
       </w:rPr>
     </w:lvl>
   </w:abstractNum>
-  <w:abstractNum w:abstractNumId="36" w15:restartNumberingAfterBreak="0">
+  <w:abstractNum w:abstractNumId="37" w15:restartNumberingAfterBreak="0">
     <w:nsid w:val="725164EB"/>
     <w:multiLevelType w:val="hybridMultilevel"/>
     <w:tmpl w:val="058C2876"/>
@@ -13555,7 +15662,7 @@
       </w:rPr>
     </w:lvl>
   </w:abstractNum>
-  <w:abstractNum w:abstractNumId="37" w15:restartNumberingAfterBreak="0">
+  <w:abstractNum w:abstractNumId="38" w15:restartNumberingAfterBreak="0">
     <w:nsid w:val="7EEE737C"/>
     <w:multiLevelType w:val="hybridMultilevel"/>
     <w:tmpl w:val="3B0EDD8C"/>
@@ -13668,7 +15775,7 @@
       </w:rPr>
     </w:lvl>
   </w:abstractNum>
-  <w:abstractNum w:abstractNumId="38" w15:restartNumberingAfterBreak="0">
+  <w:abstractNum w:abstractNumId="39" w15:restartNumberingAfterBreak="0">
     <w:nsid w:val="7F45FA93"/>
     <w:multiLevelType w:val="hybridMultilevel"/>
     <w:tmpl w:val="B75CC686"/>
@@ -13782,121 +15889,124 @@
     </w:lvl>
   </w:abstractNum>
   <w:num w:numId="1" w16cid:durableId="735978475">
-    <w:abstractNumId w:val="20"/>
+    <w:abstractNumId w:val="21"/>
   </w:num>
   <w:num w:numId="2" w16cid:durableId="1474366344">
+    <w:abstractNumId w:val="7"/>
+  </w:num>
+  <w:num w:numId="3" w16cid:durableId="914898776">
+    <w:abstractNumId w:val="9"/>
+  </w:num>
+  <w:num w:numId="4" w16cid:durableId="403845044">
+    <w:abstractNumId w:val="12"/>
+  </w:num>
+  <w:num w:numId="5" w16cid:durableId="1027801819">
+    <w:abstractNumId w:val="39"/>
+  </w:num>
+  <w:num w:numId="6" w16cid:durableId="2087263953">
+    <w:abstractNumId w:val="28"/>
+  </w:num>
+  <w:num w:numId="7" w16cid:durableId="135531027">
+    <w:abstractNumId w:val="36"/>
+  </w:num>
+  <w:num w:numId="8" w16cid:durableId="1798832347">
     <w:abstractNumId w:val="6"/>
   </w:num>
-  <w:num w:numId="3" w16cid:durableId="914898776">
-    <w:abstractNumId w:val="8"/>
-  </w:num>
-  <w:num w:numId="4" w16cid:durableId="403845044">
-    <w:abstractNumId w:val="11"/>
-  </w:num>
-  <w:num w:numId="5" w16cid:durableId="1027801819">
-    <w:abstractNumId w:val="38"/>
-  </w:num>
-  <w:num w:numId="6" w16cid:durableId="2087263953">
-    <w:abstractNumId w:val="27"/>
-  </w:num>
-  <w:num w:numId="7" w16cid:durableId="135531027">
-    <w:abstractNumId w:val="35"/>
-  </w:num>
-  <w:num w:numId="8" w16cid:durableId="1798832347">
-    <w:abstractNumId w:val="5"/>
-  </w:num>
   <w:num w:numId="9" w16cid:durableId="708336540">
-    <w:abstractNumId w:val="33"/>
+    <w:abstractNumId w:val="34"/>
   </w:num>
   <w:num w:numId="10" w16cid:durableId="992441462">
-    <w:abstractNumId w:val="12"/>
+    <w:abstractNumId w:val="13"/>
   </w:num>
   <w:num w:numId="11" w16cid:durableId="1749108674">
-    <w:abstractNumId w:val="26"/>
+    <w:abstractNumId w:val="27"/>
   </w:num>
   <w:num w:numId="12" w16cid:durableId="2050910823">
     <w:abstractNumId w:val="0"/>
   </w:num>
   <w:num w:numId="13" w16cid:durableId="1014572579">
-    <w:abstractNumId w:val="14"/>
+    <w:abstractNumId w:val="15"/>
   </w:num>
   <w:num w:numId="14" w16cid:durableId="239682918">
-    <w:abstractNumId w:val="22"/>
+    <w:abstractNumId w:val="23"/>
   </w:num>
   <w:num w:numId="15" w16cid:durableId="1025400161">
-    <w:abstractNumId w:val="37"/>
+    <w:abstractNumId w:val="38"/>
   </w:num>
   <w:num w:numId="16" w16cid:durableId="1141581957">
     <w:abstractNumId w:val="1"/>
   </w:num>
   <w:num w:numId="17" w16cid:durableId="1739353166">
-    <w:abstractNumId w:val="21"/>
+    <w:abstractNumId w:val="22"/>
   </w:num>
   <w:num w:numId="18" w16cid:durableId="1430126907">
-    <w:abstractNumId w:val="28"/>
+    <w:abstractNumId w:val="29"/>
   </w:num>
   <w:num w:numId="19" w16cid:durableId="1856113293">
-    <w:abstractNumId w:val="32"/>
+    <w:abstractNumId w:val="33"/>
   </w:num>
   <w:num w:numId="20" w16cid:durableId="1037588309">
     <w:abstractNumId w:val="2"/>
   </w:num>
   <w:num w:numId="21" w16cid:durableId="2109890275">
+    <w:abstractNumId w:val="26"/>
+  </w:num>
+  <w:num w:numId="22" w16cid:durableId="890654856">
+    <w:abstractNumId w:val="24"/>
+  </w:num>
+  <w:num w:numId="23" w16cid:durableId="821314832">
+    <w:abstractNumId w:val="11"/>
+  </w:num>
+  <w:num w:numId="24" w16cid:durableId="2144808822">
+    <w:abstractNumId w:val="16"/>
+  </w:num>
+  <w:num w:numId="25" w16cid:durableId="2061974195">
+    <w:abstractNumId w:val="32"/>
+  </w:num>
+  <w:num w:numId="26" w16cid:durableId="1243829079">
+    <w:abstractNumId w:val="35"/>
+  </w:num>
+  <w:num w:numId="27" w16cid:durableId="1608348957">
+    <w:abstractNumId w:val="19"/>
+  </w:num>
+  <w:num w:numId="28" w16cid:durableId="710307759">
+    <w:abstractNumId w:val="5"/>
+  </w:num>
+  <w:num w:numId="29" w16cid:durableId="238251190">
+    <w:abstractNumId w:val="31"/>
+  </w:num>
+  <w:num w:numId="30" w16cid:durableId="1519463330">
+    <w:abstractNumId w:val="10"/>
+  </w:num>
+  <w:num w:numId="31" w16cid:durableId="684676877">
+    <w:abstractNumId w:val="8"/>
+  </w:num>
+  <w:num w:numId="32" w16cid:durableId="1593466184">
     <w:abstractNumId w:val="25"/>
   </w:num>
-  <w:num w:numId="22" w16cid:durableId="890654856">
-    <w:abstractNumId w:val="23"/>
+  <w:num w:numId="33" w16cid:durableId="1500072115">
+    <w:abstractNumId w:val="17"/>
   </w:num>
-  <w:num w:numId="23" w16cid:durableId="821314832">
-    <w:abstractNumId w:val="10"/>
+  <w:num w:numId="34" w16cid:durableId="2123574219">
+    <w:abstractNumId w:val="20"/>
   </w:num>
-  <w:num w:numId="24" w16cid:durableId="2144808822">
-    <w:abstractNumId w:val="15"/>
+  <w:num w:numId="35" w16cid:durableId="1360203795">
+    <w:abstractNumId w:val="14"/>
   </w:num>
-  <w:num w:numId="25" w16cid:durableId="2061974195">
-    <w:abstractNumId w:val="31"/>
+  <w:num w:numId="36" w16cid:durableId="870146807">
+    <w:abstractNumId w:val="37"/>
   </w:num>
-  <w:num w:numId="26" w16cid:durableId="1243829079">
-    <w:abstractNumId w:val="34"/>
+  <w:num w:numId="37" w16cid:durableId="1310404618">
+    <w:abstractNumId w:val="4"/>
   </w:num>
-  <w:num w:numId="27" w16cid:durableId="1608348957">
+  <w:num w:numId="38" w16cid:durableId="1447626726">
     <w:abstractNumId w:val="18"/>
   </w:num>
-  <w:num w:numId="28" w16cid:durableId="710307759">
-    <w:abstractNumId w:val="4"/>
-  </w:num>
-  <w:num w:numId="29" w16cid:durableId="238251190">
+  <w:num w:numId="39" w16cid:durableId="1024012903">
     <w:abstractNumId w:val="30"/>
   </w:num>
-  <w:num w:numId="30" w16cid:durableId="1519463330">
-    <w:abstractNumId w:val="9"/>
-  </w:num>
-  <w:num w:numId="31" w16cid:durableId="684676877">
-    <w:abstractNumId w:val="7"/>
-  </w:num>
-  <w:num w:numId="32" w16cid:durableId="1593466184">
-    <w:abstractNumId w:val="24"/>
-  </w:num>
-  <w:num w:numId="33" w16cid:durableId="1500072115">
-    <w:abstractNumId w:val="16"/>
-  </w:num>
-  <w:num w:numId="34" w16cid:durableId="2123574219">
-    <w:abstractNumId w:val="19"/>
-  </w:num>
-  <w:num w:numId="35" w16cid:durableId="1360203795">
-    <w:abstractNumId w:val="13"/>
-  </w:num>
-  <w:num w:numId="36" w16cid:durableId="870146807">
-    <w:abstractNumId w:val="36"/>
-  </w:num>
-  <w:num w:numId="37" w16cid:durableId="1310404618">
+  <w:num w:numId="40" w16cid:durableId="687487396">
     <w:abstractNumId w:val="3"/>
-  </w:num>
-  <w:num w:numId="38" w16cid:durableId="1447626726">
-    <w:abstractNumId w:val="17"/>
-  </w:num>
-  <w:num w:numId="39" w16cid:durableId="1024012903">
-    <w:abstractNumId w:val="29"/>
   </w:num>
   <w:numIdMacAtCleanup w:val="36"/>
 </w:numbering>
@@ -14540,6 +16650,31 @@
       <w:shd w:val="clear" w:color="auto" w:fill="E1DFDD"/>
     </w:rPr>
   </w:style>
+  <w:style w:type="paragraph" w:styleId="NoSpacing">
+    <w:name w:val="No Spacing"/>
+    <w:link w:val="NoSpacingChar"/>
+    <w:uiPriority w:val="1"/>
+    <w:qFormat/>
+    <w:rsid w:val="00256F0E"/>
+    <w:pPr>
+      <w:spacing w:after="0" w:line="240" w:lineRule="auto"/>
+    </w:pPr>
+    <w:rPr>
+      <w:rFonts w:eastAsiaTheme="minorEastAsia"/>
+      <w:lang w:val="en-US"/>
+    </w:rPr>
+  </w:style>
+  <w:style w:type="character" w:customStyle="1" w:styleId="NoSpacingChar">
+    <w:name w:val="No Spacing Char"/>
+    <w:basedOn w:val="DefaultParagraphFont"/>
+    <w:link w:val="NoSpacing"/>
+    <w:uiPriority w:val="1"/>
+    <w:rsid w:val="00256F0E"/>
+    <w:rPr>
+      <w:rFonts w:eastAsiaTheme="minorEastAsia"/>
+      <w:lang w:val="en-US"/>
+    </w:rPr>
+  </w:style>
 </w:styles>
 </file>
 
@@ -14805,10 +16940,29 @@
 </file>
 
 <file path=customXml/item1.xml><?xml version="1.0" encoding="utf-8"?>
+<CoverPageProperties xmlns="http://schemas.microsoft.com/office/2006/coverPageProps">
+  <PublishDate>2025-11-14T00:00:00</PublishDate>
+  <Abstract/>
+  <CompanyAddress/>
+  <CompanyPhone/>
+  <CompanyFax/>
+  <CompanyEmail/>
+</CoverPageProperties>
+</file>
+
+<file path=customXml/item2.xml><?xml version="1.0" encoding="utf-8"?>
 <b:Sources xmlns:b="http://schemas.openxmlformats.org/officeDocument/2006/bibliography" xmlns="http://schemas.openxmlformats.org/officeDocument/2006/bibliography" SelectedStyle="\APASixthEditionOfficeOnline.xsl" StyleName="APA" Version="6"/>
 </file>
 
 <file path=customXml/itemProps1.xml><?xml version="1.0" encoding="utf-8"?>
+<ds:datastoreItem xmlns:ds="http://schemas.openxmlformats.org/officeDocument/2006/customXml" ds:itemID="{55AF091B-3C7A-41E3-B477-F2FDAA23CFDA}">
+  <ds:schemaRefs>
+    <ds:schemaRef ds:uri="http://schemas.microsoft.com/office/2006/coverPageProps"/>
+  </ds:schemaRefs>
+</ds:datastoreItem>
+</file>
+
+<file path=customXml/itemProps2.xml><?xml version="1.0" encoding="utf-8"?>
 <ds:datastoreItem xmlns:ds="http://schemas.openxmlformats.org/officeDocument/2006/customXml" ds:itemID="{11B438F4-03BF-4C6D-8122-4AA4FF3DC379}">
   <ds:schemaRefs>
     <ds:schemaRef ds:uri="http://schemas.openxmlformats.org/officeDocument/2006/bibliography"/>

</xml_diff>